<commit_message>
Update Computer Systems assignment document
Modified Computer Systems assignment document for Level 4. Changes include temporary Word document files created during editing.
</commit_message>
<xml_diff>
--- a/Level_4/Level_4(1st Semester)/Computer Systems/L4DC-L4DCBM- Computer Systems- Blessings Tamanga(P00221220).docx
+++ b/Level_4/Level_4(1st Semester)/Computer Systems/L4DC-L4DCBM- Computer Systems- Blessings Tamanga(P00221220).docx
@@ -5563,6 +5563,10 @@
     <w:p>
       <w:pPr>
         <w:pStyle w:val="ListParagraph"/>
+        <w:numPr>
+          <w:ilvl w:val="2"/>
+          <w:numId w:val="28"/>
+        </w:numPr>
         <w:rPr>
           <w:rFonts w:ascii="Arial" w:hAnsi="Arial" w:cs="Arial"/>
         </w:rPr>
@@ -5594,11 +5598,412 @@
     </w:p>
     <w:p>
       <w:pPr>
+        <w:pStyle w:val="Heading1"/>
+        <w:numPr>
+          <w:ilvl w:val="2"/>
+          <w:numId w:val="27"/>
+        </w:numPr>
+        <w:rPr>
+          <w:rFonts w:ascii="Arial" w:hAnsi="Arial" w:cs="Arial"/>
+          <w:b/>
+          <w:color w:val="auto"/>
+          <w:sz w:val="32"/>
+          <w:szCs w:val="32"/>
+        </w:rPr>
+      </w:pPr>
+      <w:r>
+        <w:rPr>
+          <w:rFonts w:ascii="Arial" w:hAnsi="Arial" w:cs="Arial"/>
+          <w:b/>
+          <w:color w:val="auto"/>
+          <w:sz w:val="32"/>
+          <w:szCs w:val="32"/>
+        </w:rPr>
+        <w:lastRenderedPageBreak/>
+        <w:t>Future Computing Services</w:t>
+      </w:r>
+    </w:p>
+    <w:p>
+      <w:pPr>
+        <w:rPr>
+          <w:rFonts w:ascii="Arial" w:hAnsi="Arial" w:cs="Arial"/>
+        </w:rPr>
+      </w:pPr>
+    </w:p>
+    <w:p>
+      <w:pPr>
+        <w:rPr>
+          <w:rFonts w:ascii="Arial" w:hAnsi="Arial" w:cs="Arial"/>
+        </w:rPr>
+      </w:pPr>
+      <w:r>
+        <w:rPr>
+          <w:rFonts w:ascii="Arial" w:hAnsi="Arial" w:cs="Arial"/>
+        </w:rPr>
+        <w:t>The section explores areas of technologi</w:t>
+      </w:r>
+      <w:r>
+        <w:rPr>
+          <w:rFonts w:ascii="Arial" w:hAnsi="Arial" w:cs="Arial"/>
+        </w:rPr>
+        <w:t>cal</w:t>
+      </w:r>
+      <w:r>
+        <w:rPr>
+          <w:rFonts w:ascii="Arial" w:hAnsi="Arial" w:cs="Arial"/>
+        </w:rPr>
+        <w:t xml:space="preserve"> advancement that QuantumTech could consider</w:t>
+      </w:r>
+      <w:r>
+        <w:rPr>
+          <w:rFonts w:ascii="Arial" w:hAnsi="Arial" w:cs="Arial"/>
+        </w:rPr>
+        <w:t xml:space="preserve"> to</w:t>
+      </w:r>
+      <w:r>
+        <w:rPr>
+          <w:rFonts w:ascii="Arial" w:hAnsi="Arial" w:cs="Arial"/>
+        </w:rPr>
+        <w:t xml:space="preserve"> broad</w:t>
+      </w:r>
+      <w:r>
+        <w:rPr>
+          <w:rFonts w:ascii="Arial" w:hAnsi="Arial" w:cs="Arial"/>
+        </w:rPr>
+        <w:t>en</w:t>
+      </w:r>
+      <w:r>
+        <w:rPr>
+          <w:rFonts w:ascii="Arial" w:hAnsi="Arial" w:cs="Arial"/>
+        </w:rPr>
+        <w:t xml:space="preserve"> its computing services. This</w:t>
+      </w:r>
+      <w:r>
+        <w:rPr>
+          <w:rFonts w:ascii="Arial" w:hAnsi="Arial" w:cs="Arial"/>
+        </w:rPr>
+        <w:t xml:space="preserve"> section is crucial for senior financial stakeholders who are unfamiliar with technical jargon to grasp the potential of such expansions.</w:t>
+      </w:r>
+    </w:p>
+    <w:p>
+      <w:pPr>
+        <w:rPr>
+          <w:rFonts w:ascii="Arial" w:hAnsi="Arial" w:cs="Arial"/>
+          <w:b/>
+        </w:rPr>
+      </w:pPr>
+    </w:p>
+    <w:p>
+      <w:pPr>
+        <w:pStyle w:val="Heading1"/>
+        <w:rPr>
+          <w:rFonts w:ascii="Arial" w:hAnsi="Arial" w:cs="Arial"/>
+          <w:b/>
+          <w:color w:val="auto"/>
+          <w:sz w:val="32"/>
+          <w:szCs w:val="32"/>
+        </w:rPr>
+      </w:pPr>
+      <w:r>
+        <w:rPr>
+          <w:rFonts w:ascii="Arial" w:hAnsi="Arial" w:cs="Arial"/>
+          <w:b/>
+          <w:color w:val="auto"/>
+          <w:sz w:val="32"/>
+          <w:szCs w:val="32"/>
+        </w:rPr>
+        <w:t xml:space="preserve"> Distributed Computing Services</w:t>
+      </w:r>
+    </w:p>
+    <w:p>
+      <w:pPr>
+        <w:rPr>
+          <w:rFonts w:ascii="Arial" w:hAnsi="Arial" w:cs="Arial"/>
+        </w:rPr>
+      </w:pPr>
+      <w:r>
+        <w:rPr>
+          <w:rFonts w:ascii="Arial" w:hAnsi="Arial" w:cs="Arial"/>
+        </w:rPr>
+        <w:t>According to</w:t>
+      </w:r>
+      <w:sdt>
+        <w:sdtPr>
+          <w:rPr>
+            <w:rFonts w:ascii="Arial" w:hAnsi="Arial" w:cs="Arial"/>
+          </w:rPr>
+          <w:id w:val="-1619598570"/>
+          <w:citation/>
+        </w:sdtPr>
+        <w:sdtContent>
+          <w:r>
+            <w:rPr>
+              <w:rFonts w:ascii="Arial" w:hAnsi="Arial" w:cs="Arial"/>
+            </w:rPr>
+            <w:fldChar w:fldCharType="begin"/>
+          </w:r>
+          <w:r>
+            <w:rPr>
+              <w:rFonts w:ascii="Arial" w:hAnsi="Arial" w:cs="Arial"/>
+              <w:lang w:val="en-GB"/>
+            </w:rPr>
+            <w:instrText xml:space="preserve"> CITATION Gee256 \l 2057 </w:instrText>
+          </w:r>
+          <w:r>
+            <w:rPr>
+              <w:rFonts w:ascii="Arial" w:hAnsi="Arial" w:cs="Arial"/>
+            </w:rPr>
+            <w:fldChar w:fldCharType="separate"/>
+          </w:r>
+          <w:r>
+            <w:rPr>
+              <w:rFonts w:ascii="Arial" w:hAnsi="Arial" w:cs="Arial"/>
+              <w:noProof/>
+              <w:lang w:val="en-GB"/>
+            </w:rPr>
+            <w:t xml:space="preserve"> </w:t>
+          </w:r>
+          <w:r>
+            <w:rPr>
+              <w:rFonts w:ascii="Arial" w:hAnsi="Arial" w:cs="Arial"/>
+              <w:noProof/>
+              <w:lang w:val="en-GB"/>
+            </w:rPr>
+            <w:t>(GeeksforGeeks, 2025)</w:t>
+          </w:r>
+          <w:r>
+            <w:rPr>
+              <w:rFonts w:ascii="Arial" w:hAnsi="Arial" w:cs="Arial"/>
+            </w:rPr>
+            <w:fldChar w:fldCharType="end"/>
+          </w:r>
+        </w:sdtContent>
+      </w:sdt>
+      <w:r>
+        <w:rPr>
+          <w:rFonts w:ascii="Arial" w:hAnsi="Arial" w:cs="Arial"/>
+        </w:rPr>
+        <w:t xml:space="preserve"> and </w:t>
+      </w:r>
+      <w:sdt>
+        <w:sdtPr>
+          <w:rPr>
+            <w:rFonts w:ascii="Arial" w:hAnsi="Arial" w:cs="Arial"/>
+          </w:rPr>
+          <w:id w:val="1056516127"/>
+          <w:citation/>
+        </w:sdtPr>
+        <w:sdtContent>
+          <w:r>
+            <w:rPr>
+              <w:rFonts w:ascii="Arial" w:hAnsi="Arial" w:cs="Arial"/>
+            </w:rPr>
+            <w:fldChar w:fldCharType="begin"/>
+          </w:r>
+          <w:r>
+            <w:rPr>
+              <w:rFonts w:ascii="Arial" w:hAnsi="Arial" w:cs="Arial"/>
+              <w:lang w:val="en-GB"/>
+            </w:rPr>
+            <w:instrText xml:space="preserve"> CITATION Phi26 \l 2057 </w:instrText>
+          </w:r>
+          <w:r>
+            <w:rPr>
+              <w:rFonts w:ascii="Arial" w:hAnsi="Arial" w:cs="Arial"/>
+            </w:rPr>
+            <w:fldChar w:fldCharType="separate"/>
+          </w:r>
+          <w:r>
+            <w:rPr>
+              <w:rFonts w:ascii="Arial" w:hAnsi="Arial" w:cs="Arial"/>
+              <w:noProof/>
+              <w:lang w:val="en-GB"/>
+            </w:rPr>
+            <w:t>(Phill Powell, n.d.)</w:t>
+          </w:r>
+          <w:r>
+            <w:rPr>
+              <w:rFonts w:ascii="Arial" w:hAnsi="Arial" w:cs="Arial"/>
+            </w:rPr>
+            <w:fldChar w:fldCharType="end"/>
+          </w:r>
+        </w:sdtContent>
+      </w:sdt>
+      <w:r>
+        <w:rPr>
+          <w:rFonts w:ascii="Arial" w:hAnsi="Arial" w:cs="Arial"/>
+        </w:rPr>
+        <w:t xml:space="preserve">, Distributed computing refers to a </w:t>
+      </w:r>
+      <w:r>
+        <w:rPr>
+          <w:rFonts w:ascii="Arial" w:hAnsi="Arial" w:cs="Arial"/>
+        </w:rPr>
+        <w:t>approach</w:t>
+      </w:r>
+      <w:r>
+        <w:rPr>
+          <w:rFonts w:ascii="Arial" w:hAnsi="Arial" w:cs="Arial"/>
+        </w:rPr>
+        <w:t xml:space="preserve"> where data processing and storage is di</w:t>
+      </w:r>
+      <w:r>
+        <w:rPr>
+          <w:rFonts w:ascii="Arial" w:hAnsi="Arial" w:cs="Arial"/>
+        </w:rPr>
+        <w:t>s</w:t>
+      </w:r>
+      <w:r>
+        <w:rPr>
+          <w:rFonts w:ascii="Arial" w:hAnsi="Arial" w:cs="Arial"/>
+        </w:rPr>
+        <w:t>tributed across multiple systems rather than being handled by a single central device.</w:t>
+      </w:r>
+      <w:r>
+        <w:rPr>
+          <w:rFonts w:ascii="Arial" w:hAnsi="Arial" w:cs="Arial"/>
+        </w:rPr>
+        <w:t xml:space="preserve"> </w:t>
+      </w:r>
+      <w:r>
+        <w:rPr>
+          <w:rFonts w:ascii="Arial" w:hAnsi="Arial" w:cs="Arial"/>
+        </w:rPr>
+        <w:t>Distributed computing are made up of the key components which includes Device, Network and resource management. Distributed computing is made up of different types including client-server system and peer system. Distributed computing is used in banks, computing, energy and science. Distributed computing advantages include scalability, reliability and flexibility. Some of disadvantages of  distributed computing include complexity, security and perfomance.</w:t>
+      </w:r>
+    </w:p>
+    <w:p>
+      <w:pPr>
+        <w:rPr>
+          <w:rFonts w:ascii="Arial" w:hAnsi="Arial" w:cs="Arial"/>
+        </w:rPr>
+      </w:pPr>
+    </w:p>
+    <w:p>
+      <w:pPr>
+        <w:rPr>
+          <w:rFonts w:ascii="Arial" w:hAnsi="Arial" w:cs="Arial"/>
+        </w:rPr>
+      </w:pPr>
+    </w:p>
+    <w:p>
+      <w:pPr>
+        <w:pStyle w:val="Heading1"/>
+        <w:numPr>
+          <w:ilvl w:val="0"/>
+          <w:numId w:val="28"/>
+        </w:numPr>
+        <w:rPr>
+          <w:rFonts w:ascii="Arial" w:hAnsi="Arial" w:cs="Arial"/>
+          <w:b/>
+          <w:color w:val="auto"/>
+          <w:sz w:val="32"/>
+          <w:szCs w:val="32"/>
+        </w:rPr>
+      </w:pPr>
+      <w:r>
+        <w:rPr>
+          <w:rFonts w:ascii="Arial" w:hAnsi="Arial" w:cs="Arial"/>
+          <w:b/>
+          <w:color w:val="auto"/>
+          <w:sz w:val="32"/>
+          <w:szCs w:val="32"/>
+        </w:rPr>
+        <w:t>Quantum Computing Advancements</w:t>
+      </w:r>
+    </w:p>
+    <w:p>
+      <w:pPr>
+        <w:rPr>
+          <w:rFonts w:ascii="Arial" w:hAnsi="Arial" w:cs="Arial"/>
+        </w:rPr>
+      </w:pPr>
+      <w:r>
+        <w:rPr>
+          <w:rFonts w:ascii="Arial" w:hAnsi="Arial" w:cs="Arial"/>
+        </w:rPr>
+        <w:t xml:space="preserve">Quantum computing is an emerging technology that uses quantum mechanics, a branch of physics dealing with very tiny particles to process information. </w:t>
+      </w:r>
+      <w:r>
+        <w:rPr>
+          <w:rFonts w:ascii="Arial" w:hAnsi="Arial" w:cs="Arial"/>
+        </w:rPr>
+        <w:t xml:space="preserve">Unlike </w:t>
+      </w:r>
+      <w:r>
+        <w:rPr>
+          <w:rFonts w:ascii="Arial" w:hAnsi="Arial" w:cs="Arial"/>
+        </w:rPr>
+        <w:t>Normal computers</w:t>
+      </w:r>
+      <w:r>
+        <w:rPr>
+          <w:rFonts w:ascii="Arial" w:hAnsi="Arial" w:cs="Arial"/>
+        </w:rPr>
+        <w:t xml:space="preserve"> which</w:t>
+      </w:r>
+      <w:r>
+        <w:rPr>
+          <w:rFonts w:ascii="Arial" w:hAnsi="Arial" w:cs="Arial"/>
+        </w:rPr>
+        <w:t xml:space="preserve"> uses “bits” represent data while </w:t>
+      </w:r>
+      <w:r>
+        <w:rPr>
+          <w:rFonts w:ascii="Arial" w:hAnsi="Arial" w:cs="Arial"/>
+        </w:rPr>
+        <w:t>Qu</w:t>
+      </w:r>
+      <w:r>
+        <w:rPr>
+          <w:rFonts w:ascii="Arial" w:hAnsi="Arial" w:cs="Arial"/>
+        </w:rPr>
+        <w:t>antum computing uses “qubits”</w:t>
+      </w:r>
+      <w:r>
+        <w:rPr>
+          <w:rFonts w:ascii="Arial" w:hAnsi="Arial" w:cs="Arial"/>
+        </w:rPr>
+        <w:t>.</w:t>
+      </w:r>
+      <w:r>
+        <w:rPr>
+          <w:rFonts w:ascii="Arial" w:hAnsi="Arial" w:cs="Arial"/>
+        </w:rPr>
+        <w:t xml:space="preserve"> A qubit can exist in multiple states at the exact time. Furthermore, through entanglement, these qubits linked so that changing the state of one instantly affects the others, regardless of the physical distance between them. This allows quantum computers  to process complex calculations instantaneously , eliminating the processing delays found in traditional systems.</w:t>
+      </w:r>
+    </w:p>
+    <w:p>
+      <w:pPr>
+        <w:rPr>
+          <w:rFonts w:ascii="Arial" w:hAnsi="Arial" w:cs="Arial"/>
+        </w:rPr>
+      </w:pPr>
+      <w:r>
+        <w:rPr>
+          <w:rFonts w:ascii="Arial" w:hAnsi="Arial" w:cs="Arial"/>
+        </w:rPr>
+        <w:br/>
+        <w:t>The following are some of the advantages quantum  computing has over classical computers.</w:t>
+      </w:r>
+    </w:p>
+    <w:p>
+      <w:pPr>
         <w:pStyle w:val="ListParagraph"/>
-        <w:rPr>
-          <w:rFonts w:ascii="Arial" w:hAnsi="Arial" w:cs="Arial"/>
-        </w:rPr>
-      </w:pPr>
+        <w:numPr>
+          <w:ilvl w:val="0"/>
+          <w:numId w:val="29"/>
+        </w:numPr>
+        <w:rPr>
+          <w:rFonts w:ascii="Arial" w:hAnsi="Arial" w:cs="Arial"/>
+        </w:rPr>
+      </w:pPr>
+      <w:r>
+        <w:rPr>
+          <w:rFonts w:ascii="Arial" w:hAnsi="Arial" w:cs="Arial"/>
+        </w:rPr>
+        <w:t>Speed</w:t>
+      </w:r>
     </w:p>
     <w:p>
       <w:pPr>
@@ -5607,6 +6012,13 @@
           <w:rFonts w:ascii="Arial" w:hAnsi="Arial" w:cs="Arial"/>
         </w:rPr>
       </w:pPr>
+      <w:r>
+        <w:rPr>
+          <w:rFonts w:ascii="Arial" w:hAnsi="Arial" w:cs="Arial"/>
+        </w:rPr>
+        <w:lastRenderedPageBreak/>
+        <w:t>Quantum computing can solve highly complex problems faster than classical computers by evaluating multiple possibilities at once. This results in massive time saving  for QuantumTech startup dealing with coplex data models.</w:t>
+      </w:r>
     </w:p>
     <w:p>
       <w:pPr>
@@ -5615,6 +6027,78 @@
           <w:rFonts w:ascii="Arial" w:hAnsi="Arial" w:cs="Arial"/>
         </w:rPr>
       </w:pPr>
+    </w:p>
+    <w:p>
+      <w:pPr>
+        <w:pStyle w:val="ListParagraph"/>
+        <w:numPr>
+          <w:ilvl w:val="0"/>
+          <w:numId w:val="29"/>
+        </w:numPr>
+        <w:rPr>
+          <w:rFonts w:ascii="Arial" w:hAnsi="Arial" w:cs="Arial"/>
+        </w:rPr>
+      </w:pPr>
+      <w:r>
+        <w:rPr>
+          <w:rFonts w:ascii="Arial" w:hAnsi="Arial" w:cs="Arial"/>
+        </w:rPr>
+        <w:t>Parallel Computing</w:t>
+      </w:r>
+    </w:p>
+    <w:p>
+      <w:pPr>
+        <w:pStyle w:val="ListParagraph"/>
+        <w:rPr>
+          <w:rFonts w:ascii="Arial" w:hAnsi="Arial" w:cs="Arial"/>
+        </w:rPr>
+      </w:pPr>
+      <w:r>
+        <w:rPr>
+          <w:rFonts w:ascii="Arial" w:hAnsi="Arial" w:cs="Arial"/>
+        </w:rPr>
+        <w:t>Quantum computers can process vast amount of data by utilizing the components individually. This creates potential for AI startups to train  complex machine learning models faster than traditional hardware allows.</w:t>
+      </w:r>
+    </w:p>
+    <w:p>
+      <w:pPr>
+        <w:pStyle w:val="ListParagraph"/>
+        <w:rPr>
+          <w:rFonts w:ascii="Arial" w:hAnsi="Arial" w:cs="Arial"/>
+        </w:rPr>
+      </w:pPr>
+    </w:p>
+    <w:p>
+      <w:pPr>
+        <w:pStyle w:val="ListParagraph"/>
+        <w:numPr>
+          <w:ilvl w:val="0"/>
+          <w:numId w:val="29"/>
+        </w:numPr>
+        <w:rPr>
+          <w:rFonts w:ascii="Arial" w:hAnsi="Arial" w:cs="Arial"/>
+        </w:rPr>
+      </w:pPr>
+      <w:r>
+        <w:rPr>
+          <w:rFonts w:ascii="Arial" w:hAnsi="Arial" w:cs="Arial"/>
+        </w:rPr>
+        <w:t>Optimisation</w:t>
+      </w:r>
+    </w:p>
+    <w:p>
+      <w:pPr>
+        <w:pStyle w:val="ListParagraph"/>
+        <w:rPr>
+          <w:rFonts w:ascii="Arial" w:hAnsi="Arial" w:cs="Arial"/>
+        </w:rPr>
+      </w:pPr>
+      <w:r>
+        <w:rPr>
+          <w:rFonts w:ascii="Arial" w:hAnsi="Arial" w:cs="Arial"/>
+        </w:rPr>
+        <w:t>Quantum computers can find the absolute best solution among millions of variables. This is highly calued for Big Data and logistics startups that need to optimize complex operational routes.</w:t>
+      </w:r>
     </w:p>
     <w:p>
       <w:pPr>
@@ -5657,6 +6141,92 @@
 <file path=word/numbering.xml><?xml version="1.0" encoding="utf-8"?>
 <w:numbering xmlns:wpc="http://schemas.microsoft.com/office/word/2010/wordprocessingCanvas" xmlns:cx="http://schemas.microsoft.com/office/drawing/2014/chartex" xmlns:cx1="http://schemas.microsoft.com/office/drawing/2015/9/8/chartex" xmlns:cx2="http://schemas.microsoft.com/office/drawing/2015/10/21/chartex" xmlns:cx3="http://schemas.microsoft.com/office/drawing/2016/5/9/chartex" xmlns:cx4="http://schemas.microsoft.com/office/drawing/2016/5/10/chartex" xmlns:cx5="http://schemas.microsoft.com/office/drawing/2016/5/11/chartex" xmlns:cx6="http://schemas.microsoft.com/office/drawing/2016/5/12/chartex" xmlns:cx7="http://schemas.microsoft.com/office/drawing/2016/5/13/chartex" xmlns:cx8="http://schemas.microsoft.com/office/drawing/2016/5/14/chartex" xmlns:mc="http://schemas.openxmlformats.org/markup-compatibility/2006" xmlns:aink="http://schemas.microsoft.com/office/drawing/2016/ink" xmlns:am3d="http://schemas.microsoft.com/office/drawing/2017/model3d" xmlns:o="urn:schemas-microsoft-com:office:office" xmlns:oel="http://schemas.microsoft.com/office/2019/extlst" xmlns:r="http://schemas.openxmlformats.org/officeDocument/2006/relationships" xmlns:m="http://schemas.openxmlformats.org/officeDocument/2006/math" xmlns:v="urn:schemas-microsoft-com:vml" xmlns:wp14="http://schemas.microsoft.com/office/word/2010/wordprocessingDrawing" xmlns:wp="http://schemas.openxmlformats.org/drawingml/2006/wordprocessingDrawing" xmlns:w10="urn:schemas-microsoft-com:office:word" xmlns:w="http://schemas.openxmlformats.org/wordprocessingml/2006/main" xmlns:w14="http://schemas.microsoft.com/office/word/2010/wordml" xmlns:w15="http://schemas.microsoft.com/office/word/2012/wordml" xmlns:w16cex="http://schemas.microsoft.com/office/word/2018/wordml/cex" xmlns:w16cid="http://schemas.microsoft.com/office/word/2016/wordml/cid" xmlns:w16="http://schemas.microsoft.com/office/word/2018/wordml" xmlns:w16du="http://schemas.microsoft.com/office/word/2023/wordml/word16du" xmlns:w16sdtdh="http://schemas.microsoft.com/office/word/2020/wordml/sdtdatahash" xmlns:w16sdtfl="http://schemas.microsoft.com/office/word/2024/wordml/sdtformatlock" xmlns:w16se="http://schemas.microsoft.com/office/word/2015/wordml/symex" xmlns:wpg="http://schemas.microsoft.com/office/word/2010/wordprocessingGroup" xmlns:wpi="http://schemas.microsoft.com/office/word/2010/wordprocessingInk" xmlns:wne="http://schemas.microsoft.com/office/word/2006/wordml" xmlns:wps="http://schemas.microsoft.com/office/word/2010/wordprocessingShape" mc:Ignorable="w14 w15 w16se w16cid w16 w16cex w16sdtdh w16sdtfl w16du wp14">
   <w:abstractNum w:abstractNumId="0" w15:restartNumberingAfterBreak="0">
+    <w:nsid w:val="056F2649"/>
+    <w:multiLevelType w:val="hybridMultilevel"/>
+    <w:tmpl w:val="9A342E4C"/>
+    <w:lvl w:ilvl="0" w:tplc="FFFFFFFF">
+      <w:start w:val="1"/>
+      <w:numFmt w:val="upperRoman"/>
+      <w:lvlText w:val="%1."/>
+      <w:lvlJc w:val="right"/>
+      <w:pPr>
+        <w:ind w:left="720" w:hanging="360"/>
+      </w:pPr>
+    </w:lvl>
+    <w:lvl w:ilvl="1" w:tplc="FFFFFFFF" w:tentative="1">
+      <w:start w:val="1"/>
+      <w:numFmt w:val="lowerLetter"/>
+      <w:lvlText w:val="%2."/>
+      <w:lvlJc w:val="left"/>
+      <w:pPr>
+        <w:ind w:left="1440" w:hanging="360"/>
+      </w:pPr>
+    </w:lvl>
+    <w:lvl w:ilvl="2" w:tplc="FFFFFFFF" w:tentative="1">
+      <w:start w:val="1"/>
+      <w:numFmt w:val="lowerRoman"/>
+      <w:lvlText w:val="%3."/>
+      <w:lvlJc w:val="right"/>
+      <w:pPr>
+        <w:ind w:left="2160" w:hanging="180"/>
+      </w:pPr>
+    </w:lvl>
+    <w:lvl w:ilvl="3" w:tplc="FFFFFFFF" w:tentative="1">
+      <w:start w:val="1"/>
+      <w:numFmt w:val="decimal"/>
+      <w:lvlText w:val="%4."/>
+      <w:lvlJc w:val="left"/>
+      <w:pPr>
+        <w:ind w:left="2880" w:hanging="360"/>
+      </w:pPr>
+    </w:lvl>
+    <w:lvl w:ilvl="4" w:tplc="FFFFFFFF" w:tentative="1">
+      <w:start w:val="1"/>
+      <w:numFmt w:val="lowerLetter"/>
+      <w:lvlText w:val="%5."/>
+      <w:lvlJc w:val="left"/>
+      <w:pPr>
+        <w:ind w:left="3600" w:hanging="360"/>
+      </w:pPr>
+    </w:lvl>
+    <w:lvl w:ilvl="5" w:tplc="FFFFFFFF" w:tentative="1">
+      <w:start w:val="1"/>
+      <w:numFmt w:val="lowerRoman"/>
+      <w:lvlText w:val="%6."/>
+      <w:lvlJc w:val="right"/>
+      <w:pPr>
+        <w:ind w:left="4320" w:hanging="180"/>
+      </w:pPr>
+    </w:lvl>
+    <w:lvl w:ilvl="6" w:tplc="FFFFFFFF" w:tentative="1">
+      <w:start w:val="1"/>
+      <w:numFmt w:val="decimal"/>
+      <w:lvlText w:val="%7."/>
+      <w:lvlJc w:val="left"/>
+      <w:pPr>
+        <w:ind w:left="5040" w:hanging="360"/>
+      </w:pPr>
+    </w:lvl>
+    <w:lvl w:ilvl="7" w:tplc="FFFFFFFF" w:tentative="1">
+      <w:start w:val="1"/>
+      <w:numFmt w:val="lowerLetter"/>
+      <w:lvlText w:val="%8."/>
+      <w:lvlJc w:val="left"/>
+      <w:pPr>
+        <w:ind w:left="5760" w:hanging="360"/>
+      </w:pPr>
+    </w:lvl>
+    <w:lvl w:ilvl="8" w:tplc="FFFFFFFF" w:tentative="1">
+      <w:start w:val="1"/>
+      <w:numFmt w:val="lowerRoman"/>
+      <w:lvlText w:val="%9."/>
+      <w:lvlJc w:val="right"/>
+      <w:pPr>
+        <w:ind w:left="6480" w:hanging="180"/>
+      </w:pPr>
+    </w:lvl>
+  </w:abstractNum>
+  <w:abstractNum w:abstractNumId="1" w15:restartNumberingAfterBreak="0">
     <w:nsid w:val="0A546499"/>
     <w:multiLevelType w:val="multilevel"/>
     <w:tmpl w:val="0409001F"/>
@@ -5742,7 +6312,120 @@
       </w:pPr>
     </w:lvl>
   </w:abstractNum>
-  <w:abstractNum w:abstractNumId="1" w15:restartNumberingAfterBreak="0">
+  <w:abstractNum w:abstractNumId="2" w15:restartNumberingAfterBreak="0">
+    <w:nsid w:val="0C233A16"/>
+    <w:multiLevelType w:val="multilevel"/>
+    <w:tmpl w:val="707E0EE2"/>
+    <w:lvl w:ilvl="0">
+      <w:start w:val="1"/>
+      <w:numFmt w:val="decimal"/>
+      <w:lvlText w:val="%1."/>
+      <w:lvlJc w:val="left"/>
+      <w:pPr>
+        <w:ind w:left="360" w:hanging="360"/>
+      </w:pPr>
+      <w:rPr>
+        <w:rFonts w:hint="default"/>
+      </w:rPr>
+    </w:lvl>
+    <w:lvl w:ilvl="1">
+      <w:start w:val="1"/>
+      <w:numFmt w:val="decimal"/>
+      <w:lvlText w:val="%1.%2."/>
+      <w:lvlJc w:val="left"/>
+      <w:pPr>
+        <w:ind w:left="792" w:hanging="432"/>
+      </w:pPr>
+      <w:rPr>
+        <w:rFonts w:hint="default"/>
+      </w:rPr>
+    </w:lvl>
+    <w:lvl w:ilvl="2">
+      <w:start w:val="1"/>
+      <w:numFmt w:val="none"/>
+      <w:lvlText w:val="Task 4.0"/>
+      <w:lvlJc w:val="left"/>
+      <w:pPr>
+        <w:ind w:left="504" w:hanging="504"/>
+      </w:pPr>
+      <w:rPr>
+        <w:rFonts w:hint="default"/>
+      </w:rPr>
+    </w:lvl>
+    <w:lvl w:ilvl="3">
+      <w:start w:val="1"/>
+      <w:numFmt w:val="decimal"/>
+      <w:lvlText w:val="%1.%2.%3.%4."/>
+      <w:lvlJc w:val="left"/>
+      <w:pPr>
+        <w:ind w:left="1728" w:hanging="648"/>
+      </w:pPr>
+      <w:rPr>
+        <w:rFonts w:hint="default"/>
+      </w:rPr>
+    </w:lvl>
+    <w:lvl w:ilvl="4">
+      <w:start w:val="1"/>
+      <w:numFmt w:val="decimal"/>
+      <w:lvlText w:val="%1.%2.%3.%4.%5."/>
+      <w:lvlJc w:val="left"/>
+      <w:pPr>
+        <w:ind w:left="2232" w:hanging="792"/>
+      </w:pPr>
+      <w:rPr>
+        <w:rFonts w:hint="default"/>
+      </w:rPr>
+    </w:lvl>
+    <w:lvl w:ilvl="5">
+      <w:start w:val="1"/>
+      <w:numFmt w:val="decimal"/>
+      <w:lvlText w:val="%1.%2.%3.%4.%5.%6."/>
+      <w:lvlJc w:val="left"/>
+      <w:pPr>
+        <w:ind w:left="2736" w:hanging="936"/>
+      </w:pPr>
+      <w:rPr>
+        <w:rFonts w:hint="default"/>
+      </w:rPr>
+    </w:lvl>
+    <w:lvl w:ilvl="6">
+      <w:start w:val="1"/>
+      <w:numFmt w:val="decimal"/>
+      <w:lvlText w:val="%1.%2.%3.%4.%5.%6.%7."/>
+      <w:lvlJc w:val="left"/>
+      <w:pPr>
+        <w:ind w:left="3240" w:hanging="1080"/>
+      </w:pPr>
+      <w:rPr>
+        <w:rFonts w:hint="default"/>
+      </w:rPr>
+    </w:lvl>
+    <w:lvl w:ilvl="7">
+      <w:start w:val="1"/>
+      <w:numFmt w:val="decimal"/>
+      <w:lvlText w:val="%1.%2.%3.%4.%5.%6.%7.%8."/>
+      <w:lvlJc w:val="left"/>
+      <w:pPr>
+        <w:ind w:left="3744" w:hanging="1224"/>
+      </w:pPr>
+      <w:rPr>
+        <w:rFonts w:hint="default"/>
+      </w:rPr>
+    </w:lvl>
+    <w:lvl w:ilvl="8">
+      <w:start w:val="1"/>
+      <w:numFmt w:val="decimal"/>
+      <w:lvlText w:val="%1.%2.%3.%4.%5.%6.%7.%8.%9."/>
+      <w:lvlJc w:val="left"/>
+      <w:pPr>
+        <w:ind w:left="4320" w:hanging="1440"/>
+      </w:pPr>
+      <w:rPr>
+        <w:rFonts w:hint="default"/>
+      </w:rPr>
+    </w:lvl>
+  </w:abstractNum>
+  <w:abstractNum w:abstractNumId="3" w15:restartNumberingAfterBreak="0">
     <w:nsid w:val="16503A6D"/>
     <w:multiLevelType w:val="hybridMultilevel"/>
     <w:tmpl w:val="A5727500"/>
@@ -5831,7 +6514,7 @@
       </w:pPr>
     </w:lvl>
   </w:abstractNum>
-  <w:abstractNum w:abstractNumId="2" w15:restartNumberingAfterBreak="0">
+  <w:abstractNum w:abstractNumId="4" w15:restartNumberingAfterBreak="0">
     <w:nsid w:val="17C63856"/>
     <w:multiLevelType w:val="hybridMultilevel"/>
     <w:tmpl w:val="2BFA9D02"/>
@@ -5917,10 +6600,10 @@
       </w:pPr>
     </w:lvl>
   </w:abstractNum>
-  <w:abstractNum w:abstractNumId="3" w15:restartNumberingAfterBreak="0">
+  <w:abstractNum w:abstractNumId="5" w15:restartNumberingAfterBreak="0">
     <w:nsid w:val="19725F8A"/>
     <w:multiLevelType w:val="hybridMultilevel"/>
-    <w:tmpl w:val="01C07260"/>
+    <w:tmpl w:val="9A342E4C"/>
     <w:lvl w:ilvl="0" w:tplc="04090013">
       <w:start w:val="1"/>
       <w:numFmt w:val="upperRoman"/>
@@ -6003,7 +6686,7 @@
       </w:pPr>
     </w:lvl>
   </w:abstractNum>
-  <w:abstractNum w:abstractNumId="4" w15:restartNumberingAfterBreak="0">
+  <w:abstractNum w:abstractNumId="6" w15:restartNumberingAfterBreak="0">
     <w:nsid w:val="1B955587"/>
     <w:multiLevelType w:val="hybridMultilevel"/>
     <w:tmpl w:val="B01CBC00"/>
@@ -6092,7 +6775,7 @@
       </w:pPr>
     </w:lvl>
   </w:abstractNum>
-  <w:abstractNum w:abstractNumId="5" w15:restartNumberingAfterBreak="0">
+  <w:abstractNum w:abstractNumId="7" w15:restartNumberingAfterBreak="0">
     <w:nsid w:val="1E6D6DE6"/>
     <w:multiLevelType w:val="hybridMultilevel"/>
     <w:tmpl w:val="B090FE92"/>
@@ -6181,7 +6864,7 @@
       </w:pPr>
     </w:lvl>
   </w:abstractNum>
-  <w:abstractNum w:abstractNumId="6" w15:restartNumberingAfterBreak="0">
+  <w:abstractNum w:abstractNumId="8" w15:restartNumberingAfterBreak="0">
     <w:nsid w:val="25EF7998"/>
     <w:multiLevelType w:val="multilevel"/>
     <w:tmpl w:val="3340991E"/>
@@ -6294,7 +6977,7 @@
       </w:rPr>
     </w:lvl>
   </w:abstractNum>
-  <w:abstractNum w:abstractNumId="7" w15:restartNumberingAfterBreak="0">
+  <w:abstractNum w:abstractNumId="9" w15:restartNumberingAfterBreak="0">
     <w:nsid w:val="270369F4"/>
     <w:multiLevelType w:val="multilevel"/>
     <w:tmpl w:val="76A63A12"/>
@@ -6407,7 +7090,7 @@
       </w:rPr>
     </w:lvl>
   </w:abstractNum>
-  <w:abstractNum w:abstractNumId="8" w15:restartNumberingAfterBreak="0">
+  <w:abstractNum w:abstractNumId="10" w15:restartNumberingAfterBreak="0">
     <w:nsid w:val="27EC4B19"/>
     <w:multiLevelType w:val="multilevel"/>
     <w:tmpl w:val="5E127758"/>
@@ -6520,7 +7203,121 @@
       </w:rPr>
     </w:lvl>
   </w:abstractNum>
-  <w:abstractNum w:abstractNumId="9" w15:restartNumberingAfterBreak="0">
+  <w:abstractNum w:abstractNumId="11" w15:restartNumberingAfterBreak="0">
+    <w:nsid w:val="37475CD4"/>
+    <w:multiLevelType w:val="multilevel"/>
+    <w:tmpl w:val="FCBC6F76"/>
+    <w:lvl w:ilvl="0">
+      <w:start w:val="1"/>
+      <w:numFmt w:val="none"/>
+      <w:lvlText w:val="4.2"/>
+      <w:lvlJc w:val="left"/>
+      <w:pPr>
+        <w:ind w:left="360" w:hanging="360"/>
+      </w:pPr>
+      <w:rPr>
+        <w:rFonts w:ascii="Arial" w:hAnsi="Arial" w:cs="Arial" w:hint="default"/>
+        <w:color w:val="auto"/>
+      </w:rPr>
+    </w:lvl>
+    <w:lvl w:ilvl="1">
+      <w:start w:val="1"/>
+      <w:numFmt w:val="decimal"/>
+      <w:lvlText w:val="%1.%2."/>
+      <w:lvlJc w:val="left"/>
+      <w:pPr>
+        <w:ind w:left="792" w:hanging="432"/>
+      </w:pPr>
+      <w:rPr>
+        <w:rFonts w:hint="default"/>
+      </w:rPr>
+    </w:lvl>
+    <w:lvl w:ilvl="2">
+      <w:start w:val="1"/>
+      <w:numFmt w:val="none"/>
+      <w:lvlText w:val="4.2"/>
+      <w:lvlJc w:val="left"/>
+      <w:pPr>
+        <w:ind w:left="1224" w:hanging="504"/>
+      </w:pPr>
+      <w:rPr>
+        <w:rFonts w:hint="default"/>
+      </w:rPr>
+    </w:lvl>
+    <w:lvl w:ilvl="3">
+      <w:start w:val="1"/>
+      <w:numFmt w:val="decimal"/>
+      <w:lvlText w:val="%1.%2.%3.%4."/>
+      <w:lvlJc w:val="left"/>
+      <w:pPr>
+        <w:ind w:left="1728" w:hanging="648"/>
+      </w:pPr>
+      <w:rPr>
+        <w:rFonts w:hint="default"/>
+      </w:rPr>
+    </w:lvl>
+    <w:lvl w:ilvl="4">
+      <w:start w:val="1"/>
+      <w:numFmt w:val="decimal"/>
+      <w:lvlText w:val="%1.%2.%3.%4.%5."/>
+      <w:lvlJc w:val="left"/>
+      <w:pPr>
+        <w:ind w:left="2232" w:hanging="792"/>
+      </w:pPr>
+      <w:rPr>
+        <w:rFonts w:hint="default"/>
+      </w:rPr>
+    </w:lvl>
+    <w:lvl w:ilvl="5">
+      <w:start w:val="1"/>
+      <w:numFmt w:val="decimal"/>
+      <w:lvlText w:val="%1.%2.%3.%4.%5.%6."/>
+      <w:lvlJc w:val="left"/>
+      <w:pPr>
+        <w:ind w:left="2736" w:hanging="936"/>
+      </w:pPr>
+      <w:rPr>
+        <w:rFonts w:hint="default"/>
+      </w:rPr>
+    </w:lvl>
+    <w:lvl w:ilvl="6">
+      <w:start w:val="1"/>
+      <w:numFmt w:val="decimal"/>
+      <w:lvlText w:val="%1.%2.%3.%4.%5.%6.%7."/>
+      <w:lvlJc w:val="left"/>
+      <w:pPr>
+        <w:ind w:left="3240" w:hanging="1080"/>
+      </w:pPr>
+      <w:rPr>
+        <w:rFonts w:hint="default"/>
+      </w:rPr>
+    </w:lvl>
+    <w:lvl w:ilvl="7">
+      <w:start w:val="1"/>
+      <w:numFmt w:val="decimal"/>
+      <w:lvlText w:val="%1.%2.%3.%4.%5.%6.%7.%8."/>
+      <w:lvlJc w:val="left"/>
+      <w:pPr>
+        <w:ind w:left="3744" w:hanging="1224"/>
+      </w:pPr>
+      <w:rPr>
+        <w:rFonts w:hint="default"/>
+      </w:rPr>
+    </w:lvl>
+    <w:lvl w:ilvl="8">
+      <w:start w:val="1"/>
+      <w:numFmt w:val="decimal"/>
+      <w:lvlText w:val="%1.%2.%3.%4.%5.%6.%7.%8.%9."/>
+      <w:lvlJc w:val="left"/>
+      <w:pPr>
+        <w:ind w:left="4320" w:hanging="1440"/>
+      </w:pPr>
+      <w:rPr>
+        <w:rFonts w:hint="default"/>
+      </w:rPr>
+    </w:lvl>
+  </w:abstractNum>
+  <w:abstractNum w:abstractNumId="12" w15:restartNumberingAfterBreak="0">
     <w:nsid w:val="3926225C"/>
     <w:multiLevelType w:val="hybridMultilevel"/>
     <w:tmpl w:val="AEAA255E"/>
@@ -6609,7 +7406,7 @@
       </w:pPr>
     </w:lvl>
   </w:abstractNum>
-  <w:abstractNum w:abstractNumId="10" w15:restartNumberingAfterBreak="0">
+  <w:abstractNum w:abstractNumId="13" w15:restartNumberingAfterBreak="0">
     <w:nsid w:val="3CB70887"/>
     <w:multiLevelType w:val="hybridMultilevel"/>
     <w:tmpl w:val="01C07260"/>
@@ -6695,7 +7492,7 @@
       </w:pPr>
     </w:lvl>
   </w:abstractNum>
-  <w:abstractNum w:abstractNumId="11" w15:restartNumberingAfterBreak="0">
+  <w:abstractNum w:abstractNumId="14" w15:restartNumberingAfterBreak="0">
     <w:nsid w:val="434E3CA0"/>
     <w:multiLevelType w:val="hybridMultilevel"/>
     <w:tmpl w:val="B090FE92"/>
@@ -6784,7 +7581,7 @@
       </w:pPr>
     </w:lvl>
   </w:abstractNum>
-  <w:abstractNum w:abstractNumId="12" w15:restartNumberingAfterBreak="0">
+  <w:abstractNum w:abstractNumId="15" w15:restartNumberingAfterBreak="0">
     <w:nsid w:val="47EB4567"/>
     <w:multiLevelType w:val="multilevel"/>
     <w:tmpl w:val="D3E23786"/>
@@ -6899,7 +7696,7 @@
       </w:rPr>
     </w:lvl>
   </w:abstractNum>
-  <w:abstractNum w:abstractNumId="13" w15:restartNumberingAfterBreak="0">
+  <w:abstractNum w:abstractNumId="16" w15:restartNumberingAfterBreak="0">
     <w:nsid w:val="4F5E09BB"/>
     <w:multiLevelType w:val="multilevel"/>
     <w:tmpl w:val="0409001F"/>
@@ -6985,7 +7782,7 @@
       </w:pPr>
     </w:lvl>
   </w:abstractNum>
-  <w:abstractNum w:abstractNumId="14" w15:restartNumberingAfterBreak="0">
+  <w:abstractNum w:abstractNumId="17" w15:restartNumberingAfterBreak="0">
     <w:nsid w:val="52815615"/>
     <w:multiLevelType w:val="multilevel"/>
     <w:tmpl w:val="2F02DAB0"/>
@@ -7098,7 +7895,7 @@
       </w:rPr>
     </w:lvl>
   </w:abstractNum>
-  <w:abstractNum w:abstractNumId="15" w15:restartNumberingAfterBreak="0">
+  <w:abstractNum w:abstractNumId="18" w15:restartNumberingAfterBreak="0">
     <w:nsid w:val="56732FD1"/>
     <w:multiLevelType w:val="multilevel"/>
     <w:tmpl w:val="0BBA54D6"/>
@@ -7211,7 +8008,7 @@
       </w:rPr>
     </w:lvl>
   </w:abstractNum>
-  <w:abstractNum w:abstractNumId="16" w15:restartNumberingAfterBreak="0">
+  <w:abstractNum w:abstractNumId="19" w15:restartNumberingAfterBreak="0">
     <w:nsid w:val="56E602E4"/>
     <w:multiLevelType w:val="multilevel"/>
     <w:tmpl w:val="39421F86"/>
@@ -7326,15 +8123,15 @@
       </w:rPr>
     </w:lvl>
   </w:abstractNum>
-  <w:abstractNum w:abstractNumId="17" w15:restartNumberingAfterBreak="0">
+  <w:abstractNum w:abstractNumId="20" w15:restartNumberingAfterBreak="0">
     <w:nsid w:val="573C5BD3"/>
     <w:multiLevelType w:val="multilevel"/>
-    <w:tmpl w:val="5344C128"/>
+    <w:tmpl w:val="D96C9CE0"/>
     <w:lvl w:ilvl="0">
       <w:start w:val="1"/>
       <w:numFmt w:val="none"/>
       <w:pStyle w:val="Heading1"/>
-      <w:lvlText w:val="3.1"/>
+      <w:lvlText w:val="4.1"/>
       <w:lvlJc w:val="left"/>
       <w:pPr>
         <w:ind w:left="432" w:hanging="432"/>
@@ -7450,7 +8247,7 @@
       </w:rPr>
     </w:lvl>
   </w:abstractNum>
-  <w:abstractNum w:abstractNumId="18" w15:restartNumberingAfterBreak="0">
+  <w:abstractNum w:abstractNumId="21" w15:restartNumberingAfterBreak="0">
     <w:nsid w:val="576926E3"/>
     <w:multiLevelType w:val="hybridMultilevel"/>
     <w:tmpl w:val="B01CBC00"/>
@@ -7539,7 +8336,7 @@
       </w:pPr>
     </w:lvl>
   </w:abstractNum>
-  <w:abstractNum w:abstractNumId="19" w15:restartNumberingAfterBreak="0">
+  <w:abstractNum w:abstractNumId="22" w15:restartNumberingAfterBreak="0">
     <w:nsid w:val="59420E1F"/>
     <w:multiLevelType w:val="multilevel"/>
     <w:tmpl w:val="DB142C84"/>
@@ -7652,7 +8449,7 @@
       </w:rPr>
     </w:lvl>
   </w:abstractNum>
-  <w:abstractNum w:abstractNumId="20" w15:restartNumberingAfterBreak="0">
+  <w:abstractNum w:abstractNumId="23" w15:restartNumberingAfterBreak="0">
     <w:nsid w:val="658E3C4B"/>
     <w:multiLevelType w:val="hybridMultilevel"/>
     <w:tmpl w:val="0EFC35C4"/>
@@ -7738,7 +8535,7 @@
       </w:pPr>
     </w:lvl>
   </w:abstractNum>
-  <w:abstractNum w:abstractNumId="21" w15:restartNumberingAfterBreak="0">
+  <w:abstractNum w:abstractNumId="24" w15:restartNumberingAfterBreak="0">
     <w:nsid w:val="701F13D8"/>
     <w:multiLevelType w:val="multilevel"/>
     <w:tmpl w:val="00BEB4B8"/>
@@ -7851,7 +8648,7 @@
       </w:rPr>
     </w:lvl>
   </w:abstractNum>
-  <w:abstractNum w:abstractNumId="22" w15:restartNumberingAfterBreak="0">
+  <w:abstractNum w:abstractNumId="25" w15:restartNumberingAfterBreak="0">
     <w:nsid w:val="71C30F3E"/>
     <w:multiLevelType w:val="hybridMultilevel"/>
     <w:tmpl w:val="DBDAE274"/>
@@ -7940,7 +8737,7 @@
       </w:pPr>
     </w:lvl>
   </w:abstractNum>
-  <w:abstractNum w:abstractNumId="23" w15:restartNumberingAfterBreak="0">
+  <w:abstractNum w:abstractNumId="26" w15:restartNumberingAfterBreak="0">
     <w:nsid w:val="735A22CA"/>
     <w:multiLevelType w:val="multilevel"/>
     <w:tmpl w:val="C540E4A6"/>
@@ -8053,7 +8850,7 @@
       </w:rPr>
     </w:lvl>
   </w:abstractNum>
-  <w:abstractNum w:abstractNumId="24" w15:restartNumberingAfterBreak="0">
+  <w:abstractNum w:abstractNumId="27" w15:restartNumberingAfterBreak="0">
     <w:nsid w:val="793B2065"/>
     <w:multiLevelType w:val="multilevel"/>
     <w:tmpl w:val="78B2D79A"/>
@@ -8166,7 +8963,7 @@
       </w:rPr>
     </w:lvl>
   </w:abstractNum>
-  <w:abstractNum w:abstractNumId="25" w15:restartNumberingAfterBreak="0">
+  <w:abstractNum w:abstractNumId="28" w15:restartNumberingAfterBreak="0">
     <w:nsid w:val="7B332041"/>
     <w:multiLevelType w:val="hybridMultilevel"/>
     <w:tmpl w:val="DBDAE274"/>
@@ -8256,82 +9053,91 @@
     </w:lvl>
   </w:abstractNum>
   <w:num w:numId="1" w16cid:durableId="97025434">
+    <w:abstractNumId w:val="16"/>
+  </w:num>
+  <w:num w:numId="2" w16cid:durableId="491028291">
+    <w:abstractNumId w:val="26"/>
+  </w:num>
+  <w:num w:numId="3" w16cid:durableId="916284354">
+    <w:abstractNumId w:val="20"/>
+  </w:num>
+  <w:num w:numId="4" w16cid:durableId="459226019">
+    <w:abstractNumId w:val="7"/>
+  </w:num>
+  <w:num w:numId="5" w16cid:durableId="1551072031">
+    <w:abstractNumId w:val="12"/>
+  </w:num>
+  <w:num w:numId="6" w16cid:durableId="112869033">
+    <w:abstractNumId w:val="4"/>
+  </w:num>
+  <w:num w:numId="7" w16cid:durableId="512688732">
+    <w:abstractNumId w:val="3"/>
+  </w:num>
+  <w:num w:numId="8" w16cid:durableId="467817391">
+    <w:abstractNumId w:val="9"/>
+  </w:num>
+  <w:num w:numId="9" w16cid:durableId="285813201">
+    <w:abstractNumId w:val="28"/>
+  </w:num>
+  <w:num w:numId="10" w16cid:durableId="2006978129">
+    <w:abstractNumId w:val="22"/>
+  </w:num>
+  <w:num w:numId="11" w16cid:durableId="56782151">
+    <w:abstractNumId w:val="21"/>
+  </w:num>
+  <w:num w:numId="12" w16cid:durableId="1573151696">
+    <w:abstractNumId w:val="6"/>
+  </w:num>
+  <w:num w:numId="13" w16cid:durableId="1900171951">
+    <w:abstractNumId w:val="25"/>
+  </w:num>
+  <w:num w:numId="14" w16cid:durableId="646015506">
+    <w:abstractNumId w:val="1"/>
+  </w:num>
+  <w:num w:numId="15" w16cid:durableId="354886874">
+    <w:abstractNumId w:val="14"/>
+  </w:num>
+  <w:num w:numId="16" w16cid:durableId="1956062949">
+    <w:abstractNumId w:val="19"/>
+  </w:num>
+  <w:num w:numId="17" w16cid:durableId="1124739891">
+    <w:abstractNumId w:val="27"/>
+  </w:num>
+  <w:num w:numId="18" w16cid:durableId="1209492702">
+    <w:abstractNumId w:val="24"/>
+  </w:num>
+  <w:num w:numId="19" w16cid:durableId="1130199702">
+    <w:abstractNumId w:val="10"/>
+  </w:num>
+  <w:num w:numId="20" w16cid:durableId="1391996048">
+    <w:abstractNumId w:val="18"/>
+  </w:num>
+  <w:num w:numId="21" w16cid:durableId="2062363420">
+    <w:abstractNumId w:val="5"/>
+  </w:num>
+  <w:num w:numId="22" w16cid:durableId="1205017578">
+    <w:abstractNumId w:val="23"/>
+  </w:num>
+  <w:num w:numId="23" w16cid:durableId="1327905754">
+    <w:abstractNumId w:val="17"/>
+  </w:num>
+  <w:num w:numId="24" w16cid:durableId="1821997618">
+    <w:abstractNumId w:val="8"/>
+  </w:num>
+  <w:num w:numId="25" w16cid:durableId="1368411863">
+    <w:abstractNumId w:val="15"/>
+  </w:num>
+  <w:num w:numId="26" w16cid:durableId="1242325312">
     <w:abstractNumId w:val="13"/>
   </w:num>
-  <w:num w:numId="2" w16cid:durableId="491028291">
-    <w:abstractNumId w:val="23"/>
-  </w:num>
-  <w:num w:numId="3" w16cid:durableId="916284354">
-    <w:abstractNumId w:val="17"/>
-  </w:num>
-  <w:num w:numId="4" w16cid:durableId="459226019">
-    <w:abstractNumId w:val="5"/>
-  </w:num>
-  <w:num w:numId="5" w16cid:durableId="1551072031">
-    <w:abstractNumId w:val="9"/>
-  </w:num>
-  <w:num w:numId="6" w16cid:durableId="112869033">
+  <w:num w:numId="27" w16cid:durableId="1618441086">
     <w:abstractNumId w:val="2"/>
   </w:num>
-  <w:num w:numId="7" w16cid:durableId="512688732">
-    <w:abstractNumId w:val="1"/>
-  </w:num>
-  <w:num w:numId="8" w16cid:durableId="467817391">
-    <w:abstractNumId w:val="7"/>
-  </w:num>
-  <w:num w:numId="9" w16cid:durableId="285813201">
-    <w:abstractNumId w:val="25"/>
-  </w:num>
-  <w:num w:numId="10" w16cid:durableId="2006978129">
-    <w:abstractNumId w:val="19"/>
-  </w:num>
-  <w:num w:numId="11" w16cid:durableId="56782151">
-    <w:abstractNumId w:val="18"/>
-  </w:num>
-  <w:num w:numId="12" w16cid:durableId="1573151696">
-    <w:abstractNumId w:val="4"/>
-  </w:num>
-  <w:num w:numId="13" w16cid:durableId="1900171951">
-    <w:abstractNumId w:val="22"/>
-  </w:num>
-  <w:num w:numId="14" w16cid:durableId="646015506">
-    <w:abstractNumId w:val="0"/>
-  </w:num>
-  <w:num w:numId="15" w16cid:durableId="354886874">
+  <w:num w:numId="28" w16cid:durableId="446387640">
     <w:abstractNumId w:val="11"/>
   </w:num>
-  <w:num w:numId="16" w16cid:durableId="1956062949">
-    <w:abstractNumId w:val="16"/>
-  </w:num>
-  <w:num w:numId="17" w16cid:durableId="1124739891">
-    <w:abstractNumId w:val="24"/>
-  </w:num>
-  <w:num w:numId="18" w16cid:durableId="1209492702">
-    <w:abstractNumId w:val="21"/>
-  </w:num>
-  <w:num w:numId="19" w16cid:durableId="1130199702">
-    <w:abstractNumId w:val="8"/>
-  </w:num>
-  <w:num w:numId="20" w16cid:durableId="1391996048">
-    <w:abstractNumId w:val="15"/>
-  </w:num>
-  <w:num w:numId="21" w16cid:durableId="2062363420">
-    <w:abstractNumId w:val="3"/>
-  </w:num>
-  <w:num w:numId="22" w16cid:durableId="1205017578">
-    <w:abstractNumId w:val="20"/>
-  </w:num>
-  <w:num w:numId="23" w16cid:durableId="1327905754">
-    <w:abstractNumId w:val="14"/>
-  </w:num>
-  <w:num w:numId="24" w16cid:durableId="1821997618">
-    <w:abstractNumId w:val="6"/>
-  </w:num>
-  <w:num w:numId="25" w16cid:durableId="1368411863">
-    <w:abstractNumId w:val="12"/>
-  </w:num>
-  <w:num w:numId="26" w16cid:durableId="1242325312">
-    <w:abstractNumId w:val="10"/>
+  <w:num w:numId="29" w16cid:durableId="2039767916">
+    <w:abstractNumId w:val="0"/>
   </w:num>
 </w:numbering>
 </file>
@@ -8973,6 +9779,7 @@
   <w:style w:type="character" w:default="1" w:styleId="DefaultParagraphFont">
     <w:name w:val="Default Paragraph Font"/>
     <w:uiPriority w:val="1"/>
+    <w:semiHidden/>
     <w:unhideWhenUsed/>
   </w:style>
   <w:style w:type="table" w:default="1" w:styleId="TableNormal">
@@ -9727,7 +10534,7 @@
     <b:MonthAccessed>July</b:MonthAccessed>
     <b:DayAccessed>24</b:DayAccessed>
     <b:URL>https://www.geeksforgeeks.org/operating-systems/operating-systems/</b:URL>
-    <b:RefOrder>16</b:RefOrder>
+    <b:RefOrder>18</b:RefOrder>
   </b:Source>
   <b:Source>
     <b:Tag>Mic26</b:Tag>
@@ -9865,11 +10672,50 @@
     <b:URL>https://www.geeksforgeeks.org/computer-networks/types-of-network-topology/</b:URL>
     <b:RefOrder>15</b:RefOrder>
   </b:Source>
+  <b:Source>
+    <b:Tag>Phi26</b:Tag>
+    <b:SourceType>InternetSite</b:SourceType>
+    <b:Guid>{1436EC10-8E19-4C5A-ABE3-DE94457894FF}</b:Guid>
+    <b:Author>
+      <b:Author>
+        <b:NameList>
+          <b:Person>
+            <b:Last>Phill Powell</b:Last>
+            <b:First>Ian</b:First>
+            <b:Middle>Smalley</b:Middle>
+          </b:Person>
+        </b:NameList>
+      </b:Author>
+    </b:Author>
+    <b:Title>IBM</b:Title>
+    <b:YearAccessed>2026</b:YearAccessed>
+    <b:MonthAccessed>July</b:MonthAccessed>
+    <b:DayAccessed>23</b:DayAccessed>
+    <b:URL>https://www.ibm.com/think/topics/distributed-computing</b:URL>
+    <b:RefOrder>17</b:RefOrder>
+  </b:Source>
+  <b:Source>
+    <b:Tag>Gee256</b:Tag>
+    <b:SourceType>InternetSite</b:SourceType>
+    <b:Guid>{2C90079D-8444-4864-9AF9-50D2AA6DF84B}</b:Guid>
+    <b:Author>
+      <b:Author>
+        <b:Corporate>GeeksforGeeks</b:Corporate>
+      </b:Author>
+    </b:Author>
+    <b:Title>GeeksforGeeks</b:Title>
+    <b:Year>2025</b:Year>
+    <b:YearAccessed>2026</b:YearAccessed>
+    <b:MonthAccessed>July</b:MonthAccessed>
+    <b:DayAccessed>23</b:DayAccessed>
+    <b:URL>https://www.geeksforgeeks.org/devops/what-is-distributed-computing/</b:URL>
+    <b:RefOrder>16</b:RefOrder>
+  </b:Source>
 </b:Sources>
 </file>
 
 <file path=customXml/itemProps1.xml><?xml version="1.0" encoding="utf-8"?>
-<ds:datastoreItem xmlns:ds="http://schemas.openxmlformats.org/officeDocument/2006/customXml" ds:itemID="{449724B7-3E5F-4E09-8C17-4D2F37DCB6D3}">
+<ds:datastoreItem xmlns:ds="http://schemas.openxmlformats.org/officeDocument/2006/customXml" ds:itemID="{9D51B343-0568-461D-A472-8E16872F9D6D}">
   <ds:schemaRefs>
     <ds:schemaRef ds:uri="http://schemas.openxmlformats.org/officeDocument/2006/bibliography"/>
   </ds:schemaRefs>

</xml_diff>

<commit_message>
added content in CS assignment
</commit_message>
<xml_diff>
--- a/Level_4/Level_4(1st Semester)/Computer Systems/L4DC-L4DCBM- Computer Systems- Blessings Tamanga(P00221220).docx
+++ b/Level_4/Level_4(1st Semester)/Computer Systems/L4DC-L4DCBM- Computer Systems- Blessings Tamanga(P00221220).docx
@@ -1315,14 +1315,38 @@
         <w:rPr>
           <w:rFonts w:ascii="Arial" w:hAnsi="Arial" w:cs="Arial"/>
         </w:rPr>
-        <w:t>Solid State</w:t>
+        <w:t xml:space="preserve">Solid </w:t>
+      </w:r>
+      <w:r>
+        <w:rPr>
+          <w:rFonts w:ascii="Arial" w:hAnsi="Arial" w:cs="Arial"/>
+        </w:rPr>
+        <w:t>S</w:t>
+      </w:r>
+      <w:r>
+        <w:rPr>
+          <w:rFonts w:ascii="Arial" w:hAnsi="Arial" w:cs="Arial"/>
+        </w:rPr>
+        <w:t>t</w:t>
+      </w:r>
+      <w:r>
+        <w:rPr>
+          <w:rFonts w:ascii="Arial" w:hAnsi="Arial" w:cs="Arial"/>
+        </w:rPr>
+        <w:t>ate</w:t>
       </w:r>
       <w:proofErr w:type="gramEnd"/>
       <w:r>
         <w:rPr>
           <w:rFonts w:ascii="Arial" w:hAnsi="Arial" w:cs="Arial"/>
         </w:rPr>
-        <w:t xml:space="preserve"> D</w:t>
+        <w:t xml:space="preserve"> </w:t>
+      </w:r>
+      <w:r>
+        <w:rPr>
+          <w:rFonts w:ascii="Arial" w:hAnsi="Arial" w:cs="Arial"/>
+        </w:rPr>
+        <w:t>D</w:t>
       </w:r>
       <w:r>
         <w:rPr>
@@ -1348,33 +1372,29 @@
         </w:rPr>
         <w:t xml:space="preserve">, </w:t>
       </w:r>
-      <w:proofErr w:type="gramStart"/>
-      <w:r>
-        <w:rPr>
-          <w:rFonts w:ascii="Arial" w:hAnsi="Arial" w:cs="Arial"/>
-        </w:rPr>
-        <w:t>Unlike</w:t>
-      </w:r>
-      <w:proofErr w:type="gramEnd"/>
-      <w:r>
-        <w:rPr>
-          <w:rFonts w:ascii="Arial" w:hAnsi="Arial" w:cs="Arial"/>
-        </w:rPr>
-        <w:t xml:space="preserve"> traditional Hard Disk </w:t>
-      </w:r>
-      <w:proofErr w:type="gramStart"/>
-      <w:r>
-        <w:rPr>
-          <w:rFonts w:ascii="Arial" w:hAnsi="Arial" w:cs="Arial"/>
-        </w:rPr>
-        <w:t>Drives(</w:t>
-      </w:r>
-      <w:proofErr w:type="gramEnd"/>
-      <w:r>
-        <w:rPr>
-          <w:rFonts w:ascii="Arial" w:hAnsi="Arial" w:cs="Arial"/>
-        </w:rPr>
-        <w:t xml:space="preserve">HDD) which has moving parts which needs to start first before allowing the retrieval or writing of data. </w:t>
+      <w:r>
+        <w:rPr>
+          <w:rFonts w:ascii="Arial" w:hAnsi="Arial" w:cs="Arial"/>
+        </w:rPr>
+        <w:t>u</w:t>
+      </w:r>
+      <w:r>
+        <w:rPr>
+          <w:rFonts w:ascii="Arial" w:hAnsi="Arial" w:cs="Arial"/>
+        </w:rPr>
+        <w:t>nlike traditional Hard Disk Drives</w:t>
+      </w:r>
+      <w:r>
+        <w:rPr>
+          <w:rFonts w:ascii="Arial" w:hAnsi="Arial" w:cs="Arial"/>
+        </w:rPr>
+        <w:t xml:space="preserve"> </w:t>
+      </w:r>
+      <w:r>
+        <w:rPr>
+          <w:rFonts w:ascii="Arial" w:hAnsi="Arial" w:cs="Arial"/>
+        </w:rPr>
+        <w:t xml:space="preserve">(HDD) which has moving parts which needs to start first before allowing the retrieval or writing of data. </w:t>
       </w:r>
       <w:r>
         <w:rPr>
@@ -1902,7 +1922,7 @@
           <w:ilvl w:val="0"/>
           <w:numId w:val="7"/>
         </w:numPr>
-        <w:ind w:left="1800"/>
+        <w:ind w:left="1080"/>
         <w:rPr>
           <w:rFonts w:ascii="Arial" w:hAnsi="Arial" w:cs="Arial"/>
           <w:bCs/>
@@ -1923,7 +1943,7 @@
     </w:p>
     <w:p>
       <w:pPr>
-        <w:ind w:left="589"/>
+        <w:ind w:left="-131"/>
         <w:rPr>
           <w:rFonts w:ascii="Arial" w:hAnsi="Arial" w:cs="Arial"/>
           <w:bCs/>
@@ -2058,7 +2078,7 @@
           <w:ilvl w:val="0"/>
           <w:numId w:val="7"/>
         </w:numPr>
-        <w:ind w:left="1800"/>
+        <w:ind w:left="1080"/>
         <w:rPr>
           <w:rFonts w:ascii="Arial" w:hAnsi="Arial" w:cs="Arial"/>
           <w:bCs/>
@@ -2078,7 +2098,7 @@
     </w:p>
     <w:p>
       <w:pPr>
-        <w:ind w:left="589"/>
+        <w:ind w:left="-131"/>
         <w:rPr>
           <w:rFonts w:ascii="Arial" w:hAnsi="Arial" w:cs="Arial"/>
         </w:rPr>
@@ -2281,27 +2301,27 @@
       <w:pPr>
         <w:rPr>
           <w:rFonts w:ascii="Arial" w:hAnsi="Arial" w:cs="Arial"/>
-        </w:rPr>
-      </w:pPr>
-      <w:r>
-        <w:rPr>
-          <w:rFonts w:ascii="Arial" w:hAnsi="Arial" w:cs="Arial"/>
-        </w:rPr>
-        <w:t xml:space="preserve">Modern computer systems need operating </w:t>
-      </w:r>
-      <w:proofErr w:type="gramStart"/>
-      <w:r>
-        <w:rPr>
-          <w:rFonts w:ascii="Arial" w:hAnsi="Arial" w:cs="Arial"/>
-        </w:rPr>
-        <w:t>system(</w:t>
-      </w:r>
-      <w:proofErr w:type="gramEnd"/>
-      <w:r>
-        <w:rPr>
-          <w:rFonts w:ascii="Arial" w:hAnsi="Arial" w:cs="Arial"/>
-        </w:rPr>
-        <w:t>OS).</w:t>
+          <w:sz w:val="28"/>
+          <w:szCs w:val="28"/>
+        </w:rPr>
+      </w:pPr>
+      <w:r>
+        <w:rPr>
+          <w:rFonts w:ascii="Arial" w:hAnsi="Arial" w:cs="Arial"/>
+        </w:rPr>
+        <w:t>Modern computer systems need operating system</w:t>
+      </w:r>
+      <w:r>
+        <w:rPr>
+          <w:rFonts w:ascii="Arial" w:hAnsi="Arial" w:cs="Arial"/>
+        </w:rPr>
+        <w:t xml:space="preserve"> </w:t>
+      </w:r>
+      <w:r>
+        <w:rPr>
+          <w:rFonts w:ascii="Arial" w:hAnsi="Arial" w:cs="Arial"/>
+        </w:rPr>
+        <w:t>(OS).</w:t>
       </w:r>
       <w:sdt>
         <w:sdtPr>
@@ -2351,7 +2371,19 @@
         <w:rPr>
           <w:rFonts w:ascii="Arial" w:hAnsi="Arial" w:cs="Arial"/>
         </w:rPr>
-        <w:t xml:space="preserve"> defined </w:t>
+        <w:t xml:space="preserve"> define</w:t>
+      </w:r>
+      <w:r>
+        <w:rPr>
+          <w:rFonts w:ascii="Arial" w:hAnsi="Arial" w:cs="Arial"/>
+        </w:rPr>
+        <w:t xml:space="preserve">s </w:t>
+      </w:r>
+      <w:r>
+        <w:rPr>
+          <w:rFonts w:ascii="Arial" w:hAnsi="Arial" w:cs="Arial"/>
+        </w:rPr>
+        <w:t xml:space="preserve">an </w:t>
       </w:r>
       <w:r>
         <w:rPr>
@@ -2381,7 +2413,31 @@
         <w:rPr>
           <w:rFonts w:ascii="Arial" w:hAnsi="Arial" w:cs="Arial"/>
         </w:rPr>
-        <w:t xml:space="preserve"> and hardware allowing the user to seemingly interacts with the computer system. </w:t>
+        <w:t xml:space="preserve"> and hardware allowing the user to se</w:t>
+      </w:r>
+      <w:r>
+        <w:rPr>
+          <w:rFonts w:ascii="Arial" w:hAnsi="Arial" w:cs="Arial"/>
+        </w:rPr>
+        <w:t>a</w:t>
+      </w:r>
+      <w:r>
+        <w:rPr>
+          <w:rFonts w:ascii="Arial" w:hAnsi="Arial" w:cs="Arial"/>
+        </w:rPr>
+        <w:t>m</w:t>
+      </w:r>
+      <w:r>
+        <w:rPr>
+          <w:rFonts w:ascii="Arial" w:hAnsi="Arial" w:cs="Arial"/>
+        </w:rPr>
+        <w:t>less</w:t>
+      </w:r>
+      <w:r>
+        <w:rPr>
+          <w:rFonts w:ascii="Arial" w:hAnsi="Arial" w:cs="Arial"/>
+        </w:rPr>
+        <w:t xml:space="preserve">ly interact with the computer system. </w:t>
       </w:r>
       <w:r>
         <w:rPr>
@@ -2457,202 +2513,638 @@
         <w:rPr>
           <w:rFonts w:ascii="Arial" w:hAnsi="Arial" w:cs="Arial"/>
         </w:rPr>
-        <w:t xml:space="preserve"> to operate well, the operating is needed for the following functionalities.</w:t>
-      </w:r>
+        <w:t xml:space="preserve"> to operate well</w:t>
+      </w:r>
+      <w:r>
+        <w:rPr>
+          <w:rFonts w:ascii="Arial" w:hAnsi="Arial" w:cs="Arial"/>
+        </w:rPr>
+        <w:t xml:space="preserve"> in the start-up environment</w:t>
+      </w:r>
+      <w:r>
+        <w:rPr>
+          <w:rFonts w:ascii="Arial" w:hAnsi="Arial" w:cs="Arial"/>
+        </w:rPr>
+        <w:t xml:space="preserve">, the </w:t>
+      </w:r>
+      <w:r>
+        <w:rPr>
+          <w:rFonts w:ascii="Arial" w:hAnsi="Arial" w:cs="Arial"/>
+        </w:rPr>
+        <w:t xml:space="preserve">OS provides </w:t>
+      </w:r>
+      <w:r>
+        <w:rPr>
+          <w:rFonts w:ascii="Arial" w:hAnsi="Arial" w:cs="Arial"/>
+        </w:rPr>
+        <w:t>the following</w:t>
+      </w:r>
+      <w:r>
+        <w:rPr>
+          <w:rFonts w:ascii="Arial" w:hAnsi="Arial" w:cs="Arial"/>
+        </w:rPr>
+        <w:t xml:space="preserve"> main</w:t>
+      </w:r>
+      <w:r>
+        <w:rPr>
+          <w:rFonts w:ascii="Arial" w:hAnsi="Arial" w:cs="Arial"/>
+        </w:rPr>
+        <w:t xml:space="preserve"> functionalities.</w:t>
+      </w:r>
+    </w:p>
+    <w:p>
+      <w:pPr>
+        <w:rPr>
+          <w:rFonts w:ascii="Arial" w:hAnsi="Arial" w:cs="Arial"/>
+          <w:sz w:val="28"/>
+          <w:szCs w:val="28"/>
+        </w:rPr>
+      </w:pPr>
     </w:p>
     <w:p>
       <w:pPr>
         <w:pStyle w:val="ListParagraph"/>
         <w:numPr>
           <w:ilvl w:val="0"/>
-          <w:numId w:val="9"/>
+          <w:numId w:val="33"/>
         </w:numPr>
+        <w:ind w:left="1440"/>
+        <w:rPr>
+          <w:rFonts w:ascii="Arial" w:hAnsi="Arial" w:cs="Arial"/>
+        </w:rPr>
+      </w:pPr>
+      <w:r>
         <w:rPr>
           <w:rFonts w:ascii="Arial" w:hAnsi="Arial" w:cs="Arial"/>
           <w:sz w:val="28"/>
           <w:szCs w:val="28"/>
         </w:rPr>
-      </w:pPr>
+        <w:t>Device</w:t>
+      </w:r>
       <w:r>
         <w:rPr>
           <w:rFonts w:ascii="Arial" w:hAnsi="Arial" w:cs="Arial"/>
           <w:sz w:val="28"/>
           <w:szCs w:val="28"/>
         </w:rPr>
-        <w:t>Process Management</w:t>
-      </w:r>
-    </w:p>
-    <w:p>
-      <w:pPr>
-        <w:rPr>
-          <w:rFonts w:ascii="Arial" w:hAnsi="Arial" w:cs="Arial"/>
-        </w:rPr>
-      </w:pPr>
-      <w:r>
-        <w:rPr>
-          <w:rFonts w:ascii="Arial" w:hAnsi="Arial" w:cs="Arial"/>
-        </w:rPr>
-        <w:t xml:space="preserve">A process refers to a running program. Process management in operating system is about management of programs. Processes management has its </w:t>
-      </w:r>
-      <w:proofErr w:type="spellStart"/>
-      <w:r>
-        <w:rPr>
-          <w:rFonts w:ascii="Arial" w:hAnsi="Arial" w:cs="Arial"/>
-        </w:rPr>
-        <w:t>on</w:t>
-      </w:r>
-      <w:proofErr w:type="spellEnd"/>
-      <w:r>
-        <w:rPr>
-          <w:rFonts w:ascii="Arial" w:hAnsi="Arial" w:cs="Arial"/>
-        </w:rPr>
-        <w:t xml:space="preserve"> circle that varies from Starting the process, Ready state, wait state, running and Terminated states. The OS </w:t>
-      </w:r>
-      <w:r>
-        <w:rPr>
-          <w:rFonts w:ascii="Arial" w:hAnsi="Arial" w:cs="Arial"/>
-        </w:rPr>
-        <w:t>archives</w:t>
-      </w:r>
-      <w:r>
-        <w:rPr>
-          <w:rFonts w:ascii="Arial" w:hAnsi="Arial" w:cs="Arial"/>
-        </w:rPr>
-        <w:t xml:space="preserve"> processes management by process scheduling, synchronization, deadlock handling and </w:t>
-      </w:r>
-      <w:r>
-        <w:rPr>
-          <w:rFonts w:ascii="Arial" w:hAnsi="Arial" w:cs="Arial"/>
-        </w:rPr>
-        <w:t>interposes</w:t>
-      </w:r>
-      <w:r>
-        <w:rPr>
-          <w:rFonts w:ascii="Arial" w:hAnsi="Arial" w:cs="Arial"/>
-        </w:rPr>
-        <w:t xml:space="preserve"> communication. Scheduling is a process in which the operating system figures out who gets the resources first. Scheduling processes uses algorithms like First Come First Save</w:t>
-      </w:r>
-      <w:r>
-        <w:rPr>
-          <w:rFonts w:ascii="Arial" w:hAnsi="Arial" w:cs="Arial"/>
+        <w:t xml:space="preserve"> Management(I/O Sys</w:t>
+      </w:r>
+      <w:r>
+        <w:rPr>
+          <w:rFonts w:ascii="Arial" w:hAnsi="Arial" w:cs="Arial"/>
+          <w:sz w:val="28"/>
+          <w:szCs w:val="28"/>
+        </w:rPr>
+        <w:t>t</w:t>
+      </w:r>
+      <w:r>
+        <w:rPr>
+          <w:rFonts w:ascii="Arial" w:hAnsi="Arial" w:cs="Arial"/>
+          <w:sz w:val="28"/>
+          <w:szCs w:val="28"/>
+        </w:rPr>
+        <w:t>em)</w:t>
+      </w:r>
+      <w:r>
+        <w:rPr>
+          <w:rFonts w:ascii="Arial" w:hAnsi="Arial" w:cs="Arial"/>
+          <w:sz w:val="28"/>
+          <w:szCs w:val="28"/>
         </w:rPr>
         <w:t xml:space="preserve"> </w:t>
       </w:r>
       <w:r>
         <w:rPr>
           <w:rFonts w:ascii="Arial" w:hAnsi="Arial" w:cs="Arial"/>
-        </w:rPr>
-        <w:t>(FCFS), Short Job Firs</w:t>
-      </w:r>
-      <w:r>
-        <w:rPr>
-          <w:rFonts w:ascii="Arial" w:hAnsi="Arial" w:cs="Arial"/>
-        </w:rPr>
-        <w:t xml:space="preserve">t </w:t>
-      </w:r>
-      <w:r>
-        <w:rPr>
-          <w:rFonts w:ascii="Arial" w:hAnsi="Arial" w:cs="Arial"/>
-        </w:rPr>
-        <w:t>(SJF) or Round-</w:t>
-      </w:r>
-      <w:proofErr w:type="gramStart"/>
-      <w:r>
-        <w:rPr>
-          <w:rFonts w:ascii="Arial" w:hAnsi="Arial" w:cs="Arial"/>
-        </w:rPr>
-        <w:t>Robin(</w:t>
-      </w:r>
-      <w:proofErr w:type="gramEnd"/>
-      <w:r>
-        <w:rPr>
-          <w:rFonts w:ascii="Arial" w:hAnsi="Arial" w:cs="Arial"/>
-        </w:rPr>
-        <w:t>RR).</w:t>
-      </w:r>
+          <w:sz w:val="28"/>
+          <w:szCs w:val="28"/>
+        </w:rPr>
+        <w:t xml:space="preserve">                                                                                                                                                                                                                                                                                                                                                                                                                                                                                                                                                                             </w:t>
+      </w:r>
+      <w:r>
+        <w:rPr>
+          <w:rFonts w:ascii="Arial" w:hAnsi="Arial" w:cs="Arial"/>
+        </w:rPr>
+        <w:t>Computers have peripherals such as k</w:t>
+      </w:r>
+      <w:r>
+        <w:rPr>
+          <w:rFonts w:ascii="Arial" w:hAnsi="Arial" w:cs="Arial"/>
+        </w:rPr>
+        <w:t>e</w:t>
+      </w:r>
+      <w:r>
+        <w:rPr>
+          <w:rFonts w:ascii="Arial" w:hAnsi="Arial" w:cs="Arial"/>
+        </w:rPr>
+        <w:t>yboard, m</w:t>
+      </w:r>
+      <w:r>
+        <w:rPr>
+          <w:rFonts w:ascii="Arial" w:hAnsi="Arial" w:cs="Arial"/>
+        </w:rPr>
+        <w:t>ice</w:t>
+      </w:r>
+      <w:r>
+        <w:rPr>
+          <w:rFonts w:ascii="Arial" w:hAnsi="Arial" w:cs="Arial"/>
+        </w:rPr>
+        <w:t>, printers</w:t>
+      </w:r>
+      <w:r>
+        <w:rPr>
+          <w:rFonts w:ascii="Arial" w:hAnsi="Arial" w:cs="Arial"/>
+        </w:rPr>
+        <w:t xml:space="preserve"> and </w:t>
+      </w:r>
+      <w:r>
+        <w:rPr>
+          <w:rFonts w:ascii="Arial" w:hAnsi="Arial" w:cs="Arial"/>
+        </w:rPr>
+        <w:t>scanners</w:t>
+      </w:r>
+      <w:r>
+        <w:rPr>
+          <w:rFonts w:ascii="Arial" w:hAnsi="Arial" w:cs="Arial"/>
+        </w:rPr>
+        <w:t xml:space="preserve"> which allows users to insert input or get output from the computer systems. Operating system is responsible for managing these devices. It archives this using Device drivers</w:t>
+      </w:r>
+      <w:r>
+        <w:rPr>
+          <w:rFonts w:ascii="Arial" w:hAnsi="Arial" w:cs="Arial"/>
+        </w:rPr>
+        <w:t xml:space="preserve"> </w:t>
+      </w:r>
+      <w:r>
+        <w:rPr>
+          <w:rFonts w:ascii="Arial" w:hAnsi="Arial" w:cs="Arial"/>
+        </w:rPr>
+        <w:t>(an interpreter between the hardware and the system), buffering an</w:t>
+      </w:r>
+      <w:r>
+        <w:rPr>
+          <w:rFonts w:ascii="Arial" w:hAnsi="Arial" w:cs="Arial"/>
+        </w:rPr>
+        <w:t>d</w:t>
+      </w:r>
+      <w:r>
+        <w:rPr>
+          <w:rFonts w:ascii="Arial" w:hAnsi="Arial" w:cs="Arial"/>
+        </w:rPr>
+        <w:t xml:space="preserve"> caching.</w:t>
+      </w:r>
+      <w:r>
+        <w:rPr>
+          <w:rFonts w:ascii="Arial" w:hAnsi="Arial" w:cs="Arial"/>
+        </w:rPr>
+        <w:t xml:space="preserve"> In start-up environment where multiple employees might need to share a single network printer or external storage, device management ensures that these peripherals are allocated efficiently without conflicts, thereby enhancing workplace productivity.</w:t>
+      </w:r>
+    </w:p>
+    <w:p>
+      <w:pPr>
+        <w:pStyle w:val="ListParagraph"/>
+        <w:ind w:left="1440"/>
+        <w:rPr>
+          <w:rFonts w:ascii="Arial" w:hAnsi="Arial" w:cs="Arial"/>
+        </w:rPr>
+      </w:pPr>
     </w:p>
     <w:p>
       <w:pPr>
         <w:pStyle w:val="ListParagraph"/>
         <w:numPr>
           <w:ilvl w:val="0"/>
-          <w:numId w:val="9"/>
+          <w:numId w:val="33"/>
         </w:numPr>
-        <w:rPr>
-          <w:rFonts w:ascii="Arial" w:hAnsi="Arial" w:cs="Arial"/>
-          <w:sz w:val="28"/>
-          <w:szCs w:val="28"/>
-        </w:rPr>
-      </w:pPr>
-      <w:r>
-        <w:rPr>
-          <w:rFonts w:ascii="Arial" w:hAnsi="Arial" w:cs="Arial"/>
-          <w:sz w:val="28"/>
-          <w:szCs w:val="28"/>
-        </w:rPr>
-        <w:t>Memory Management</w:t>
-      </w:r>
-    </w:p>
-    <w:p>
-      <w:pPr>
-        <w:rPr>
-          <w:rFonts w:ascii="Arial" w:hAnsi="Arial" w:cs="Arial"/>
-        </w:rPr>
-      </w:pPr>
-      <w:r>
-        <w:rPr>
-          <w:rFonts w:ascii="Arial" w:hAnsi="Arial" w:cs="Arial"/>
-        </w:rPr>
-        <w:t xml:space="preserve">Memory of programs either running programs or programs which are not running are stored in either primary memory or secondary memory. Operating system controls how data is stored between the two. Some of the key activities OS uses to manage the </w:t>
-      </w:r>
+        <w:ind w:left="1440"/>
+        <w:rPr>
+          <w:rFonts w:ascii="Arial" w:hAnsi="Arial" w:cs="Arial"/>
+        </w:rPr>
+      </w:pPr>
+      <w:r>
+        <w:rPr>
+          <w:rFonts w:ascii="Arial" w:hAnsi="Arial" w:cs="Arial"/>
+        </w:rPr>
+        <w:t>User Interface</w:t>
+      </w:r>
+    </w:p>
+    <w:p>
+      <w:pPr>
+        <w:pStyle w:val="ListParagraph"/>
+        <w:ind w:left="1440"/>
+        <w:rPr>
+          <w:rFonts w:ascii="Arial" w:hAnsi="Arial" w:cs="Arial"/>
+        </w:rPr>
+      </w:pPr>
       <w:r>
         <w:rPr>
           <w:rFonts w:ascii="Arial" w:hAnsi="Arial" w:cs="Arial"/>
         </w:rPr>
         <w:lastRenderedPageBreak/>
-        <w:t xml:space="preserve">memory includes Allocation and deallocation, virtual </w:t>
+        <w:t xml:space="preserve">The OS provides Graphical User Interface (GUI) which allows users to interact with the computer system using visual elements like windows, icons and menus. For technology start-ups in </w:t>
       </w:r>
       <w:proofErr w:type="spellStart"/>
       <w:r>
         <w:rPr>
           <w:rFonts w:ascii="Arial" w:hAnsi="Arial" w:cs="Arial"/>
         </w:rPr>
-        <w:t>meory</w:t>
+        <w:t>Techville</w:t>
       </w:r>
       <w:proofErr w:type="spellEnd"/>
       <w:r>
         <w:rPr>
           <w:rFonts w:ascii="Arial" w:hAnsi="Arial" w:cs="Arial"/>
         </w:rPr>
-        <w:t xml:space="preserve">, disc management and fragmentation handling. </w:t>
-      </w:r>
+        <w:t xml:space="preserve">, employees may come from various backgrounds and might not be technically trained. A user-friendly GUI allows them to operate the </w:t>
+      </w:r>
+      <w:proofErr w:type="spellStart"/>
+      <w:r>
+        <w:rPr>
+          <w:rFonts w:ascii="Arial" w:hAnsi="Arial" w:cs="Arial"/>
+        </w:rPr>
+        <w:t>QuntumX</w:t>
+      </w:r>
+      <w:proofErr w:type="spellEnd"/>
+      <w:r>
+        <w:rPr>
+          <w:rFonts w:ascii="Arial" w:hAnsi="Arial" w:cs="Arial"/>
+        </w:rPr>
+        <w:t xml:space="preserve"> easily without any advance training, reducing time taken for people to adopt the usage of the computer and allow start-ups to focus on their core business operations.</w:t>
+      </w:r>
+    </w:p>
+    <w:p>
+      <w:pPr>
+        <w:pStyle w:val="ListParagraph"/>
+        <w:ind w:left="1440"/>
+        <w:rPr>
+          <w:rFonts w:ascii="Arial" w:hAnsi="Arial" w:cs="Arial"/>
+        </w:rPr>
+      </w:pPr>
     </w:p>
     <w:p>
       <w:pPr>
         <w:pStyle w:val="ListParagraph"/>
         <w:numPr>
           <w:ilvl w:val="0"/>
-          <w:numId w:val="13"/>
+          <w:numId w:val="33"/>
         </w:numPr>
-        <w:rPr>
-          <w:rFonts w:ascii="Arial" w:hAnsi="Arial" w:cs="Arial"/>
-        </w:rPr>
-      </w:pPr>
-      <w:r>
+        <w:ind w:left="1440"/>
+        <w:rPr>
+          <w:rFonts w:ascii="Arial" w:hAnsi="Arial" w:cs="Arial"/>
+        </w:rPr>
+      </w:pPr>
+      <w:r>
+        <w:rPr>
+          <w:rFonts w:ascii="Arial" w:hAnsi="Arial" w:cs="Arial"/>
+        </w:rPr>
+        <w:t>Networking</w:t>
+      </w:r>
+    </w:p>
+    <w:p>
+      <w:pPr>
+        <w:pStyle w:val="ListParagraph"/>
+        <w:ind w:left="1440"/>
+        <w:rPr>
+          <w:rFonts w:ascii="Arial" w:hAnsi="Arial" w:cs="Arial"/>
+        </w:rPr>
+      </w:pPr>
+      <w:r>
+        <w:rPr>
+          <w:rFonts w:ascii="Arial" w:hAnsi="Arial" w:cs="Arial"/>
+        </w:rPr>
+        <w:t xml:space="preserve">The OS includes built-in protocols and services that allow </w:t>
+      </w:r>
+      <w:proofErr w:type="spellStart"/>
+      <w:r>
+        <w:rPr>
+          <w:rFonts w:ascii="Arial" w:hAnsi="Arial" w:cs="Arial"/>
+        </w:rPr>
+        <w:t>QuantumX</w:t>
+      </w:r>
+      <w:proofErr w:type="spellEnd"/>
+      <w:r>
+        <w:rPr>
+          <w:rFonts w:ascii="Arial" w:hAnsi="Arial" w:cs="Arial"/>
+        </w:rPr>
+        <w:t xml:space="preserve"> to connect to local and wide area networks seamlessly. In areas like </w:t>
+      </w:r>
+      <w:proofErr w:type="spellStart"/>
+      <w:r>
+        <w:rPr>
+          <w:rFonts w:ascii="Arial" w:hAnsi="Arial" w:cs="Arial"/>
+        </w:rPr>
+        <w:t>Techville</w:t>
+      </w:r>
+      <w:proofErr w:type="spellEnd"/>
+      <w:r>
+        <w:rPr>
+          <w:rFonts w:ascii="Arial" w:hAnsi="Arial" w:cs="Arial"/>
+        </w:rPr>
+        <w:t xml:space="preserve">, start-ups rely </w:t>
+      </w:r>
+      <w:proofErr w:type="spellStart"/>
+      <w:r>
+        <w:rPr>
+          <w:rFonts w:ascii="Arial" w:hAnsi="Arial" w:cs="Arial"/>
+        </w:rPr>
+        <w:t>heavilt</w:t>
+      </w:r>
+      <w:proofErr w:type="spellEnd"/>
+      <w:r>
+        <w:rPr>
+          <w:rFonts w:ascii="Arial" w:hAnsi="Arial" w:cs="Arial"/>
+        </w:rPr>
+        <w:t xml:space="preserve"> on internet access and sharing files across local servers. Th</w:t>
+      </w:r>
+      <w:r>
+        <w:rPr>
+          <w:rFonts w:ascii="Arial" w:hAnsi="Arial" w:cs="Arial"/>
+        </w:rPr>
+        <w:t xml:space="preserve">e networking functionality of the OS ensures that </w:t>
+      </w:r>
+      <w:proofErr w:type="spellStart"/>
+      <w:r>
+        <w:rPr>
+          <w:rFonts w:ascii="Arial" w:hAnsi="Arial" w:cs="Arial"/>
+        </w:rPr>
+        <w:t>QuantumX</w:t>
+      </w:r>
+      <w:proofErr w:type="spellEnd"/>
+      <w:r>
+        <w:rPr>
+          <w:rFonts w:ascii="Arial" w:hAnsi="Arial" w:cs="Arial"/>
+        </w:rPr>
+        <w:t xml:space="preserve"> can communicate with other devices effectively, enabling remote collaboration and seamless data sharing among start-up teams.</w:t>
+      </w:r>
+    </w:p>
+    <w:p>
+      <w:pPr>
+        <w:rPr>
+          <w:rFonts w:ascii="Arial" w:hAnsi="Arial" w:cs="Arial"/>
+        </w:rPr>
+      </w:pPr>
+    </w:p>
+    <w:p>
+      <w:pPr>
+        <w:rPr>
+          <w:rFonts w:ascii="Arial" w:hAnsi="Arial" w:cs="Arial"/>
+        </w:rPr>
+      </w:pPr>
+      <w:r>
+        <w:rPr>
+          <w:rFonts w:ascii="Arial" w:hAnsi="Arial" w:cs="Arial"/>
+        </w:rPr>
+        <w:t xml:space="preserve">Furthermore, the operating system works together with the computer hardware in four specific ways to ensure the </w:t>
+      </w:r>
+      <w:proofErr w:type="spellStart"/>
+      <w:r>
+        <w:rPr>
+          <w:rFonts w:ascii="Arial" w:hAnsi="Arial" w:cs="Arial"/>
+        </w:rPr>
+        <w:t>QuantumX</w:t>
+      </w:r>
+      <w:proofErr w:type="spellEnd"/>
+      <w:r>
+        <w:rPr>
+          <w:rFonts w:ascii="Arial" w:hAnsi="Arial" w:cs="Arial"/>
+        </w:rPr>
+        <w:t xml:space="preserve"> operates as a high-</w:t>
+      </w:r>
+      <w:proofErr w:type="spellStart"/>
+      <w:r>
+        <w:rPr>
+          <w:rFonts w:ascii="Arial" w:hAnsi="Arial" w:cs="Arial"/>
+        </w:rPr>
+        <w:t>perfomance</w:t>
+      </w:r>
+      <w:proofErr w:type="spellEnd"/>
+      <w:r>
+        <w:rPr>
+          <w:rFonts w:ascii="Arial" w:hAnsi="Arial" w:cs="Arial"/>
+        </w:rPr>
+        <w:t xml:space="preserve"> machine:</w:t>
+      </w:r>
+    </w:p>
+    <w:p>
+      <w:pPr>
+        <w:pStyle w:val="ListParagraph"/>
+        <w:numPr>
+          <w:ilvl w:val="0"/>
+          <w:numId w:val="34"/>
+        </w:numPr>
+        <w:rPr>
+          <w:rFonts w:ascii="Arial" w:hAnsi="Arial" w:cs="Arial"/>
+        </w:rPr>
+      </w:pPr>
+      <w:r>
+        <w:rPr>
+          <w:rFonts w:ascii="Arial" w:hAnsi="Arial" w:cs="Arial"/>
+        </w:rPr>
+        <w:t>Resource Allocation</w:t>
+      </w:r>
+    </w:p>
+    <w:p>
+      <w:pPr>
+        <w:rPr>
+          <w:rFonts w:ascii="Arial" w:hAnsi="Arial" w:cs="Arial"/>
+        </w:rPr>
+      </w:pPr>
+      <w:r>
+        <w:rPr>
+          <w:rFonts w:ascii="Arial" w:hAnsi="Arial" w:cs="Arial"/>
+        </w:rPr>
+        <w:t>The OS acts as a manager. It distributes CPU time and RAM among application running at the same time. By using scheduling algorithms such as First-Come-First-Save (FCFS), Short-Job-First and Roun-Robin it ensures that high priority startup applications such as machine learning or large databases get necessary processing power without starving other background processes, thereby preventing system crashes.</w:t>
+      </w:r>
+    </w:p>
+    <w:p>
+      <w:pPr>
+        <w:rPr>
+          <w:rFonts w:ascii="Arial" w:hAnsi="Arial" w:cs="Arial"/>
+        </w:rPr>
+      </w:pPr>
+    </w:p>
+    <w:p>
+      <w:pPr>
+        <w:pStyle w:val="ListParagraph"/>
+        <w:numPr>
+          <w:ilvl w:val="0"/>
+          <w:numId w:val="34"/>
+        </w:numPr>
+        <w:rPr>
+          <w:rFonts w:ascii="Arial" w:hAnsi="Arial" w:cs="Arial"/>
+        </w:rPr>
+      </w:pPr>
+      <w:r>
+        <w:rPr>
+          <w:rFonts w:ascii="Arial" w:hAnsi="Arial" w:cs="Arial"/>
+        </w:rPr>
+        <w:t>Error Handling</w:t>
+      </w:r>
+    </w:p>
+    <w:p>
+      <w:pPr>
+        <w:pStyle w:val="ListParagraph"/>
+        <w:rPr>
+          <w:rFonts w:ascii="Arial" w:hAnsi="Arial" w:cs="Arial"/>
+        </w:rPr>
+      </w:pPr>
+      <w:r>
+        <w:rPr>
+          <w:rFonts w:ascii="Arial" w:hAnsi="Arial" w:cs="Arial"/>
+        </w:rPr>
+        <w:t xml:space="preserve">The OS constantly monitors the hardware for faults or anomalies. If the hardware or software suddenly crash, the OS generates an error message and isolates the failing process. This protects the start-ups information and prevents a single application failure from bringing down the entire </w:t>
+      </w:r>
+      <w:proofErr w:type="spellStart"/>
+      <w:r>
+        <w:rPr>
+          <w:rFonts w:ascii="Arial" w:hAnsi="Arial" w:cs="Arial"/>
+        </w:rPr>
+        <w:t>QuantumX</w:t>
+      </w:r>
+      <w:proofErr w:type="spellEnd"/>
+      <w:r>
+        <w:rPr>
+          <w:rFonts w:ascii="Arial" w:hAnsi="Arial" w:cs="Arial"/>
+        </w:rPr>
+        <w:t xml:space="preserve"> system.</w:t>
+      </w:r>
+    </w:p>
+    <w:p>
+      <w:pPr>
+        <w:pStyle w:val="ListParagraph"/>
+        <w:rPr>
+          <w:rFonts w:ascii="Arial" w:hAnsi="Arial" w:cs="Arial"/>
+        </w:rPr>
+      </w:pPr>
+      <w:r>
+        <w:rPr>
+          <w:rFonts w:ascii="Arial" w:hAnsi="Arial" w:cs="Arial"/>
+        </w:rPr>
+        <w:t xml:space="preserve"> </w:t>
+      </w:r>
+    </w:p>
+    <w:p>
+      <w:pPr>
+        <w:pStyle w:val="ListParagraph"/>
+        <w:numPr>
+          <w:ilvl w:val="0"/>
+          <w:numId w:val="34"/>
+        </w:numPr>
+        <w:rPr>
+          <w:rFonts w:ascii="Arial" w:hAnsi="Arial" w:cs="Arial"/>
+        </w:rPr>
+      </w:pPr>
+      <w:r>
+        <w:rPr>
+          <w:rFonts w:ascii="Arial" w:hAnsi="Arial" w:cs="Arial"/>
+        </w:rPr>
+        <w:t>Input/Output Devices Management</w:t>
+      </w:r>
+    </w:p>
+    <w:p>
+      <w:pPr>
+        <w:pStyle w:val="ListParagraph"/>
+        <w:rPr>
+          <w:rFonts w:ascii="Arial" w:hAnsi="Arial" w:cs="Arial"/>
+        </w:rPr>
+      </w:pPr>
+      <w:r>
+        <w:rPr>
+          <w:rFonts w:ascii="Arial" w:hAnsi="Arial" w:cs="Arial"/>
+        </w:rPr>
+        <w:t xml:space="preserve">The OS manages the flow of data between the input devices and output devices. Since the CPU is much faster than peripherals like hard drives or </w:t>
+      </w:r>
+      <w:proofErr w:type="spellStart"/>
+      <w:proofErr w:type="gramStart"/>
+      <w:r>
+        <w:rPr>
+          <w:rFonts w:ascii="Arial" w:hAnsi="Arial" w:cs="Arial"/>
+        </w:rPr>
+        <w:t>pronter</w:t>
+      </w:r>
+      <w:proofErr w:type="spellEnd"/>
+      <w:r>
+        <w:rPr>
+          <w:rFonts w:ascii="Arial" w:hAnsi="Arial" w:cs="Arial"/>
+        </w:rPr>
+        <w:t>,  the</w:t>
+      </w:r>
+      <w:proofErr w:type="gramEnd"/>
+      <w:r>
+        <w:rPr>
+          <w:rFonts w:ascii="Arial" w:hAnsi="Arial" w:cs="Arial"/>
+        </w:rPr>
+        <w:t xml:space="preserve"> OS uses </w:t>
+      </w:r>
+      <w:proofErr w:type="gramStart"/>
+      <w:r>
+        <w:rPr>
+          <w:rFonts w:ascii="Arial" w:hAnsi="Arial" w:cs="Arial"/>
+        </w:rPr>
+        <w:t>buffering(</w:t>
+      </w:r>
+      <w:proofErr w:type="gramEnd"/>
+      <w:r>
+        <w:rPr>
+          <w:rFonts w:ascii="Arial" w:hAnsi="Arial" w:cs="Arial"/>
+        </w:rPr>
+        <w:t xml:space="preserve">) and spooling. This ensures that the fast CPU of the </w:t>
+      </w:r>
+      <w:proofErr w:type="spellStart"/>
+      <w:r>
+        <w:rPr>
+          <w:rFonts w:ascii="Arial" w:hAnsi="Arial" w:cs="Arial"/>
+        </w:rPr>
+        <w:t>QuantumX</w:t>
+      </w:r>
+      <w:proofErr w:type="spellEnd"/>
+      <w:r>
+        <w:rPr>
+          <w:rFonts w:ascii="Arial" w:hAnsi="Arial" w:cs="Arial"/>
+        </w:rPr>
+        <w:t xml:space="preserve"> is not held up waiting for slower peripherals, maximizing overall system performance and efficiency.</w:t>
+      </w:r>
+    </w:p>
+    <w:p>
+      <w:pPr>
+        <w:rPr>
+          <w:rFonts w:ascii="Arial" w:hAnsi="Arial" w:cs="Arial"/>
+        </w:rPr>
+      </w:pPr>
+    </w:p>
+    <w:p>
+      <w:pPr>
+        <w:pStyle w:val="ListParagraph"/>
+        <w:numPr>
+          <w:ilvl w:val="0"/>
+          <w:numId w:val="34"/>
+        </w:numPr>
+        <w:rPr>
+          <w:rFonts w:ascii="Arial" w:hAnsi="Arial" w:cs="Arial"/>
+        </w:rPr>
+      </w:pPr>
+      <w:r>
+        <w:rPr>
+          <w:rFonts w:ascii="Arial" w:hAnsi="Arial" w:cs="Arial"/>
+        </w:rPr>
+        <w:t>Device Drivers</w:t>
+      </w:r>
+    </w:p>
+    <w:p>
+      <w:pPr>
         <w:rPr>
           <w:rFonts w:ascii="Arial" w:hAnsi="Arial" w:cs="Arial"/>
           <w:sz w:val="28"/>
           <w:szCs w:val="28"/>
         </w:rPr>
-        <w:t>Device</w:t>
-      </w:r>
+      </w:pPr>
       <w:r>
         <w:rPr>
           <w:rFonts w:ascii="Arial" w:hAnsi="Arial" w:cs="Arial"/>
           <w:sz w:val="28"/>
           <w:szCs w:val="28"/>
         </w:rPr>
-        <w:t xml:space="preserve"> Management(I/O Sys</w:t>
+        <w:t>The OS utilizes device drivers</w:t>
       </w:r>
       <w:r>
         <w:rPr>
@@ -2660,7 +3152,7 @@
           <w:sz w:val="28"/>
           <w:szCs w:val="28"/>
         </w:rPr>
-        <w:t>t</w:t>
+        <w:t xml:space="preserve">, </w:t>
       </w:r>
       <w:r>
         <w:rPr>
@@ -2668,7 +3160,7 @@
           <w:sz w:val="28"/>
           <w:szCs w:val="28"/>
         </w:rPr>
-        <w:t>em)</w:t>
+        <w:t xml:space="preserve">special programs </w:t>
       </w:r>
       <w:r>
         <w:rPr>
@@ -2676,148 +3168,244 @@
           <w:sz w:val="28"/>
           <w:szCs w:val="28"/>
         </w:rPr>
-        <w:t xml:space="preserve"> </w:t>
-      </w:r>
+        <w:t xml:space="preserve">that’s acts as an interpreter between the hardware and the system. When the </w:t>
+      </w:r>
+      <w:proofErr w:type="spellStart"/>
       <w:r>
         <w:rPr>
           <w:rFonts w:ascii="Arial" w:hAnsi="Arial" w:cs="Arial"/>
           <w:sz w:val="28"/>
           <w:szCs w:val="28"/>
         </w:rPr>
-        <w:t xml:space="preserve">                                                                                                                                                                                                                                                                                                                                                                                                                                                                                                                                                                             </w:t>
-      </w:r>
-      <w:r>
-        <w:rPr>
-          <w:rFonts w:ascii="Arial" w:hAnsi="Arial" w:cs="Arial"/>
-        </w:rPr>
-        <w:t>Computers have peripherals such as k</w:t>
-      </w:r>
-      <w:r>
-        <w:rPr>
-          <w:rFonts w:ascii="Arial" w:hAnsi="Arial" w:cs="Arial"/>
-        </w:rPr>
-        <w:t>e</w:t>
-      </w:r>
-      <w:r>
-        <w:rPr>
-          <w:rFonts w:ascii="Arial" w:hAnsi="Arial" w:cs="Arial"/>
-        </w:rPr>
-        <w:t>yboard, mouses and disks which allows users to insert input or get output from the computer systems. Operating system is responsible for managing these devices. It archives this using Device drivers</w:t>
-      </w:r>
-      <w:r>
-        <w:rPr>
-          <w:rFonts w:ascii="Arial" w:hAnsi="Arial" w:cs="Arial"/>
-        </w:rPr>
-        <w:t xml:space="preserve"> </w:t>
-      </w:r>
-      <w:r>
-        <w:rPr>
-          <w:rFonts w:ascii="Arial" w:hAnsi="Arial" w:cs="Arial"/>
-        </w:rPr>
-        <w:t>(an interpreter between the hardware and the system), buffering an</w:t>
-      </w:r>
-      <w:r>
-        <w:rPr>
-          <w:rFonts w:ascii="Arial" w:hAnsi="Arial" w:cs="Arial"/>
-        </w:rPr>
-        <w:t>d</w:t>
-      </w:r>
-      <w:r>
-        <w:rPr>
-          <w:rFonts w:ascii="Arial" w:hAnsi="Arial" w:cs="Arial"/>
-        </w:rPr>
-        <w:t xml:space="preserve"> caching.</w:t>
-      </w:r>
-    </w:p>
-    <w:p>
-      <w:pPr>
+        <w:t>QuantumX</w:t>
+      </w:r>
+      <w:proofErr w:type="spellEnd"/>
+      <w:r>
         <w:rPr>
           <w:rFonts w:ascii="Arial" w:hAnsi="Arial" w:cs="Arial"/>
           <w:sz w:val="28"/>
           <w:szCs w:val="28"/>
         </w:rPr>
-      </w:pPr>
-    </w:p>
-    <w:p>
-      <w:pPr>
+        <w:t xml:space="preserve"> uses high-</w:t>
+      </w:r>
+      <w:r>
         <w:rPr>
           <w:rFonts w:ascii="Arial" w:hAnsi="Arial" w:cs="Arial"/>
           <w:sz w:val="28"/>
           <w:szCs w:val="28"/>
         </w:rPr>
-      </w:pPr>
-    </w:p>
-    <w:p>
-      <w:pPr>
+        <w:t>performance</w:t>
+      </w:r>
+      <w:r>
         <w:rPr>
           <w:rFonts w:ascii="Arial" w:hAnsi="Arial" w:cs="Arial"/>
           <w:sz w:val="28"/>
           <w:szCs w:val="28"/>
         </w:rPr>
-      </w:pPr>
-    </w:p>
-    <w:p>
-      <w:pPr>
+        <w:t xml:space="preserve"> </w:t>
+      </w:r>
+      <w:r>
         <w:rPr>
           <w:rFonts w:ascii="Arial" w:hAnsi="Arial" w:cs="Arial"/>
           <w:sz w:val="28"/>
           <w:szCs w:val="28"/>
         </w:rPr>
-      </w:pPr>
-    </w:p>
-    <w:p>
-      <w:pPr>
+        <w:t>components</w:t>
+      </w:r>
+      <w:r>
         <w:rPr>
           <w:rFonts w:ascii="Arial" w:hAnsi="Arial" w:cs="Arial"/>
           <w:sz w:val="28"/>
           <w:szCs w:val="28"/>
         </w:rPr>
-      </w:pPr>
-    </w:p>
-    <w:p>
-      <w:pPr>
+        <w:t xml:space="preserve"> the device drivers translate high-level OS commands into specific low-level instructions that the physical hardware can understand. This ensures </w:t>
+      </w:r>
+      <w:r>
         <w:rPr>
           <w:rFonts w:ascii="Arial" w:hAnsi="Arial" w:cs="Arial"/>
           <w:sz w:val="28"/>
           <w:szCs w:val="28"/>
         </w:rPr>
-      </w:pPr>
-    </w:p>
-    <w:p>
-      <w:pPr>
+        <w:t>seamless</w:t>
+      </w:r>
+      <w:r>
         <w:rPr>
           <w:rFonts w:ascii="Arial" w:hAnsi="Arial" w:cs="Arial"/>
           <w:sz w:val="28"/>
           <w:szCs w:val="28"/>
         </w:rPr>
-      </w:pPr>
-    </w:p>
-    <w:p>
-      <w:pPr>
+        <w:t xml:space="preserve"> </w:t>
+      </w:r>
+      <w:r>
         <w:rPr>
           <w:rFonts w:ascii="Arial" w:hAnsi="Arial" w:cs="Arial"/>
           <w:sz w:val="28"/>
           <w:szCs w:val="28"/>
         </w:rPr>
-      </w:pPr>
-    </w:p>
-    <w:p>
-      <w:pPr>
-        <w:rPr>
-          <w:rFonts w:ascii="Arial" w:hAnsi="Arial" w:cs="Arial"/>
-          <w:b/>
-          <w:sz w:val="32"/>
-          <w:szCs w:val="32"/>
-        </w:rPr>
-      </w:pPr>
-    </w:p>
-    <w:p>
-      <w:pPr>
-        <w:rPr>
-          <w:rFonts w:ascii="Arial" w:hAnsi="Arial" w:cs="Arial"/>
-          <w:b/>
-          <w:sz w:val="32"/>
-          <w:szCs w:val="32"/>
+        <w:t>communication</w:t>
+      </w:r>
+      <w:r>
+        <w:rPr>
+          <w:rFonts w:ascii="Arial" w:hAnsi="Arial" w:cs="Arial"/>
+          <w:sz w:val="28"/>
+          <w:szCs w:val="28"/>
+        </w:rPr>
+        <w:t xml:space="preserve"> between the software and physical components.</w:t>
+      </w:r>
+    </w:p>
+    <w:p>
+      <w:pPr>
+        <w:rPr>
+          <w:rFonts w:ascii="Arial" w:hAnsi="Arial" w:cs="Arial"/>
+          <w:sz w:val="28"/>
+          <w:szCs w:val="28"/>
+        </w:rPr>
+      </w:pPr>
+    </w:p>
+    <w:p>
+      <w:pPr>
+        <w:rPr>
+          <w:rFonts w:ascii="Arial" w:hAnsi="Arial" w:cs="Arial"/>
+          <w:sz w:val="28"/>
+          <w:szCs w:val="28"/>
+        </w:rPr>
+      </w:pPr>
+    </w:p>
+    <w:p>
+      <w:pPr>
+        <w:rPr>
+          <w:rFonts w:ascii="Arial" w:hAnsi="Arial" w:cs="Arial"/>
+          <w:sz w:val="28"/>
+          <w:szCs w:val="28"/>
+        </w:rPr>
+      </w:pPr>
+      <w:r>
+        <w:rPr>
+          <w:rFonts w:ascii="Arial" w:hAnsi="Arial" w:cs="Arial"/>
+          <w:sz w:val="28"/>
+          <w:szCs w:val="28"/>
+        </w:rPr>
+        <w:t xml:space="preserve">By </w:t>
+      </w:r>
+      <w:r>
+        <w:rPr>
+          <w:rFonts w:ascii="Arial" w:hAnsi="Arial" w:cs="Arial"/>
+          <w:sz w:val="28"/>
+          <w:szCs w:val="28"/>
+        </w:rPr>
+        <w:t>integrating</w:t>
+      </w:r>
+      <w:r>
+        <w:rPr>
+          <w:rFonts w:ascii="Arial" w:hAnsi="Arial" w:cs="Arial"/>
+          <w:sz w:val="28"/>
+          <w:szCs w:val="28"/>
+        </w:rPr>
+        <w:t xml:space="preserve"> these functionalities and hardware management technique, the OS ensures that the </w:t>
+      </w:r>
+      <w:proofErr w:type="spellStart"/>
+      <w:r>
+        <w:rPr>
+          <w:rFonts w:ascii="Arial" w:hAnsi="Arial" w:cs="Arial"/>
+          <w:sz w:val="28"/>
+          <w:szCs w:val="28"/>
+        </w:rPr>
+        <w:t>QuantumX</w:t>
+      </w:r>
+      <w:proofErr w:type="spellEnd"/>
+      <w:r>
+        <w:rPr>
+          <w:rFonts w:ascii="Arial" w:hAnsi="Arial" w:cs="Arial"/>
+          <w:sz w:val="28"/>
+          <w:szCs w:val="28"/>
+        </w:rPr>
+        <w:t xml:space="preserve"> operates reliably and </w:t>
+      </w:r>
+      <w:proofErr w:type="gramStart"/>
+      <w:r>
+        <w:rPr>
+          <w:rFonts w:ascii="Arial" w:hAnsi="Arial" w:cs="Arial"/>
+          <w:sz w:val="28"/>
+          <w:szCs w:val="28"/>
+        </w:rPr>
+        <w:t>efficientl</w:t>
+      </w:r>
+      <w:r>
+        <w:rPr>
+          <w:rFonts w:ascii="Arial" w:hAnsi="Arial" w:cs="Arial"/>
+          <w:sz w:val="28"/>
+          <w:szCs w:val="28"/>
+        </w:rPr>
+        <w:t>y</w:t>
+      </w:r>
+      <w:r>
+        <w:rPr>
+          <w:rFonts w:ascii="Arial" w:hAnsi="Arial" w:cs="Arial"/>
+          <w:sz w:val="28"/>
+          <w:szCs w:val="28"/>
+        </w:rPr>
+        <w:t xml:space="preserve"> </w:t>
+      </w:r>
+      <w:r>
+        <w:rPr>
+          <w:rFonts w:ascii="Arial" w:hAnsi="Arial" w:cs="Arial"/>
+          <w:sz w:val="28"/>
+          <w:szCs w:val="28"/>
+        </w:rPr>
+        <w:t>,</w:t>
+      </w:r>
+      <w:proofErr w:type="gramEnd"/>
+      <w:r>
+        <w:rPr>
+          <w:rFonts w:ascii="Arial" w:hAnsi="Arial" w:cs="Arial"/>
+          <w:sz w:val="28"/>
+          <w:szCs w:val="28"/>
+        </w:rPr>
+        <w:t xml:space="preserve"> reinforcing customer trust and justifying the investment to financial stakeholders.</w:t>
+      </w:r>
+    </w:p>
+    <w:p>
+      <w:pPr>
+        <w:rPr>
+          <w:rFonts w:ascii="Arial" w:hAnsi="Arial" w:cs="Arial"/>
+          <w:sz w:val="28"/>
+          <w:szCs w:val="28"/>
+        </w:rPr>
+      </w:pPr>
+    </w:p>
+    <w:p>
+      <w:pPr>
+        <w:rPr>
+          <w:rFonts w:ascii="Arial" w:hAnsi="Arial" w:cs="Arial"/>
+          <w:sz w:val="28"/>
+          <w:szCs w:val="28"/>
+        </w:rPr>
+      </w:pPr>
+    </w:p>
+    <w:p>
+      <w:pPr>
+        <w:rPr>
+          <w:rFonts w:ascii="Arial" w:hAnsi="Arial" w:cs="Arial"/>
+          <w:sz w:val="28"/>
+          <w:szCs w:val="28"/>
+        </w:rPr>
+      </w:pPr>
+    </w:p>
+    <w:p>
+      <w:pPr>
+        <w:rPr>
+          <w:rFonts w:ascii="Arial" w:hAnsi="Arial" w:cs="Arial"/>
+          <w:sz w:val="28"/>
+          <w:szCs w:val="28"/>
+        </w:rPr>
+      </w:pPr>
+    </w:p>
+    <w:p>
+      <w:pPr>
+        <w:rPr>
+          <w:rFonts w:ascii="Arial" w:hAnsi="Arial" w:cs="Arial"/>
+          <w:sz w:val="28"/>
+          <w:szCs w:val="28"/>
         </w:rPr>
       </w:pPr>
     </w:p>
@@ -4924,6 +5512,20 @@
         </w:rPr>
         <w:t xml:space="preserve">(devices) are connected within a limited geographical setting for example office building, homes or campus buildings. </w:t>
       </w:r>
+      <w:r>
+        <w:rPr>
+          <w:rFonts w:ascii="Arial" w:hAnsi="Arial" w:cs="Arial"/>
+          <w:bCs/>
+        </w:rPr>
+        <w:t>Its main purpose is to share local resources like printers and files at high speeds. It works by using high-speed connections such as Ethernet cables or Wi-Fi to allow devices to communicate and share resources efficiently. A LAN is usually owned and man</w:t>
+      </w:r>
+      <w:r>
+        <w:rPr>
+          <w:rFonts w:ascii="Arial" w:hAnsi="Arial" w:cs="Arial"/>
+          <w:bCs/>
+        </w:rPr>
+        <w:t>aged by a single organization or individual.</w:t>
+      </w:r>
     </w:p>
     <w:p>
       <w:pPr>
@@ -5137,7 +5739,77 @@
           <w:rFonts w:ascii="Arial" w:hAnsi="Arial" w:cs="Arial"/>
           <w:bCs/>
         </w:rPr>
-        <w:t>The main difference between them is the distance they cover and ownership. Local Area Networks are small and private owned, Metropolitan Area Network cover cities and may be jointly owned while Wide Area Networks cover vast distances and relies on third-party telecommunication providers.</w:t>
+        <w:lastRenderedPageBreak/>
+        <w:t>The main difference between the</w:t>
+      </w:r>
+      <w:r>
+        <w:rPr>
+          <w:rFonts w:ascii="Arial" w:hAnsi="Arial" w:cs="Arial"/>
+          <w:bCs/>
+        </w:rPr>
+        <w:t>se configurations</w:t>
+      </w:r>
+      <w:r>
+        <w:rPr>
+          <w:rFonts w:ascii="Arial" w:hAnsi="Arial" w:cs="Arial"/>
+          <w:bCs/>
+        </w:rPr>
+        <w:t xml:space="preserve"> is the distance they cover and ownership. Local Area Networks are small and private owned, Metropolitan Area Network cover cities and may be jointly owned while Wide Area Networks cover vast distances and relies on third-party telecommunication providers.</w:t>
+      </w:r>
+    </w:p>
+    <w:p>
+      <w:pPr>
+        <w:rPr>
+          <w:rFonts w:ascii="Arial" w:hAnsi="Arial" w:cs="Arial"/>
+          <w:bCs/>
+        </w:rPr>
+      </w:pPr>
+    </w:p>
+    <w:p>
+      <w:pPr>
+        <w:rPr>
+          <w:rFonts w:ascii="Arial" w:hAnsi="Arial" w:cs="Arial"/>
+          <w:bCs/>
+        </w:rPr>
+      </w:pPr>
+      <w:r>
+        <w:rPr>
+          <w:rFonts w:ascii="Arial" w:hAnsi="Arial" w:cs="Arial"/>
+          <w:bCs/>
+        </w:rPr>
+        <w:t xml:space="preserve">For </w:t>
+      </w:r>
+      <w:proofErr w:type="spellStart"/>
+      <w:r>
+        <w:rPr>
+          <w:rFonts w:ascii="Arial" w:hAnsi="Arial" w:cs="Arial"/>
+          <w:bCs/>
+        </w:rPr>
+        <w:t>Techville’s</w:t>
+      </w:r>
+      <w:proofErr w:type="spellEnd"/>
+      <w:r>
+        <w:rPr>
+          <w:rFonts w:ascii="Arial" w:hAnsi="Arial" w:cs="Arial"/>
+          <w:bCs/>
+        </w:rPr>
+        <w:t xml:space="preserve"> start-up businesses, I recommend offering a Star Topology for their LAN configuration. This is because start-up businesses need a network that I easy to install, reliable and simple to maintain and scale. In star topology if one cable or node fails, the rest of the network continues to operate normally. </w:t>
+      </w:r>
+      <w:proofErr w:type="gramStart"/>
+      <w:r>
+        <w:rPr>
+          <w:rFonts w:ascii="Arial" w:hAnsi="Arial" w:cs="Arial"/>
+          <w:bCs/>
+        </w:rPr>
+        <w:t>This  means</w:t>
+      </w:r>
+      <w:proofErr w:type="gramEnd"/>
+      <w:r>
+        <w:rPr>
+          <w:rFonts w:ascii="Arial" w:hAnsi="Arial" w:cs="Arial"/>
+          <w:bCs/>
+        </w:rPr>
+        <w:t xml:space="preserve"> businesses can continue operating without disruptions.</w:t>
       </w:r>
     </w:p>
     <w:p>
@@ -5163,7 +5835,6 @@
           <w:sz w:val="32"/>
           <w:szCs w:val="32"/>
         </w:rPr>
-        <w:lastRenderedPageBreak/>
         <w:t xml:space="preserve"> </w:t>
       </w:r>
       <w:r>
@@ -5275,6 +5946,7 @@
           <w:ilvl w:val="0"/>
           <w:numId w:val="22"/>
         </w:numPr>
+        <w:ind w:left="1080"/>
         <w:rPr>
           <w:rFonts w:ascii="Arial" w:hAnsi="Arial" w:cs="Arial"/>
         </w:rPr>
@@ -5294,15 +5966,28 @@
     </w:p>
     <w:p>
       <w:pPr>
-        <w:rPr>
-          <w:rFonts w:ascii="Arial" w:hAnsi="Arial" w:cs="Arial"/>
-        </w:rPr>
-      </w:pPr>
-      <w:r>
-        <w:rPr>
-          <w:rFonts w:ascii="Arial" w:hAnsi="Arial" w:cs="Arial"/>
-        </w:rPr>
-        <w:t>Mesh topology is a network topology in which every node(device) is connected to another device via particular channel known as links. Therefore, Mesh topology does not depend on specific protocols, it focuses on direct device-to-device connections.</w:t>
+        <w:ind w:left="720"/>
+        <w:rPr>
+          <w:rFonts w:ascii="Arial" w:hAnsi="Arial" w:cs="Arial"/>
+        </w:rPr>
+      </w:pPr>
+      <w:r>
+        <w:rPr>
+          <w:rFonts w:ascii="Arial" w:hAnsi="Arial" w:cs="Arial"/>
+        </w:rPr>
+        <w:t xml:space="preserve">Mesh topology is a network topology in which every node(device) is connected to </w:t>
+      </w:r>
+      <w:r>
+        <w:rPr>
+          <w:rFonts w:ascii="Arial" w:hAnsi="Arial" w:cs="Arial"/>
+        </w:rPr>
+        <w:t xml:space="preserve">every </w:t>
+      </w:r>
+      <w:r>
+        <w:rPr>
+          <w:rFonts w:ascii="Arial" w:hAnsi="Arial" w:cs="Arial"/>
+        </w:rPr>
+        <w:t>other device via particular channel known as links. Therefore, Mesh topology does not depend on specific protocols, it focuses on direct device-to-device connections.</w:t>
       </w:r>
       <w:r>
         <w:rPr>
@@ -5310,14 +5995,12 @@
         </w:rPr>
         <w:t xml:space="preserve"> Some of the advantages of Mesh topologies include fast communication speed between nodes, easy fault diagnosis and provision of security and privacy. Therefore, Mesh topology </w:t>
       </w:r>
-      <w:proofErr w:type="gramStart"/>
-      <w:r>
-        <w:rPr>
-          <w:rFonts w:ascii="Arial" w:hAnsi="Arial" w:cs="Arial"/>
-        </w:rPr>
-        <w:t>are</w:t>
-      </w:r>
-      <w:proofErr w:type="gramEnd"/>
+      <w:r>
+        <w:rPr>
+          <w:rFonts w:ascii="Arial" w:hAnsi="Arial" w:cs="Arial"/>
+        </w:rPr>
+        <w:t>is</w:t>
+      </w:r>
       <w:r>
         <w:rPr>
           <w:rFonts w:ascii="Arial" w:hAnsi="Arial" w:cs="Arial"/>
@@ -5327,6 +6010,7 @@
     </w:p>
     <w:p>
       <w:pPr>
+        <w:ind w:left="720"/>
         <w:rPr>
           <w:rFonts w:ascii="Arial" w:hAnsi="Arial" w:cs="Arial"/>
         </w:rPr>
@@ -5345,6 +6029,7 @@
           <w:ilvl w:val="0"/>
           <w:numId w:val="22"/>
         </w:numPr>
+        <w:ind w:left="1080"/>
         <w:rPr>
           <w:rFonts w:ascii="Arial" w:hAnsi="Arial" w:cs="Arial"/>
         </w:rPr>
@@ -5364,6 +6049,7 @@
     </w:p>
     <w:p>
       <w:pPr>
+        <w:ind w:left="720"/>
         <w:rPr>
           <w:rFonts w:ascii="Arial" w:hAnsi="Arial" w:cs="Arial"/>
         </w:rPr>
@@ -5383,6 +6069,7 @@
     </w:p>
     <w:p>
       <w:pPr>
+        <w:ind w:left="720"/>
         <w:rPr>
           <w:rFonts w:ascii="Arial" w:hAnsi="Arial" w:cs="Arial"/>
         </w:rPr>
@@ -5401,6 +6088,7 @@
           <w:ilvl w:val="0"/>
           <w:numId w:val="22"/>
         </w:numPr>
+        <w:ind w:left="1080"/>
         <w:rPr>
           <w:rFonts w:ascii="Arial" w:hAnsi="Arial" w:cs="Arial"/>
         </w:rPr>
@@ -5420,14 +6108,16 @@
     </w:p>
     <w:p>
       <w:pPr>
-        <w:rPr>
-          <w:rFonts w:ascii="Arial" w:hAnsi="Arial" w:cs="Arial"/>
-        </w:rPr>
-      </w:pPr>
-      <w:r>
-        <w:rPr>
-          <w:rFonts w:ascii="Arial" w:hAnsi="Arial" w:cs="Arial"/>
-        </w:rPr>
+        <w:ind w:left="720"/>
+        <w:rPr>
+          <w:rFonts w:ascii="Arial" w:hAnsi="Arial" w:cs="Arial"/>
+        </w:rPr>
+      </w:pPr>
+      <w:r>
+        <w:rPr>
+          <w:rFonts w:ascii="Arial" w:hAnsi="Arial" w:cs="Arial"/>
+        </w:rPr>
+        <w:lastRenderedPageBreak/>
         <w:t xml:space="preserve">In </w:t>
       </w:r>
       <w:r>
@@ -5504,6 +6194,7 @@
           <w:ilvl w:val="0"/>
           <w:numId w:val="22"/>
         </w:numPr>
+        <w:ind w:left="1080"/>
         <w:rPr>
           <w:rFonts w:ascii="Arial" w:hAnsi="Arial" w:cs="Arial"/>
         </w:rPr>
@@ -5517,6 +6208,7 @@
     </w:p>
     <w:p>
       <w:pPr>
+        <w:ind w:left="720"/>
         <w:rPr>
           <w:rFonts w:ascii="Arial" w:hAnsi="Arial" w:cs="Arial"/>
         </w:rPr>
@@ -5564,6 +6256,250 @@
           <w:rFonts w:ascii="Arial" w:hAnsi="Arial" w:cs="Arial"/>
         </w:rPr>
         <w:t>.</w:t>
+      </w:r>
+    </w:p>
+    <w:p>
+      <w:pPr>
+        <w:ind w:left="720"/>
+        <w:rPr>
+          <w:rFonts w:ascii="Arial" w:hAnsi="Arial" w:cs="Arial"/>
+        </w:rPr>
+      </w:pPr>
+    </w:p>
+    <w:p>
+      <w:pPr>
+        <w:rPr>
+          <w:rFonts w:ascii="Arial" w:hAnsi="Arial" w:cs="Arial"/>
+          <w:b/>
+          <w:sz w:val="28"/>
+          <w:szCs w:val="28"/>
+        </w:rPr>
+      </w:pPr>
+      <w:r>
+        <w:rPr>
+          <w:rFonts w:ascii="Arial" w:hAnsi="Arial" w:cs="Arial"/>
+          <w:b/>
+          <w:sz w:val="28"/>
+          <w:szCs w:val="28"/>
+        </w:rPr>
+        <w:t>P</w:t>
+      </w:r>
+      <w:r>
+        <w:rPr>
+          <w:rFonts w:ascii="Arial" w:hAnsi="Arial" w:cs="Arial"/>
+          <w:b/>
+          <w:sz w:val="28"/>
+          <w:szCs w:val="28"/>
+        </w:rPr>
+        <w:t>h</w:t>
+      </w:r>
+      <w:r>
+        <w:rPr>
+          <w:rFonts w:ascii="Arial" w:hAnsi="Arial" w:cs="Arial"/>
+          <w:b/>
+          <w:sz w:val="28"/>
+          <w:szCs w:val="28"/>
+        </w:rPr>
+        <w:t>ysical Networking Equipment Required</w:t>
+      </w:r>
+    </w:p>
+    <w:p>
+      <w:pPr>
+        <w:rPr>
+          <w:rFonts w:ascii="Arial" w:hAnsi="Arial" w:cs="Arial"/>
+          <w:sz w:val="28"/>
+          <w:szCs w:val="28"/>
+        </w:rPr>
+      </w:pPr>
+      <w:r>
+        <w:rPr>
+          <w:rFonts w:ascii="Arial" w:hAnsi="Arial" w:cs="Arial"/>
+          <w:sz w:val="28"/>
+          <w:szCs w:val="28"/>
+        </w:rPr>
+        <w:t xml:space="preserve">According to </w:t>
+      </w:r>
+      <w:sdt>
+        <w:sdtPr>
+          <w:rPr>
+            <w:rFonts w:ascii="Arial" w:hAnsi="Arial" w:cs="Arial"/>
+            <w:sz w:val="28"/>
+            <w:szCs w:val="28"/>
+          </w:rPr>
+          <w:id w:val="793187480"/>
+          <w:citation/>
+        </w:sdtPr>
+        <w:sdtContent>
+          <w:r>
+            <w:rPr>
+              <w:rFonts w:ascii="Arial" w:hAnsi="Arial" w:cs="Arial"/>
+              <w:sz w:val="28"/>
+              <w:szCs w:val="28"/>
+            </w:rPr>
+            <w:fldChar w:fldCharType="begin"/>
+          </w:r>
+          <w:r>
+            <w:rPr>
+              <w:rFonts w:ascii="Arial" w:hAnsi="Arial" w:cs="Arial"/>
+              <w:sz w:val="28"/>
+              <w:szCs w:val="28"/>
+              <w:lang w:val="en-GB"/>
+            </w:rPr>
+            <w:instrText xml:space="preserve"> CITATION Com26 \l 2057 </w:instrText>
+          </w:r>
+          <w:r>
+            <w:rPr>
+              <w:rFonts w:ascii="Arial" w:hAnsi="Arial" w:cs="Arial"/>
+              <w:sz w:val="28"/>
+              <w:szCs w:val="28"/>
+            </w:rPr>
+            <w:fldChar w:fldCharType="separate"/>
+          </w:r>
+          <w:r>
+            <w:rPr>
+              <w:rFonts w:ascii="Arial" w:hAnsi="Arial" w:cs="Arial"/>
+              <w:noProof/>
+              <w:sz w:val="28"/>
+              <w:szCs w:val="28"/>
+              <w:lang w:val="en-GB"/>
+            </w:rPr>
+            <w:t>(Commerce Engine, 2026)</w:t>
+          </w:r>
+          <w:r>
+            <w:rPr>
+              <w:rFonts w:ascii="Arial" w:hAnsi="Arial" w:cs="Arial"/>
+              <w:sz w:val="28"/>
+              <w:szCs w:val="28"/>
+            </w:rPr>
+            <w:fldChar w:fldCharType="end"/>
+          </w:r>
+        </w:sdtContent>
+      </w:sdt>
+      <w:r>
+        <w:rPr>
+          <w:rFonts w:ascii="Arial" w:hAnsi="Arial" w:cs="Arial"/>
+          <w:sz w:val="28"/>
+          <w:szCs w:val="28"/>
+        </w:rPr>
+        <w:t xml:space="preserve">, </w:t>
+      </w:r>
+      <w:r>
+        <w:rPr>
+          <w:rFonts w:ascii="Arial" w:hAnsi="Arial" w:cs="Arial"/>
+          <w:sz w:val="28"/>
+          <w:szCs w:val="28"/>
+        </w:rPr>
+        <w:t xml:space="preserve">Network </w:t>
+      </w:r>
+      <w:r>
+        <w:rPr>
+          <w:rFonts w:ascii="Arial" w:hAnsi="Arial" w:cs="Arial"/>
+          <w:sz w:val="28"/>
+          <w:szCs w:val="28"/>
+        </w:rPr>
+        <w:t>topolog</w:t>
+      </w:r>
+      <w:r>
+        <w:rPr>
+          <w:rFonts w:ascii="Arial" w:hAnsi="Arial" w:cs="Arial"/>
+          <w:sz w:val="28"/>
+          <w:szCs w:val="28"/>
+        </w:rPr>
+        <w:t>ies require specific physical equipment. Therefore,</w:t>
+      </w:r>
+      <w:r>
+        <w:rPr>
+          <w:rFonts w:ascii="Arial" w:hAnsi="Arial" w:cs="Arial"/>
+          <w:sz w:val="28"/>
+          <w:szCs w:val="28"/>
+        </w:rPr>
+        <w:t xml:space="preserve"> </w:t>
+      </w:r>
+      <w:proofErr w:type="spellStart"/>
+      <w:proofErr w:type="gramStart"/>
+      <w:r>
+        <w:rPr>
+          <w:rFonts w:ascii="Arial" w:hAnsi="Arial" w:cs="Arial"/>
+          <w:sz w:val="28"/>
+          <w:szCs w:val="28"/>
+        </w:rPr>
+        <w:t>QuntumTech</w:t>
+      </w:r>
+      <w:proofErr w:type="spellEnd"/>
+      <w:r>
+        <w:rPr>
+          <w:rFonts w:ascii="Arial" w:hAnsi="Arial" w:cs="Arial"/>
+          <w:sz w:val="28"/>
+          <w:szCs w:val="28"/>
+        </w:rPr>
+        <w:t xml:space="preserve"> </w:t>
+      </w:r>
+      <w:r>
+        <w:rPr>
+          <w:rFonts w:ascii="Arial" w:hAnsi="Arial" w:cs="Arial"/>
+          <w:sz w:val="28"/>
+          <w:szCs w:val="28"/>
+        </w:rPr>
+        <w:t xml:space="preserve"> understand</w:t>
+      </w:r>
+      <w:proofErr w:type="gramEnd"/>
+      <w:r>
+        <w:rPr>
+          <w:rFonts w:ascii="Arial" w:hAnsi="Arial" w:cs="Arial"/>
+          <w:sz w:val="28"/>
+          <w:szCs w:val="28"/>
+        </w:rPr>
+        <w:t xml:space="preserve"> the required equipment for the desired topology they would like to install</w:t>
+      </w:r>
+      <w:r>
+        <w:rPr>
+          <w:rFonts w:ascii="Arial" w:hAnsi="Arial" w:cs="Arial"/>
+          <w:sz w:val="28"/>
+          <w:szCs w:val="28"/>
+        </w:rPr>
+        <w:t>. A star topology requires a Network Switch to act as the central connection point</w:t>
+      </w:r>
+      <w:r>
+        <w:rPr>
+          <w:rFonts w:ascii="Arial" w:hAnsi="Arial" w:cs="Arial"/>
+          <w:sz w:val="28"/>
+          <w:szCs w:val="28"/>
+        </w:rPr>
+        <w:t xml:space="preserve">. The switch routes data only to intended device. Network Interface Cards (NICs) are required inside every </w:t>
+      </w:r>
+      <w:proofErr w:type="spellStart"/>
+      <w:r>
+        <w:rPr>
+          <w:rFonts w:ascii="Arial" w:hAnsi="Arial" w:cs="Arial"/>
+          <w:sz w:val="28"/>
+          <w:szCs w:val="28"/>
+        </w:rPr>
+        <w:t>QuantumX</w:t>
+      </w:r>
+      <w:proofErr w:type="spellEnd"/>
+      <w:r>
+        <w:rPr>
+          <w:rFonts w:ascii="Arial" w:hAnsi="Arial" w:cs="Arial"/>
+          <w:sz w:val="28"/>
+          <w:szCs w:val="28"/>
+        </w:rPr>
+        <w:t xml:space="preserve"> computer to connect to the network. </w:t>
+      </w:r>
+      <w:r>
+        <w:rPr>
+          <w:rFonts w:ascii="Arial" w:hAnsi="Arial" w:cs="Arial"/>
+          <w:sz w:val="28"/>
+          <w:szCs w:val="28"/>
+        </w:rPr>
+        <w:t xml:space="preserve">Unshielded Twisted Pair (UTP) Cabling such as Cat6 with RJ-45 connectors is needed to link the devices to the switch. Finally, a Router is required </w:t>
+      </w:r>
+      <w:r>
+        <w:rPr>
+          <w:rFonts w:ascii="Arial" w:hAnsi="Arial" w:cs="Arial"/>
+          <w:sz w:val="28"/>
+          <w:szCs w:val="28"/>
+        </w:rPr>
+        <w:t>at the edge of the network to connect the local LAN to the wider internet and Wireless Access Points are needed to provide Wi-Fi connectivity to devices like mobile phones.</w:t>
       </w:r>
     </w:p>
     <w:p>
@@ -5589,7 +6525,6 @@
           <w:sz w:val="32"/>
           <w:szCs w:val="32"/>
         </w:rPr>
-        <w:lastRenderedPageBreak/>
         <w:t>The OSI Model as a Global Standard</w:t>
       </w:r>
     </w:p>
@@ -5625,14 +6560,12 @@
         </w:rPr>
         <w:t xml:space="preserve"> This is achieved through the Open Systems Interconnection (OSI) model. OSI model is 7-layered framework defined by ISO to model how data is transmitted across networks. Each layer performs a specific function while </w:t>
       </w:r>
-      <w:proofErr w:type="spellStart"/>
-      <w:r>
-        <w:rPr>
-          <w:rFonts w:ascii="Arial" w:hAnsi="Arial" w:cs="Arial"/>
-        </w:rPr>
-        <w:t>intacting</w:t>
-      </w:r>
-      <w:proofErr w:type="spellEnd"/>
+      <w:r>
+        <w:rPr>
+          <w:rFonts w:ascii="Arial" w:hAnsi="Arial" w:cs="Arial"/>
+        </w:rPr>
+        <w:t>interacting</w:t>
+      </w:r>
       <w:r>
         <w:rPr>
           <w:rFonts w:ascii="Arial" w:hAnsi="Arial" w:cs="Arial"/>
@@ -5653,19 +6586,22 @@
           <w:ilvl w:val="0"/>
           <w:numId w:val="26"/>
         </w:numPr>
-        <w:rPr>
-          <w:rFonts w:ascii="Arial" w:hAnsi="Arial" w:cs="Arial"/>
-        </w:rPr>
-      </w:pPr>
-      <w:r>
-        <w:rPr>
-          <w:rFonts w:ascii="Arial" w:hAnsi="Arial" w:cs="Arial"/>
-        </w:rPr>
+        <w:ind w:left="1080"/>
+        <w:rPr>
+          <w:rFonts w:ascii="Arial" w:hAnsi="Arial" w:cs="Arial"/>
+        </w:rPr>
+      </w:pPr>
+      <w:r>
+        <w:rPr>
+          <w:rFonts w:ascii="Arial" w:hAnsi="Arial" w:cs="Arial"/>
+        </w:rPr>
+        <w:lastRenderedPageBreak/>
         <w:t>Physical Layer</w:t>
       </w:r>
     </w:p>
     <w:p>
       <w:pPr>
+        <w:ind w:left="360"/>
         <w:rPr>
           <w:rFonts w:ascii="Arial" w:hAnsi="Arial" w:cs="Arial"/>
         </w:rPr>
@@ -5684,6 +6620,7 @@
           <w:ilvl w:val="0"/>
           <w:numId w:val="26"/>
         </w:numPr>
+        <w:ind w:left="1080"/>
         <w:rPr>
           <w:rFonts w:ascii="Arial" w:hAnsi="Arial" w:cs="Arial"/>
         </w:rPr>
@@ -5697,6 +6634,7 @@
     </w:p>
     <w:p>
       <w:pPr>
+        <w:ind w:left="360"/>
         <w:rPr>
           <w:rFonts w:ascii="Arial" w:hAnsi="Arial" w:cs="Arial"/>
         </w:rPr>
@@ -5721,6 +6659,7 @@
           <w:ilvl w:val="0"/>
           <w:numId w:val="26"/>
         </w:numPr>
+        <w:ind w:left="1080"/>
         <w:rPr>
           <w:rFonts w:ascii="Arial" w:hAnsi="Arial" w:cs="Arial"/>
         </w:rPr>
@@ -5734,6 +6673,7 @@
     </w:p>
     <w:p>
       <w:pPr>
+        <w:ind w:left="360"/>
         <w:rPr>
           <w:rFonts w:ascii="Arial" w:hAnsi="Arial" w:cs="Arial"/>
         </w:rPr>
@@ -5782,6 +6722,7 @@
           <w:ilvl w:val="0"/>
           <w:numId w:val="26"/>
         </w:numPr>
+        <w:ind w:left="1080"/>
         <w:rPr>
           <w:rFonts w:ascii="Arial" w:hAnsi="Arial" w:cs="Arial"/>
         </w:rPr>
@@ -5795,6 +6736,7 @@
     </w:p>
     <w:p>
       <w:pPr>
+        <w:ind w:left="360"/>
         <w:rPr>
           <w:rFonts w:ascii="Arial" w:hAnsi="Arial" w:cs="Arial"/>
         </w:rPr>
@@ -5837,6 +6779,7 @@
           <w:ilvl w:val="0"/>
           <w:numId w:val="26"/>
         </w:numPr>
+        <w:ind w:left="1080"/>
         <w:rPr>
           <w:rFonts w:ascii="Arial" w:hAnsi="Arial" w:cs="Arial"/>
         </w:rPr>
@@ -5850,15 +6793,15 @@
     </w:p>
     <w:p>
       <w:pPr>
-        <w:rPr>
-          <w:rFonts w:ascii="Arial" w:hAnsi="Arial" w:cs="Arial"/>
-        </w:rPr>
-      </w:pPr>
-      <w:r>
-        <w:rPr>
-          <w:rFonts w:ascii="Arial" w:hAnsi="Arial" w:cs="Arial"/>
-        </w:rPr>
-        <w:lastRenderedPageBreak/>
+        <w:ind w:left="360"/>
+        <w:rPr>
+          <w:rFonts w:ascii="Arial" w:hAnsi="Arial" w:cs="Arial"/>
+        </w:rPr>
+      </w:pPr>
+      <w:r>
+        <w:rPr>
+          <w:rFonts w:ascii="Arial" w:hAnsi="Arial" w:cs="Arial"/>
+        </w:rPr>
         <w:t xml:space="preserve">Session layer, the sixth fifth layer in the OSI model is responsible for establishing, managing and terminating communication sessions between applications. The layer ensures that communication remains active while data is being exchanged among </w:t>
       </w:r>
       <w:proofErr w:type="spellStart"/>
@@ -5879,6 +6822,7 @@
     <w:p>
       <w:pPr>
         <w:pStyle w:val="ListParagraph"/>
+        <w:ind w:left="1080"/>
         <w:rPr>
           <w:rFonts w:ascii="Arial" w:hAnsi="Arial" w:cs="Arial"/>
         </w:rPr>
@@ -5891,6 +6835,7 @@
           <w:ilvl w:val="0"/>
           <w:numId w:val="26"/>
         </w:numPr>
+        <w:ind w:left="1080"/>
         <w:rPr>
           <w:rFonts w:ascii="Arial" w:hAnsi="Arial" w:cs="Arial"/>
         </w:rPr>
@@ -5904,15 +6849,23 @@
     </w:p>
     <w:p>
       <w:pPr>
-        <w:rPr>
-          <w:rFonts w:ascii="Arial" w:hAnsi="Arial" w:cs="Arial"/>
-        </w:rPr>
-      </w:pPr>
-      <w:r>
-        <w:rPr>
-          <w:rFonts w:ascii="Arial" w:hAnsi="Arial" w:cs="Arial"/>
-        </w:rPr>
-        <w:t>The sixth layer of the OSI model is the presentation layer. This layer is responsible for translating data into a format that both communicating devices can understand. It also performs functions such as data encryption, compression and decryption. This ensures that information remains secure du</w:t>
+        <w:ind w:left="360"/>
+        <w:rPr>
+          <w:rFonts w:ascii="Arial" w:hAnsi="Arial" w:cs="Arial"/>
+        </w:rPr>
+      </w:pPr>
+      <w:r>
+        <w:rPr>
+          <w:rFonts w:ascii="Arial" w:hAnsi="Arial" w:cs="Arial"/>
+        </w:rPr>
+        <w:t xml:space="preserve">The sixth layer of the OSI model is the presentation layer. This layer is responsible for translating data into a format that both communicating devices can understand. It </w:t>
+      </w:r>
+      <w:r>
+        <w:rPr>
+          <w:rFonts w:ascii="Arial" w:hAnsi="Arial" w:cs="Arial"/>
+        </w:rPr>
+        <w:lastRenderedPageBreak/>
+        <w:t>also performs functions such as data encryption, compression and decryption. This ensures that information remains secure du</w:t>
       </w:r>
       <w:r>
         <w:rPr>
@@ -5964,6 +6917,7 @@
           <w:ilvl w:val="0"/>
           <w:numId w:val="26"/>
         </w:numPr>
+        <w:ind w:left="1080"/>
         <w:rPr>
           <w:rFonts w:ascii="Arial" w:hAnsi="Arial" w:cs="Arial"/>
         </w:rPr>
@@ -5977,6 +6931,7 @@
     </w:p>
     <w:p>
       <w:pPr>
+        <w:ind w:left="360"/>
         <w:rPr>
           <w:rFonts w:ascii="Arial" w:hAnsi="Arial" w:cs="Arial"/>
         </w:rPr>
@@ -6015,6 +6970,7 @@
     <w:p>
       <w:pPr>
         <w:pStyle w:val="ListParagraph"/>
+        <w:ind w:left="1080"/>
         <w:rPr>
           <w:rFonts w:ascii="Arial" w:hAnsi="Arial" w:cs="Arial"/>
         </w:rPr>
@@ -6023,6 +6979,7 @@
     <w:p>
       <w:pPr>
         <w:pStyle w:val="ListParagraph"/>
+        <w:ind w:left="1080"/>
         <w:rPr>
           <w:rFonts w:ascii="Arial" w:hAnsi="Arial" w:cs="Arial"/>
         </w:rPr>
@@ -6031,6 +6988,7 @@
     <w:p>
       <w:pPr>
         <w:pStyle w:val="ListParagraph"/>
+        <w:ind w:left="1080"/>
         <w:rPr>
           <w:rFonts w:ascii="Arial" w:hAnsi="Arial" w:cs="Arial"/>
         </w:rPr>
@@ -6039,6 +6997,7 @@
     <w:p>
       <w:pPr>
         <w:pStyle w:val="ListParagraph"/>
+        <w:ind w:left="1080"/>
         <w:rPr>
           <w:rFonts w:ascii="Arial" w:hAnsi="Arial" w:cs="Arial"/>
         </w:rPr>
@@ -6047,6 +7006,7 @@
     <w:p>
       <w:pPr>
         <w:pStyle w:val="ListParagraph"/>
+        <w:ind w:left="1080"/>
         <w:rPr>
           <w:rFonts w:ascii="Arial" w:hAnsi="Arial" w:cs="Arial"/>
         </w:rPr>
@@ -6055,6 +7015,7 @@
     <w:p>
       <w:pPr>
         <w:pStyle w:val="ListParagraph"/>
+        <w:ind w:left="1080"/>
         <w:rPr>
           <w:rFonts w:ascii="Arial" w:hAnsi="Arial" w:cs="Arial"/>
         </w:rPr>
@@ -6063,6 +7024,7 @@
     <w:p>
       <w:pPr>
         <w:pStyle w:val="ListParagraph"/>
+        <w:ind w:left="1080"/>
         <w:rPr>
           <w:rFonts w:ascii="Arial" w:hAnsi="Arial" w:cs="Arial"/>
         </w:rPr>
@@ -6071,6 +7033,7 @@
     <w:p>
       <w:pPr>
         <w:pStyle w:val="ListParagraph"/>
+        <w:ind w:left="1080"/>
         <w:rPr>
           <w:rFonts w:ascii="Arial" w:hAnsi="Arial" w:cs="Arial"/>
         </w:rPr>
@@ -6079,6 +7042,7 @@
     <w:p>
       <w:pPr>
         <w:pStyle w:val="ListParagraph"/>
+        <w:ind w:left="1080"/>
         <w:rPr>
           <w:rFonts w:ascii="Arial" w:hAnsi="Arial" w:cs="Arial"/>
         </w:rPr>
@@ -6087,6 +7051,7 @@
     <w:p>
       <w:pPr>
         <w:pStyle w:val="ListParagraph"/>
+        <w:ind w:left="1080"/>
         <w:rPr>
           <w:rFonts w:ascii="Arial" w:hAnsi="Arial" w:cs="Arial"/>
         </w:rPr>
@@ -6095,6 +7060,7 @@
     <w:p>
       <w:pPr>
         <w:pStyle w:val="ListParagraph"/>
+        <w:ind w:left="1080"/>
         <w:rPr>
           <w:rFonts w:ascii="Arial" w:hAnsi="Arial" w:cs="Arial"/>
         </w:rPr>
@@ -6103,6 +7069,7 @@
     <w:p>
       <w:pPr>
         <w:pStyle w:val="ListParagraph"/>
+        <w:ind w:left="1080"/>
         <w:rPr>
           <w:rFonts w:ascii="Arial" w:hAnsi="Arial" w:cs="Arial"/>
         </w:rPr>
@@ -6111,6 +7078,7 @@
     <w:p>
       <w:pPr>
         <w:pStyle w:val="ListParagraph"/>
+        <w:ind w:left="1080"/>
         <w:rPr>
           <w:rFonts w:ascii="Arial" w:hAnsi="Arial" w:cs="Arial"/>
         </w:rPr>
@@ -6119,6 +7087,7 @@
     <w:p>
       <w:pPr>
         <w:pStyle w:val="ListParagraph"/>
+        <w:ind w:left="1080"/>
         <w:rPr>
           <w:rFonts w:ascii="Arial" w:hAnsi="Arial" w:cs="Arial"/>
         </w:rPr>
@@ -6127,6 +7096,7 @@
     <w:p>
       <w:pPr>
         <w:pStyle w:val="ListParagraph"/>
+        <w:ind w:left="1080"/>
         <w:rPr>
           <w:rFonts w:ascii="Arial" w:hAnsi="Arial" w:cs="Arial"/>
         </w:rPr>
@@ -6135,13 +7105,7 @@
     <w:p>
       <w:pPr>
         <w:pStyle w:val="ListParagraph"/>
-        <w:rPr>
-          <w:rFonts w:ascii="Arial" w:hAnsi="Arial" w:cs="Arial"/>
-        </w:rPr>
-      </w:pPr>
-    </w:p>
-    <w:p>
-      <w:pPr>
+        <w:ind w:left="1080"/>
         <w:rPr>
           <w:rFonts w:ascii="Arial" w:hAnsi="Arial" w:cs="Arial"/>
         </w:rPr>
@@ -6150,6 +7114,7 @@
     <w:p>
       <w:pPr>
         <w:pStyle w:val="ListParagraph"/>
+        <w:ind w:left="1080"/>
         <w:rPr>
           <w:rFonts w:ascii="Arial" w:hAnsi="Arial" w:cs="Arial"/>
         </w:rPr>
@@ -6158,6 +7123,7 @@
     <w:p>
       <w:pPr>
         <w:pStyle w:val="ListParagraph"/>
+        <w:ind w:left="1080"/>
         <w:rPr>
           <w:rFonts w:ascii="Arial" w:hAnsi="Arial" w:cs="Arial"/>
         </w:rPr>
@@ -6166,6 +7132,68 @@
     <w:p>
       <w:pPr>
         <w:pStyle w:val="ListParagraph"/>
+        <w:ind w:left="1080"/>
+        <w:rPr>
+          <w:rFonts w:ascii="Arial" w:hAnsi="Arial" w:cs="Arial"/>
+        </w:rPr>
+      </w:pPr>
+    </w:p>
+    <w:p>
+      <w:pPr>
+        <w:pStyle w:val="ListParagraph"/>
+        <w:ind w:left="1080"/>
+        <w:rPr>
+          <w:rFonts w:ascii="Arial" w:hAnsi="Arial" w:cs="Arial"/>
+        </w:rPr>
+      </w:pPr>
+    </w:p>
+    <w:p>
+      <w:pPr>
+        <w:pStyle w:val="ListParagraph"/>
+        <w:ind w:left="1080"/>
+        <w:rPr>
+          <w:rFonts w:ascii="Arial" w:hAnsi="Arial" w:cs="Arial"/>
+        </w:rPr>
+      </w:pPr>
+    </w:p>
+    <w:p>
+      <w:pPr>
+        <w:pStyle w:val="ListParagraph"/>
+        <w:ind w:left="1080"/>
+        <w:rPr>
+          <w:rFonts w:ascii="Arial" w:hAnsi="Arial" w:cs="Arial"/>
+        </w:rPr>
+      </w:pPr>
+    </w:p>
+    <w:p>
+      <w:pPr>
+        <w:pStyle w:val="ListParagraph"/>
+        <w:ind w:left="1080"/>
+        <w:rPr>
+          <w:rFonts w:ascii="Arial" w:hAnsi="Arial" w:cs="Arial"/>
+        </w:rPr>
+      </w:pPr>
+    </w:p>
+    <w:p>
+      <w:pPr>
+        <w:pStyle w:val="ListParagraph"/>
+        <w:ind w:left="1080"/>
+        <w:rPr>
+          <w:rFonts w:ascii="Arial" w:hAnsi="Arial" w:cs="Arial"/>
+        </w:rPr>
+      </w:pPr>
+    </w:p>
+    <w:p>
+      <w:pPr>
+        <w:pStyle w:val="ListParagraph"/>
+        <w:ind w:left="1080"/>
+        <w:rPr>
+          <w:rFonts w:ascii="Arial" w:hAnsi="Arial" w:cs="Arial"/>
+        </w:rPr>
+      </w:pPr>
+    </w:p>
+    <w:p>
+      <w:pPr>
         <w:rPr>
           <w:rFonts w:ascii="Arial" w:hAnsi="Arial" w:cs="Arial"/>
         </w:rPr>
@@ -6194,15 +7222,9 @@
           <w:sz w:val="32"/>
           <w:szCs w:val="32"/>
         </w:rPr>
+        <w:lastRenderedPageBreak/>
         <w:t>Future Computing Services</w:t>
       </w:r>
-    </w:p>
-    <w:p>
-      <w:pPr>
-        <w:rPr>
-          <w:rFonts w:ascii="Arial" w:hAnsi="Arial" w:cs="Arial"/>
-        </w:rPr>
-      </w:pPr>
     </w:p>
     <w:p>
       <w:pPr>
@@ -6421,16 +7443,14 @@
         <w:rPr>
           <w:rFonts w:ascii="Arial" w:hAnsi="Arial" w:cs="Arial"/>
         </w:rPr>
-        <w:t xml:space="preserve">, Distributed computing refers to </w:t>
-      </w:r>
-      <w:proofErr w:type="gramStart"/>
-      <w:r>
-        <w:rPr>
-          <w:rFonts w:ascii="Arial" w:hAnsi="Arial" w:cs="Arial"/>
-        </w:rPr>
-        <w:t>a</w:t>
-      </w:r>
-      <w:proofErr w:type="gramEnd"/>
+        <w:t>, Distributed computing refers to a</w:t>
+      </w:r>
+      <w:r>
+        <w:rPr>
+          <w:rFonts w:ascii="Arial" w:hAnsi="Arial" w:cs="Arial"/>
+        </w:rPr>
+        <w:t>n</w:t>
+      </w:r>
       <w:r>
         <w:rPr>
           <w:rFonts w:ascii="Arial" w:hAnsi="Arial" w:cs="Arial"/>
@@ -6447,7 +7467,19 @@
         <w:rPr>
           <w:rFonts w:ascii="Arial" w:hAnsi="Arial" w:cs="Arial"/>
         </w:rPr>
-        <w:t xml:space="preserve"> where data processing and storage is di</w:t>
+        <w:t xml:space="preserve"> where data processing and storage </w:t>
+      </w:r>
+      <w:r>
+        <w:rPr>
+          <w:rFonts w:ascii="Arial" w:hAnsi="Arial" w:cs="Arial"/>
+        </w:rPr>
+        <w:t>are</w:t>
+      </w:r>
+      <w:r>
+        <w:rPr>
+          <w:rFonts w:ascii="Arial" w:hAnsi="Arial" w:cs="Arial"/>
+        </w:rPr>
+        <w:t xml:space="preserve"> di</w:t>
       </w:r>
       <w:r>
         <w:rPr>
@@ -6459,69 +7491,357 @@
         <w:rPr>
           <w:rFonts w:ascii="Arial" w:hAnsi="Arial" w:cs="Arial"/>
         </w:rPr>
-        <w:t>tributed across multiple systems rather than being handled by a single central device.</w:t>
-      </w:r>
-      <w:r>
-        <w:rPr>
-          <w:rFonts w:ascii="Arial" w:hAnsi="Arial" w:cs="Arial"/>
-        </w:rPr>
-        <w:t xml:space="preserve"> </w:t>
-      </w:r>
-      <w:r>
-        <w:rPr>
-          <w:rFonts w:ascii="Arial" w:hAnsi="Arial" w:cs="Arial"/>
-        </w:rPr>
-        <w:t xml:space="preserve">Distributed computing </w:t>
-      </w:r>
-      <w:proofErr w:type="gramStart"/>
-      <w:r>
-        <w:rPr>
-          <w:rFonts w:ascii="Arial" w:hAnsi="Arial" w:cs="Arial"/>
-        </w:rPr>
-        <w:t>are</w:t>
-      </w:r>
-      <w:proofErr w:type="gramEnd"/>
-      <w:r>
-        <w:rPr>
-          <w:rFonts w:ascii="Arial" w:hAnsi="Arial" w:cs="Arial"/>
-        </w:rPr>
-        <w:t xml:space="preserve"> made up of the key components which includes Device, Network and resource management. Distributed computing is made up of different types including client-server system and peer system. Distributed computing is used in banks, computing, energy and science. Distributed computing advantages include scalability, reliability and flexibility. Some of disadvantages </w:t>
-      </w:r>
-      <w:proofErr w:type="gramStart"/>
-      <w:r>
-        <w:rPr>
-          <w:rFonts w:ascii="Arial" w:hAnsi="Arial" w:cs="Arial"/>
-        </w:rPr>
-        <w:t>of  distributed</w:t>
-      </w:r>
-      <w:proofErr w:type="gramEnd"/>
-      <w:r>
-        <w:rPr>
-          <w:rFonts w:ascii="Arial" w:hAnsi="Arial" w:cs="Arial"/>
-        </w:rPr>
-        <w:t xml:space="preserve"> computing include complexity, security and </w:t>
+        <w:t>tributed across multiple</w:t>
+      </w:r>
+      <w:r>
+        <w:rPr>
+          <w:rFonts w:ascii="Arial" w:hAnsi="Arial" w:cs="Arial"/>
+        </w:rPr>
+        <w:t xml:space="preserve"> independent</w:t>
+      </w:r>
+      <w:r>
+        <w:rPr>
+          <w:rFonts w:ascii="Arial" w:hAnsi="Arial" w:cs="Arial"/>
+        </w:rPr>
+        <w:t xml:space="preserve"> systems </w:t>
+      </w:r>
+      <w:r>
+        <w:rPr>
+          <w:rFonts w:ascii="Arial" w:hAnsi="Arial" w:cs="Arial"/>
+        </w:rPr>
+        <w:t xml:space="preserve">connected via a network </w:t>
+      </w:r>
+      <w:r>
+        <w:rPr>
+          <w:rFonts w:ascii="Arial" w:hAnsi="Arial" w:cs="Arial"/>
+        </w:rPr>
+        <w:t>rather than being handled by a single central device</w:t>
+      </w:r>
+      <w:r>
+        <w:rPr>
+          <w:rFonts w:ascii="Arial" w:hAnsi="Arial" w:cs="Arial"/>
+        </w:rPr>
+        <w:t xml:space="preserve">. As technology continues to grow, many startup companies require more computing power than a single server can provide. It is for this reason that </w:t>
       </w:r>
       <w:proofErr w:type="spellStart"/>
       <w:r>
         <w:rPr>
           <w:rFonts w:ascii="Arial" w:hAnsi="Arial" w:cs="Arial"/>
         </w:rPr>
-        <w:t>perfomance</w:t>
+        <w:t>QuantumTech</w:t>
       </w:r>
       <w:proofErr w:type="spellEnd"/>
       <w:r>
         <w:rPr>
           <w:rFonts w:ascii="Arial" w:hAnsi="Arial" w:cs="Arial"/>
         </w:rPr>
+        <w:t xml:space="preserve"> should consider offering distributed computing services so that it can support these companies and expand its business. Therefore, it is important to distinguish between the two models of distributed computing which include:</w:t>
+      </w:r>
+    </w:p>
+    <w:p>
+      <w:pPr>
+        <w:pStyle w:val="ListParagraph"/>
+        <w:numPr>
+          <w:ilvl w:val="0"/>
+          <w:numId w:val="31"/>
+        </w:numPr>
+        <w:rPr>
+          <w:rFonts w:ascii="Arial" w:hAnsi="Arial" w:cs="Arial"/>
+        </w:rPr>
+      </w:pPr>
+      <w:r>
+        <w:rPr>
+          <w:rFonts w:ascii="Arial" w:hAnsi="Arial" w:cs="Arial"/>
+        </w:rPr>
+        <w:t>Client-Server Model</w:t>
+      </w:r>
+    </w:p>
+    <w:p>
+      <w:pPr>
+        <w:rPr>
+          <w:rFonts w:ascii="Arial" w:hAnsi="Arial" w:cs="Arial"/>
+        </w:rPr>
+      </w:pPr>
+      <w:r>
+        <w:rPr>
+          <w:rFonts w:ascii="Arial" w:hAnsi="Arial" w:cs="Arial"/>
+        </w:rPr>
+        <w:t xml:space="preserve">In this model, dedicated computers acting as servers provide services while other computers acting as clients request and consume those services. This model is highly centralized, making it easier to manage, secure and allocate resources </w:t>
+      </w:r>
+      <w:proofErr w:type="spellStart"/>
+      <w:r>
+        <w:rPr>
+          <w:rFonts w:ascii="Arial" w:hAnsi="Arial" w:cs="Arial"/>
+        </w:rPr>
+        <w:t>effienciently</w:t>
+      </w:r>
+      <w:proofErr w:type="spellEnd"/>
+      <w:r>
+        <w:rPr>
+          <w:rFonts w:ascii="Arial" w:hAnsi="Arial" w:cs="Arial"/>
+        </w:rPr>
         <w:t>.</w:t>
       </w:r>
     </w:p>
     <w:p>
       <w:pPr>
-        <w:rPr>
-          <w:rFonts w:ascii="Arial" w:hAnsi="Arial" w:cs="Arial"/>
-        </w:rPr>
-      </w:pPr>
+        <w:pStyle w:val="ListParagraph"/>
+        <w:numPr>
+          <w:ilvl w:val="0"/>
+          <w:numId w:val="31"/>
+        </w:numPr>
+        <w:rPr>
+          <w:rFonts w:ascii="Arial" w:hAnsi="Arial" w:cs="Arial"/>
+        </w:rPr>
+      </w:pPr>
+      <w:r>
+        <w:rPr>
+          <w:rFonts w:ascii="Arial" w:hAnsi="Arial" w:cs="Arial"/>
+        </w:rPr>
+        <w:t>Peer-to-Peer (P2P) Model</w:t>
+      </w:r>
+    </w:p>
+    <w:p>
+      <w:pPr>
+        <w:rPr>
+          <w:rFonts w:ascii="Arial" w:hAnsi="Arial" w:cs="Arial"/>
+        </w:rPr>
+      </w:pPr>
+      <w:r>
+        <w:rPr>
+          <w:rFonts w:ascii="Arial" w:hAnsi="Arial" w:cs="Arial"/>
+        </w:rPr>
+        <w:t>In this architecture, all computers have equal status which means computers can act as both clients and servers sharing resources directly with each other without a central device. Although this model is highly flexible, it is decentralized and significantly harder to secure and manage.</w:t>
+      </w:r>
+    </w:p>
+    <w:p>
+      <w:pPr>
+        <w:rPr>
+          <w:rFonts w:ascii="Arial" w:hAnsi="Arial" w:cs="Arial"/>
+        </w:rPr>
+      </w:pPr>
+    </w:p>
+    <w:p>
+      <w:pPr>
+        <w:rPr>
+          <w:rFonts w:ascii="Arial" w:hAnsi="Arial" w:cs="Arial"/>
+        </w:rPr>
+      </w:pPr>
+      <w:r>
+        <w:rPr>
+          <w:rFonts w:ascii="Arial" w:hAnsi="Arial" w:cs="Arial"/>
+        </w:rPr>
+        <w:t>The following are fo</w:t>
+      </w:r>
+      <w:r>
+        <w:rPr>
+          <w:rFonts w:ascii="Arial" w:hAnsi="Arial" w:cs="Arial"/>
+        </w:rPr>
+        <w:t xml:space="preserve">ur characteristics of distributed computing among others and how they are useful to </w:t>
+      </w:r>
+      <w:proofErr w:type="spellStart"/>
+      <w:r>
+        <w:rPr>
+          <w:rFonts w:ascii="Arial" w:hAnsi="Arial" w:cs="Arial"/>
+        </w:rPr>
+        <w:t>Techville</w:t>
+      </w:r>
+      <w:proofErr w:type="spellEnd"/>
+      <w:r>
+        <w:rPr>
+          <w:rFonts w:ascii="Arial" w:hAnsi="Arial" w:cs="Arial"/>
+        </w:rPr>
+        <w:t xml:space="preserve"> start-ups:</w:t>
+      </w:r>
+    </w:p>
+    <w:p>
+      <w:pPr>
+        <w:pStyle w:val="ListParagraph"/>
+        <w:numPr>
+          <w:ilvl w:val="0"/>
+          <w:numId w:val="32"/>
+        </w:numPr>
+        <w:rPr>
+          <w:rFonts w:ascii="Arial" w:hAnsi="Arial" w:cs="Arial"/>
+        </w:rPr>
+      </w:pPr>
+      <w:r>
+        <w:rPr>
+          <w:rFonts w:ascii="Arial" w:hAnsi="Arial" w:cs="Arial"/>
+        </w:rPr>
+        <w:t>Concurrency</w:t>
+      </w:r>
+    </w:p>
+    <w:p>
+      <w:pPr>
+        <w:pStyle w:val="ListParagraph"/>
+        <w:rPr>
+          <w:rFonts w:ascii="Arial" w:hAnsi="Arial" w:cs="Arial"/>
+        </w:rPr>
+      </w:pPr>
+      <w:proofErr w:type="spellStart"/>
+      <w:r>
+        <w:rPr>
+          <w:rFonts w:ascii="Arial" w:hAnsi="Arial" w:cs="Arial"/>
+        </w:rPr>
+        <w:t>Concurency</w:t>
+      </w:r>
+      <w:proofErr w:type="spellEnd"/>
+      <w:r>
+        <w:rPr>
+          <w:rFonts w:ascii="Arial" w:hAnsi="Arial" w:cs="Arial"/>
+        </w:rPr>
+        <w:t xml:space="preserve"> is ability of a system to run multiple processes </w:t>
+      </w:r>
+      <w:proofErr w:type="spellStart"/>
+      <w:r>
+        <w:rPr>
+          <w:rFonts w:ascii="Arial" w:hAnsi="Arial" w:cs="Arial"/>
+        </w:rPr>
+        <w:t>silmutaneously</w:t>
+      </w:r>
+      <w:proofErr w:type="spellEnd"/>
+      <w:r>
+        <w:rPr>
+          <w:rFonts w:ascii="Arial" w:hAnsi="Arial" w:cs="Arial"/>
+        </w:rPr>
+        <w:t xml:space="preserve"> across different devices. This is highly useful for Artificial Intelligence (AI) startups because it allows them t train complex machine learning models much faster by diving the workload across multiple machines at the same time.</w:t>
+      </w:r>
+    </w:p>
+    <w:p>
+      <w:pPr>
+        <w:pStyle w:val="ListParagraph"/>
+        <w:rPr>
+          <w:rFonts w:ascii="Arial" w:hAnsi="Arial" w:cs="Arial"/>
+        </w:rPr>
+      </w:pPr>
+    </w:p>
+    <w:p>
+      <w:pPr>
+        <w:pStyle w:val="ListParagraph"/>
+        <w:numPr>
+          <w:ilvl w:val="0"/>
+          <w:numId w:val="32"/>
+        </w:numPr>
+        <w:rPr>
+          <w:rFonts w:ascii="Arial" w:hAnsi="Arial" w:cs="Arial"/>
+        </w:rPr>
+      </w:pPr>
+      <w:r>
+        <w:rPr>
+          <w:rFonts w:ascii="Arial" w:hAnsi="Arial" w:cs="Arial"/>
+        </w:rPr>
+        <w:t>Scalability</w:t>
+      </w:r>
+    </w:p>
+    <w:p>
+      <w:pPr>
+        <w:pStyle w:val="ListParagraph"/>
+        <w:rPr>
+          <w:rFonts w:ascii="Arial" w:hAnsi="Arial" w:cs="Arial"/>
+        </w:rPr>
+      </w:pPr>
+      <w:r>
+        <w:rPr>
+          <w:rFonts w:ascii="Arial" w:hAnsi="Arial" w:cs="Arial"/>
+        </w:rPr>
+        <w:lastRenderedPageBreak/>
+        <w:t>Scalability means the ability for a system to add more nodes to a network without replacing the existing infrastructure. This benefits Big Data startups as they can seamlessly increase their storage and processing capacity as their data volumes expands.</w:t>
+      </w:r>
+    </w:p>
+    <w:p>
+      <w:pPr>
+        <w:pStyle w:val="ListParagraph"/>
+        <w:rPr>
+          <w:rFonts w:ascii="Arial" w:hAnsi="Arial" w:cs="Arial"/>
+        </w:rPr>
+      </w:pPr>
+    </w:p>
+    <w:p>
+      <w:pPr>
+        <w:pStyle w:val="ListParagraph"/>
+        <w:numPr>
+          <w:ilvl w:val="0"/>
+          <w:numId w:val="32"/>
+        </w:numPr>
+        <w:rPr>
+          <w:rFonts w:ascii="Arial" w:hAnsi="Arial" w:cs="Arial"/>
+        </w:rPr>
+      </w:pPr>
+      <w:r>
+        <w:rPr>
+          <w:rFonts w:ascii="Arial" w:hAnsi="Arial" w:cs="Arial"/>
+        </w:rPr>
+        <w:t>Fault Tolerance</w:t>
+      </w:r>
+    </w:p>
+    <w:p>
+      <w:pPr>
+        <w:pStyle w:val="ListParagraph"/>
+        <w:rPr>
+          <w:rFonts w:ascii="Arial" w:hAnsi="Arial" w:cs="Arial"/>
+        </w:rPr>
+      </w:pPr>
+      <w:r>
+        <w:rPr>
+          <w:rFonts w:ascii="Arial" w:hAnsi="Arial" w:cs="Arial"/>
+        </w:rPr>
+        <w:t xml:space="preserve">Fault tolerance means the ability of the system to keep running even if there is a fault occurring in the system, preventing total </w:t>
+      </w:r>
+      <w:proofErr w:type="spellStart"/>
+      <w:r>
+        <w:rPr>
+          <w:rFonts w:ascii="Arial" w:hAnsi="Arial" w:cs="Arial"/>
+        </w:rPr>
+        <w:t>failture</w:t>
+      </w:r>
+      <w:proofErr w:type="spellEnd"/>
+      <w:r>
+        <w:rPr>
+          <w:rFonts w:ascii="Arial" w:hAnsi="Arial" w:cs="Arial"/>
+        </w:rPr>
+        <w:t xml:space="preserve"> of the system. This ensures highly reliable of the systems making startups not to cost a lot during system maintenance.</w:t>
+      </w:r>
+    </w:p>
+    <w:p>
+      <w:pPr>
+        <w:pStyle w:val="ListParagraph"/>
+        <w:rPr>
+          <w:rFonts w:ascii="Arial" w:hAnsi="Arial" w:cs="Arial"/>
+        </w:rPr>
+      </w:pPr>
+    </w:p>
+    <w:p>
+      <w:pPr>
+        <w:pStyle w:val="ListParagraph"/>
+        <w:numPr>
+          <w:ilvl w:val="0"/>
+          <w:numId w:val="32"/>
+        </w:numPr>
+        <w:rPr>
+          <w:rFonts w:ascii="Arial" w:hAnsi="Arial" w:cs="Arial"/>
+        </w:rPr>
+      </w:pPr>
+      <w:r>
+        <w:rPr>
+          <w:rFonts w:ascii="Arial" w:hAnsi="Arial" w:cs="Arial"/>
+        </w:rPr>
+        <w:t>Transparency</w:t>
+      </w:r>
+    </w:p>
+    <w:p>
+      <w:pPr>
+        <w:pStyle w:val="ListParagraph"/>
+        <w:rPr>
+          <w:rFonts w:ascii="Arial" w:hAnsi="Arial" w:cs="Arial"/>
+        </w:rPr>
+      </w:pPr>
+      <w:r>
+        <w:rPr>
+          <w:rFonts w:ascii="Arial" w:hAnsi="Arial" w:cs="Arial"/>
+        </w:rPr>
+        <w:t>Transparency means ensuring that the complexity of the distributed system is hidden from the user. Start-up employees can access files and applications seamlessly as if they are working on a single local machine. This greatly simplifies their daily workflows.</w:t>
+      </w:r>
     </w:p>
     <w:p>
       <w:pPr>
@@ -6578,7 +7898,13 @@
         <w:rPr>
           <w:rFonts w:ascii="Arial" w:hAnsi="Arial" w:cs="Arial"/>
         </w:rPr>
-        <w:t>Normal computers</w:t>
+        <w:t xml:space="preserve">normal classical </w:t>
+      </w:r>
+      <w:r>
+        <w:rPr>
+          <w:rFonts w:ascii="Arial" w:hAnsi="Arial" w:cs="Arial"/>
+        </w:rPr>
+        <w:t>computers</w:t>
       </w:r>
       <w:r>
         <w:rPr>
@@ -6590,7 +7916,37 @@
         <w:rPr>
           <w:rFonts w:ascii="Arial" w:hAnsi="Arial" w:cs="Arial"/>
         </w:rPr>
-        <w:t xml:space="preserve"> uses “bits” represent data while </w:t>
+        <w:t xml:space="preserve"> represents data</w:t>
+      </w:r>
+      <w:r>
+        <w:rPr>
+          <w:rFonts w:ascii="Arial" w:hAnsi="Arial" w:cs="Arial"/>
+        </w:rPr>
+        <w:t xml:space="preserve"> us</w:t>
+      </w:r>
+      <w:r>
+        <w:rPr>
+          <w:rFonts w:ascii="Arial" w:hAnsi="Arial" w:cs="Arial"/>
+        </w:rPr>
+        <w:t>ing</w:t>
+      </w:r>
+      <w:r>
+        <w:rPr>
+          <w:rFonts w:ascii="Arial" w:hAnsi="Arial" w:cs="Arial"/>
+        </w:rPr>
+        <w:t xml:space="preserve"> “bits”</w:t>
+      </w:r>
+      <w:r>
+        <w:rPr>
+          <w:rFonts w:ascii="Arial" w:hAnsi="Arial" w:cs="Arial"/>
+        </w:rPr>
+        <w:t xml:space="preserve"> representing either a 0 or a 1 </w:t>
+      </w:r>
+      <w:r>
+        <w:rPr>
+          <w:rFonts w:ascii="Arial" w:hAnsi="Arial" w:cs="Arial"/>
+        </w:rPr>
+        <w:t xml:space="preserve">while </w:t>
       </w:r>
       <w:r>
         <w:rPr>
@@ -6614,35 +7970,19 @@
         <w:rPr>
           <w:rFonts w:ascii="Arial" w:hAnsi="Arial" w:cs="Arial"/>
         </w:rPr>
-        <w:t xml:space="preserve"> A qubit can exist in multiple states at the exact time. Furthermore, through entanglement, these qubits linked so that changing the state of one instantly affects the others, regardless of the physical distance between them. This allows quantum </w:t>
-      </w:r>
-      <w:proofErr w:type="gramStart"/>
-      <w:r>
-        <w:rPr>
-          <w:rFonts w:ascii="Arial" w:hAnsi="Arial" w:cs="Arial"/>
-        </w:rPr>
-        <w:t>computers  to</w:t>
-      </w:r>
-      <w:proofErr w:type="gramEnd"/>
-      <w:r>
-        <w:rPr>
-          <w:rFonts w:ascii="Arial" w:hAnsi="Arial" w:cs="Arial"/>
-        </w:rPr>
-        <w:t xml:space="preserve"> process complex calculations </w:t>
-      </w:r>
-      <w:proofErr w:type="gramStart"/>
-      <w:r>
-        <w:rPr>
-          <w:rFonts w:ascii="Arial" w:hAnsi="Arial" w:cs="Arial"/>
-        </w:rPr>
-        <w:t>instantaneously ,</w:t>
-      </w:r>
-      <w:proofErr w:type="gramEnd"/>
-      <w:r>
-        <w:rPr>
-          <w:rFonts w:ascii="Arial" w:hAnsi="Arial" w:cs="Arial"/>
-        </w:rPr>
-        <w:t xml:space="preserve"> eliminating the processing delays found in traditional systems.</w:t>
+        <w:t xml:space="preserve"> A qubit can exist in multiple states at the exact time. Furthermore, through entanglement, these qubits</w:t>
+      </w:r>
+      <w:r>
+        <w:rPr>
+          <w:rFonts w:ascii="Arial" w:hAnsi="Arial" w:cs="Arial"/>
+        </w:rPr>
+        <w:t xml:space="preserve"> are</w:t>
+      </w:r>
+      <w:r>
+        <w:rPr>
+          <w:rFonts w:ascii="Arial" w:hAnsi="Arial" w:cs="Arial"/>
+        </w:rPr>
+        <w:t xml:space="preserve"> linked so that changing the state of one instantly affects the others, regardless of the physical distance between them. This allows quantum computers to process complex calculations instantaneously, eliminating the processing delays found in traditional systems.</w:t>
       </w:r>
     </w:p>
     <w:p>
@@ -6656,21 +7996,7 @@
           <w:rFonts w:ascii="Arial" w:hAnsi="Arial" w:cs="Arial"/>
         </w:rPr>
         <w:br/>
-        <w:t xml:space="preserve">The following are some of the advantages </w:t>
-      </w:r>
-      <w:proofErr w:type="gramStart"/>
-      <w:r>
-        <w:rPr>
-          <w:rFonts w:ascii="Arial" w:hAnsi="Arial" w:cs="Arial"/>
-        </w:rPr>
-        <w:t>quantum  computing</w:t>
-      </w:r>
-      <w:proofErr w:type="gramEnd"/>
-      <w:r>
-        <w:rPr>
-          <w:rFonts w:ascii="Arial" w:hAnsi="Arial" w:cs="Arial"/>
-        </w:rPr>
-        <w:t xml:space="preserve"> has over classical computers.</w:t>
+        <w:t>The following are some of the advantages quantum computing has over classical computers.</w:t>
       </w:r>
     </w:p>
     <w:p>
@@ -6688,7 +8014,6 @@
         <w:rPr>
           <w:rFonts w:ascii="Arial" w:hAnsi="Arial" w:cs="Arial"/>
         </w:rPr>
-        <w:lastRenderedPageBreak/>
         <w:t>Speed</w:t>
       </w:r>
     </w:p>
@@ -6703,49 +8028,69 @@
         <w:rPr>
           <w:rFonts w:ascii="Arial" w:hAnsi="Arial" w:cs="Arial"/>
         </w:rPr>
-        <w:t xml:space="preserve">Quantum computing can solve highly complex problems faster than classical computers by evaluating multiple possibilities at once. This results in massive time </w:t>
-      </w:r>
-      <w:proofErr w:type="gramStart"/>
-      <w:r>
-        <w:rPr>
-          <w:rFonts w:ascii="Arial" w:hAnsi="Arial" w:cs="Arial"/>
-        </w:rPr>
-        <w:t>saving  for</w:t>
-      </w:r>
-      <w:proofErr w:type="gramEnd"/>
-      <w:r>
-        <w:rPr>
-          <w:rFonts w:ascii="Arial" w:hAnsi="Arial" w:cs="Arial"/>
-        </w:rPr>
-        <w:t xml:space="preserve"> </w:t>
+        <w:t>Quantum computing can solve highly complex problems faster than classical computers by evaluating multiple possibilities at once. This results in massive time saving</w:t>
+      </w:r>
+      <w:r>
+        <w:rPr>
+          <w:rFonts w:ascii="Arial" w:hAnsi="Arial" w:cs="Arial"/>
+        </w:rPr>
+        <w:t>s</w:t>
+      </w:r>
+      <w:r>
+        <w:rPr>
+          <w:rFonts w:ascii="Arial" w:hAnsi="Arial" w:cs="Arial"/>
+        </w:rPr>
+        <w:t xml:space="preserve"> for </w:t>
       </w:r>
       <w:proofErr w:type="spellStart"/>
       <w:r>
         <w:rPr>
           <w:rFonts w:ascii="Arial" w:hAnsi="Arial" w:cs="Arial"/>
         </w:rPr>
-        <w:t>QuantumTech</w:t>
+        <w:t>Techville</w:t>
       </w:r>
       <w:proofErr w:type="spellEnd"/>
       <w:r>
         <w:rPr>
           <w:rFonts w:ascii="Arial" w:hAnsi="Arial" w:cs="Arial"/>
         </w:rPr>
-        <w:t xml:space="preserve"> startup dealing with </w:t>
-      </w:r>
-      <w:proofErr w:type="spellStart"/>
-      <w:r>
-        <w:rPr>
-          <w:rFonts w:ascii="Arial" w:hAnsi="Arial" w:cs="Arial"/>
-        </w:rPr>
-        <w:t>coplex</w:t>
-      </w:r>
-      <w:proofErr w:type="spellEnd"/>
-      <w:r>
-        <w:rPr>
-          <w:rFonts w:ascii="Arial" w:hAnsi="Arial" w:cs="Arial"/>
-        </w:rPr>
-        <w:t xml:space="preserve"> data models.</w:t>
+        <w:t xml:space="preserve"> start</w:t>
+      </w:r>
+      <w:r>
+        <w:rPr>
+          <w:rFonts w:ascii="Arial" w:hAnsi="Arial" w:cs="Arial"/>
+        </w:rPr>
+        <w:t>-</w:t>
+      </w:r>
+      <w:r>
+        <w:rPr>
+          <w:rFonts w:ascii="Arial" w:hAnsi="Arial" w:cs="Arial"/>
+        </w:rPr>
+        <w:t>up</w:t>
+      </w:r>
+      <w:r>
+        <w:rPr>
+          <w:rFonts w:ascii="Arial" w:hAnsi="Arial" w:cs="Arial"/>
+        </w:rPr>
+        <w:t>s</w:t>
+      </w:r>
+      <w:r>
+        <w:rPr>
+          <w:rFonts w:ascii="Arial" w:hAnsi="Arial" w:cs="Arial"/>
+        </w:rPr>
+        <w:t xml:space="preserve"> dealing with co</w:t>
+      </w:r>
+      <w:r>
+        <w:rPr>
+          <w:rFonts w:ascii="Arial" w:hAnsi="Arial" w:cs="Arial"/>
+        </w:rPr>
+        <w:t>m</w:t>
+      </w:r>
+      <w:r>
+        <w:rPr>
+          <w:rFonts w:ascii="Arial" w:hAnsi="Arial" w:cs="Arial"/>
+        </w:rPr>
+        <w:t>plex data models.</w:t>
       </w:r>
     </w:p>
     <w:p>
@@ -6785,7 +8130,26 @@
         <w:rPr>
           <w:rFonts w:ascii="Arial" w:hAnsi="Arial" w:cs="Arial"/>
         </w:rPr>
-        <w:t xml:space="preserve">Quantum computers can process vast amount of data by utilizing the components individually. This creates potential for AI startups to </w:t>
+        <w:lastRenderedPageBreak/>
+        <w:t xml:space="preserve">Due to superposition. </w:t>
+      </w:r>
+      <w:r>
+        <w:rPr>
+          <w:rFonts w:ascii="Arial" w:hAnsi="Arial" w:cs="Arial"/>
+        </w:rPr>
+        <w:t>Quantum computers can process vast amount of data by utilizing the components individually. This creates potential for AI start</w:t>
+      </w:r>
+      <w:r>
+        <w:rPr>
+          <w:rFonts w:ascii="Arial" w:hAnsi="Arial" w:cs="Arial"/>
+        </w:rPr>
+        <w:t>-</w:t>
+      </w:r>
+      <w:r>
+        <w:rPr>
+          <w:rFonts w:ascii="Arial" w:hAnsi="Arial" w:cs="Arial"/>
+        </w:rPr>
+        <w:t xml:space="preserve">ups to </w:t>
       </w:r>
       <w:proofErr w:type="gramStart"/>
       <w:r>
@@ -6821,14 +8185,12 @@
           <w:rFonts w:ascii="Arial" w:hAnsi="Arial" w:cs="Arial"/>
         </w:rPr>
       </w:pPr>
-      <w:proofErr w:type="spellStart"/>
-      <w:r>
-        <w:rPr>
-          <w:rFonts w:ascii="Arial" w:hAnsi="Arial" w:cs="Arial"/>
-        </w:rPr>
-        <w:t>Optimisation</w:t>
-      </w:r>
-      <w:proofErr w:type="spellEnd"/>
+      <w:r>
+        <w:rPr>
+          <w:rFonts w:ascii="Arial" w:hAnsi="Arial" w:cs="Arial"/>
+        </w:rPr>
+        <w:t>Optimization</w:t>
+      </w:r>
     </w:p>
     <w:p>
       <w:pPr>
@@ -6843,31 +8205,48 @@
         </w:rPr>
         <w:t xml:space="preserve">Quantum computers can find the absolute best solution among millions of variables. This is highly </w:t>
       </w:r>
-      <w:proofErr w:type="spellStart"/>
-      <w:r>
-        <w:rPr>
-          <w:rFonts w:ascii="Arial" w:hAnsi="Arial" w:cs="Arial"/>
-        </w:rPr>
-        <w:t>calued</w:t>
-      </w:r>
-      <w:proofErr w:type="spellEnd"/>
-      <w:r>
-        <w:rPr>
-          <w:rFonts w:ascii="Arial" w:hAnsi="Arial" w:cs="Arial"/>
-        </w:rPr>
-        <w:t xml:space="preserve"> for Big Data and logistics startups that need to optimize complex operational routes.</w:t>
-      </w:r>
-    </w:p>
-    <w:p>
-      <w:pPr>
-        <w:pStyle w:val="ListParagraph"/>
-        <w:rPr>
-          <w:rFonts w:ascii="Arial" w:hAnsi="Arial" w:cs="Arial"/>
-        </w:rPr>
-      </w:pPr>
-    </w:p>
-    <w:p>
-      <w:pPr>
+      <w:r>
+        <w:rPr>
+          <w:rFonts w:ascii="Arial" w:hAnsi="Arial" w:cs="Arial"/>
+        </w:rPr>
+        <w:t>v</w:t>
+      </w:r>
+      <w:r>
+        <w:rPr>
+          <w:rFonts w:ascii="Arial" w:hAnsi="Arial" w:cs="Arial"/>
+        </w:rPr>
+        <w:t>alue</w:t>
+      </w:r>
+      <w:r>
+        <w:rPr>
+          <w:rFonts w:ascii="Arial" w:hAnsi="Arial" w:cs="Arial"/>
+        </w:rPr>
+        <w:t>d</w:t>
+      </w:r>
+      <w:r>
+        <w:rPr>
+          <w:rFonts w:ascii="Arial" w:hAnsi="Arial" w:cs="Arial"/>
+        </w:rPr>
+        <w:t xml:space="preserve"> for</w:t>
+      </w:r>
+      <w:r>
+        <w:rPr>
+          <w:rFonts w:ascii="Arial" w:hAnsi="Arial" w:cs="Arial"/>
+        </w:rPr>
+        <w:t xml:space="preserve"> l</w:t>
+      </w:r>
+      <w:r>
+        <w:rPr>
+          <w:rFonts w:ascii="Arial" w:hAnsi="Arial" w:cs="Arial"/>
+        </w:rPr>
+        <w:t xml:space="preserve"> Big Data and logistics startups that need to optimize complex operational routes.</w:t>
+      </w:r>
+    </w:p>
+    <w:p>
+      <w:pPr>
+        <w:tabs>
+          <w:tab w:val="left" w:pos="5613"/>
+        </w:tabs>
         <w:rPr>
           <w:rFonts w:ascii="Arial" w:hAnsi="Arial" w:cs="Arial"/>
           <w:b/>
@@ -6885,6 +8264,150 @@
           <w:rFonts w:ascii="Arial" w:hAnsi="Arial" w:cs="Arial"/>
         </w:rPr>
       </w:pPr>
+      <w:r>
+        <w:rPr>
+          <w:rFonts w:ascii="Arial" w:hAnsi="Arial" w:cs="Arial"/>
+        </w:rPr>
+        <w:t xml:space="preserve">In addition to that, quantum computing is useful in cryptography because it can solve </w:t>
+      </w:r>
+      <w:r>
+        <w:rPr>
+          <w:rFonts w:ascii="Arial" w:hAnsi="Arial" w:cs="Arial"/>
+        </w:rPr>
+        <w:t xml:space="preserve">some mathematical </w:t>
+      </w:r>
+      <w:r>
+        <w:rPr>
+          <w:rFonts w:ascii="Arial" w:hAnsi="Arial" w:cs="Arial"/>
+        </w:rPr>
+        <w:t>problems much faster than normal computers</w:t>
+      </w:r>
+      <w:r>
+        <w:rPr>
+          <w:rFonts w:ascii="Arial" w:hAnsi="Arial" w:cs="Arial"/>
+        </w:rPr>
+        <w:t xml:space="preserve">. Current encryption methods like RSA are secure because traditional computers take a very long time to break them. </w:t>
+      </w:r>
+      <w:proofErr w:type="spellStart"/>
+      <w:proofErr w:type="gramStart"/>
+      <w:r>
+        <w:rPr>
+          <w:rFonts w:ascii="Arial" w:hAnsi="Arial" w:cs="Arial"/>
+        </w:rPr>
+        <w:t>However,in</w:t>
+      </w:r>
+      <w:proofErr w:type="spellEnd"/>
+      <w:proofErr w:type="gramEnd"/>
+      <w:r>
+        <w:rPr>
+          <w:rFonts w:ascii="Arial" w:hAnsi="Arial" w:cs="Arial"/>
+        </w:rPr>
+        <w:t xml:space="preserve"> the future quantum computers may break this type of encryption much faster in the </w:t>
+      </w:r>
+      <w:proofErr w:type="spellStart"/>
+      <w:proofErr w:type="gramStart"/>
+      <w:r>
+        <w:rPr>
+          <w:rFonts w:ascii="Arial" w:hAnsi="Arial" w:cs="Arial"/>
+        </w:rPr>
+        <w:t>future.</w:t>
+      </w:r>
+      <w:r>
+        <w:rPr>
+          <w:rFonts w:ascii="Arial" w:hAnsi="Arial" w:cs="Arial"/>
+        </w:rPr>
+        <w:t>Therefore</w:t>
+      </w:r>
+      <w:proofErr w:type="spellEnd"/>
+      <w:proofErr w:type="gramEnd"/>
+      <w:r>
+        <w:rPr>
+          <w:rFonts w:ascii="Arial" w:hAnsi="Arial" w:cs="Arial"/>
+        </w:rPr>
+        <w:t xml:space="preserve">, </w:t>
+      </w:r>
+      <w:proofErr w:type="spellStart"/>
+      <w:r>
+        <w:rPr>
+          <w:rFonts w:ascii="Arial" w:hAnsi="Arial" w:cs="Arial"/>
+        </w:rPr>
+        <w:t>QuantumTech</w:t>
+      </w:r>
+      <w:proofErr w:type="spellEnd"/>
+      <w:r>
+        <w:rPr>
+          <w:rFonts w:ascii="Arial" w:hAnsi="Arial" w:cs="Arial"/>
+        </w:rPr>
+        <w:t xml:space="preserve"> </w:t>
+      </w:r>
+      <w:r>
+        <w:rPr>
+          <w:rFonts w:ascii="Arial" w:hAnsi="Arial" w:cs="Arial"/>
+        </w:rPr>
+        <w:t>should consider</w:t>
+      </w:r>
+      <w:r>
+        <w:rPr>
+          <w:rFonts w:ascii="Arial" w:hAnsi="Arial" w:cs="Arial"/>
+        </w:rPr>
+        <w:t xml:space="preserve"> offer</w:t>
+      </w:r>
+      <w:r>
+        <w:rPr>
+          <w:rFonts w:ascii="Arial" w:hAnsi="Arial" w:cs="Arial"/>
+        </w:rPr>
+        <w:t>ing</w:t>
+      </w:r>
+      <w:r>
+        <w:rPr>
+          <w:rFonts w:ascii="Arial" w:hAnsi="Arial" w:cs="Arial"/>
+        </w:rPr>
+        <w:t xml:space="preserve"> better security services to help</w:t>
+      </w:r>
+      <w:r>
+        <w:rPr>
+          <w:rFonts w:ascii="Arial" w:hAnsi="Arial" w:cs="Arial"/>
+        </w:rPr>
+        <w:t xml:space="preserve"> in</w:t>
+      </w:r>
+      <w:r>
+        <w:rPr>
+          <w:rFonts w:ascii="Arial" w:hAnsi="Arial" w:cs="Arial"/>
+        </w:rPr>
+        <w:t xml:space="preserve"> protec</w:t>
+      </w:r>
+      <w:r>
+        <w:rPr>
+          <w:rFonts w:ascii="Arial" w:hAnsi="Arial" w:cs="Arial"/>
+        </w:rPr>
+        <w:t>t</w:t>
+      </w:r>
+      <w:r>
+        <w:rPr>
+          <w:rFonts w:ascii="Arial" w:hAnsi="Arial" w:cs="Arial"/>
+        </w:rPr>
+        <w:t>ing sensitive</w:t>
+      </w:r>
+      <w:r>
+        <w:rPr>
+          <w:rFonts w:ascii="Arial" w:hAnsi="Arial" w:cs="Arial"/>
+        </w:rPr>
+        <w:t xml:space="preserve"> data of start-up business in </w:t>
+      </w:r>
+      <w:proofErr w:type="spellStart"/>
+      <w:r>
+        <w:rPr>
+          <w:rFonts w:ascii="Arial" w:hAnsi="Arial" w:cs="Arial"/>
+        </w:rPr>
+        <w:t>Techville</w:t>
+      </w:r>
+      <w:proofErr w:type="spellEnd"/>
+      <w:r>
+        <w:rPr>
+          <w:rFonts w:ascii="Arial" w:hAnsi="Arial" w:cs="Arial"/>
+        </w:rPr>
+        <w:t>.</w:t>
+      </w:r>
     </w:p>
     <w:sectPr>
       <w:pgSz w:w="12240" w:h="15840"/>
@@ -6899,6 +8422,92 @@
 <file path=word/numbering.xml><?xml version="1.0" encoding="utf-8"?>
 <w:numbering xmlns:wpc="http://schemas.microsoft.com/office/word/2010/wordprocessingCanvas" xmlns:cx="http://schemas.microsoft.com/office/drawing/2014/chartex" xmlns:cx1="http://schemas.microsoft.com/office/drawing/2015/9/8/chartex" xmlns:cx2="http://schemas.microsoft.com/office/drawing/2015/10/21/chartex" xmlns:cx3="http://schemas.microsoft.com/office/drawing/2016/5/9/chartex" xmlns:cx4="http://schemas.microsoft.com/office/drawing/2016/5/10/chartex" xmlns:cx5="http://schemas.microsoft.com/office/drawing/2016/5/11/chartex" xmlns:cx6="http://schemas.microsoft.com/office/drawing/2016/5/12/chartex" xmlns:cx7="http://schemas.microsoft.com/office/drawing/2016/5/13/chartex" xmlns:cx8="http://schemas.microsoft.com/office/drawing/2016/5/14/chartex" xmlns:mc="http://schemas.openxmlformats.org/markup-compatibility/2006" xmlns:aink="http://schemas.microsoft.com/office/drawing/2016/ink" xmlns:am3d="http://schemas.microsoft.com/office/drawing/2017/model3d" xmlns:o="urn:schemas-microsoft-com:office:office" xmlns:oel="http://schemas.microsoft.com/office/2019/extlst" xmlns:r="http://schemas.openxmlformats.org/officeDocument/2006/relationships" xmlns:m="http://schemas.openxmlformats.org/officeDocument/2006/math" xmlns:v="urn:schemas-microsoft-com:vml" xmlns:wp14="http://schemas.microsoft.com/office/word/2010/wordprocessingDrawing" xmlns:wp="http://schemas.openxmlformats.org/drawingml/2006/wordprocessingDrawing" xmlns:w10="urn:schemas-microsoft-com:office:word" xmlns:w="http://schemas.openxmlformats.org/wordprocessingml/2006/main" xmlns:w14="http://schemas.microsoft.com/office/word/2010/wordml" xmlns:w15="http://schemas.microsoft.com/office/word/2012/wordml" xmlns:w16cex="http://schemas.microsoft.com/office/word/2018/wordml/cex" xmlns:w16cid="http://schemas.microsoft.com/office/word/2016/wordml/cid" xmlns:w16="http://schemas.microsoft.com/office/word/2018/wordml" xmlns:w16du="http://schemas.microsoft.com/office/word/2023/wordml/word16du" xmlns:w16sdtdh="http://schemas.microsoft.com/office/word/2020/wordml/sdtdatahash" xmlns:w16sdtfl="http://schemas.microsoft.com/office/word/2024/wordml/sdtformatlock" xmlns:w16se="http://schemas.microsoft.com/office/word/2015/wordml/symex" xmlns:wpg="http://schemas.microsoft.com/office/word/2010/wordprocessingGroup" xmlns:wpi="http://schemas.microsoft.com/office/word/2010/wordprocessingInk" xmlns:wne="http://schemas.microsoft.com/office/word/2006/wordml" xmlns:wps="http://schemas.microsoft.com/office/word/2010/wordprocessingShape" mc:Ignorable="w14 w15 w16se w16cid w16 w16cex w16sdtdh w16sdtfl w16du wp14">
   <w:abstractNum w:abstractNumId="0" w15:restartNumberingAfterBreak="0">
+    <w:nsid w:val="03DA7D28"/>
+    <w:multiLevelType w:val="hybridMultilevel"/>
+    <w:tmpl w:val="33F82C1C"/>
+    <w:lvl w:ilvl="0" w:tplc="FFFFFFFF">
+      <w:start w:val="1"/>
+      <w:numFmt w:val="upperRoman"/>
+      <w:lvlText w:val="%1."/>
+      <w:lvlJc w:val="right"/>
+      <w:pPr>
+        <w:ind w:left="720" w:hanging="360"/>
+      </w:pPr>
+    </w:lvl>
+    <w:lvl w:ilvl="1" w:tplc="FFFFFFFF" w:tentative="1">
+      <w:start w:val="1"/>
+      <w:numFmt w:val="lowerLetter"/>
+      <w:lvlText w:val="%2."/>
+      <w:lvlJc w:val="left"/>
+      <w:pPr>
+        <w:ind w:left="1440" w:hanging="360"/>
+      </w:pPr>
+    </w:lvl>
+    <w:lvl w:ilvl="2" w:tplc="FFFFFFFF" w:tentative="1">
+      <w:start w:val="1"/>
+      <w:numFmt w:val="lowerRoman"/>
+      <w:lvlText w:val="%3."/>
+      <w:lvlJc w:val="right"/>
+      <w:pPr>
+        <w:ind w:left="2160" w:hanging="180"/>
+      </w:pPr>
+    </w:lvl>
+    <w:lvl w:ilvl="3" w:tplc="FFFFFFFF" w:tentative="1">
+      <w:start w:val="1"/>
+      <w:numFmt w:val="decimal"/>
+      <w:lvlText w:val="%4."/>
+      <w:lvlJc w:val="left"/>
+      <w:pPr>
+        <w:ind w:left="2880" w:hanging="360"/>
+      </w:pPr>
+    </w:lvl>
+    <w:lvl w:ilvl="4" w:tplc="FFFFFFFF" w:tentative="1">
+      <w:start w:val="1"/>
+      <w:numFmt w:val="lowerLetter"/>
+      <w:lvlText w:val="%5."/>
+      <w:lvlJc w:val="left"/>
+      <w:pPr>
+        <w:ind w:left="3600" w:hanging="360"/>
+      </w:pPr>
+    </w:lvl>
+    <w:lvl w:ilvl="5" w:tplc="FFFFFFFF" w:tentative="1">
+      <w:start w:val="1"/>
+      <w:numFmt w:val="lowerRoman"/>
+      <w:lvlText w:val="%6."/>
+      <w:lvlJc w:val="right"/>
+      <w:pPr>
+        <w:ind w:left="4320" w:hanging="180"/>
+      </w:pPr>
+    </w:lvl>
+    <w:lvl w:ilvl="6" w:tplc="FFFFFFFF" w:tentative="1">
+      <w:start w:val="1"/>
+      <w:numFmt w:val="decimal"/>
+      <w:lvlText w:val="%7."/>
+      <w:lvlJc w:val="left"/>
+      <w:pPr>
+        <w:ind w:left="5040" w:hanging="360"/>
+      </w:pPr>
+    </w:lvl>
+    <w:lvl w:ilvl="7" w:tplc="FFFFFFFF" w:tentative="1">
+      <w:start w:val="1"/>
+      <w:numFmt w:val="lowerLetter"/>
+      <w:lvlText w:val="%8."/>
+      <w:lvlJc w:val="left"/>
+      <w:pPr>
+        <w:ind w:left="5760" w:hanging="360"/>
+      </w:pPr>
+    </w:lvl>
+    <w:lvl w:ilvl="8" w:tplc="FFFFFFFF" w:tentative="1">
+      <w:start w:val="1"/>
+      <w:numFmt w:val="lowerRoman"/>
+      <w:lvlText w:val="%9."/>
+      <w:lvlJc w:val="right"/>
+      <w:pPr>
+        <w:ind w:left="6480" w:hanging="180"/>
+      </w:pPr>
+    </w:lvl>
+  </w:abstractNum>
+  <w:abstractNum w:abstractNumId="1" w15:restartNumberingAfterBreak="0">
     <w:nsid w:val="056F2649"/>
     <w:multiLevelType w:val="hybridMultilevel"/>
     <w:tmpl w:val="9A342E4C"/>
@@ -6984,7 +8593,7 @@
       </w:pPr>
     </w:lvl>
   </w:abstractNum>
-  <w:abstractNum w:abstractNumId="1" w15:restartNumberingAfterBreak="0">
+  <w:abstractNum w:abstractNumId="2" w15:restartNumberingAfterBreak="0">
     <w:nsid w:val="0A546499"/>
     <w:multiLevelType w:val="multilevel"/>
     <w:tmpl w:val="0409001F"/>
@@ -7070,7 +8679,7 @@
       </w:pPr>
     </w:lvl>
   </w:abstractNum>
-  <w:abstractNum w:abstractNumId="2" w15:restartNumberingAfterBreak="0">
+  <w:abstractNum w:abstractNumId="3" w15:restartNumberingAfterBreak="0">
     <w:nsid w:val="0C233A16"/>
     <w:multiLevelType w:val="multilevel"/>
     <w:tmpl w:val="707E0EE2"/>
@@ -7183,7 +8792,93 @@
       </w:rPr>
     </w:lvl>
   </w:abstractNum>
-  <w:abstractNum w:abstractNumId="3" w15:restartNumberingAfterBreak="0">
+  <w:abstractNum w:abstractNumId="4" w15:restartNumberingAfterBreak="0">
+    <w:nsid w:val="12086B3D"/>
+    <w:multiLevelType w:val="hybridMultilevel"/>
+    <w:tmpl w:val="33F82C1C"/>
+    <w:lvl w:ilvl="0" w:tplc="FFFFFFFF">
+      <w:start w:val="1"/>
+      <w:numFmt w:val="upperRoman"/>
+      <w:lvlText w:val="%1."/>
+      <w:lvlJc w:val="right"/>
+      <w:pPr>
+        <w:ind w:left="720" w:hanging="360"/>
+      </w:pPr>
+    </w:lvl>
+    <w:lvl w:ilvl="1" w:tplc="FFFFFFFF" w:tentative="1">
+      <w:start w:val="1"/>
+      <w:numFmt w:val="lowerLetter"/>
+      <w:lvlText w:val="%2."/>
+      <w:lvlJc w:val="left"/>
+      <w:pPr>
+        <w:ind w:left="1440" w:hanging="360"/>
+      </w:pPr>
+    </w:lvl>
+    <w:lvl w:ilvl="2" w:tplc="FFFFFFFF" w:tentative="1">
+      <w:start w:val="1"/>
+      <w:numFmt w:val="lowerRoman"/>
+      <w:lvlText w:val="%3."/>
+      <w:lvlJc w:val="right"/>
+      <w:pPr>
+        <w:ind w:left="2160" w:hanging="180"/>
+      </w:pPr>
+    </w:lvl>
+    <w:lvl w:ilvl="3" w:tplc="FFFFFFFF" w:tentative="1">
+      <w:start w:val="1"/>
+      <w:numFmt w:val="decimal"/>
+      <w:lvlText w:val="%4."/>
+      <w:lvlJc w:val="left"/>
+      <w:pPr>
+        <w:ind w:left="2880" w:hanging="360"/>
+      </w:pPr>
+    </w:lvl>
+    <w:lvl w:ilvl="4" w:tplc="FFFFFFFF" w:tentative="1">
+      <w:start w:val="1"/>
+      <w:numFmt w:val="lowerLetter"/>
+      <w:lvlText w:val="%5."/>
+      <w:lvlJc w:val="left"/>
+      <w:pPr>
+        <w:ind w:left="3600" w:hanging="360"/>
+      </w:pPr>
+    </w:lvl>
+    <w:lvl w:ilvl="5" w:tplc="FFFFFFFF" w:tentative="1">
+      <w:start w:val="1"/>
+      <w:numFmt w:val="lowerRoman"/>
+      <w:lvlText w:val="%6."/>
+      <w:lvlJc w:val="right"/>
+      <w:pPr>
+        <w:ind w:left="4320" w:hanging="180"/>
+      </w:pPr>
+    </w:lvl>
+    <w:lvl w:ilvl="6" w:tplc="FFFFFFFF" w:tentative="1">
+      <w:start w:val="1"/>
+      <w:numFmt w:val="decimal"/>
+      <w:lvlText w:val="%7."/>
+      <w:lvlJc w:val="left"/>
+      <w:pPr>
+        <w:ind w:left="5040" w:hanging="360"/>
+      </w:pPr>
+    </w:lvl>
+    <w:lvl w:ilvl="7" w:tplc="FFFFFFFF" w:tentative="1">
+      <w:start w:val="1"/>
+      <w:numFmt w:val="lowerLetter"/>
+      <w:lvlText w:val="%8."/>
+      <w:lvlJc w:val="left"/>
+      <w:pPr>
+        <w:ind w:left="5760" w:hanging="360"/>
+      </w:pPr>
+    </w:lvl>
+    <w:lvl w:ilvl="8" w:tplc="FFFFFFFF" w:tentative="1">
+      <w:start w:val="1"/>
+      <w:numFmt w:val="lowerRoman"/>
+      <w:lvlText w:val="%9."/>
+      <w:lvlJc w:val="right"/>
+      <w:pPr>
+        <w:ind w:left="6480" w:hanging="180"/>
+      </w:pPr>
+    </w:lvl>
+  </w:abstractNum>
+  <w:abstractNum w:abstractNumId="5" w15:restartNumberingAfterBreak="0">
     <w:nsid w:val="16503A6D"/>
     <w:multiLevelType w:val="hybridMultilevel"/>
     <w:tmpl w:val="A5727500"/>
@@ -7193,7 +8888,7 @@
       <w:lvlText w:val="%1."/>
       <w:lvlJc w:val="left"/>
       <w:pPr>
-        <w:ind w:left="1211" w:hanging="360"/>
+        <w:ind w:left="360" w:hanging="360"/>
       </w:pPr>
       <w:rPr>
         <w:rFonts w:hint="default"/>
@@ -7272,7 +8967,7 @@
       </w:pPr>
     </w:lvl>
   </w:abstractNum>
-  <w:abstractNum w:abstractNumId="4" w15:restartNumberingAfterBreak="0">
+  <w:abstractNum w:abstractNumId="6" w15:restartNumberingAfterBreak="0">
     <w:nsid w:val="17C63856"/>
     <w:multiLevelType w:val="hybridMultilevel"/>
     <w:tmpl w:val="2BFA9D02"/>
@@ -7358,10 +9053,10 @@
       </w:pPr>
     </w:lvl>
   </w:abstractNum>
-  <w:abstractNum w:abstractNumId="5" w15:restartNumberingAfterBreak="0">
+  <w:abstractNum w:abstractNumId="7" w15:restartNumberingAfterBreak="0">
     <w:nsid w:val="19725F8A"/>
     <w:multiLevelType w:val="hybridMultilevel"/>
-    <w:tmpl w:val="9A342E4C"/>
+    <w:tmpl w:val="49C69CB6"/>
     <w:lvl w:ilvl="0" w:tplc="04090013">
       <w:start w:val="1"/>
       <w:numFmt w:val="upperRoman"/>
@@ -7444,7 +9139,7 @@
       </w:pPr>
     </w:lvl>
   </w:abstractNum>
-  <w:abstractNum w:abstractNumId="6" w15:restartNumberingAfterBreak="0">
+  <w:abstractNum w:abstractNumId="8" w15:restartNumberingAfterBreak="0">
     <w:nsid w:val="1B955587"/>
     <w:multiLevelType w:val="hybridMultilevel"/>
     <w:tmpl w:val="B01CBC00"/>
@@ -7533,7 +9228,7 @@
       </w:pPr>
     </w:lvl>
   </w:abstractNum>
-  <w:abstractNum w:abstractNumId="7" w15:restartNumberingAfterBreak="0">
+  <w:abstractNum w:abstractNumId="9" w15:restartNumberingAfterBreak="0">
     <w:nsid w:val="1E6D6DE6"/>
     <w:multiLevelType w:val="hybridMultilevel"/>
     <w:tmpl w:val="B090FE92"/>
@@ -7622,7 +9317,93 @@
       </w:pPr>
     </w:lvl>
   </w:abstractNum>
-  <w:abstractNum w:abstractNumId="8" w15:restartNumberingAfterBreak="0">
+  <w:abstractNum w:abstractNumId="10" w15:restartNumberingAfterBreak="0">
+    <w:nsid w:val="21DB00DC"/>
+    <w:multiLevelType w:val="hybridMultilevel"/>
+    <w:tmpl w:val="09F07774"/>
+    <w:lvl w:ilvl="0" w:tplc="04090013">
+      <w:start w:val="1"/>
+      <w:numFmt w:val="upperRoman"/>
+      <w:lvlText w:val="%1."/>
+      <w:lvlJc w:val="right"/>
+      <w:pPr>
+        <w:ind w:left="720" w:hanging="360"/>
+      </w:pPr>
+    </w:lvl>
+    <w:lvl w:ilvl="1" w:tplc="04090019" w:tentative="1">
+      <w:start w:val="1"/>
+      <w:numFmt w:val="lowerLetter"/>
+      <w:lvlText w:val="%2."/>
+      <w:lvlJc w:val="left"/>
+      <w:pPr>
+        <w:ind w:left="1440" w:hanging="360"/>
+      </w:pPr>
+    </w:lvl>
+    <w:lvl w:ilvl="2" w:tplc="0409001B" w:tentative="1">
+      <w:start w:val="1"/>
+      <w:numFmt w:val="lowerRoman"/>
+      <w:lvlText w:val="%3."/>
+      <w:lvlJc w:val="right"/>
+      <w:pPr>
+        <w:ind w:left="2160" w:hanging="180"/>
+      </w:pPr>
+    </w:lvl>
+    <w:lvl w:ilvl="3" w:tplc="0409000F" w:tentative="1">
+      <w:start w:val="1"/>
+      <w:numFmt w:val="decimal"/>
+      <w:lvlText w:val="%4."/>
+      <w:lvlJc w:val="left"/>
+      <w:pPr>
+        <w:ind w:left="2880" w:hanging="360"/>
+      </w:pPr>
+    </w:lvl>
+    <w:lvl w:ilvl="4" w:tplc="04090019" w:tentative="1">
+      <w:start w:val="1"/>
+      <w:numFmt w:val="lowerLetter"/>
+      <w:lvlText w:val="%5."/>
+      <w:lvlJc w:val="left"/>
+      <w:pPr>
+        <w:ind w:left="3600" w:hanging="360"/>
+      </w:pPr>
+    </w:lvl>
+    <w:lvl w:ilvl="5" w:tplc="0409001B" w:tentative="1">
+      <w:start w:val="1"/>
+      <w:numFmt w:val="lowerRoman"/>
+      <w:lvlText w:val="%6."/>
+      <w:lvlJc w:val="right"/>
+      <w:pPr>
+        <w:ind w:left="4320" w:hanging="180"/>
+      </w:pPr>
+    </w:lvl>
+    <w:lvl w:ilvl="6" w:tplc="0409000F" w:tentative="1">
+      <w:start w:val="1"/>
+      <w:numFmt w:val="decimal"/>
+      <w:lvlText w:val="%7."/>
+      <w:lvlJc w:val="left"/>
+      <w:pPr>
+        <w:ind w:left="5040" w:hanging="360"/>
+      </w:pPr>
+    </w:lvl>
+    <w:lvl w:ilvl="7" w:tplc="04090019" w:tentative="1">
+      <w:start w:val="1"/>
+      <w:numFmt w:val="lowerLetter"/>
+      <w:lvlText w:val="%8."/>
+      <w:lvlJc w:val="left"/>
+      <w:pPr>
+        <w:ind w:left="5760" w:hanging="360"/>
+      </w:pPr>
+    </w:lvl>
+    <w:lvl w:ilvl="8" w:tplc="0409001B" w:tentative="1">
+      <w:start w:val="1"/>
+      <w:numFmt w:val="lowerRoman"/>
+      <w:lvlText w:val="%9."/>
+      <w:lvlJc w:val="right"/>
+      <w:pPr>
+        <w:ind w:left="6480" w:hanging="180"/>
+      </w:pPr>
+    </w:lvl>
+  </w:abstractNum>
+  <w:abstractNum w:abstractNumId="11" w15:restartNumberingAfterBreak="0">
     <w:nsid w:val="25EF7998"/>
     <w:multiLevelType w:val="multilevel"/>
     <w:tmpl w:val="3340991E"/>
@@ -7735,7 +9516,7 @@
       </w:rPr>
     </w:lvl>
   </w:abstractNum>
-  <w:abstractNum w:abstractNumId="9" w15:restartNumberingAfterBreak="0">
+  <w:abstractNum w:abstractNumId="12" w15:restartNumberingAfterBreak="0">
     <w:nsid w:val="270369F4"/>
     <w:multiLevelType w:val="multilevel"/>
     <w:tmpl w:val="76A63A12"/>
@@ -7848,7 +9629,7 @@
       </w:rPr>
     </w:lvl>
   </w:abstractNum>
-  <w:abstractNum w:abstractNumId="10" w15:restartNumberingAfterBreak="0">
+  <w:abstractNum w:abstractNumId="13" w15:restartNumberingAfterBreak="0">
     <w:nsid w:val="27EC4B19"/>
     <w:multiLevelType w:val="multilevel"/>
     <w:tmpl w:val="5E127758"/>
@@ -7961,7 +9742,7 @@
       </w:rPr>
     </w:lvl>
   </w:abstractNum>
-  <w:abstractNum w:abstractNumId="11" w15:restartNumberingAfterBreak="0">
+  <w:abstractNum w:abstractNumId="14" w15:restartNumberingAfterBreak="0">
     <w:nsid w:val="37475CD4"/>
     <w:multiLevelType w:val="multilevel"/>
     <w:tmpl w:val="FCBC6F76"/>
@@ -8075,7 +9856,7 @@
       </w:rPr>
     </w:lvl>
   </w:abstractNum>
-  <w:abstractNum w:abstractNumId="12" w15:restartNumberingAfterBreak="0">
+  <w:abstractNum w:abstractNumId="15" w15:restartNumberingAfterBreak="0">
     <w:nsid w:val="3926225C"/>
     <w:multiLevelType w:val="hybridMultilevel"/>
     <w:tmpl w:val="AEAA255E"/>
@@ -8164,7 +9945,7 @@
       </w:pPr>
     </w:lvl>
   </w:abstractNum>
-  <w:abstractNum w:abstractNumId="13" w15:restartNumberingAfterBreak="0">
+  <w:abstractNum w:abstractNumId="16" w15:restartNumberingAfterBreak="0">
     <w:nsid w:val="3CB70887"/>
     <w:multiLevelType w:val="hybridMultilevel"/>
     <w:tmpl w:val="01C07260"/>
@@ -8250,7 +10031,7 @@
       </w:pPr>
     </w:lvl>
   </w:abstractNum>
-  <w:abstractNum w:abstractNumId="14" w15:restartNumberingAfterBreak="0">
+  <w:abstractNum w:abstractNumId="17" w15:restartNumberingAfterBreak="0">
     <w:nsid w:val="434E3CA0"/>
     <w:multiLevelType w:val="hybridMultilevel"/>
     <w:tmpl w:val="B090FE92"/>
@@ -8339,7 +10120,7 @@
       </w:pPr>
     </w:lvl>
   </w:abstractNum>
-  <w:abstractNum w:abstractNumId="15" w15:restartNumberingAfterBreak="0">
+  <w:abstractNum w:abstractNumId="18" w15:restartNumberingAfterBreak="0">
     <w:nsid w:val="47EB4567"/>
     <w:multiLevelType w:val="multilevel"/>
     <w:tmpl w:val="D3E23786"/>
@@ -8454,7 +10235,93 @@
       </w:rPr>
     </w:lvl>
   </w:abstractNum>
-  <w:abstractNum w:abstractNumId="16" w15:restartNumberingAfterBreak="0">
+  <w:abstractNum w:abstractNumId="19" w15:restartNumberingAfterBreak="0">
+    <w:nsid w:val="4B3D3995"/>
+    <w:multiLevelType w:val="hybridMultilevel"/>
+    <w:tmpl w:val="09F07774"/>
+    <w:lvl w:ilvl="0" w:tplc="FFFFFFFF">
+      <w:start w:val="1"/>
+      <w:numFmt w:val="upperRoman"/>
+      <w:lvlText w:val="%1."/>
+      <w:lvlJc w:val="right"/>
+      <w:pPr>
+        <w:ind w:left="720" w:hanging="360"/>
+      </w:pPr>
+    </w:lvl>
+    <w:lvl w:ilvl="1" w:tplc="FFFFFFFF" w:tentative="1">
+      <w:start w:val="1"/>
+      <w:numFmt w:val="lowerLetter"/>
+      <w:lvlText w:val="%2."/>
+      <w:lvlJc w:val="left"/>
+      <w:pPr>
+        <w:ind w:left="1440" w:hanging="360"/>
+      </w:pPr>
+    </w:lvl>
+    <w:lvl w:ilvl="2" w:tplc="FFFFFFFF" w:tentative="1">
+      <w:start w:val="1"/>
+      <w:numFmt w:val="lowerRoman"/>
+      <w:lvlText w:val="%3."/>
+      <w:lvlJc w:val="right"/>
+      <w:pPr>
+        <w:ind w:left="2160" w:hanging="180"/>
+      </w:pPr>
+    </w:lvl>
+    <w:lvl w:ilvl="3" w:tplc="FFFFFFFF" w:tentative="1">
+      <w:start w:val="1"/>
+      <w:numFmt w:val="decimal"/>
+      <w:lvlText w:val="%4."/>
+      <w:lvlJc w:val="left"/>
+      <w:pPr>
+        <w:ind w:left="2880" w:hanging="360"/>
+      </w:pPr>
+    </w:lvl>
+    <w:lvl w:ilvl="4" w:tplc="FFFFFFFF" w:tentative="1">
+      <w:start w:val="1"/>
+      <w:numFmt w:val="lowerLetter"/>
+      <w:lvlText w:val="%5."/>
+      <w:lvlJc w:val="left"/>
+      <w:pPr>
+        <w:ind w:left="3600" w:hanging="360"/>
+      </w:pPr>
+    </w:lvl>
+    <w:lvl w:ilvl="5" w:tplc="FFFFFFFF" w:tentative="1">
+      <w:start w:val="1"/>
+      <w:numFmt w:val="lowerRoman"/>
+      <w:lvlText w:val="%6."/>
+      <w:lvlJc w:val="right"/>
+      <w:pPr>
+        <w:ind w:left="4320" w:hanging="180"/>
+      </w:pPr>
+    </w:lvl>
+    <w:lvl w:ilvl="6" w:tplc="FFFFFFFF" w:tentative="1">
+      <w:start w:val="1"/>
+      <w:numFmt w:val="decimal"/>
+      <w:lvlText w:val="%7."/>
+      <w:lvlJc w:val="left"/>
+      <w:pPr>
+        <w:ind w:left="5040" w:hanging="360"/>
+      </w:pPr>
+    </w:lvl>
+    <w:lvl w:ilvl="7" w:tplc="FFFFFFFF" w:tentative="1">
+      <w:start w:val="1"/>
+      <w:numFmt w:val="lowerLetter"/>
+      <w:lvlText w:val="%8."/>
+      <w:lvlJc w:val="left"/>
+      <w:pPr>
+        <w:ind w:left="5760" w:hanging="360"/>
+      </w:pPr>
+    </w:lvl>
+    <w:lvl w:ilvl="8" w:tplc="FFFFFFFF" w:tentative="1">
+      <w:start w:val="1"/>
+      <w:numFmt w:val="lowerRoman"/>
+      <w:lvlText w:val="%9."/>
+      <w:lvlJc w:val="right"/>
+      <w:pPr>
+        <w:ind w:left="6480" w:hanging="180"/>
+      </w:pPr>
+    </w:lvl>
+  </w:abstractNum>
+  <w:abstractNum w:abstractNumId="20" w15:restartNumberingAfterBreak="0">
     <w:nsid w:val="4F5E09BB"/>
     <w:multiLevelType w:val="multilevel"/>
     <w:tmpl w:val="0409001F"/>
@@ -8540,7 +10407,7 @@
       </w:pPr>
     </w:lvl>
   </w:abstractNum>
-  <w:abstractNum w:abstractNumId="17" w15:restartNumberingAfterBreak="0">
+  <w:abstractNum w:abstractNumId="21" w15:restartNumberingAfterBreak="0">
     <w:nsid w:val="52815615"/>
     <w:multiLevelType w:val="multilevel"/>
     <w:tmpl w:val="2F02DAB0"/>
@@ -8574,7 +10441,7 @@
       <w:lvlText w:val="1.2"/>
       <w:lvlJc w:val="left"/>
       <w:pPr>
-        <w:ind w:left="1224" w:hanging="504"/>
+        <w:ind w:left="504" w:hanging="504"/>
       </w:pPr>
       <w:rPr>
         <w:rFonts w:hint="default"/>
@@ -8653,7 +10520,7 @@
       </w:rPr>
     </w:lvl>
   </w:abstractNum>
-  <w:abstractNum w:abstractNumId="18" w15:restartNumberingAfterBreak="0">
+  <w:abstractNum w:abstractNumId="22" w15:restartNumberingAfterBreak="0">
     <w:nsid w:val="56732FD1"/>
     <w:multiLevelType w:val="multilevel"/>
     <w:tmpl w:val="0BBA54D6"/>
@@ -8766,7 +10633,7 @@
       </w:rPr>
     </w:lvl>
   </w:abstractNum>
-  <w:abstractNum w:abstractNumId="19" w15:restartNumberingAfterBreak="0">
+  <w:abstractNum w:abstractNumId="23" w15:restartNumberingAfterBreak="0">
     <w:nsid w:val="56E602E4"/>
     <w:multiLevelType w:val="multilevel"/>
     <w:tmpl w:val="39421F86"/>
@@ -8881,7 +10748,7 @@
       </w:rPr>
     </w:lvl>
   </w:abstractNum>
-  <w:abstractNum w:abstractNumId="20" w15:restartNumberingAfterBreak="0">
+  <w:abstractNum w:abstractNumId="24" w15:restartNumberingAfterBreak="0">
     <w:nsid w:val="573C5BD3"/>
     <w:multiLevelType w:val="multilevel"/>
     <w:tmpl w:val="D96C9CE0"/>
@@ -9005,7 +10872,7 @@
       </w:rPr>
     </w:lvl>
   </w:abstractNum>
-  <w:abstractNum w:abstractNumId="21" w15:restartNumberingAfterBreak="0">
+  <w:abstractNum w:abstractNumId="25" w15:restartNumberingAfterBreak="0">
     <w:nsid w:val="576926E3"/>
     <w:multiLevelType w:val="hybridMultilevel"/>
     <w:tmpl w:val="B01CBC00"/>
@@ -9094,7 +10961,7 @@
       </w:pPr>
     </w:lvl>
   </w:abstractNum>
-  <w:abstractNum w:abstractNumId="22" w15:restartNumberingAfterBreak="0">
+  <w:abstractNum w:abstractNumId="26" w15:restartNumberingAfterBreak="0">
     <w:nsid w:val="59420E1F"/>
     <w:multiLevelType w:val="multilevel"/>
     <w:tmpl w:val="DB142C84"/>
@@ -9207,7 +11074,7 @@
       </w:rPr>
     </w:lvl>
   </w:abstractNum>
-  <w:abstractNum w:abstractNumId="23" w15:restartNumberingAfterBreak="0">
+  <w:abstractNum w:abstractNumId="27" w15:restartNumberingAfterBreak="0">
     <w:nsid w:val="60670AA1"/>
     <w:multiLevelType w:val="multilevel"/>
     <w:tmpl w:val="A5344538"/>
@@ -9320,7 +11187,7 @@
       </w:rPr>
     </w:lvl>
   </w:abstractNum>
-  <w:abstractNum w:abstractNumId="24" w15:restartNumberingAfterBreak="0">
+  <w:abstractNum w:abstractNumId="28" w15:restartNumberingAfterBreak="0">
     <w:nsid w:val="658E3C4B"/>
     <w:multiLevelType w:val="hybridMultilevel"/>
     <w:tmpl w:val="0EFC35C4"/>
@@ -9406,7 +11273,7 @@
       </w:pPr>
     </w:lvl>
   </w:abstractNum>
-  <w:abstractNum w:abstractNumId="25" w15:restartNumberingAfterBreak="0">
+  <w:abstractNum w:abstractNumId="29" w15:restartNumberingAfterBreak="0">
     <w:nsid w:val="701F13D8"/>
     <w:multiLevelType w:val="multilevel"/>
     <w:tmpl w:val="00BEB4B8"/>
@@ -9519,7 +11386,7 @@
       </w:rPr>
     </w:lvl>
   </w:abstractNum>
-  <w:abstractNum w:abstractNumId="26" w15:restartNumberingAfterBreak="0">
+  <w:abstractNum w:abstractNumId="30" w15:restartNumberingAfterBreak="0">
     <w:nsid w:val="71C30F3E"/>
     <w:multiLevelType w:val="hybridMultilevel"/>
     <w:tmpl w:val="DBDAE274"/>
@@ -9608,7 +11475,7 @@
       </w:pPr>
     </w:lvl>
   </w:abstractNum>
-  <w:abstractNum w:abstractNumId="27" w15:restartNumberingAfterBreak="0">
+  <w:abstractNum w:abstractNumId="31" w15:restartNumberingAfterBreak="0">
     <w:nsid w:val="735A22CA"/>
     <w:multiLevelType w:val="multilevel"/>
     <w:tmpl w:val="C540E4A6"/>
@@ -9721,7 +11588,7 @@
       </w:rPr>
     </w:lvl>
   </w:abstractNum>
-  <w:abstractNum w:abstractNumId="28" w15:restartNumberingAfterBreak="0">
+  <w:abstractNum w:abstractNumId="32" w15:restartNumberingAfterBreak="0">
     <w:nsid w:val="793B2065"/>
     <w:multiLevelType w:val="multilevel"/>
     <w:tmpl w:val="78B2D79A"/>
@@ -9834,7 +11701,7 @@
       </w:rPr>
     </w:lvl>
   </w:abstractNum>
-  <w:abstractNum w:abstractNumId="29" w15:restartNumberingAfterBreak="0">
+  <w:abstractNum w:abstractNumId="33" w15:restartNumberingAfterBreak="0">
     <w:nsid w:val="7B332041"/>
     <w:multiLevelType w:val="hybridMultilevel"/>
     <w:tmpl w:val="DBDAE274"/>
@@ -9924,94 +11791,106 @@
     </w:lvl>
   </w:abstractNum>
   <w:num w:numId="1" w16cid:durableId="97025434">
+    <w:abstractNumId w:val="20"/>
+  </w:num>
+  <w:num w:numId="2" w16cid:durableId="491028291">
+    <w:abstractNumId w:val="31"/>
+  </w:num>
+  <w:num w:numId="3" w16cid:durableId="916284354">
+    <w:abstractNumId w:val="24"/>
+  </w:num>
+  <w:num w:numId="4" w16cid:durableId="459226019">
+    <w:abstractNumId w:val="9"/>
+  </w:num>
+  <w:num w:numId="5" w16cid:durableId="1551072031">
+    <w:abstractNumId w:val="15"/>
+  </w:num>
+  <w:num w:numId="6" w16cid:durableId="112869033">
+    <w:abstractNumId w:val="6"/>
+  </w:num>
+  <w:num w:numId="7" w16cid:durableId="512688732">
+    <w:abstractNumId w:val="5"/>
+  </w:num>
+  <w:num w:numId="8" w16cid:durableId="467817391">
+    <w:abstractNumId w:val="12"/>
+  </w:num>
+  <w:num w:numId="9" w16cid:durableId="285813201">
+    <w:abstractNumId w:val="33"/>
+  </w:num>
+  <w:num w:numId="10" w16cid:durableId="2006978129">
+    <w:abstractNumId w:val="26"/>
+  </w:num>
+  <w:num w:numId="11" w16cid:durableId="56782151">
+    <w:abstractNumId w:val="25"/>
+  </w:num>
+  <w:num w:numId="12" w16cid:durableId="1573151696">
+    <w:abstractNumId w:val="8"/>
+  </w:num>
+  <w:num w:numId="13" w16cid:durableId="1900171951">
+    <w:abstractNumId w:val="30"/>
+  </w:num>
+  <w:num w:numId="14" w16cid:durableId="646015506">
+    <w:abstractNumId w:val="2"/>
+  </w:num>
+  <w:num w:numId="15" w16cid:durableId="354886874">
+    <w:abstractNumId w:val="17"/>
+  </w:num>
+  <w:num w:numId="16" w16cid:durableId="1956062949">
+    <w:abstractNumId w:val="23"/>
+  </w:num>
+  <w:num w:numId="17" w16cid:durableId="1124739891">
+    <w:abstractNumId w:val="32"/>
+  </w:num>
+  <w:num w:numId="18" w16cid:durableId="1209492702">
+    <w:abstractNumId w:val="29"/>
+  </w:num>
+  <w:num w:numId="19" w16cid:durableId="1130199702">
+    <w:abstractNumId w:val="13"/>
+  </w:num>
+  <w:num w:numId="20" w16cid:durableId="1391996048">
+    <w:abstractNumId w:val="22"/>
+  </w:num>
+  <w:num w:numId="21" w16cid:durableId="2062363420">
+    <w:abstractNumId w:val="7"/>
+  </w:num>
+  <w:num w:numId="22" w16cid:durableId="1205017578">
+    <w:abstractNumId w:val="28"/>
+  </w:num>
+  <w:num w:numId="23" w16cid:durableId="1327905754">
+    <w:abstractNumId w:val="21"/>
+  </w:num>
+  <w:num w:numId="24" w16cid:durableId="1821997618">
+    <w:abstractNumId w:val="11"/>
+  </w:num>
+  <w:num w:numId="25" w16cid:durableId="1368411863">
+    <w:abstractNumId w:val="18"/>
+  </w:num>
+  <w:num w:numId="26" w16cid:durableId="1242325312">
     <w:abstractNumId w:val="16"/>
   </w:num>
-  <w:num w:numId="2" w16cid:durableId="491028291">
+  <w:num w:numId="27" w16cid:durableId="1618441086">
+    <w:abstractNumId w:val="3"/>
+  </w:num>
+  <w:num w:numId="28" w16cid:durableId="446387640">
+    <w:abstractNumId w:val="14"/>
+  </w:num>
+  <w:num w:numId="29" w16cid:durableId="2039767916">
+    <w:abstractNumId w:val="1"/>
+  </w:num>
+  <w:num w:numId="30" w16cid:durableId="1322613647">
     <w:abstractNumId w:val="27"/>
   </w:num>
-  <w:num w:numId="3" w16cid:durableId="916284354">
-    <w:abstractNumId w:val="20"/>
-  </w:num>
-  <w:num w:numId="4" w16cid:durableId="459226019">
-    <w:abstractNumId w:val="7"/>
-  </w:num>
-  <w:num w:numId="5" w16cid:durableId="1551072031">
-    <w:abstractNumId w:val="12"/>
-  </w:num>
-  <w:num w:numId="6" w16cid:durableId="112869033">
+  <w:num w:numId="31" w16cid:durableId="1612857945">
     <w:abstractNumId w:val="4"/>
   </w:num>
-  <w:num w:numId="7" w16cid:durableId="512688732">
-    <w:abstractNumId w:val="3"/>
+  <w:num w:numId="32" w16cid:durableId="1276325300">
+    <w:abstractNumId w:val="0"/>
   </w:num>
-  <w:num w:numId="8" w16cid:durableId="467817391">
-    <w:abstractNumId w:val="9"/>
-  </w:num>
-  <w:num w:numId="9" w16cid:durableId="285813201">
-    <w:abstractNumId w:val="29"/>
-  </w:num>
-  <w:num w:numId="10" w16cid:durableId="2006978129">
-    <w:abstractNumId w:val="22"/>
-  </w:num>
-  <w:num w:numId="11" w16cid:durableId="56782151">
-    <w:abstractNumId w:val="21"/>
-  </w:num>
-  <w:num w:numId="12" w16cid:durableId="1573151696">
-    <w:abstractNumId w:val="6"/>
-  </w:num>
-  <w:num w:numId="13" w16cid:durableId="1900171951">
-    <w:abstractNumId w:val="26"/>
-  </w:num>
-  <w:num w:numId="14" w16cid:durableId="646015506">
-    <w:abstractNumId w:val="1"/>
-  </w:num>
-  <w:num w:numId="15" w16cid:durableId="354886874">
-    <w:abstractNumId w:val="14"/>
-  </w:num>
-  <w:num w:numId="16" w16cid:durableId="1956062949">
-    <w:abstractNumId w:val="19"/>
-  </w:num>
-  <w:num w:numId="17" w16cid:durableId="1124739891">
-    <w:abstractNumId w:val="28"/>
-  </w:num>
-  <w:num w:numId="18" w16cid:durableId="1209492702">
-    <w:abstractNumId w:val="25"/>
-  </w:num>
-  <w:num w:numId="19" w16cid:durableId="1130199702">
+  <w:num w:numId="33" w16cid:durableId="2040620489">
     <w:abstractNumId w:val="10"/>
   </w:num>
-  <w:num w:numId="20" w16cid:durableId="1391996048">
-    <w:abstractNumId w:val="18"/>
-  </w:num>
-  <w:num w:numId="21" w16cid:durableId="2062363420">
-    <w:abstractNumId w:val="5"/>
-  </w:num>
-  <w:num w:numId="22" w16cid:durableId="1205017578">
-    <w:abstractNumId w:val="24"/>
-  </w:num>
-  <w:num w:numId="23" w16cid:durableId="1327905754">
-    <w:abstractNumId w:val="17"/>
-  </w:num>
-  <w:num w:numId="24" w16cid:durableId="1821997618">
-    <w:abstractNumId w:val="8"/>
-  </w:num>
-  <w:num w:numId="25" w16cid:durableId="1368411863">
-    <w:abstractNumId w:val="15"/>
-  </w:num>
-  <w:num w:numId="26" w16cid:durableId="1242325312">
-    <w:abstractNumId w:val="13"/>
-  </w:num>
-  <w:num w:numId="27" w16cid:durableId="1618441086">
-    <w:abstractNumId w:val="2"/>
-  </w:num>
-  <w:num w:numId="28" w16cid:durableId="446387640">
-    <w:abstractNumId w:val="11"/>
-  </w:num>
-  <w:num w:numId="29" w16cid:durableId="2039767916">
-    <w:abstractNumId w:val="0"/>
-  </w:num>
-  <w:num w:numId="30" w16cid:durableId="1322613647">
-    <w:abstractNumId w:val="23"/>
+  <w:num w:numId="34" w16cid:durableId="987126089">
+    <w:abstractNumId w:val="19"/>
   </w:num>
 </w:numbering>
 </file>
@@ -11408,7 +13287,7 @@
     <b:MonthAccessed>July</b:MonthAccessed>
     <b:DayAccessed>24</b:DayAccessed>
     <b:URL>https://www.geeksforgeeks.org/operating-systems/operating-systems/</b:URL>
-    <b:RefOrder>18</b:RefOrder>
+    <b:RefOrder>19</b:RefOrder>
   </b:Source>
   <b:Source>
     <b:Tag>Mic26</b:Tag>
@@ -11566,7 +13445,7 @@
     <b:MonthAccessed>July</b:MonthAccessed>
     <b:DayAccessed>23</b:DayAccessed>
     <b:URL>https://www.ibm.com/think/topics/distributed-computing</b:URL>
-    <b:RefOrder>17</b:RefOrder>
+    <b:RefOrder>18</b:RefOrder>
   </b:Source>
   <b:Source>
     <b:Tag>Gee256</b:Tag>
@@ -11583,13 +13462,30 @@
     <b:MonthAccessed>July</b:MonthAccessed>
     <b:DayAccessed>23</b:DayAccessed>
     <b:URL>https://www.geeksforgeeks.org/devops/what-is-distributed-computing/</b:URL>
+    <b:RefOrder>17</b:RefOrder>
+  </b:Source>
+  <b:Source>
+    <b:Tag>Com26</b:Tag>
+    <b:SourceType>InternetSite</b:SourceType>
+    <b:Guid>{03FCFBB8-1FA6-414A-B8E9-37991D305C2E}</b:Guid>
+    <b:Author>
+      <b:Author>
+        <b:Corporate>Commerce Engine</b:Corporate>
+      </b:Author>
+    </b:Author>
+    <b:Title>Commerce Engine</b:Title>
+    <b:Year>2026</b:Year>
+    <b:YearAccessed>2026</b:YearAccessed>
+    <b:MonthAccessed>July</b:MonthAccessed>
+    <b:DayAccessed>29</b:DayAccessed>
+    <b:URL>https://www.commercengine.io/blog/star-topology</b:URL>
     <b:RefOrder>16</b:RefOrder>
   </b:Source>
 </b:Sources>
 </file>
 
 <file path=customXml/itemProps1.xml><?xml version="1.0" encoding="utf-8"?>
-<ds:datastoreItem xmlns:ds="http://schemas.openxmlformats.org/officeDocument/2006/customXml" ds:itemID="{9D51B343-0568-461D-A472-8E16872F9D6D}">
+<ds:datastoreItem xmlns:ds="http://schemas.openxmlformats.org/officeDocument/2006/customXml" ds:itemID="{DA5E0321-064A-4622-9999-145101DE00A2}">
   <ds:schemaRefs>
     <ds:schemaRef ds:uri="http://schemas.openxmlformats.org/officeDocument/2006/bibliography"/>
   </ds:schemaRefs>

</xml_diff>

<commit_message>
last but one commit cs
</commit_message>
<xml_diff>
--- a/Level_4/Level_4(1st Semester)/Computer Systems/L4DC-L4DCBM- Computer Systems- Blessings Tamanga(P00221220).docx
+++ b/Level_4/Level_4(1st Semester)/Computer Systems/L4DC-L4DCBM- Computer Systems- Blessings Tamanga(P00221220).docx
@@ -518,7 +518,19 @@
         <w:rPr>
           <w:rFonts w:ascii="Arial" w:hAnsi="Arial" w:cs="Arial"/>
         </w:rPr>
-        <w:t>(RAM) and storage devices which must work together efficiently with the operating system and other software to deliver reliable performance. Understanding how these components operate and interact is essential for developing computer systems that outstands the growing demands of modern market.</w:t>
+        <w:t xml:space="preserve">(RAM) and storage devices which must work together efficiently with the operating system and other software to deliver reliable performance. Understanding how these components operate and interact is essential for developing computer systems that </w:t>
+      </w:r>
+      <w:r>
+        <w:rPr>
+          <w:rFonts w:ascii="Arial" w:hAnsi="Arial" w:cs="Arial"/>
+        </w:rPr>
+        <w:t>meet the growing</w:t>
+      </w:r>
+      <w:r>
+        <w:rPr>
+          <w:rFonts w:ascii="Arial" w:hAnsi="Arial" w:cs="Arial"/>
+        </w:rPr>
+        <w:t xml:space="preserve"> demands of modern market.</w:t>
       </w:r>
     </w:p>
     <w:p>
@@ -562,7 +574,13 @@
         <w:rPr>
           <w:rFonts w:ascii="Arial" w:hAnsi="Arial" w:cs="Arial"/>
         </w:rPr>
-        <w:t xml:space="preserve"> technologies are applied withing </w:t>
+        <w:t xml:space="preserve"> technologies are applied </w:t>
+      </w:r>
+      <w:r>
+        <w:rPr>
+          <w:rFonts w:ascii="Arial" w:hAnsi="Arial" w:cs="Arial"/>
+        </w:rPr>
+        <w:t xml:space="preserve">within </w:t>
       </w:r>
       <w:proofErr w:type="spellStart"/>
       <w:r>
@@ -644,7 +662,13 @@
         <w:rPr>
           <w:rFonts w:ascii="Arial" w:hAnsi="Arial" w:cs="Arial"/>
         </w:rPr>
-        <w:t>startup-up technology</w:t>
+        <w:t>start-up</w:t>
+      </w:r>
+      <w:r>
+        <w:rPr>
+          <w:rFonts w:ascii="Arial" w:hAnsi="Arial" w:cs="Arial"/>
+        </w:rPr>
+        <w:t xml:space="preserve"> technology</w:t>
       </w:r>
       <w:r>
         <w:rPr>
@@ -1026,7 +1050,19 @@
         <w:rPr>
           <w:rFonts w:ascii="Arial" w:hAnsi="Arial" w:cs="Arial"/>
         </w:rPr>
-        <w:t xml:space="preserve"> it performs calculations, processes instructions and controls operations of almost every other hardware component therefore is it referred as</w:t>
+        <w:t xml:space="preserve"> it performs calculations, processes instructions and controls operations of other hardware component</w:t>
+      </w:r>
+      <w:r>
+        <w:rPr>
+          <w:rFonts w:ascii="Arial" w:hAnsi="Arial" w:cs="Arial"/>
+        </w:rPr>
+        <w:t>s</w:t>
+      </w:r>
+      <w:r>
+        <w:rPr>
+          <w:rFonts w:ascii="Arial" w:hAnsi="Arial" w:cs="Arial"/>
+        </w:rPr>
+        <w:t xml:space="preserve"> therefore is it referred as</w:t>
       </w:r>
       <w:r>
         <w:rPr>
@@ -1050,13 +1086,107 @@
         <w:rPr>
           <w:rFonts w:ascii="Arial" w:hAnsi="Arial" w:cs="Arial"/>
         </w:rPr>
-        <w:t xml:space="preserve"> The Central Processing Unit is responsible for fetching, interpreting and executing of those instructions.</w:t>
-      </w:r>
-      <w:r>
-        <w:rPr>
-          <w:rFonts w:ascii="Arial" w:hAnsi="Arial" w:cs="Arial"/>
-        </w:rPr>
-        <w:t xml:space="preserve"> According to</w:t>
+        <w:t xml:space="preserve"> Th</w:t>
+      </w:r>
+      <w:r>
+        <w:rPr>
+          <w:rFonts w:ascii="Arial" w:hAnsi="Arial" w:cs="Arial"/>
+        </w:rPr>
+        <w:t>e CPU</w:t>
+      </w:r>
+      <w:r>
+        <w:rPr>
+          <w:rFonts w:ascii="Arial" w:hAnsi="Arial" w:cs="Arial"/>
+        </w:rPr>
+        <w:t xml:space="preserve"> fetch</w:t>
+      </w:r>
+      <w:r>
+        <w:rPr>
+          <w:rFonts w:ascii="Arial" w:hAnsi="Arial" w:cs="Arial"/>
+        </w:rPr>
+        <w:t>es</w:t>
+      </w:r>
+      <w:r>
+        <w:rPr>
+          <w:rFonts w:ascii="Arial" w:hAnsi="Arial" w:cs="Arial"/>
+        </w:rPr>
+        <w:t>, interpret</w:t>
+      </w:r>
+      <w:r>
+        <w:rPr>
+          <w:rFonts w:ascii="Arial" w:hAnsi="Arial" w:cs="Arial"/>
+        </w:rPr>
+        <w:t>s</w:t>
+      </w:r>
+      <w:r>
+        <w:rPr>
+          <w:rFonts w:ascii="Arial" w:hAnsi="Arial" w:cs="Arial"/>
+        </w:rPr>
+        <w:t xml:space="preserve"> and execut</w:t>
+      </w:r>
+      <w:r>
+        <w:rPr>
+          <w:rFonts w:ascii="Arial" w:hAnsi="Arial" w:cs="Arial"/>
+        </w:rPr>
+        <w:t xml:space="preserve">es </w:t>
+      </w:r>
+      <w:r>
+        <w:rPr>
+          <w:rFonts w:ascii="Arial" w:hAnsi="Arial" w:cs="Arial"/>
+        </w:rPr>
+        <w:t>instructions</w:t>
+      </w:r>
+      <w:r>
+        <w:rPr>
+          <w:rFonts w:ascii="Arial" w:hAnsi="Arial" w:cs="Arial"/>
+        </w:rPr>
+        <w:t xml:space="preserve"> that allow computers perform </w:t>
+      </w:r>
+      <w:proofErr w:type="spellStart"/>
+      <w:r>
+        <w:rPr>
+          <w:rFonts w:ascii="Arial" w:hAnsi="Arial" w:cs="Arial"/>
+        </w:rPr>
+        <w:t>fifferent</w:t>
+      </w:r>
+      <w:proofErr w:type="spellEnd"/>
+      <w:r>
+        <w:rPr>
+          <w:rFonts w:ascii="Arial" w:hAnsi="Arial" w:cs="Arial"/>
+        </w:rPr>
+        <w:t xml:space="preserve"> task</w:t>
+      </w:r>
+      <w:r>
+        <w:rPr>
+          <w:rFonts w:ascii="Arial" w:hAnsi="Arial" w:cs="Arial"/>
+        </w:rPr>
+        <w:t>.</w:t>
+      </w:r>
+      <w:r>
+        <w:rPr>
+          <w:rFonts w:ascii="Arial" w:hAnsi="Arial" w:cs="Arial"/>
+        </w:rPr>
+        <w:t xml:space="preserve"> </w:t>
+      </w:r>
+    </w:p>
+    <w:p>
+      <w:pPr>
+        <w:rPr>
+          <w:rFonts w:ascii="Arial" w:hAnsi="Arial" w:cs="Arial"/>
+        </w:rPr>
+      </w:pPr>
+    </w:p>
+    <w:p>
+      <w:pPr>
+        <w:rPr>
+          <w:rFonts w:ascii="Arial" w:hAnsi="Arial" w:cs="Arial"/>
+        </w:rPr>
+      </w:pPr>
+      <w:r>
+        <w:rPr>
+          <w:rFonts w:ascii="Arial" w:hAnsi="Arial" w:cs="Arial"/>
+        </w:rPr>
+        <w:t>According to</w:t>
       </w:r>
       <w:r>
         <w:rPr>
@@ -1112,19 +1242,67 @@
         <w:rPr>
           <w:rFonts w:ascii="Arial" w:hAnsi="Arial" w:cs="Arial"/>
         </w:rPr>
-        <w:t>, A CPU is made up of cores which are individual compone</w:t>
-      </w:r>
-      <w:r>
-        <w:rPr>
-          <w:rFonts w:ascii="Arial" w:hAnsi="Arial" w:cs="Arial"/>
-        </w:rPr>
-        <w:t>n</w:t>
-      </w:r>
-      <w:r>
-        <w:rPr>
-          <w:rFonts w:ascii="Arial" w:hAnsi="Arial" w:cs="Arial"/>
-        </w:rPr>
-        <w:t xml:space="preserve">t processing unit within the CPU. The cores are capable of executing tasks independently. A CPU having multiple cores can handle a number of operations faster compared to a CPU having only one core thereby affecting overall performance of the </w:t>
+        <w:t xml:space="preserve">, A CPU </w:t>
+      </w:r>
+      <w:r>
+        <w:rPr>
+          <w:rFonts w:ascii="Arial" w:hAnsi="Arial" w:cs="Arial"/>
+        </w:rPr>
+        <w:t>consists</w:t>
+      </w:r>
+      <w:r>
+        <w:rPr>
+          <w:rFonts w:ascii="Arial" w:hAnsi="Arial" w:cs="Arial"/>
+        </w:rPr>
+        <w:t xml:space="preserve"> of</w:t>
+      </w:r>
+      <w:r>
+        <w:rPr>
+          <w:rFonts w:ascii="Arial" w:hAnsi="Arial" w:cs="Arial"/>
+        </w:rPr>
+        <w:t xml:space="preserve"> one or more</w:t>
+      </w:r>
+      <w:r>
+        <w:rPr>
+          <w:rFonts w:ascii="Arial" w:hAnsi="Arial" w:cs="Arial"/>
+        </w:rPr>
+        <w:t xml:space="preserve"> cores</w:t>
+      </w:r>
+      <w:r>
+        <w:rPr>
+          <w:rFonts w:ascii="Arial" w:hAnsi="Arial" w:cs="Arial"/>
+        </w:rPr>
+        <w:t xml:space="preserve">. </w:t>
+      </w:r>
+      <w:r>
+        <w:rPr>
+          <w:rFonts w:ascii="Arial" w:hAnsi="Arial" w:cs="Arial"/>
+        </w:rPr>
+        <w:t>The cores are capable of executing tasks independently. A CPU having multiple cores</w:t>
+      </w:r>
+      <w:r>
+        <w:rPr>
+          <w:rFonts w:ascii="Arial" w:hAnsi="Arial" w:cs="Arial"/>
+        </w:rPr>
+        <w:t xml:space="preserve"> known as </w:t>
+      </w:r>
+      <w:r>
+        <w:rPr>
+          <w:rFonts w:ascii="Arial" w:hAnsi="Arial" w:cs="Arial"/>
+        </w:rPr>
+        <w:t>Multi-core CPU</w:t>
+      </w:r>
+      <w:r>
+        <w:rPr>
+          <w:rFonts w:ascii="Arial" w:hAnsi="Arial" w:cs="Arial"/>
+        </w:rPr>
+        <w:t>,</w:t>
+      </w:r>
+      <w:r>
+        <w:rPr>
+          <w:rFonts w:ascii="Arial" w:hAnsi="Arial" w:cs="Arial"/>
+        </w:rPr>
+        <w:t xml:space="preserve"> can handle a number of operations faster compared to a CPU having only one core thereby affecting overall performance of the </w:t>
       </w:r>
       <w:r>
         <w:rPr>
@@ -1142,13 +1320,25 @@
         <w:rPr>
           <w:rFonts w:ascii="Arial" w:hAnsi="Arial" w:cs="Arial"/>
         </w:rPr>
-        <w:t xml:space="preserve">A CPU having a number of cores is called Multi-core CPU. </w:t>
-      </w:r>
-      <w:r>
-        <w:rPr>
-          <w:rFonts w:ascii="Arial" w:hAnsi="Arial" w:cs="Arial"/>
-        </w:rPr>
-        <w:t>Apart from number of cores the computer performance is also affected by clock speed and cache memory size. Clock speed refers to</w:t>
+        <w:t xml:space="preserve">Computer </w:t>
+      </w:r>
+      <w:r>
+        <w:rPr>
+          <w:rFonts w:ascii="Arial" w:hAnsi="Arial" w:cs="Arial"/>
+        </w:rPr>
+        <w:t xml:space="preserve">performance is also affected by </w:t>
+      </w:r>
+      <w:r>
+        <w:rPr>
+          <w:rFonts w:ascii="Arial" w:hAnsi="Arial" w:cs="Arial"/>
+        </w:rPr>
+        <w:t xml:space="preserve">CPU’s </w:t>
+      </w:r>
+      <w:r>
+        <w:rPr>
+          <w:rFonts w:ascii="Arial" w:hAnsi="Arial" w:cs="Arial"/>
+        </w:rPr>
+        <w:t>clock speed and cache memory size. Clock speed refers to</w:t>
       </w:r>
       <w:r>
         <w:rPr>
@@ -1160,25 +1350,61 @@
         <w:rPr>
           <w:rFonts w:ascii="Arial" w:hAnsi="Arial" w:cs="Arial"/>
         </w:rPr>
-        <w:t xml:space="preserve"> Cache is small storage found in the CPU which holds frequently accessed instructions reducing time the CPU takes to go into the memory to find</w:t>
-      </w:r>
-      <w:r>
-        <w:rPr>
-          <w:rFonts w:ascii="Arial" w:hAnsi="Arial" w:cs="Arial"/>
-        </w:rPr>
-        <w:t xml:space="preserve"> the frequently used</w:t>
-      </w:r>
-      <w:r>
-        <w:rPr>
-          <w:rFonts w:ascii="Arial" w:hAnsi="Arial" w:cs="Arial"/>
-        </w:rPr>
-        <w:t xml:space="preserve"> instruction</w:t>
-      </w:r>
-      <w:r>
-        <w:rPr>
-          <w:rFonts w:ascii="Arial" w:hAnsi="Arial" w:cs="Arial"/>
-        </w:rPr>
-        <w:t>s</w:t>
+        <w:t xml:space="preserve"> Cache is small</w:t>
+      </w:r>
+      <w:r>
+        <w:rPr>
+          <w:rFonts w:ascii="Arial" w:hAnsi="Arial" w:cs="Arial"/>
+        </w:rPr>
+        <w:t>, high speed</w:t>
+      </w:r>
+      <w:r>
+        <w:rPr>
+          <w:rFonts w:ascii="Arial" w:hAnsi="Arial" w:cs="Arial"/>
+        </w:rPr>
+        <w:t xml:space="preserve"> </w:t>
+      </w:r>
+      <w:r>
+        <w:rPr>
+          <w:rFonts w:ascii="Arial" w:hAnsi="Arial" w:cs="Arial"/>
+        </w:rPr>
+        <w:t>memory</w:t>
+      </w:r>
+      <w:r>
+        <w:rPr>
+          <w:rFonts w:ascii="Arial" w:hAnsi="Arial" w:cs="Arial"/>
+        </w:rPr>
+        <w:t xml:space="preserve"> </w:t>
+      </w:r>
+      <w:r>
+        <w:rPr>
+          <w:rFonts w:ascii="Arial" w:hAnsi="Arial" w:cs="Arial"/>
+        </w:rPr>
+        <w:t>within</w:t>
+      </w:r>
+      <w:r>
+        <w:rPr>
+          <w:rFonts w:ascii="Arial" w:hAnsi="Arial" w:cs="Arial"/>
+        </w:rPr>
+        <w:t xml:space="preserve"> the CPU which holds frequently </w:t>
+      </w:r>
+      <w:r>
+        <w:rPr>
+          <w:rFonts w:ascii="Arial" w:hAnsi="Arial" w:cs="Arial"/>
+        </w:rPr>
+        <w:t xml:space="preserve">used </w:t>
+      </w:r>
+      <w:r>
+        <w:rPr>
+          <w:rFonts w:ascii="Arial" w:hAnsi="Arial" w:cs="Arial"/>
+        </w:rPr>
+        <w:t>instructions reducing time the CPU takes to</w:t>
+      </w:r>
+      <w:r>
+        <w:rPr>
+          <w:rFonts w:ascii="Arial" w:hAnsi="Arial" w:cs="Arial"/>
+        </w:rPr>
+        <w:t xml:space="preserve"> access data from the memory</w:t>
       </w:r>
       <w:r>
         <w:rPr>
@@ -1210,7 +1436,19 @@
         <w:rPr>
           <w:rFonts w:ascii="Arial" w:hAnsi="Arial" w:cs="Arial"/>
         </w:rPr>
-        <w:t xml:space="preserve"> utilizes a multi-core CPU with high clock speeds and large cache memory.</w:t>
+        <w:t xml:space="preserve"> utilizes a multi-core CPU with high clock speeds and large cache memory</w:t>
+      </w:r>
+      <w:r>
+        <w:rPr>
+          <w:rFonts w:ascii="Arial" w:hAnsi="Arial" w:cs="Arial"/>
+        </w:rPr>
+        <w:t xml:space="preserve"> to support demanding application and multitasking</w:t>
+      </w:r>
+      <w:r>
+        <w:rPr>
+          <w:rFonts w:ascii="Arial" w:hAnsi="Arial" w:cs="Arial"/>
+        </w:rPr>
+        <w:t>.</w:t>
       </w:r>
     </w:p>
     <w:p>
@@ -1253,31 +1491,87 @@
         <w:rPr>
           <w:rFonts w:ascii="Arial" w:hAnsi="Arial" w:cs="Arial"/>
         </w:rPr>
-        <w:t xml:space="preserve">(RAM) serving as the computer’s primary memory storing memory of running processes. The higher the capacity of the RAM the faster the PC becomes and the lower the </w:t>
-      </w:r>
-      <w:r>
-        <w:rPr>
-          <w:rFonts w:ascii="Arial" w:hAnsi="Arial" w:cs="Arial"/>
-        </w:rPr>
-        <w:t>capacity</w:t>
-      </w:r>
-      <w:r>
-        <w:rPr>
-          <w:rFonts w:ascii="Arial" w:hAnsi="Arial" w:cs="Arial"/>
-        </w:rPr>
-        <w:t xml:space="preserve"> of the RAM the </w:t>
-      </w:r>
-      <w:r>
-        <w:rPr>
-          <w:rFonts w:ascii="Arial" w:hAnsi="Arial" w:cs="Arial"/>
-        </w:rPr>
-        <w:t>s</w:t>
-      </w:r>
-      <w:r>
-        <w:rPr>
-          <w:rFonts w:ascii="Arial" w:hAnsi="Arial" w:cs="Arial"/>
-        </w:rPr>
-        <w:t>lower the operation.</w:t>
+        <w:t xml:space="preserve">(RAM) </w:t>
+      </w:r>
+      <w:r>
+        <w:rPr>
+          <w:rFonts w:ascii="Arial" w:hAnsi="Arial" w:cs="Arial"/>
+        </w:rPr>
+        <w:t>i</w:t>
+      </w:r>
+      <w:r>
+        <w:rPr>
+          <w:rFonts w:ascii="Arial" w:hAnsi="Arial" w:cs="Arial"/>
+        </w:rPr>
+        <w:t xml:space="preserve">s the computer’s primary memory storing memory </w:t>
+      </w:r>
+      <w:r>
+        <w:rPr>
+          <w:rFonts w:ascii="Arial" w:hAnsi="Arial" w:cs="Arial"/>
+        </w:rPr>
+        <w:t xml:space="preserve">that temporarily stores data and instructions for programs that are currently </w:t>
+      </w:r>
+      <w:r>
+        <w:rPr>
+          <w:rFonts w:ascii="Arial" w:hAnsi="Arial" w:cs="Arial"/>
+        </w:rPr>
+        <w:t>running.</w:t>
+      </w:r>
+      <w:r>
+        <w:rPr>
+          <w:rFonts w:ascii="Arial" w:hAnsi="Arial" w:cs="Arial"/>
+        </w:rPr>
+        <w:t xml:space="preserve"> It allows the CPU to access information quickly, improving the overall performance of the computer system. A computer with</w:t>
+      </w:r>
+      <w:r>
+        <w:rPr>
+          <w:rFonts w:ascii="Arial" w:hAnsi="Arial" w:cs="Arial"/>
+        </w:rPr>
+        <w:t xml:space="preserve"> higher the capacity of the RAM </w:t>
+      </w:r>
+      <w:r>
+        <w:rPr>
+          <w:rFonts w:ascii="Arial" w:hAnsi="Arial" w:cs="Arial"/>
+        </w:rPr>
+        <w:t>can run multiple application smoothly while insufficient RAM may cause the system to slow down. T</w:t>
+      </w:r>
+      <w:r>
+        <w:rPr>
+          <w:rFonts w:ascii="Arial" w:hAnsi="Arial" w:cs="Arial"/>
+        </w:rPr>
+        <w:t xml:space="preserve">he </w:t>
+      </w:r>
+      <w:proofErr w:type="spellStart"/>
+      <w:r>
+        <w:rPr>
+          <w:rFonts w:ascii="Arial" w:hAnsi="Arial" w:cs="Arial"/>
+        </w:rPr>
+        <w:t>QuantumX</w:t>
+      </w:r>
+      <w:proofErr w:type="spellEnd"/>
+      <w:r>
+        <w:rPr>
+          <w:rFonts w:ascii="Arial" w:hAnsi="Arial" w:cs="Arial"/>
+        </w:rPr>
+        <w:t xml:space="preserve"> is equipped with high-capacity RAM to support multitasking and demanding applicatio</w:t>
+      </w:r>
+      <w:r>
+        <w:rPr>
+          <w:rFonts w:ascii="Arial" w:hAnsi="Arial" w:cs="Arial"/>
+        </w:rPr>
+        <w:t>n</w:t>
+      </w:r>
+      <w:r>
+        <w:rPr>
+          <w:rFonts w:ascii="Arial" w:hAnsi="Arial" w:cs="Arial"/>
+        </w:rPr>
+        <w:t>s used by startups</w:t>
+      </w:r>
+      <w:r>
+        <w:rPr>
+          <w:rFonts w:ascii="Arial" w:hAnsi="Arial" w:cs="Arial"/>
+        </w:rPr>
+        <w:t>.</w:t>
       </w:r>
     </w:p>
     <w:p>
@@ -1308,14 +1602,7 @@
         <w:rPr>
           <w:rFonts w:ascii="Arial" w:hAnsi="Arial" w:cs="Arial"/>
         </w:rPr>
-        <w:t xml:space="preserve">The storage component specifically </w:t>
-      </w:r>
-      <w:proofErr w:type="gramStart"/>
-      <w:r>
-        <w:rPr>
-          <w:rFonts w:ascii="Arial" w:hAnsi="Arial" w:cs="Arial"/>
-        </w:rPr>
-        <w:t xml:space="preserve">Solid </w:t>
+        <w:t xml:space="preserve">The storage component specifically Solid </w:t>
       </w:r>
       <w:r>
         <w:rPr>
@@ -1333,9 +1620,32 @@
         <w:rPr>
           <w:rFonts w:ascii="Arial" w:hAnsi="Arial" w:cs="Arial"/>
         </w:rPr>
-        <w:t>ate</w:t>
-      </w:r>
-      <w:proofErr w:type="gramEnd"/>
+        <w:t xml:space="preserve">ate </w:t>
+      </w:r>
+      <w:r>
+        <w:rPr>
+          <w:rFonts w:ascii="Arial" w:hAnsi="Arial" w:cs="Arial"/>
+        </w:rPr>
+        <w:t>D</w:t>
+      </w:r>
+      <w:r>
+        <w:rPr>
+          <w:rFonts w:ascii="Arial" w:hAnsi="Arial" w:cs="Arial"/>
+        </w:rPr>
+        <w:t>rives</w:t>
+      </w:r>
+      <w:r>
+        <w:rPr>
+          <w:rFonts w:ascii="Arial" w:hAnsi="Arial" w:cs="Arial"/>
+        </w:rPr>
+        <w:t xml:space="preserve"> which</w:t>
+      </w:r>
+      <w:r>
+        <w:rPr>
+          <w:rFonts w:ascii="Arial" w:hAnsi="Arial" w:cs="Arial"/>
+        </w:rPr>
+        <w:t xml:space="preserve"> has no moving parts and</w:t>
+      </w:r>
       <w:r>
         <w:rPr>
           <w:rFonts w:ascii="Arial" w:hAnsi="Arial" w:cs="Arial"/>
@@ -1346,19 +1656,7 @@
         <w:rPr>
           <w:rFonts w:ascii="Arial" w:hAnsi="Arial" w:cs="Arial"/>
         </w:rPr>
-        <w:t>D</w:t>
-      </w:r>
-      <w:r>
-        <w:rPr>
-          <w:rFonts w:ascii="Arial" w:hAnsi="Arial" w:cs="Arial"/>
-        </w:rPr>
-        <w:t>rives</w:t>
-      </w:r>
-      <w:r>
-        <w:rPr>
-          <w:rFonts w:ascii="Arial" w:hAnsi="Arial" w:cs="Arial"/>
-        </w:rPr>
-        <w:t xml:space="preserve"> which provides rapid writing and retrieval</w:t>
+        <w:t xml:space="preserve"> provides rapid writing and retrieval</w:t>
       </w:r>
       <w:r>
         <w:rPr>
@@ -1394,13 +1692,32 @@
         <w:rPr>
           <w:rFonts w:ascii="Arial" w:hAnsi="Arial" w:cs="Arial"/>
         </w:rPr>
-        <w:t xml:space="preserve">(HDD) which has moving parts which needs to start first before allowing the retrieval or writing of data. </w:t>
-      </w:r>
-      <w:r>
-        <w:rPr>
-          <w:rFonts w:ascii="Arial" w:hAnsi="Arial" w:cs="Arial"/>
-        </w:rPr>
-        <w:t xml:space="preserve">By utilizing these technologies, </w:t>
+        <w:t xml:space="preserve">(HDD) </w:t>
+      </w:r>
+      <w:r>
+        <w:rPr>
+          <w:rFonts w:ascii="Arial" w:hAnsi="Arial" w:cs="Arial"/>
+        </w:rPr>
+        <w:lastRenderedPageBreak/>
+        <w:t xml:space="preserve">which has moving parts which needs to start first before allowing the retrieval or writing of data. </w:t>
+      </w:r>
+      <w:r>
+        <w:rPr>
+          <w:rFonts w:ascii="Arial" w:hAnsi="Arial" w:cs="Arial"/>
+        </w:rPr>
+        <w:t xml:space="preserve">By utilizing these </w:t>
+      </w:r>
+      <w:r>
+        <w:rPr>
+          <w:rFonts w:ascii="Arial" w:hAnsi="Arial" w:cs="Arial"/>
+        </w:rPr>
+        <w:t>Solid State Drives</w:t>
+      </w:r>
+      <w:r>
+        <w:rPr>
+          <w:rFonts w:ascii="Arial" w:hAnsi="Arial" w:cs="Arial"/>
+        </w:rPr>
+        <w:t xml:space="preserve">, </w:t>
       </w:r>
       <w:proofErr w:type="spellStart"/>
       <w:r>
@@ -1414,7 +1731,25 @@
         <w:rPr>
           <w:rFonts w:ascii="Arial" w:hAnsi="Arial" w:cs="Arial"/>
         </w:rPr>
-        <w:t xml:space="preserve"> minimizes CPU wait times (Bottlenecks), thereby improving system efficiency and supporting heavy multitasking.</w:t>
+        <w:t xml:space="preserve"> minimizes CPU wait times (Bottlenecks), thereby improving system </w:t>
+      </w:r>
+      <w:r>
+        <w:rPr>
+          <w:rFonts w:ascii="Arial" w:hAnsi="Arial" w:cs="Arial"/>
+        </w:rPr>
+        <w:t xml:space="preserve">overall </w:t>
+      </w:r>
+      <w:r>
+        <w:rPr>
+          <w:rFonts w:ascii="Arial" w:hAnsi="Arial" w:cs="Arial"/>
+        </w:rPr>
+        <w:t>performance</w:t>
+      </w:r>
+      <w:r>
+        <w:rPr>
+          <w:rFonts w:ascii="Arial" w:hAnsi="Arial" w:cs="Arial"/>
+        </w:rPr>
+        <w:t xml:space="preserve"> and supporting heavy multitasking.</w:t>
       </w:r>
     </w:p>
     <w:p>
@@ -1445,7 +1780,6 @@
           <w:sz w:val="28"/>
           <w:szCs w:val="28"/>
         </w:rPr>
-        <w:lastRenderedPageBreak/>
         <w:t>Classifications of computer systems</w:t>
       </w:r>
     </w:p>
@@ -1619,14 +1953,12 @@
         </w:rPr>
         <w:t xml:space="preserve">s. </w:t>
       </w:r>
-      <w:proofErr w:type="spellStart"/>
-      <w:r>
-        <w:rPr>
-          <w:rFonts w:ascii="Arial" w:hAnsi="Arial" w:cs="Arial"/>
-        </w:rPr>
-        <w:t>Microcumputers</w:t>
-      </w:r>
-      <w:proofErr w:type="spellEnd"/>
+      <w:r>
+        <w:rPr>
+          <w:rFonts w:ascii="Arial" w:hAnsi="Arial" w:cs="Arial"/>
+        </w:rPr>
+        <w:t>Microcomputers</w:t>
+      </w:r>
       <w:r>
         <w:rPr>
           <w:rFonts w:ascii="Arial" w:hAnsi="Arial" w:cs="Arial"/>
@@ -1828,13 +2160,37 @@
         <w:rPr>
           <w:rFonts w:ascii="Arial" w:hAnsi="Arial" w:cs="Arial"/>
         </w:rPr>
-        <w:t xml:space="preserve">Mainframe computers are large and powerful computers designed to handle and process huge amounts of data quickly. Mainframes are commonly used in large organizations for instance banks and government institutions for tasks such as transaction processions and database management. Some of the characteristics of mainframes include </w:t>
-      </w:r>
-      <w:r>
-        <w:rPr>
-          <w:rFonts w:ascii="Arial" w:hAnsi="Arial" w:cs="Arial"/>
-        </w:rPr>
-        <w:t>supporting large population of users smoothly, scalable and processing large volume of data. Examples of Mainframes include IBM Z Seres and Unisys ClearPath.</w:t>
+        <w:t xml:space="preserve">Mainframe computers are large and powerful computers designed to handle and process huge amounts of data quickly. Mainframes are commonly used in large organizations for instance banks and government institutions for tasks such as </w:t>
+      </w:r>
+      <w:r>
+        <w:rPr>
+          <w:rFonts w:ascii="Arial" w:hAnsi="Arial" w:cs="Arial"/>
+        </w:rPr>
+        <w:t>transaction processing</w:t>
+      </w:r>
+      <w:r>
+        <w:rPr>
+          <w:rFonts w:ascii="Arial" w:hAnsi="Arial" w:cs="Arial"/>
+        </w:rPr>
+        <w:t xml:space="preserve"> and database management. Some of the characteristics of mainframes include </w:t>
+      </w:r>
+      <w:r>
+        <w:rPr>
+          <w:rFonts w:ascii="Arial" w:hAnsi="Arial" w:cs="Arial"/>
+        </w:rPr>
+        <w:t xml:space="preserve">supporting large population of users smoothly, scalable and processing large volume of data. Examples of Mainframes include </w:t>
+      </w:r>
+      <w:r>
+        <w:rPr>
+          <w:rFonts w:ascii="Arial" w:hAnsi="Arial" w:cs="Arial"/>
+        </w:rPr>
+        <w:t>IBM Z Series</w:t>
+      </w:r>
+      <w:r>
+        <w:rPr>
+          <w:rFonts w:ascii="Arial" w:hAnsi="Arial" w:cs="Arial"/>
+        </w:rPr>
+        <w:t xml:space="preserve"> and Unisys ClearPath.</w:t>
       </w:r>
     </w:p>
     <w:p>
@@ -1865,6 +2221,7 @@
           <w:sz w:val="28"/>
           <w:szCs w:val="28"/>
         </w:rPr>
+        <w:lastRenderedPageBreak/>
         <w:t>Possible Expansion areas</w:t>
       </w:r>
     </w:p>
@@ -1937,7 +2294,6 @@
           <w:sz w:val="28"/>
           <w:szCs w:val="28"/>
         </w:rPr>
-        <w:lastRenderedPageBreak/>
         <w:t>Networking infrastructure services</w:t>
       </w:r>
     </w:p>
@@ -2667,7 +3023,19 @@
         <w:rPr>
           <w:rFonts w:ascii="Arial" w:hAnsi="Arial" w:cs="Arial"/>
         </w:rPr>
-        <w:t xml:space="preserve"> which allows users to insert input or get output from the computer systems. Operating system is responsible for managing these devices. It archives this using Device drivers</w:t>
+        <w:t xml:space="preserve"> which allows users to insert input or get output from the computer systems. Operating system is responsible for managing these devices. It </w:t>
+      </w:r>
+      <w:r>
+        <w:rPr>
+          <w:rFonts w:ascii="Arial" w:hAnsi="Arial" w:cs="Arial"/>
+        </w:rPr>
+        <w:t>achieves</w:t>
+      </w:r>
+      <w:r>
+        <w:rPr>
+          <w:rFonts w:ascii="Arial" w:hAnsi="Arial" w:cs="Arial"/>
+        </w:rPr>
+        <w:t xml:space="preserve"> this using Device drivers</w:t>
       </w:r>
       <w:r>
         <w:rPr>
@@ -2697,7 +3065,14 @@
         <w:rPr>
           <w:rFonts w:ascii="Arial" w:hAnsi="Arial" w:cs="Arial"/>
         </w:rPr>
-        <w:t xml:space="preserve"> In start-up environment where multiple employees might need to share a single network printer or external storage, device management ensures that these peripherals are allocated efficiently without conflicts, thereby enhancing workplace productivity.</w:t>
+        <w:t xml:space="preserve"> In start-up environment where multiple employees might need to share a single network printer or external storage, device management ensures that these peripherals are </w:t>
+      </w:r>
+      <w:r>
+        <w:rPr>
+          <w:rFonts w:ascii="Arial" w:hAnsi="Arial" w:cs="Arial"/>
+        </w:rPr>
+        <w:lastRenderedPageBreak/>
+        <w:t>allocated efficiently without conflicts, thereby enhancing workplace productivity.</w:t>
       </w:r>
     </w:p>
     <w:p>
@@ -2740,7 +3115,6 @@
         <w:rPr>
           <w:rFonts w:ascii="Arial" w:hAnsi="Arial" w:cs="Arial"/>
         </w:rPr>
-        <w:lastRenderedPageBreak/>
         <w:t xml:space="preserve">The OS provides Graphical User Interface (GUI) which allows users to interact with the computer system using visual elements like windows, icons and menus. For technology start-ups in </w:t>
       </w:r>
       <w:proofErr w:type="spellStart"/>
@@ -2762,7 +3136,7 @@
         <w:rPr>
           <w:rFonts w:ascii="Arial" w:hAnsi="Arial" w:cs="Arial"/>
         </w:rPr>
-        <w:t>QuntumX</w:t>
+        <w:t>QuantumTech</w:t>
       </w:r>
       <w:proofErr w:type="spellEnd"/>
       <w:r>
@@ -2842,25 +3216,57 @@
         </w:rPr>
         <w:t xml:space="preserve">, start-ups rely </w:t>
       </w:r>
+      <w:r>
+        <w:rPr>
+          <w:rFonts w:ascii="Arial" w:hAnsi="Arial" w:cs="Arial"/>
+        </w:rPr>
+        <w:t>heavily</w:t>
+      </w:r>
+      <w:r>
+        <w:rPr>
+          <w:rFonts w:ascii="Arial" w:hAnsi="Arial" w:cs="Arial"/>
+        </w:rPr>
+        <w:t xml:space="preserve"> on internet access and sharing files across local servers. Th</w:t>
+      </w:r>
+      <w:r>
+        <w:rPr>
+          <w:rFonts w:ascii="Arial" w:hAnsi="Arial" w:cs="Arial"/>
+        </w:rPr>
+        <w:t xml:space="preserve">e networking functionality of the OS ensures that </w:t>
+      </w:r>
       <w:proofErr w:type="spellStart"/>
       <w:r>
         <w:rPr>
           <w:rFonts w:ascii="Arial" w:hAnsi="Arial" w:cs="Arial"/>
         </w:rPr>
-        <w:t>heavilt</w:t>
+        <w:t>QuantumX</w:t>
       </w:r>
       <w:proofErr w:type="spellEnd"/>
       <w:r>
         <w:rPr>
           <w:rFonts w:ascii="Arial" w:hAnsi="Arial" w:cs="Arial"/>
         </w:rPr>
-        <w:t xml:space="preserve"> on internet access and sharing files across local servers. Th</w:t>
-      </w:r>
-      <w:r>
-        <w:rPr>
-          <w:rFonts w:ascii="Arial" w:hAnsi="Arial" w:cs="Arial"/>
-        </w:rPr>
-        <w:t xml:space="preserve">e networking functionality of the OS ensures that </w:t>
+        <w:t xml:space="preserve"> can communicate with other devices effectively, enabling remote collaboration and seamless data sharing among start-up teams.</w:t>
+      </w:r>
+    </w:p>
+    <w:p>
+      <w:pPr>
+        <w:rPr>
+          <w:rFonts w:ascii="Arial" w:hAnsi="Arial" w:cs="Arial"/>
+        </w:rPr>
+      </w:pPr>
+    </w:p>
+    <w:p>
+      <w:pPr>
+        <w:rPr>
+          <w:rFonts w:ascii="Arial" w:hAnsi="Arial" w:cs="Arial"/>
+        </w:rPr>
+      </w:pPr>
+      <w:r>
+        <w:rPr>
+          <w:rFonts w:ascii="Arial" w:hAnsi="Arial" w:cs="Arial"/>
+        </w:rPr>
+        <w:t xml:space="preserve">Furthermore, the operating system works together with the computer hardware in four specific ways to ensure the </w:t>
       </w:r>
       <w:proofErr w:type="spellStart"/>
       <w:r>
@@ -2874,50 +3280,14 @@
         <w:rPr>
           <w:rFonts w:ascii="Arial" w:hAnsi="Arial" w:cs="Arial"/>
         </w:rPr>
-        <w:t xml:space="preserve"> can communicate with other devices effectively, enabling remote collaboration and seamless data sharing among start-up teams.</w:t>
-      </w:r>
-    </w:p>
-    <w:p>
-      <w:pPr>
-        <w:rPr>
-          <w:rFonts w:ascii="Arial" w:hAnsi="Arial" w:cs="Arial"/>
-        </w:rPr>
-      </w:pPr>
-    </w:p>
-    <w:p>
-      <w:pPr>
-        <w:rPr>
-          <w:rFonts w:ascii="Arial" w:hAnsi="Arial" w:cs="Arial"/>
-        </w:rPr>
-      </w:pPr>
-      <w:r>
-        <w:rPr>
-          <w:rFonts w:ascii="Arial" w:hAnsi="Arial" w:cs="Arial"/>
-        </w:rPr>
-        <w:t xml:space="preserve">Furthermore, the operating system works together with the computer hardware in four specific ways to ensure the </w:t>
-      </w:r>
-      <w:proofErr w:type="spellStart"/>
-      <w:r>
-        <w:rPr>
-          <w:rFonts w:ascii="Arial" w:hAnsi="Arial" w:cs="Arial"/>
-        </w:rPr>
-        <w:t>QuantumX</w:t>
-      </w:r>
-      <w:proofErr w:type="spellEnd"/>
-      <w:r>
-        <w:rPr>
-          <w:rFonts w:ascii="Arial" w:hAnsi="Arial" w:cs="Arial"/>
-        </w:rPr>
         <w:t xml:space="preserve"> operates as a high-</w:t>
       </w:r>
-      <w:proofErr w:type="spellStart"/>
-      <w:r>
-        <w:rPr>
-          <w:rFonts w:ascii="Arial" w:hAnsi="Arial" w:cs="Arial"/>
-        </w:rPr>
-        <w:t>perfomance</w:t>
-      </w:r>
-      <w:proofErr w:type="spellEnd"/>
+      <w:r>
+        <w:rPr>
+          <w:rFonts w:ascii="Arial" w:hAnsi="Arial" w:cs="Arial"/>
+        </w:rPr>
+        <w:t>performance</w:t>
+      </w:r>
       <w:r>
         <w:rPr>
           <w:rFonts w:ascii="Arial" w:hAnsi="Arial" w:cs="Arial"/>
@@ -3052,43 +3422,32 @@
         <w:rPr>
           <w:rFonts w:ascii="Arial" w:hAnsi="Arial" w:cs="Arial"/>
         </w:rPr>
+        <w:lastRenderedPageBreak/>
         <w:t xml:space="preserve">The OS manages the flow of data between the input devices and output devices. Since the CPU is much faster than peripherals like hard drives or </w:t>
       </w:r>
-      <w:proofErr w:type="spellStart"/>
-      <w:proofErr w:type="gramStart"/>
-      <w:r>
-        <w:rPr>
-          <w:rFonts w:ascii="Arial" w:hAnsi="Arial" w:cs="Arial"/>
-        </w:rPr>
-        <w:t>pronter</w:t>
-      </w:r>
-      <w:proofErr w:type="spellEnd"/>
-      <w:r>
-        <w:rPr>
-          <w:rFonts w:ascii="Arial" w:hAnsi="Arial" w:cs="Arial"/>
-        </w:rPr>
-        <w:t>,  the</w:t>
-      </w:r>
-      <w:proofErr w:type="gramEnd"/>
-      <w:r>
-        <w:rPr>
-          <w:rFonts w:ascii="Arial" w:hAnsi="Arial" w:cs="Arial"/>
-        </w:rPr>
-        <w:t xml:space="preserve"> OS uses </w:t>
-      </w:r>
-      <w:proofErr w:type="gramStart"/>
-      <w:r>
-        <w:rPr>
-          <w:rFonts w:ascii="Arial" w:hAnsi="Arial" w:cs="Arial"/>
-        </w:rPr>
-        <w:t>buffering(</w:t>
-      </w:r>
-      <w:proofErr w:type="gramEnd"/>
-      <w:r>
-        <w:rPr>
-          <w:rFonts w:ascii="Arial" w:hAnsi="Arial" w:cs="Arial"/>
-        </w:rPr>
-        <w:t xml:space="preserve">) and spooling. This ensures that the fast CPU of the </w:t>
+      <w:r>
+        <w:rPr>
+          <w:rFonts w:ascii="Arial" w:hAnsi="Arial" w:cs="Arial"/>
+        </w:rPr>
+        <w:t>printer</w:t>
+      </w:r>
+      <w:r>
+        <w:rPr>
+          <w:rFonts w:ascii="Arial" w:hAnsi="Arial" w:cs="Arial"/>
+        </w:rPr>
+        <w:t xml:space="preserve">,  the OS uses </w:t>
+      </w:r>
+      <w:r>
+        <w:rPr>
+          <w:rFonts w:ascii="Arial" w:hAnsi="Arial" w:cs="Arial"/>
+        </w:rPr>
+        <w:t>buffering</w:t>
+      </w:r>
+      <w:r>
+        <w:rPr>
+          <w:rFonts w:ascii="Arial" w:hAnsi="Arial" w:cs="Arial"/>
+        </w:rPr>
+        <w:t xml:space="preserve"> and spooling. This ensures that the fast CPU of the </w:t>
       </w:r>
       <w:proofErr w:type="spellStart"/>
       <w:r>
@@ -3319,16 +3678,15 @@
           <w:sz w:val="28"/>
           <w:szCs w:val="28"/>
         </w:rPr>
-        <w:t xml:space="preserve"> operates reliably and </w:t>
-      </w:r>
-      <w:proofErr w:type="gramStart"/>
+        <w:t xml:space="preserve"> operates reliably and efficientl</w:t>
+      </w:r>
       <w:r>
         <w:rPr>
           <w:rFonts w:ascii="Arial" w:hAnsi="Arial" w:cs="Arial"/>
           <w:sz w:val="28"/>
           <w:szCs w:val="28"/>
         </w:rPr>
-        <w:t>efficientl</w:t>
+        <w:t>y</w:t>
       </w:r>
       <w:r>
         <w:rPr>
@@ -3336,7 +3694,7 @@
           <w:sz w:val="28"/>
           <w:szCs w:val="28"/>
         </w:rPr>
-        <w:t>y</w:t>
+        <w:t xml:space="preserve"> </w:t>
       </w:r>
       <w:r>
         <w:rPr>
@@ -3344,25 +3702,26 @@
           <w:sz w:val="28"/>
           <w:szCs w:val="28"/>
         </w:rPr>
-        <w:t xml:space="preserve"> </w:t>
-      </w:r>
-      <w:r>
+        <w:t>, reinforcing customer trust and justifying the investment to financial stakeholders.</w:t>
+      </w:r>
+    </w:p>
+    <w:p>
+      <w:pPr>
         <w:rPr>
           <w:rFonts w:ascii="Arial" w:hAnsi="Arial" w:cs="Arial"/>
           <w:sz w:val="28"/>
           <w:szCs w:val="28"/>
         </w:rPr>
-        <w:t>,</w:t>
-      </w:r>
-      <w:proofErr w:type="gramEnd"/>
-      <w:r>
+      </w:pPr>
+    </w:p>
+    <w:p>
+      <w:pPr>
         <w:rPr>
           <w:rFonts w:ascii="Arial" w:hAnsi="Arial" w:cs="Arial"/>
           <w:sz w:val="28"/>
           <w:szCs w:val="28"/>
         </w:rPr>
-        <w:t xml:space="preserve"> reinforcing customer trust and justifying the investment to financial stakeholders.</w:t>
-      </w:r>
+      </w:pPr>
     </w:p>
     <w:p>
       <w:pPr>
@@ -3388,54 +3747,6 @@
           <w:rFonts w:ascii="Arial" w:hAnsi="Arial" w:cs="Arial"/>
           <w:sz w:val="28"/>
           <w:szCs w:val="28"/>
-        </w:rPr>
-      </w:pPr>
-    </w:p>
-    <w:p>
-      <w:pPr>
-        <w:rPr>
-          <w:rFonts w:ascii="Arial" w:hAnsi="Arial" w:cs="Arial"/>
-          <w:sz w:val="28"/>
-          <w:szCs w:val="28"/>
-        </w:rPr>
-      </w:pPr>
-    </w:p>
-    <w:p>
-      <w:pPr>
-        <w:rPr>
-          <w:rFonts w:ascii="Arial" w:hAnsi="Arial" w:cs="Arial"/>
-          <w:sz w:val="28"/>
-          <w:szCs w:val="28"/>
-        </w:rPr>
-      </w:pPr>
-    </w:p>
-    <w:p>
-      <w:pPr>
-        <w:rPr>
-          <w:rFonts w:ascii="Arial" w:hAnsi="Arial" w:cs="Arial"/>
-          <w:b/>
-          <w:sz w:val="32"/>
-          <w:szCs w:val="32"/>
-        </w:rPr>
-      </w:pPr>
-    </w:p>
-    <w:p>
-      <w:pPr>
-        <w:rPr>
-          <w:rFonts w:ascii="Arial" w:hAnsi="Arial" w:cs="Arial"/>
-          <w:b/>
-          <w:sz w:val="32"/>
-          <w:szCs w:val="32"/>
-        </w:rPr>
-      </w:pPr>
-    </w:p>
-    <w:p>
-      <w:pPr>
-        <w:rPr>
-          <w:rFonts w:ascii="Arial" w:hAnsi="Arial" w:cs="Arial"/>
-          <w:b/>
-          <w:sz w:val="32"/>
-          <w:szCs w:val="32"/>
         </w:rPr>
       </w:pPr>
     </w:p>
@@ -4302,7 +4613,7 @@
         <w:rPr>
           <w:rFonts w:ascii="Arial" w:hAnsi="Arial" w:cs="Arial"/>
         </w:rPr>
-        <w:t>QuntumTech</w:t>
+        <w:t>QuantumTech</w:t>
       </w:r>
       <w:proofErr w:type="spellEnd"/>
       <w:r>
@@ -4762,7 +5073,19 @@
         <w:rPr>
           <w:rFonts w:ascii="Arial" w:hAnsi="Arial" w:cs="Arial"/>
         </w:rPr>
-        <w:t xml:space="preserve">reads and executes code line by line in real time without changing the hole file into machine code. Languages that need interpreters for them to run are called </w:t>
+        <w:t xml:space="preserve">reads and executes code line by line in real time without changing the </w:t>
+      </w:r>
+      <w:r>
+        <w:rPr>
+          <w:rFonts w:ascii="Arial" w:hAnsi="Arial" w:cs="Arial"/>
+        </w:rPr>
+        <w:t>whole file</w:t>
+      </w:r>
+      <w:r>
+        <w:rPr>
+          <w:rFonts w:ascii="Arial" w:hAnsi="Arial" w:cs="Arial"/>
+        </w:rPr>
+        <w:t xml:space="preserve"> into machine code. Languages that need interpreters for them to run are called </w:t>
       </w:r>
       <w:r>
         <w:rPr>
@@ -4798,13 +5121,7 @@
         <w:rPr>
           <w:rFonts w:ascii="Arial" w:hAnsi="Arial" w:cs="Arial"/>
         </w:rPr>
-        <w:t>interpreted</w:t>
-      </w:r>
-      <w:r>
-        <w:rPr>
-          <w:rFonts w:ascii="Arial" w:hAnsi="Arial" w:cs="Arial"/>
-        </w:rPr>
-        <w:t xml:space="preserve"> Development Environment</w:t>
+        <w:t>Integrated Development Environment</w:t>
       </w:r>
       <w:r>
         <w:rPr>
@@ -4957,21 +5274,7 @@
         <w:rPr>
           <w:rFonts w:ascii="Arial" w:hAnsi="Arial" w:cs="Arial"/>
         </w:rPr>
-        <w:t xml:space="preserve"> </w:t>
-      </w:r>
-      <w:proofErr w:type="gramStart"/>
-      <w:r>
-        <w:rPr>
-          <w:rFonts w:ascii="Arial" w:hAnsi="Arial" w:cs="Arial"/>
-        </w:rPr>
-        <w:t>IDE’s</w:t>
-      </w:r>
-      <w:proofErr w:type="gramEnd"/>
-      <w:r>
-        <w:rPr>
-          <w:rFonts w:ascii="Arial" w:hAnsi="Arial" w:cs="Arial"/>
-        </w:rPr>
-        <w:t xml:space="preserve"> are categorized into General-Purpose IDE’s that supports wide range of programming languages, and Specialized IDE’s which are tailored for specific languages. Some examples of IDE’s include Visual Studio Code, </w:t>
+        <w:t xml:space="preserve"> IDE’s are categorized into General-Purpose IDE’s that supports wide range of programming languages, and Specialized IDE’s which are tailored for specific languages. Some examples of IDE’s include Visual Studio Code, </w:t>
       </w:r>
       <w:proofErr w:type="spellStart"/>
       <w:r>
@@ -5793,23 +6096,21 @@
           <w:rFonts w:ascii="Arial" w:hAnsi="Arial" w:cs="Arial"/>
           <w:bCs/>
         </w:rPr>
-        <w:t xml:space="preserve"> start-up businesses, I recommend offering a Star Topology for their LAN configuration. This is because start-up businesses need a network that I easy to install, reliable and simple to maintain and scale. In star topology if one cable or node fails, the rest of the network continues to operate normally. </w:t>
-      </w:r>
-      <w:proofErr w:type="gramStart"/>
+        <w:t xml:space="preserve"> start-up businesses, I recommend offering a Star Topology for their LAN configuration. This is because start-up businesses need a network that </w:t>
+      </w:r>
       <w:r>
         <w:rPr>
           <w:rFonts w:ascii="Arial" w:hAnsi="Arial" w:cs="Arial"/>
           <w:bCs/>
         </w:rPr>
-        <w:t>This  means</w:t>
-      </w:r>
-      <w:proofErr w:type="gramEnd"/>
+        <w:t>Is easy to install</w:t>
+      </w:r>
       <w:r>
         <w:rPr>
           <w:rFonts w:ascii="Arial" w:hAnsi="Arial" w:cs="Arial"/>
           <w:bCs/>
         </w:rPr>
-        <w:t xml:space="preserve"> businesses can continue operating without disruptions.</w:t>
+        <w:t>, reliable and simple to maintain and scale. In star topology if one cable or node fails, the rest of the network continues to operate normally. This means businesses can continue operating without disruptions.</w:t>
       </w:r>
     </w:p>
     <w:p>
@@ -6223,16 +6524,8 @@
         <w:rPr>
           <w:rFonts w:ascii="Arial" w:hAnsi="Arial" w:cs="Arial"/>
         </w:rPr>
-        <w:t xml:space="preserve"> Hybrid technologies are free to take any form. Hybrid technologies are very flexible and can easily been expanded by adding new devices. Therefore, </w:t>
-      </w:r>
-      <w:proofErr w:type="gramStart"/>
-      <w:r>
-        <w:rPr>
-          <w:rFonts w:ascii="Arial" w:hAnsi="Arial" w:cs="Arial"/>
-        </w:rPr>
-        <w:t>It</w:t>
-      </w:r>
-      <w:proofErr w:type="gramEnd"/>
+        <w:t xml:space="preserve"> Hybrid technologies are free to take any form. Hybrid technologies are very flexible and can easily been expanded by adding new devices. Therefore, It</w:t>
+      </w:r>
       <w:r>
         <w:rPr>
           <w:rFonts w:ascii="Arial" w:hAnsi="Arial" w:cs="Arial"/>
@@ -6307,15 +6600,11 @@
       <w:pPr>
         <w:rPr>
           <w:rFonts w:ascii="Arial" w:hAnsi="Arial" w:cs="Arial"/>
-          <w:sz w:val="28"/>
-          <w:szCs w:val="28"/>
-        </w:rPr>
-      </w:pPr>
-      <w:r>
-        <w:rPr>
-          <w:rFonts w:ascii="Arial" w:hAnsi="Arial" w:cs="Arial"/>
-          <w:sz w:val="28"/>
-          <w:szCs w:val="28"/>
+        </w:rPr>
+      </w:pPr>
+      <w:r>
+        <w:rPr>
+          <w:rFonts w:ascii="Arial" w:hAnsi="Arial" w:cs="Arial"/>
         </w:rPr>
         <w:t xml:space="preserve">According to </w:t>
       </w:r>
@@ -6323,8 +6612,6 @@
         <w:sdtPr>
           <w:rPr>
             <w:rFonts w:ascii="Arial" w:hAnsi="Arial" w:cs="Arial"/>
-            <w:sz w:val="28"/>
-            <w:szCs w:val="28"/>
           </w:rPr>
           <w:id w:val="793187480"/>
           <w:citation/>
@@ -6333,16 +6620,12 @@
           <w:r>
             <w:rPr>
               <w:rFonts w:ascii="Arial" w:hAnsi="Arial" w:cs="Arial"/>
-              <w:sz w:val="28"/>
-              <w:szCs w:val="28"/>
             </w:rPr>
             <w:fldChar w:fldCharType="begin"/>
           </w:r>
           <w:r>
             <w:rPr>
               <w:rFonts w:ascii="Arial" w:hAnsi="Arial" w:cs="Arial"/>
-              <w:sz w:val="28"/>
-              <w:szCs w:val="28"/>
               <w:lang w:val="en-GB"/>
             </w:rPr>
             <w:instrText xml:space="preserve"> CITATION Com26 \l 2057 </w:instrText>
@@ -6350,8 +6633,6 @@
           <w:r>
             <w:rPr>
               <w:rFonts w:ascii="Arial" w:hAnsi="Arial" w:cs="Arial"/>
-              <w:sz w:val="28"/>
-              <w:szCs w:val="28"/>
             </w:rPr>
             <w:fldChar w:fldCharType="separate"/>
           </w:r>
@@ -6359,8 +6640,6 @@
             <w:rPr>
               <w:rFonts w:ascii="Arial" w:hAnsi="Arial" w:cs="Arial"/>
               <w:noProof/>
-              <w:sz w:val="28"/>
-              <w:szCs w:val="28"/>
               <w:lang w:val="en-GB"/>
             </w:rPr>
             <w:t>(Commerce Engine, 2026)</w:t>
@@ -6368,8 +6647,6 @@
           <w:r>
             <w:rPr>
               <w:rFonts w:ascii="Arial" w:hAnsi="Arial" w:cs="Arial"/>
-              <w:sz w:val="28"/>
-              <w:szCs w:val="28"/>
             </w:rPr>
             <w:fldChar w:fldCharType="end"/>
           </w:r>
@@ -6378,92 +6655,68 @@
       <w:r>
         <w:rPr>
           <w:rFonts w:ascii="Arial" w:hAnsi="Arial" w:cs="Arial"/>
-          <w:sz w:val="28"/>
-          <w:szCs w:val="28"/>
         </w:rPr>
         <w:t xml:space="preserve">, </w:t>
       </w:r>
       <w:r>
         <w:rPr>
           <w:rFonts w:ascii="Arial" w:hAnsi="Arial" w:cs="Arial"/>
-          <w:sz w:val="28"/>
-          <w:szCs w:val="28"/>
         </w:rPr>
         <w:t xml:space="preserve">Network </w:t>
       </w:r>
       <w:r>
         <w:rPr>
           <w:rFonts w:ascii="Arial" w:hAnsi="Arial" w:cs="Arial"/>
-          <w:sz w:val="28"/>
-          <w:szCs w:val="28"/>
         </w:rPr>
         <w:t>topolog</w:t>
       </w:r>
       <w:r>
         <w:rPr>
           <w:rFonts w:ascii="Arial" w:hAnsi="Arial" w:cs="Arial"/>
-          <w:sz w:val="28"/>
-          <w:szCs w:val="28"/>
         </w:rPr>
         <w:t>ies require specific physical equipment. Therefore,</w:t>
       </w:r>
       <w:r>
         <w:rPr>
           <w:rFonts w:ascii="Arial" w:hAnsi="Arial" w:cs="Arial"/>
-          <w:sz w:val="28"/>
-          <w:szCs w:val="28"/>
         </w:rPr>
         <w:t xml:space="preserve"> </w:t>
       </w:r>
       <w:proofErr w:type="spellStart"/>
-      <w:proofErr w:type="gramStart"/>
-      <w:r>
-        <w:rPr>
-          <w:rFonts w:ascii="Arial" w:hAnsi="Arial" w:cs="Arial"/>
-          <w:sz w:val="28"/>
-          <w:szCs w:val="28"/>
-        </w:rPr>
-        <w:t>QuntumTech</w:t>
+      <w:r>
+        <w:rPr>
+          <w:rFonts w:ascii="Arial" w:hAnsi="Arial" w:cs="Arial"/>
+        </w:rPr>
+        <w:t>QuantumTech</w:t>
       </w:r>
       <w:proofErr w:type="spellEnd"/>
       <w:r>
         <w:rPr>
           <w:rFonts w:ascii="Arial" w:hAnsi="Arial" w:cs="Arial"/>
-          <w:sz w:val="28"/>
-          <w:szCs w:val="28"/>
+        </w:rPr>
+        <w:t xml:space="preserve"> must</w:t>
+      </w:r>
+      <w:r>
+        <w:rPr>
+          <w:rFonts w:ascii="Arial" w:hAnsi="Arial" w:cs="Arial"/>
         </w:rPr>
         <w:t xml:space="preserve"> </w:t>
       </w:r>
       <w:r>
         <w:rPr>
           <w:rFonts w:ascii="Arial" w:hAnsi="Arial" w:cs="Arial"/>
-          <w:sz w:val="28"/>
-          <w:szCs w:val="28"/>
-        </w:rPr>
-        <w:t xml:space="preserve"> understand</w:t>
-      </w:r>
-      <w:proofErr w:type="gramEnd"/>
-      <w:r>
-        <w:rPr>
-          <w:rFonts w:ascii="Arial" w:hAnsi="Arial" w:cs="Arial"/>
-          <w:sz w:val="28"/>
-          <w:szCs w:val="28"/>
-        </w:rPr>
-        <w:t xml:space="preserve"> the required equipment for the desired topology they would like to install</w:t>
-      </w:r>
-      <w:r>
-        <w:rPr>
-          <w:rFonts w:ascii="Arial" w:hAnsi="Arial" w:cs="Arial"/>
-          <w:sz w:val="28"/>
-          <w:szCs w:val="28"/>
+        </w:rPr>
+        <w:t>understand the required equipment for the desired topology they would like to install</w:t>
+      </w:r>
+      <w:r>
+        <w:rPr>
+          <w:rFonts w:ascii="Arial" w:hAnsi="Arial" w:cs="Arial"/>
         </w:rPr>
         <w:t>. A star topology requires a Network Switch to act as the central connection point</w:t>
       </w:r>
       <w:r>
         <w:rPr>
           <w:rFonts w:ascii="Arial" w:hAnsi="Arial" w:cs="Arial"/>
-          <w:sz w:val="28"/>
-          <w:szCs w:val="28"/>
         </w:rPr>
         <w:t xml:space="preserve">. The switch routes data only to intended device. Network Interface Cards (NICs) are required inside every </w:t>
       </w:r>
@@ -6471,8 +6724,6 @@
       <w:r>
         <w:rPr>
           <w:rFonts w:ascii="Arial" w:hAnsi="Arial" w:cs="Arial"/>
-          <w:sz w:val="28"/>
-          <w:szCs w:val="28"/>
         </w:rPr>
         <w:t>QuantumX</w:t>
       </w:r>
@@ -6480,24 +6731,18 @@
       <w:r>
         <w:rPr>
           <w:rFonts w:ascii="Arial" w:hAnsi="Arial" w:cs="Arial"/>
-          <w:sz w:val="28"/>
-          <w:szCs w:val="28"/>
         </w:rPr>
         <w:t xml:space="preserve"> computer to connect to the network. </w:t>
       </w:r>
       <w:r>
         <w:rPr>
           <w:rFonts w:ascii="Arial" w:hAnsi="Arial" w:cs="Arial"/>
-          <w:sz w:val="28"/>
-          <w:szCs w:val="28"/>
         </w:rPr>
         <w:t xml:space="preserve">Unshielded Twisted Pair (UTP) Cabling such as Cat6 with RJ-45 connectors is needed to link the devices to the switch. Finally, a Router is required </w:t>
       </w:r>
       <w:r>
         <w:rPr>
           <w:rFonts w:ascii="Arial" w:hAnsi="Arial" w:cs="Arial"/>
-          <w:sz w:val="28"/>
-          <w:szCs w:val="28"/>
         </w:rPr>
         <w:t>at the edge of the network to connect the local LAN to the wider internet and Wireless Access Points are needed to provide Wi-Fi connectivity to devices like mobile phones.</w:t>
       </w:r>
@@ -6595,22 +6840,40 @@
         <w:rPr>
           <w:rFonts w:ascii="Arial" w:hAnsi="Arial" w:cs="Arial"/>
         </w:rPr>
+        <w:t>Physical Layer</w:t>
+      </w:r>
+    </w:p>
+    <w:p>
+      <w:pPr>
+        <w:ind w:left="360"/>
+        <w:rPr>
+          <w:rFonts w:ascii="Arial" w:hAnsi="Arial" w:cs="Arial"/>
+        </w:rPr>
+      </w:pPr>
+      <w:r>
+        <w:rPr>
+          <w:rFonts w:ascii="Arial" w:hAnsi="Arial" w:cs="Arial"/>
+        </w:rPr>
+        <w:t xml:space="preserve">This is the </w:t>
+      </w:r>
+      <w:r>
+        <w:rPr>
+          <w:rFonts w:ascii="Arial" w:hAnsi="Arial" w:cs="Arial"/>
+        </w:rPr>
+        <w:t>lowest</w:t>
+      </w:r>
+      <w:r>
+        <w:rPr>
+          <w:rFonts w:ascii="Arial" w:hAnsi="Arial" w:cs="Arial"/>
+        </w:rPr>
+        <w:t xml:space="preserve"> first layer, it is responsible for transmitting raw bits data through physical media such as Ethernet cable, Fiber optic cables or wireless signals. It </w:t>
+      </w:r>
+      <w:r>
+        <w:rPr>
+          <w:rFonts w:ascii="Arial" w:hAnsi="Arial" w:cs="Arial"/>
+        </w:rPr>
         <w:lastRenderedPageBreak/>
-        <w:t>Physical Layer</w:t>
-      </w:r>
-    </w:p>
-    <w:p>
-      <w:pPr>
-        <w:ind w:left="360"/>
-        <w:rPr>
-          <w:rFonts w:ascii="Arial" w:hAnsi="Arial" w:cs="Arial"/>
-        </w:rPr>
-      </w:pPr>
-      <w:r>
-        <w:rPr>
-          <w:rFonts w:ascii="Arial" w:hAnsi="Arial" w:cs="Arial"/>
-        </w:rPr>
-        <w:t>This is the uppermost first layer, it is responsible for transmitting raw bits data through physical media such as Ethernet cable, Fiber optic cables or wireless signals. It defines the electrical, mechanical and physical characteristics required to establish a network connection. Without this layer, no physical communication between nodes would be possible.</w:t>
+        <w:t>defines the electrical, mechanical and physical characteristics required to establish a network connection. Without this layer, no physical communication between nodes would be possible.</w:t>
       </w:r>
     </w:p>
     <w:p>
@@ -6802,21 +7065,7 @@
         <w:rPr>
           <w:rFonts w:ascii="Arial" w:hAnsi="Arial" w:cs="Arial"/>
         </w:rPr>
-        <w:t xml:space="preserve">Session layer, the sixth fifth layer in the OSI model is responsible for establishing, managing and terminating communication sessions between applications. The layer ensures that communication remains active while data is being exchanged among </w:t>
-      </w:r>
-      <w:proofErr w:type="spellStart"/>
-      <w:r>
-        <w:rPr>
-          <w:rFonts w:ascii="Arial" w:hAnsi="Arial" w:cs="Arial"/>
-        </w:rPr>
-        <w:t>aand</w:t>
-      </w:r>
-      <w:proofErr w:type="spellEnd"/>
-      <w:r>
-        <w:rPr>
-          <w:rFonts w:ascii="Arial" w:hAnsi="Arial" w:cs="Arial"/>
-        </w:rPr>
-        <w:t xml:space="preserve"> ensures that the connection is closed once the communication process has been completed.</w:t>
+        <w:t>Session layer, the fifth layer in the OSI model is responsible for establishing, managing and terminating communication sessions between applications. The layer ensures that communication remains active while data is being exchanged among ensures that the connection is closed once the communication process has been completed.</w:t>
       </w:r>
     </w:p>
     <w:p>
@@ -6858,14 +7107,7 @@
         <w:rPr>
           <w:rFonts w:ascii="Arial" w:hAnsi="Arial" w:cs="Arial"/>
         </w:rPr>
-        <w:t xml:space="preserve">The sixth layer of the OSI model is the presentation layer. This layer is responsible for translating data into a format that both communicating devices can understand. It </w:t>
-      </w:r>
-      <w:r>
-        <w:rPr>
-          <w:rFonts w:ascii="Arial" w:hAnsi="Arial" w:cs="Arial"/>
-        </w:rPr>
-        <w:lastRenderedPageBreak/>
-        <w:t>also performs functions such as data encryption, compression and decryption. This ensures that information remains secure du</w:t>
+        <w:t>The sixth layer of the OSI model is the presentation layer. This layer is responsible for translating data into a format that both communicating devices can understand. It also performs functions such as data encryption, compression and decryption. This ensures that information remains secure du</w:t>
       </w:r>
       <w:r>
         <w:rPr>
@@ -6926,6 +7168,7 @@
         <w:rPr>
           <w:rFonts w:ascii="Arial" w:hAnsi="Arial" w:cs="Arial"/>
         </w:rPr>
+        <w:lastRenderedPageBreak/>
         <w:t>Application Layer</w:t>
       </w:r>
     </w:p>
@@ -6966,6 +7209,33 @@
         </w:rPr>
         <w:t>s websites, send emails and communicate over the internet.</w:t>
       </w:r>
+    </w:p>
+    <w:p>
+      <w:pPr>
+        <w:pStyle w:val="ListParagraph"/>
+        <w:ind w:left="1080"/>
+        <w:rPr>
+          <w:rFonts w:ascii="Arial" w:hAnsi="Arial" w:cs="Arial"/>
+        </w:rPr>
+      </w:pPr>
+    </w:p>
+    <w:p>
+      <w:pPr>
+        <w:pStyle w:val="ListParagraph"/>
+        <w:ind w:left="1080"/>
+        <w:rPr>
+          <w:rFonts w:ascii="Arial" w:hAnsi="Arial" w:cs="Arial"/>
+        </w:rPr>
+      </w:pPr>
+    </w:p>
+    <w:p>
+      <w:pPr>
+        <w:pStyle w:val="ListParagraph"/>
+        <w:ind w:left="1080"/>
+        <w:rPr>
+          <w:rFonts w:ascii="Arial" w:hAnsi="Arial" w:cs="Arial"/>
+        </w:rPr>
+      </w:pPr>
     </w:p>
     <w:p>
       <w:pPr>
@@ -7693,19 +7963,29 @@
         </w:rPr>
         <w:t xml:space="preserve"> is ability of a system to run multiple processes </w:t>
       </w:r>
-      <w:proofErr w:type="spellStart"/>
-      <w:r>
-        <w:rPr>
-          <w:rFonts w:ascii="Arial" w:hAnsi="Arial" w:cs="Arial"/>
-        </w:rPr>
-        <w:t>silmutaneously</w:t>
-      </w:r>
-      <w:proofErr w:type="spellEnd"/>
-      <w:r>
-        <w:rPr>
-          <w:rFonts w:ascii="Arial" w:hAnsi="Arial" w:cs="Arial"/>
-        </w:rPr>
-        <w:t xml:space="preserve"> across different devices. This is highly useful for Artificial Intelligence (AI) startups because it allows them t train complex machine learning models much faster by diving the workload across multiple machines at the same time.</w:t>
+      <w:r>
+        <w:rPr>
+          <w:rFonts w:ascii="Arial" w:hAnsi="Arial" w:cs="Arial"/>
+        </w:rPr>
+        <w:t>simultaneously</w:t>
+      </w:r>
+      <w:r>
+        <w:rPr>
+          <w:rFonts w:ascii="Arial" w:hAnsi="Arial" w:cs="Arial"/>
+        </w:rPr>
+        <w:t xml:space="preserve"> across different devices. This is highly useful for Artificial Intelligence (AI) startups because it allows them t train complex machine learning models much faster by </w:t>
+      </w:r>
+      <w:r>
+        <w:rPr>
+          <w:rFonts w:ascii="Arial" w:hAnsi="Arial" w:cs="Arial"/>
+        </w:rPr>
+        <w:t>dividing the workload</w:t>
+      </w:r>
+      <w:r>
+        <w:rPr>
+          <w:rFonts w:ascii="Arial" w:hAnsi="Arial" w:cs="Arial"/>
+        </w:rPr>
+        <w:t xml:space="preserve"> across multiple machines at the same time.</w:t>
       </w:r>
     </w:p>
     <w:p>
@@ -7788,14 +8068,12 @@
         </w:rPr>
         <w:t xml:space="preserve">Fault tolerance means the ability of the system to keep running even if there is a fault occurring in the system, preventing total </w:t>
       </w:r>
-      <w:proofErr w:type="spellStart"/>
-      <w:r>
-        <w:rPr>
-          <w:rFonts w:ascii="Arial" w:hAnsi="Arial" w:cs="Arial"/>
-        </w:rPr>
-        <w:t>failture</w:t>
-      </w:r>
-      <w:proofErr w:type="spellEnd"/>
+      <w:r>
+        <w:rPr>
+          <w:rFonts w:ascii="Arial" w:hAnsi="Arial" w:cs="Arial"/>
+        </w:rPr>
+        <w:t>failure</w:t>
+      </w:r>
       <w:r>
         <w:rPr>
           <w:rFonts w:ascii="Arial" w:hAnsi="Arial" w:cs="Arial"/>
@@ -8149,21 +8427,7 @@
         <w:rPr>
           <w:rFonts w:ascii="Arial" w:hAnsi="Arial" w:cs="Arial"/>
         </w:rPr>
-        <w:t xml:space="preserve">ups to </w:t>
-      </w:r>
-      <w:proofErr w:type="gramStart"/>
-      <w:r>
-        <w:rPr>
-          <w:rFonts w:ascii="Arial" w:hAnsi="Arial" w:cs="Arial"/>
-        </w:rPr>
-        <w:t>train  complex</w:t>
-      </w:r>
-      <w:proofErr w:type="gramEnd"/>
-      <w:r>
-        <w:rPr>
-          <w:rFonts w:ascii="Arial" w:hAnsi="Arial" w:cs="Arial"/>
-        </w:rPr>
-        <w:t xml:space="preserve"> machine learning models faster than traditional hardware allows.</w:t>
+        <w:t>ups to train complex machine learning models faster than traditional hardware allows.</w:t>
       </w:r>
     </w:p>
     <w:p>
@@ -8203,43 +8467,19 @@
         <w:rPr>
           <w:rFonts w:ascii="Arial" w:hAnsi="Arial" w:cs="Arial"/>
         </w:rPr>
-        <w:t xml:space="preserve">Quantum computers can find the absolute best solution among millions of variables. This is highly </w:t>
-      </w:r>
-      <w:r>
-        <w:rPr>
-          <w:rFonts w:ascii="Arial" w:hAnsi="Arial" w:cs="Arial"/>
-        </w:rPr>
-        <w:t>v</w:t>
-      </w:r>
-      <w:r>
-        <w:rPr>
-          <w:rFonts w:ascii="Arial" w:hAnsi="Arial" w:cs="Arial"/>
-        </w:rPr>
-        <w:t>alue</w:t>
-      </w:r>
-      <w:r>
-        <w:rPr>
-          <w:rFonts w:ascii="Arial" w:hAnsi="Arial" w:cs="Arial"/>
-        </w:rPr>
-        <w:t>d</w:t>
-      </w:r>
-      <w:r>
-        <w:rPr>
-          <w:rFonts w:ascii="Arial" w:hAnsi="Arial" w:cs="Arial"/>
-        </w:rPr>
-        <w:t xml:space="preserve"> for</w:t>
-      </w:r>
-      <w:r>
-        <w:rPr>
-          <w:rFonts w:ascii="Arial" w:hAnsi="Arial" w:cs="Arial"/>
-        </w:rPr>
-        <w:t xml:space="preserve"> l</w:t>
-      </w:r>
-      <w:r>
-        <w:rPr>
-          <w:rFonts w:ascii="Arial" w:hAnsi="Arial" w:cs="Arial"/>
-        </w:rPr>
-        <w:t xml:space="preserve"> Big Data and logistics startups that need to optimize complex operational routes.</w:t>
+        <w:t xml:space="preserve">Quantum computers can find the absolute best solution among millions of variables. This is </w:t>
+      </w:r>
+      <w:r>
+        <w:rPr>
+          <w:rFonts w:ascii="Arial" w:hAnsi="Arial" w:cs="Arial"/>
+        </w:rPr>
+        <w:t>highly valued for Big Data</w:t>
+      </w:r>
+      <w:r>
+        <w:rPr>
+          <w:rFonts w:ascii="Arial" w:hAnsi="Arial" w:cs="Arial"/>
+        </w:rPr>
+        <w:t xml:space="preserve"> and logistics startups that need to optimize complex operational routes.</w:t>
       </w:r>
     </w:p>
     <w:p>
@@ -8289,7 +8529,6 @@
         <w:t xml:space="preserve">. Current encryption methods like RSA are secure because traditional computers take a very long time to break them. </w:t>
       </w:r>
       <w:proofErr w:type="spellStart"/>
-      <w:proofErr w:type="gramStart"/>
       <w:r>
         <w:rPr>
           <w:rFonts w:ascii="Arial" w:hAnsi="Arial" w:cs="Arial"/>
@@ -8297,111 +8536,106 @@
         <w:t>However,in</w:t>
       </w:r>
       <w:proofErr w:type="spellEnd"/>
-      <w:proofErr w:type="gramEnd"/>
-      <w:r>
-        <w:rPr>
-          <w:rFonts w:ascii="Arial" w:hAnsi="Arial" w:cs="Arial"/>
-        </w:rPr>
-        <w:t xml:space="preserve"> the future quantum computers may break this type of encryption much faster in the </w:t>
+      <w:r>
+        <w:rPr>
+          <w:rFonts w:ascii="Arial" w:hAnsi="Arial" w:cs="Arial"/>
+        </w:rPr>
+        <w:t xml:space="preserve"> the future quantum computers may break this type of encryption much faster in the future.</w:t>
+      </w:r>
+      <w:r>
+        <w:rPr>
+          <w:rFonts w:ascii="Arial" w:hAnsi="Arial" w:cs="Arial"/>
+        </w:rPr>
+        <w:t xml:space="preserve"> </w:t>
+      </w:r>
+      <w:r>
+        <w:rPr>
+          <w:rFonts w:ascii="Arial" w:hAnsi="Arial" w:cs="Arial"/>
+        </w:rPr>
+        <w:t>However</w:t>
+      </w:r>
+      <w:r>
+        <w:rPr>
+          <w:rFonts w:ascii="Arial" w:hAnsi="Arial" w:cs="Arial"/>
+        </w:rPr>
+        <w:t>,</w:t>
+      </w:r>
+      <w:r>
+        <w:rPr>
+          <w:rFonts w:ascii="Arial" w:hAnsi="Arial" w:cs="Arial"/>
+        </w:rPr>
+        <w:t xml:space="preserve"> in the future,</w:t>
+      </w:r>
+      <w:r>
+        <w:rPr>
+          <w:rFonts w:ascii="Arial" w:hAnsi="Arial" w:cs="Arial"/>
+        </w:rPr>
+        <w:t xml:space="preserve"> </w:t>
       </w:r>
       <w:proofErr w:type="spellStart"/>
-      <w:proofErr w:type="gramStart"/>
-      <w:r>
-        <w:rPr>
-          <w:rFonts w:ascii="Arial" w:hAnsi="Arial" w:cs="Arial"/>
-        </w:rPr>
-        <w:t>future.</w:t>
-      </w:r>
-      <w:r>
-        <w:rPr>
-          <w:rFonts w:ascii="Arial" w:hAnsi="Arial" w:cs="Arial"/>
-        </w:rPr>
-        <w:t>Therefore</w:t>
+      <w:r>
+        <w:rPr>
+          <w:rFonts w:ascii="Arial" w:hAnsi="Arial" w:cs="Arial"/>
+        </w:rPr>
+        <w:t>QuantumTech</w:t>
       </w:r>
       <w:proofErr w:type="spellEnd"/>
-      <w:proofErr w:type="gramEnd"/>
-      <w:r>
-        <w:rPr>
-          <w:rFonts w:ascii="Arial" w:hAnsi="Arial" w:cs="Arial"/>
-        </w:rPr>
-        <w:t xml:space="preserve">, </w:t>
+      <w:r>
+        <w:rPr>
+          <w:rFonts w:ascii="Arial" w:hAnsi="Arial" w:cs="Arial"/>
+        </w:rPr>
+        <w:t xml:space="preserve"> </w:t>
+      </w:r>
+      <w:r>
+        <w:rPr>
+          <w:rFonts w:ascii="Arial" w:hAnsi="Arial" w:cs="Arial"/>
+        </w:rPr>
+        <w:t>should consider</w:t>
+      </w:r>
+      <w:r>
+        <w:rPr>
+          <w:rFonts w:ascii="Arial" w:hAnsi="Arial" w:cs="Arial"/>
+        </w:rPr>
+        <w:t xml:space="preserve"> offer</w:t>
+      </w:r>
+      <w:r>
+        <w:rPr>
+          <w:rFonts w:ascii="Arial" w:hAnsi="Arial" w:cs="Arial"/>
+        </w:rPr>
+        <w:t>ing</w:t>
+      </w:r>
+      <w:r>
+        <w:rPr>
+          <w:rFonts w:ascii="Arial" w:hAnsi="Arial" w:cs="Arial"/>
+        </w:rPr>
+        <w:t xml:space="preserve"> post-businesses in </w:t>
       </w:r>
       <w:proofErr w:type="spellStart"/>
       <w:r>
         <w:rPr>
           <w:rFonts w:ascii="Arial" w:hAnsi="Arial" w:cs="Arial"/>
         </w:rPr>
-        <w:t>QuantumTech</w:t>
+        <w:t>Techville</w:t>
       </w:r>
       <w:proofErr w:type="spellEnd"/>
       <w:r>
         <w:rPr>
           <w:rFonts w:ascii="Arial" w:hAnsi="Arial" w:cs="Arial"/>
         </w:rPr>
-        <w:t xml:space="preserve"> </w:t>
-      </w:r>
-      <w:r>
-        <w:rPr>
-          <w:rFonts w:ascii="Arial" w:hAnsi="Arial" w:cs="Arial"/>
-        </w:rPr>
-        <w:t>should consider</w:t>
-      </w:r>
-      <w:r>
-        <w:rPr>
-          <w:rFonts w:ascii="Arial" w:hAnsi="Arial" w:cs="Arial"/>
-        </w:rPr>
-        <w:t xml:space="preserve"> offer</w:t>
-      </w:r>
-      <w:r>
-        <w:rPr>
-          <w:rFonts w:ascii="Arial" w:hAnsi="Arial" w:cs="Arial"/>
-        </w:rPr>
-        <w:t>ing</w:t>
-      </w:r>
-      <w:r>
-        <w:rPr>
-          <w:rFonts w:ascii="Arial" w:hAnsi="Arial" w:cs="Arial"/>
-        </w:rPr>
-        <w:t xml:space="preserve"> better security services to help</w:t>
-      </w:r>
-      <w:r>
-        <w:rPr>
-          <w:rFonts w:ascii="Arial" w:hAnsi="Arial" w:cs="Arial"/>
-        </w:rPr>
-        <w:t xml:space="preserve"> in</w:t>
-      </w:r>
-      <w:r>
-        <w:rPr>
-          <w:rFonts w:ascii="Arial" w:hAnsi="Arial" w:cs="Arial"/>
-        </w:rPr>
-        <w:t xml:space="preserve"> protec</w:t>
-      </w:r>
-      <w:r>
-        <w:rPr>
-          <w:rFonts w:ascii="Arial" w:hAnsi="Arial" w:cs="Arial"/>
-        </w:rPr>
-        <w:t>t</w:t>
-      </w:r>
-      <w:r>
-        <w:rPr>
-          <w:rFonts w:ascii="Arial" w:hAnsi="Arial" w:cs="Arial"/>
-        </w:rPr>
-        <w:t>ing sensitive</w:t>
-      </w:r>
-      <w:r>
-        <w:rPr>
-          <w:rFonts w:ascii="Arial" w:hAnsi="Arial" w:cs="Arial"/>
-        </w:rPr>
-        <w:t xml:space="preserve"> data of start-up business in </w:t>
-      </w:r>
-      <w:proofErr w:type="spellStart"/>
-      <w:r>
-        <w:rPr>
-          <w:rFonts w:ascii="Arial" w:hAnsi="Arial" w:cs="Arial"/>
-        </w:rPr>
-        <w:t>Techville</w:t>
-      </w:r>
-      <w:proofErr w:type="spellEnd"/>
+        <w:t>. By providing these advanced</w:t>
+      </w:r>
+      <w:r>
+        <w:rPr>
+          <w:rFonts w:ascii="Arial" w:hAnsi="Arial" w:cs="Arial"/>
+        </w:rPr>
+        <w:t xml:space="preserve"> security services</w:t>
+      </w:r>
+      <w:r>
+        <w:rPr>
+          <w:rFonts w:ascii="Arial" w:hAnsi="Arial" w:cs="Arial"/>
+        </w:rPr>
+        <w:t>, the company can better meet the future security needs of AI and Big Data businesses and may attract more clients as quantum computing continues to develop</w:t>
+      </w:r>
       <w:r>
         <w:rPr>
           <w:rFonts w:ascii="Arial" w:hAnsi="Arial" w:cs="Arial"/>
@@ -8417,6 +8651,56 @@
     </w:sectPr>
   </w:body>
 </w:document>
+</file>
+
+<file path=word/endnotes.xml><?xml version="1.0" encoding="utf-8"?>
+<w:endnotes xmlns:wpc="http://schemas.microsoft.com/office/word/2010/wordprocessingCanvas" xmlns:cx="http://schemas.microsoft.com/office/drawing/2014/chartex" xmlns:cx1="http://schemas.microsoft.com/office/drawing/2015/9/8/chartex" xmlns:cx2="http://schemas.microsoft.com/office/drawing/2015/10/21/chartex" xmlns:cx3="http://schemas.microsoft.com/office/drawing/2016/5/9/chartex" xmlns:cx4="http://schemas.microsoft.com/office/drawing/2016/5/10/chartex" xmlns:cx5="http://schemas.microsoft.com/office/drawing/2016/5/11/chartex" xmlns:cx6="http://schemas.microsoft.com/office/drawing/2016/5/12/chartex" xmlns:cx7="http://schemas.microsoft.com/office/drawing/2016/5/13/chartex" xmlns:cx8="http://schemas.microsoft.com/office/drawing/2016/5/14/chartex" xmlns:mc="http://schemas.openxmlformats.org/markup-compatibility/2006" xmlns:aink="http://schemas.microsoft.com/office/drawing/2016/ink" xmlns:am3d="http://schemas.microsoft.com/office/drawing/2017/model3d" xmlns:o="urn:schemas-microsoft-com:office:office" xmlns:oel="http://schemas.microsoft.com/office/2019/extlst" xmlns:r="http://schemas.openxmlformats.org/officeDocument/2006/relationships" xmlns:m="http://schemas.openxmlformats.org/officeDocument/2006/math" xmlns:v="urn:schemas-microsoft-com:vml" xmlns:wp14="http://schemas.microsoft.com/office/word/2010/wordprocessingDrawing" xmlns:wp="http://schemas.openxmlformats.org/drawingml/2006/wordprocessingDrawing" xmlns:w10="urn:schemas-microsoft-com:office:word" xmlns:w="http://schemas.openxmlformats.org/wordprocessingml/2006/main" xmlns:w14="http://schemas.microsoft.com/office/word/2010/wordml" xmlns:w15="http://schemas.microsoft.com/office/word/2012/wordml" xmlns:w16cex="http://schemas.microsoft.com/office/word/2018/wordml/cex" xmlns:w16cid="http://schemas.microsoft.com/office/word/2016/wordml/cid" xmlns:w16="http://schemas.microsoft.com/office/word/2018/wordml" xmlns:w16du="http://schemas.microsoft.com/office/word/2023/wordml/word16du" xmlns:w16sdtdh="http://schemas.microsoft.com/office/word/2020/wordml/sdtdatahash" xmlns:w16sdtfl="http://schemas.microsoft.com/office/word/2024/wordml/sdtformatlock" xmlns:w16se="http://schemas.microsoft.com/office/word/2015/wordml/symex" xmlns:wpg="http://schemas.microsoft.com/office/word/2010/wordprocessingGroup" xmlns:wpi="http://schemas.microsoft.com/office/word/2010/wordprocessingInk" xmlns:wne="http://schemas.microsoft.com/office/word/2006/wordml" xmlns:wps="http://schemas.microsoft.com/office/word/2010/wordprocessingShape" mc:Ignorable="w14 w15 w16se w16cid w16 w16cex w16sdtdh w16sdtfl w16du wp14">
+  <w:endnote w:type="separator" w:id="-1">
+    <w:p>
+      <w:pPr>
+        <w:spacing w:after="0" w:line="240" w:lineRule="auto"/>
+      </w:pPr>
+      <w:r>
+        <w:separator/>
+      </w:r>
+    </w:p>
+  </w:endnote>
+  <w:endnote w:type="continuationSeparator" w:id="0">
+    <w:p>
+      <w:pPr>
+        <w:spacing w:after="0" w:line="240" w:lineRule="auto"/>
+      </w:pPr>
+      <w:r>
+        <w:continuationSeparator/>
+      </w:r>
+    </w:p>
+  </w:endnote>
+</w:endnotes>
+</file>
+
+<file path=word/footnotes.xml><?xml version="1.0" encoding="utf-8"?>
+<w:footnotes xmlns:wpc="http://schemas.microsoft.com/office/word/2010/wordprocessingCanvas" xmlns:cx="http://schemas.microsoft.com/office/drawing/2014/chartex" xmlns:cx1="http://schemas.microsoft.com/office/drawing/2015/9/8/chartex" xmlns:cx2="http://schemas.microsoft.com/office/drawing/2015/10/21/chartex" xmlns:cx3="http://schemas.microsoft.com/office/drawing/2016/5/9/chartex" xmlns:cx4="http://schemas.microsoft.com/office/drawing/2016/5/10/chartex" xmlns:cx5="http://schemas.microsoft.com/office/drawing/2016/5/11/chartex" xmlns:cx6="http://schemas.microsoft.com/office/drawing/2016/5/12/chartex" xmlns:cx7="http://schemas.microsoft.com/office/drawing/2016/5/13/chartex" xmlns:cx8="http://schemas.microsoft.com/office/drawing/2016/5/14/chartex" xmlns:mc="http://schemas.openxmlformats.org/markup-compatibility/2006" xmlns:aink="http://schemas.microsoft.com/office/drawing/2016/ink" xmlns:am3d="http://schemas.microsoft.com/office/drawing/2017/model3d" xmlns:o="urn:schemas-microsoft-com:office:office" xmlns:oel="http://schemas.microsoft.com/office/2019/extlst" xmlns:r="http://schemas.openxmlformats.org/officeDocument/2006/relationships" xmlns:m="http://schemas.openxmlformats.org/officeDocument/2006/math" xmlns:v="urn:schemas-microsoft-com:vml" xmlns:wp14="http://schemas.microsoft.com/office/word/2010/wordprocessingDrawing" xmlns:wp="http://schemas.openxmlformats.org/drawingml/2006/wordprocessingDrawing" xmlns:w10="urn:schemas-microsoft-com:office:word" xmlns:w="http://schemas.openxmlformats.org/wordprocessingml/2006/main" xmlns:w14="http://schemas.microsoft.com/office/word/2010/wordml" xmlns:w15="http://schemas.microsoft.com/office/word/2012/wordml" xmlns:w16cex="http://schemas.microsoft.com/office/word/2018/wordml/cex" xmlns:w16cid="http://schemas.microsoft.com/office/word/2016/wordml/cid" xmlns:w16="http://schemas.microsoft.com/office/word/2018/wordml" xmlns:w16du="http://schemas.microsoft.com/office/word/2023/wordml/word16du" xmlns:w16sdtdh="http://schemas.microsoft.com/office/word/2020/wordml/sdtdatahash" xmlns:w16sdtfl="http://schemas.microsoft.com/office/word/2024/wordml/sdtformatlock" xmlns:w16se="http://schemas.microsoft.com/office/word/2015/wordml/symex" xmlns:wpg="http://schemas.microsoft.com/office/word/2010/wordprocessingGroup" xmlns:wpi="http://schemas.microsoft.com/office/word/2010/wordprocessingInk" xmlns:wne="http://schemas.microsoft.com/office/word/2006/wordml" xmlns:wps="http://schemas.microsoft.com/office/word/2010/wordprocessingShape" mc:Ignorable="w14 w15 w16se w16cid w16 w16cex w16sdtdh w16sdtfl w16du wp14">
+  <w:footnote w:type="separator" w:id="-1">
+    <w:p>
+      <w:pPr>
+        <w:spacing w:after="0" w:line="240" w:lineRule="auto"/>
+      </w:pPr>
+      <w:r>
+        <w:separator/>
+      </w:r>
+    </w:p>
+  </w:footnote>
+  <w:footnote w:type="continuationSeparator" w:id="0">
+    <w:p>
+      <w:pPr>
+        <w:spacing w:after="0" w:line="240" w:lineRule="auto"/>
+      </w:pPr>
+      <w:r>
+        <w:continuationSeparator/>
+      </w:r>
+    </w:p>
+  </w:footnote>
+</w:footnotes>
 </file>
 
 <file path=word/numbering.xml><?xml version="1.0" encoding="utf-8"?>
@@ -12845,6 +13129,50 @@
       <w:spacing w:val="5"/>
     </w:rPr>
   </w:style>
+  <w:style w:type="paragraph" w:styleId="Header">
+    <w:name w:val="header"/>
+    <w:basedOn w:val="Normal"/>
+    <w:link w:val="HeaderChar"/>
+    <w:uiPriority w:val="99"/>
+    <w:unhideWhenUsed/>
+    <w:rsid w:val="00C61BF4"/>
+    <w:pPr>
+      <w:tabs>
+        <w:tab w:val="center" w:pos="4680"/>
+        <w:tab w:val="right" w:pos="9360"/>
+      </w:tabs>
+      <w:spacing w:after="0" w:line="240" w:lineRule="auto"/>
+    </w:pPr>
+  </w:style>
+  <w:style w:type="character" w:customStyle="1" w:styleId="HeaderChar">
+    <w:name w:val="Header Char"/>
+    <w:basedOn w:val="DefaultParagraphFont"/>
+    <w:link w:val="Header"/>
+    <w:uiPriority w:val="99"/>
+    <w:rsid w:val="00C61BF4"/>
+  </w:style>
+  <w:style w:type="paragraph" w:styleId="Footer">
+    <w:name w:val="footer"/>
+    <w:basedOn w:val="Normal"/>
+    <w:link w:val="FooterChar"/>
+    <w:uiPriority w:val="99"/>
+    <w:unhideWhenUsed/>
+    <w:rsid w:val="00C61BF4"/>
+    <w:pPr>
+      <w:tabs>
+        <w:tab w:val="center" w:pos="4680"/>
+        <w:tab w:val="right" w:pos="9360"/>
+      </w:tabs>
+      <w:spacing w:after="0" w:line="240" w:lineRule="auto"/>
+    </w:pPr>
+  </w:style>
+  <w:style w:type="character" w:customStyle="1" w:styleId="FooterChar">
+    <w:name w:val="Footer Char"/>
+    <w:basedOn w:val="DefaultParagraphFont"/>
+    <w:link w:val="Footer"/>
+    <w:uiPriority w:val="99"/>
+    <w:rsid w:val="00C61BF4"/>
+  </w:style>
 </w:styles>
 </file>
 

</xml_diff>

<commit_message>
Final Final for Level 4
</commit_message>
<xml_diff>
--- a/Level_4/Level_4(1st Semester)/Computer Systems/L4DC-L4DCBM- Computer Systems- Blessings Tamanga(P00221220).docx
+++ b/Level_4/Level_4(1st Semester)/Computer Systems/L4DC-L4DCBM- Computer Systems- Blessings Tamanga(P00221220).docx
@@ -2,6 +2,2486 @@
 <file path=word/document.xml><?xml version="1.0" encoding="utf-8"?>
 <w:document xmlns:wpc="http://schemas.microsoft.com/office/word/2010/wordprocessingCanvas" xmlns:cx="http://schemas.microsoft.com/office/drawing/2014/chartex" xmlns:cx1="http://schemas.microsoft.com/office/drawing/2015/9/8/chartex" xmlns:cx2="http://schemas.microsoft.com/office/drawing/2015/10/21/chartex" xmlns:cx3="http://schemas.microsoft.com/office/drawing/2016/5/9/chartex" xmlns:cx4="http://schemas.microsoft.com/office/drawing/2016/5/10/chartex" xmlns:cx5="http://schemas.microsoft.com/office/drawing/2016/5/11/chartex" xmlns:cx6="http://schemas.microsoft.com/office/drawing/2016/5/12/chartex" xmlns:cx7="http://schemas.microsoft.com/office/drawing/2016/5/13/chartex" xmlns:cx8="http://schemas.microsoft.com/office/drawing/2016/5/14/chartex" xmlns:mc="http://schemas.openxmlformats.org/markup-compatibility/2006" xmlns:aink="http://schemas.microsoft.com/office/drawing/2016/ink" xmlns:am3d="http://schemas.microsoft.com/office/drawing/2017/model3d" xmlns:o="urn:schemas-microsoft-com:office:office" xmlns:oel="http://schemas.microsoft.com/office/2019/extlst" xmlns:r="http://schemas.openxmlformats.org/officeDocument/2006/relationships" xmlns:m="http://schemas.openxmlformats.org/officeDocument/2006/math" xmlns:v="urn:schemas-microsoft-com:vml" xmlns:wp14="http://schemas.microsoft.com/office/word/2010/wordprocessingDrawing" xmlns:wp="http://schemas.openxmlformats.org/drawingml/2006/wordprocessingDrawing" xmlns:w10="urn:schemas-microsoft-com:office:word" xmlns:w="http://schemas.openxmlformats.org/wordprocessingml/2006/main" xmlns:w14="http://schemas.microsoft.com/office/word/2010/wordml" xmlns:w15="http://schemas.microsoft.com/office/word/2012/wordml" xmlns:w16cei="http://schemas.microsoft.com/office/word/2026/wordml/cei" xmlns:w16cex="http://schemas.microsoft.com/office/word/2018/wordml/cex" xmlns:w16cid="http://schemas.microsoft.com/office/word/2016/wordml/cid" xmlns:w16="http://schemas.microsoft.com/office/word/2018/wordml" xmlns:w16du="http://schemas.microsoft.com/office/word/2023/wordml/word16du" xmlns:w16sdtdh="http://schemas.microsoft.com/office/word/2020/wordml/sdtdatahash" xmlns:w16sdtfl="http://schemas.microsoft.com/office/word/2024/wordml/sdtformatlock" xmlns:w16se="http://schemas.microsoft.com/office/word/2015/wordml/symex" xmlns:wpg="http://schemas.microsoft.com/office/word/2010/wordprocessingGroup" xmlns:wpi="http://schemas.microsoft.com/office/word/2010/wordprocessingInk" xmlns:wne="http://schemas.microsoft.com/office/word/2006/wordml" xmlns:wps="http://schemas.microsoft.com/office/word/2010/wordprocessingShape" mc:Ignorable="w14 w15 w16se w16cid w16 w16cex w16sdtdh w16sdtfl w16du wp14">
   <w:body>
+    <w:p>
+      <w:pPr>
+        <w:spacing w:after="56"/>
+        <w:ind w:right="-1410"/>
+        <w:rPr>
+          <w:rFonts w:ascii="Arial" w:hAnsi="Arial" w:cs="Arial"/>
+        </w:rPr>
+      </w:pPr>
+      <w:r>
+        <w:rPr>
+          <w:rFonts w:ascii="Arial" w:hAnsi="Arial" w:cs="Arial"/>
+          <w:noProof/>
+        </w:rPr>
+        <mc:AlternateContent>
+          <mc:Choice Requires="wpg">
+            <w:drawing>
+              <wp:inline distT="0" distB="0" distL="0" distR="0" wp14:anchorId="49479060" wp14:editId="1A9D9765">
+                <wp:extent cx="6104586" cy="953037"/>
+                <wp:effectExtent l="0" t="0" r="0" b="0"/>
+                <wp:docPr id="1659" name="Group 1659"/>
+                <wp:cNvGraphicFramePr/>
+                <a:graphic xmlns:a="http://schemas.openxmlformats.org/drawingml/2006/main">
+                  <a:graphicData uri="http://schemas.microsoft.com/office/word/2010/wordprocessingGroup">
+                    <wpg:wgp>
+                      <wpg:cNvGrpSpPr/>
+                      <wpg:grpSpPr>
+                        <a:xfrm>
+                          <a:off x="0" y="0"/>
+                          <a:ext cx="6104586" cy="953037"/>
+                          <a:chOff x="0" y="0"/>
+                          <a:chExt cx="6930390" cy="1059815"/>
+                        </a:xfrm>
+                      </wpg:grpSpPr>
+                      <pic:pic xmlns:pic="http://schemas.openxmlformats.org/drawingml/2006/picture">
+                        <pic:nvPicPr>
+                          <pic:cNvPr id="7" name="Picture 7"/>
+                          <pic:cNvPicPr/>
+                        </pic:nvPicPr>
+                        <pic:blipFill>
+                          <a:blip r:embed="rId8"/>
+                          <a:stretch>
+                            <a:fillRect/>
+                          </a:stretch>
+                        </pic:blipFill>
+                        <pic:spPr>
+                          <a:xfrm>
+                            <a:off x="0" y="0"/>
+                            <a:ext cx="6930390" cy="1059815"/>
+                          </a:xfrm>
+                          <a:prstGeom prst="rect">
+                            <a:avLst/>
+                          </a:prstGeom>
+                        </pic:spPr>
+                      </pic:pic>
+                      <wps:wsp>
+                        <wps:cNvPr id="8" name="Rectangle 8"/>
+                        <wps:cNvSpPr/>
+                        <wps:spPr>
+                          <a:xfrm>
+                            <a:off x="361175" y="205232"/>
+                            <a:ext cx="84472" cy="339003"/>
+                          </a:xfrm>
+                          <a:prstGeom prst="rect">
+                            <a:avLst/>
+                          </a:prstGeom>
+                          <a:ln>
+                            <a:noFill/>
+                          </a:ln>
+                        </wps:spPr>
+                        <wps:txbx>
+                          <w:txbxContent>
+                            <w:p>
+                              <w:r>
+                                <w:rPr>
+                                  <w:rFonts w:ascii="Arial" w:eastAsia="Arial" w:hAnsi="Arial" w:cs="Arial"/>
+                                  <w:color w:val="FFFFFF"/>
+                                  <w:sz w:val="36"/>
+                                </w:rPr>
+                                <w:t xml:space="preserve"> </w:t>
+                              </w:r>
+                            </w:p>
+                          </w:txbxContent>
+                        </wps:txbx>
+                        <wps:bodyPr horzOverflow="overflow" vert="horz" lIns="0" tIns="0" rIns="0" bIns="0" rtlCol="0">
+                          <a:noAutofit/>
+                        </wps:bodyPr>
+                      </wps:wsp>
+                      <wps:wsp>
+                        <wps:cNvPr id="9" name="Rectangle 9"/>
+                        <wps:cNvSpPr/>
+                        <wps:spPr>
+                          <a:xfrm>
+                            <a:off x="361173" y="469124"/>
+                            <a:ext cx="4029106" cy="280813"/>
+                          </a:xfrm>
+                          <a:prstGeom prst="rect">
+                            <a:avLst/>
+                          </a:prstGeom>
+                          <a:ln>
+                            <a:noFill/>
+                          </a:ln>
+                        </wps:spPr>
+                        <wps:txbx>
+                          <w:txbxContent>
+                            <w:p>
+                              <w:pPr>
+                                <w:rPr>
+                                  <w:sz w:val="32"/>
+                                  <w:szCs w:val="32"/>
+                                </w:rPr>
+                              </w:pPr>
+                              <w:r>
+                                <w:rPr>
+                                  <w:rFonts w:ascii="Arial" w:eastAsia="Arial" w:hAnsi="Arial" w:cs="Arial"/>
+                                  <w:color w:val="FFFFFF"/>
+                                  <w:sz w:val="32"/>
+                                  <w:szCs w:val="32"/>
+                                </w:rPr>
+                                <w:t>Statement and Confirmation of Own Work</w:t>
+                              </w:r>
+                            </w:p>
+                          </w:txbxContent>
+                        </wps:txbx>
+                        <wps:bodyPr horzOverflow="overflow" vert="horz" lIns="0" tIns="0" rIns="0" bIns="0" rtlCol="0">
+                          <a:noAutofit/>
+                        </wps:bodyPr>
+                      </wps:wsp>
+                      <wps:wsp>
+                        <wps:cNvPr id="10" name="Rectangle 10"/>
+                        <wps:cNvSpPr/>
+                        <wps:spPr>
+                          <a:xfrm>
+                            <a:off x="4357688" y="469249"/>
+                            <a:ext cx="79966" cy="320923"/>
+                          </a:xfrm>
+                          <a:prstGeom prst="rect">
+                            <a:avLst/>
+                          </a:prstGeom>
+                          <a:ln>
+                            <a:noFill/>
+                          </a:ln>
+                        </wps:spPr>
+                        <wps:txbx>
+                          <w:txbxContent>
+                            <w:p>
+                              <w:r>
+                                <w:rPr>
+                                  <w:rFonts w:ascii="Arial" w:eastAsia="Arial" w:hAnsi="Arial" w:cs="Arial"/>
+                                  <w:color w:val="FFFFFF"/>
+                                  <w:sz w:val="34"/>
+                                </w:rPr>
+                                <w:t xml:space="preserve"> </w:t>
+                              </w:r>
+                            </w:p>
+                          </w:txbxContent>
+                        </wps:txbx>
+                        <wps:bodyPr horzOverflow="overflow" vert="horz" lIns="0" tIns="0" rIns="0" bIns="0" rtlCol="0">
+                          <a:noAutofit/>
+                        </wps:bodyPr>
+                      </wps:wsp>
+                    </wpg:wgp>
+                  </a:graphicData>
+                </a:graphic>
+              </wp:inline>
+            </w:drawing>
+          </mc:Choice>
+          <mc:Fallback>
+            <w:pict>
+              <v:group w14:anchorId="49479060" id="Group 1659" o:spid="_x0000_s1026" style="width:480.7pt;height:75.05pt;mso-position-horizontal-relative:char;mso-position-vertical-relative:line" coordsize="69303,10598" o:gfxdata="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">
+                <v:shapetype id="_x0000_t75" coordsize="21600,21600" o:spt="75" o:preferrelative="t" path="m@4@5l@4@11@9@11@9@5xe" filled="f" stroked="f">
+                  <v:stroke joinstyle="miter"/>
+                  <v:formulas>
+                    <v:f eqn="if lineDrawn pixelLineWidth 0"/>
+                    <v:f eqn="sum @0 1 0"/>
+                    <v:f eqn="sum 0 0 @1"/>
+                    <v:f eqn="prod @2 1 2"/>
+                    <v:f eqn="prod @3 21600 pixelWidth"/>
+                    <v:f eqn="prod @3 21600 pixelHeight"/>
+                    <v:f eqn="sum @0 0 1"/>
+                    <v:f eqn="prod @6 1 2"/>
+                    <v:f eqn="prod @7 21600 pixelWidth"/>
+                    <v:f eqn="sum @8 21600 0"/>
+                    <v:f eqn="prod @7 21600 pixelHeight"/>
+                    <v:f eqn="sum @10 21600 0"/>
+                  </v:formulas>
+                  <v:path o:extrusionok="f" gradientshapeok="t" o:connecttype="rect"/>
+                  <o:lock v:ext="edit" aspectratio="t"/>
+                </v:shapetype>
+                <v:shape id="Picture 7" o:spid="_x0000_s1027" type="#_x0000_t75" style="position:absolute;width:69303;height:10598;visibility:visible;mso-wrap-style:square" o:gfxdata="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">
+                  <v:imagedata r:id="rId9" o:title=""/>
+                </v:shape>
+                <v:rect id="Rectangle 8" o:spid="_x0000_s1028" style="position:absolute;left:3611;top:2052;width:845;height:3390;visibility:visible;mso-wrap-style:square;v-text-anchor:top" o:gfxdata="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" filled="f" stroked="f">
+                  <v:textbox inset="0,0,0,0">
+                    <w:txbxContent>
+                      <w:p>
+                        <w:r>
+                          <w:rPr>
+                            <w:rFonts w:ascii="Arial" w:eastAsia="Arial" w:hAnsi="Arial" w:cs="Arial"/>
+                            <w:color w:val="FFFFFF"/>
+                            <w:sz w:val="36"/>
+                          </w:rPr>
+                          <w:t xml:space="preserve"> </w:t>
+                        </w:r>
+                      </w:p>
+                    </w:txbxContent>
+                  </v:textbox>
+                </v:rect>
+                <v:rect id="Rectangle 9" o:spid="_x0000_s1029" style="position:absolute;left:3611;top:4691;width:40291;height:2808;visibility:visible;mso-wrap-style:square;v-text-anchor:top" o:gfxdata="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" filled="f" stroked="f">
+                  <v:textbox inset="0,0,0,0">
+                    <w:txbxContent>
+                      <w:p>
+                        <w:pPr>
+                          <w:rPr>
+                            <w:sz w:val="32"/>
+                            <w:szCs w:val="32"/>
+                          </w:rPr>
+                        </w:pPr>
+                        <w:r>
+                          <w:rPr>
+                            <w:rFonts w:ascii="Arial" w:eastAsia="Arial" w:hAnsi="Arial" w:cs="Arial"/>
+                            <w:color w:val="FFFFFF"/>
+                            <w:sz w:val="32"/>
+                            <w:szCs w:val="32"/>
+                          </w:rPr>
+                          <w:t>Statement and Confirmation of Own Work</w:t>
+                        </w:r>
+                      </w:p>
+                    </w:txbxContent>
+                  </v:textbox>
+                </v:rect>
+                <v:rect id="Rectangle 10" o:spid="_x0000_s1030" style="position:absolute;left:43576;top:4692;width:800;height:3209;visibility:visible;mso-wrap-style:square;v-text-anchor:top" o:gfxdata="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" filled="f" stroked="f">
+                  <v:textbox inset="0,0,0,0">
+                    <w:txbxContent>
+                      <w:p>
+                        <w:r>
+                          <w:rPr>
+                            <w:rFonts w:ascii="Arial" w:eastAsia="Arial" w:hAnsi="Arial" w:cs="Arial"/>
+                            <w:color w:val="FFFFFF"/>
+                            <w:sz w:val="34"/>
+                          </w:rPr>
+                          <w:t xml:space="preserve"> </w:t>
+                        </w:r>
+                      </w:p>
+                    </w:txbxContent>
+                  </v:textbox>
+                </v:rect>
+                <w10:anchorlock/>
+              </v:group>
+            </w:pict>
+          </mc:Fallback>
+        </mc:AlternateContent>
+      </w:r>
+    </w:p>
+    <w:p>
+      <w:pPr>
+        <w:pBdr>
+          <w:top w:val="single" w:sz="6" w:space="0" w:color="000000"/>
+          <w:left w:val="single" w:sz="6" w:space="0" w:color="000000"/>
+          <w:bottom w:val="single" w:sz="6" w:space="0" w:color="000000"/>
+          <w:right w:val="single" w:sz="6" w:space="0" w:color="000000"/>
+        </w:pBdr>
+        <w:spacing w:after="0"/>
+        <w:jc w:val="right"/>
+        <w:rPr>
+          <w:rFonts w:ascii="Arial" w:hAnsi="Arial" w:cs="Arial"/>
+        </w:rPr>
+      </w:pPr>
+      <w:r>
+        <w:rPr>
+          <w:rFonts w:ascii="Arial" w:eastAsia="Arial" w:hAnsi="Arial" w:cs="Arial"/>
+          <w:b/>
+          <w:i/>
+        </w:rPr>
+        <w:t xml:space="preserve">A signed copy of this form must be submitted with every assignment. </w:t>
+      </w:r>
+    </w:p>
+    <w:p>
+      <w:pPr>
+        <w:pBdr>
+          <w:top w:val="single" w:sz="6" w:space="0" w:color="000000"/>
+          <w:left w:val="single" w:sz="6" w:space="0" w:color="000000"/>
+          <w:bottom w:val="single" w:sz="6" w:space="0" w:color="000000"/>
+          <w:right w:val="single" w:sz="6" w:space="0" w:color="000000"/>
+        </w:pBdr>
+        <w:spacing w:after="0"/>
+        <w:rPr>
+          <w:rFonts w:ascii="Arial" w:hAnsi="Arial" w:cs="Arial"/>
+        </w:rPr>
+      </w:pPr>
+      <w:r>
+        <w:rPr>
+          <w:rFonts w:ascii="Arial" w:eastAsia="Arial" w:hAnsi="Arial" w:cs="Arial"/>
+          <w:b/>
+          <w:i/>
+        </w:rPr>
+        <w:t xml:space="preserve">If the statement is missing your work may not be marked.  </w:t>
+      </w:r>
+    </w:p>
+    <w:p>
+      <w:pPr>
+        <w:pBdr>
+          <w:top w:val="single" w:sz="6" w:space="0" w:color="000000"/>
+          <w:left w:val="single" w:sz="6" w:space="0" w:color="000000"/>
+          <w:bottom w:val="single" w:sz="6" w:space="0" w:color="000000"/>
+          <w:right w:val="single" w:sz="6" w:space="0" w:color="000000"/>
+        </w:pBdr>
+        <w:spacing w:after="83" w:line="238" w:lineRule="auto"/>
+        <w:jc w:val="center"/>
+        <w:rPr>
+          <w:rFonts w:ascii="Arial" w:hAnsi="Arial" w:cs="Arial"/>
+        </w:rPr>
+      </w:pPr>
+      <w:r>
+        <w:rPr>
+          <w:rFonts w:ascii="Arial" w:eastAsia="Arial" w:hAnsi="Arial" w:cs="Arial"/>
+          <w:b/>
+          <w:i/>
+        </w:rPr>
+        <w:t>For Level 4 assignments, please use the separate Level 4 Candidate Statement of Own Work form instead of this one.</w:t>
+      </w:r>
+      <w:r>
+        <w:rPr>
+          <w:rFonts w:ascii="Arial" w:eastAsia="Times New Roman" w:hAnsi="Arial" w:cs="Arial"/>
+          <w:i/>
+        </w:rPr>
+        <w:t xml:space="preserve"> </w:t>
+      </w:r>
+      <w:r>
+        <w:rPr>
+          <w:rFonts w:ascii="Arial" w:eastAsia="Arial" w:hAnsi="Arial" w:cs="Arial"/>
+          <w:b/>
+          <w:sz w:val="28"/>
+        </w:rPr>
+        <w:t xml:space="preserve"> </w:t>
+      </w:r>
+    </w:p>
+    <w:p>
+      <w:pPr>
+        <w:spacing w:after="0"/>
+        <w:jc w:val="center"/>
+        <w:rPr>
+          <w:rFonts w:ascii="Arial" w:hAnsi="Arial" w:cs="Arial"/>
+        </w:rPr>
+      </w:pPr>
+      <w:r>
+        <w:rPr>
+          <w:rFonts w:ascii="Arial" w:eastAsia="Arial" w:hAnsi="Arial" w:cs="Arial"/>
+          <w:b/>
+          <w:sz w:val="28"/>
+          <w:u w:val="single" w:color="000000"/>
+        </w:rPr>
+        <w:t>Student Declaration</w:t>
+      </w:r>
+      <w:r>
+        <w:rPr>
+          <w:rFonts w:ascii="Arial" w:eastAsia="Arial" w:hAnsi="Arial" w:cs="Arial"/>
+          <w:sz w:val="28"/>
+        </w:rPr>
+        <w:t xml:space="preserve"> </w:t>
+      </w:r>
+    </w:p>
+    <w:p>
+      <w:pPr>
+        <w:spacing w:after="0"/>
+        <w:ind w:left="569"/>
+        <w:rPr>
+          <w:rFonts w:ascii="Arial" w:hAnsi="Arial" w:cs="Arial"/>
+        </w:rPr>
+      </w:pPr>
+      <w:r>
+        <w:rPr>
+          <w:rFonts w:ascii="Arial" w:eastAsia="Arial" w:hAnsi="Arial" w:cs="Arial"/>
+        </w:rPr>
+        <w:t>I confirm the following details:</w:t>
+      </w:r>
+      <w:r>
+        <w:rPr>
+          <w:rFonts w:ascii="Arial" w:eastAsia="Arial" w:hAnsi="Arial" w:cs="Arial"/>
+          <w:sz w:val="28"/>
+        </w:rPr>
+        <w:t xml:space="preserve"> </w:t>
+      </w:r>
+    </w:p>
+    <w:tbl>
+      <w:tblPr>
+        <w:tblStyle w:val="TableGrid"/>
+        <w:tblW w:w="9456" w:type="dxa"/>
+        <w:tblInd w:w="-5" w:type="dxa"/>
+        <w:tblCellMar>
+          <w:top w:w="13" w:type="dxa"/>
+          <w:left w:w="108" w:type="dxa"/>
+          <w:right w:w="71" w:type="dxa"/>
+        </w:tblCellMar>
+        <w:tblLook w:val="04A0" w:firstRow="1" w:lastRow="0" w:firstColumn="1" w:lastColumn="0" w:noHBand="0" w:noVBand="1"/>
+      </w:tblPr>
+      <w:tblGrid>
+        <w:gridCol w:w="3101"/>
+        <w:gridCol w:w="6355"/>
+      </w:tblGrid>
+      <w:tr>
+        <w:trPr>
+          <w:trHeight w:val="753"/>
+        </w:trPr>
+        <w:tc>
+          <w:tcPr>
+            <w:tcW w:w="3101" w:type="dxa"/>
+            <w:tcBorders>
+              <w:top w:val="single" w:sz="4" w:space="0" w:color="000000"/>
+              <w:left w:val="single" w:sz="4" w:space="0" w:color="000000"/>
+              <w:bottom w:val="single" w:sz="4" w:space="0" w:color="000000"/>
+              <w:right w:val="single" w:sz="4" w:space="0" w:color="000000"/>
+            </w:tcBorders>
+            <w:vAlign w:val="center"/>
+          </w:tcPr>
+          <w:p>
+            <w:pPr>
+              <w:ind w:left="2"/>
+              <w:rPr>
+                <w:rFonts w:ascii="Arial" w:hAnsi="Arial" w:cs="Arial"/>
+              </w:rPr>
+            </w:pPr>
+            <w:r>
+              <w:rPr>
+                <w:rFonts w:ascii="Arial" w:eastAsia="Arial" w:hAnsi="Arial" w:cs="Arial"/>
+                <w:b/>
+                <w:sz w:val="24"/>
+              </w:rPr>
+              <w:t xml:space="preserve">Candidate Name: </w:t>
+            </w:r>
+          </w:p>
+        </w:tc>
+        <w:tc>
+          <w:tcPr>
+            <w:tcW w:w="6355" w:type="dxa"/>
+            <w:tcBorders>
+              <w:top w:val="single" w:sz="4" w:space="0" w:color="000000"/>
+              <w:left w:val="single" w:sz="4" w:space="0" w:color="000000"/>
+              <w:bottom w:val="single" w:sz="4" w:space="0" w:color="000000"/>
+              <w:right w:val="single" w:sz="4" w:space="0" w:color="000000"/>
+            </w:tcBorders>
+            <w:vAlign w:val="center"/>
+          </w:tcPr>
+          <w:p>
+            <w:pPr>
+              <w:rPr>
+                <w:rFonts w:ascii="Arial" w:hAnsi="Arial" w:cs="Arial"/>
+              </w:rPr>
+            </w:pPr>
+            <w:r>
+              <w:rPr>
+                <w:rFonts w:ascii="Arial" w:eastAsia="Arial" w:hAnsi="Arial" w:cs="Arial"/>
+                <w:sz w:val="24"/>
+              </w:rPr>
+              <w:t xml:space="preserve">        Blessings Tamanga</w:t>
+            </w:r>
+          </w:p>
+        </w:tc>
+      </w:tr>
+      <w:tr>
+        <w:trPr>
+          <w:trHeight w:val="753"/>
+        </w:trPr>
+        <w:tc>
+          <w:tcPr>
+            <w:tcW w:w="3101" w:type="dxa"/>
+            <w:tcBorders>
+              <w:top w:val="single" w:sz="4" w:space="0" w:color="000000"/>
+              <w:left w:val="single" w:sz="4" w:space="0" w:color="000000"/>
+              <w:bottom w:val="single" w:sz="4" w:space="0" w:color="000000"/>
+              <w:right w:val="single" w:sz="4" w:space="0" w:color="000000"/>
+            </w:tcBorders>
+            <w:vAlign w:val="center"/>
+          </w:tcPr>
+          <w:p>
+            <w:pPr>
+              <w:ind w:left="2"/>
+              <w:rPr>
+                <w:rFonts w:ascii="Arial" w:hAnsi="Arial" w:cs="Arial"/>
+              </w:rPr>
+            </w:pPr>
+            <w:r>
+              <w:rPr>
+                <w:rFonts w:ascii="Arial" w:eastAsia="Arial" w:hAnsi="Arial" w:cs="Arial"/>
+                <w:b/>
+                <w:sz w:val="24"/>
+              </w:rPr>
+              <w:t xml:space="preserve">Candidate ID Number: </w:t>
+            </w:r>
+          </w:p>
+        </w:tc>
+        <w:tc>
+          <w:tcPr>
+            <w:tcW w:w="6355" w:type="dxa"/>
+            <w:tcBorders>
+              <w:top w:val="single" w:sz="4" w:space="0" w:color="000000"/>
+              <w:left w:val="single" w:sz="4" w:space="0" w:color="000000"/>
+              <w:bottom w:val="single" w:sz="4" w:space="0" w:color="000000"/>
+              <w:right w:val="single" w:sz="4" w:space="0" w:color="000000"/>
+            </w:tcBorders>
+            <w:vAlign w:val="center"/>
+          </w:tcPr>
+          <w:p>
+            <w:pPr>
+              <w:rPr>
+                <w:rFonts w:ascii="Arial" w:hAnsi="Arial" w:cs="Arial"/>
+              </w:rPr>
+            </w:pPr>
+            <w:r>
+              <w:rPr>
+                <w:rFonts w:ascii="Arial" w:eastAsia="Arial" w:hAnsi="Arial" w:cs="Arial"/>
+                <w:sz w:val="24"/>
+              </w:rPr>
+              <w:t xml:space="preserve">               P00221220</w:t>
+            </w:r>
+          </w:p>
+        </w:tc>
+      </w:tr>
+      <w:tr>
+        <w:trPr>
+          <w:trHeight w:val="753"/>
+        </w:trPr>
+        <w:tc>
+          <w:tcPr>
+            <w:tcW w:w="3101" w:type="dxa"/>
+            <w:tcBorders>
+              <w:top w:val="single" w:sz="4" w:space="0" w:color="000000"/>
+              <w:left w:val="single" w:sz="4" w:space="0" w:color="000000"/>
+              <w:bottom w:val="single" w:sz="4" w:space="0" w:color="000000"/>
+              <w:right w:val="single" w:sz="4" w:space="0" w:color="000000"/>
+            </w:tcBorders>
+            <w:vAlign w:val="center"/>
+          </w:tcPr>
+          <w:p>
+            <w:pPr>
+              <w:ind w:left="2"/>
+              <w:rPr>
+                <w:rFonts w:ascii="Arial" w:hAnsi="Arial" w:cs="Arial"/>
+              </w:rPr>
+            </w:pPr>
+            <w:r>
+              <w:rPr>
+                <w:rFonts w:ascii="Arial" w:eastAsia="Arial" w:hAnsi="Arial" w:cs="Arial"/>
+                <w:b/>
+                <w:sz w:val="24"/>
+              </w:rPr>
+              <w:t xml:space="preserve">Qualification: </w:t>
+            </w:r>
+          </w:p>
+        </w:tc>
+        <w:tc>
+          <w:tcPr>
+            <w:tcW w:w="6355" w:type="dxa"/>
+            <w:tcBorders>
+              <w:top w:val="single" w:sz="4" w:space="0" w:color="000000"/>
+              <w:left w:val="single" w:sz="4" w:space="0" w:color="000000"/>
+              <w:bottom w:val="single" w:sz="4" w:space="0" w:color="000000"/>
+              <w:right w:val="single" w:sz="4" w:space="0" w:color="000000"/>
+            </w:tcBorders>
+            <w:vAlign w:val="center"/>
+          </w:tcPr>
+          <w:p>
+            <w:pPr>
+              <w:rPr>
+                <w:rFonts w:ascii="Arial" w:hAnsi="Arial" w:cs="Arial"/>
+              </w:rPr>
+            </w:pPr>
+            <w:r>
+              <w:rPr>
+                <w:rFonts w:ascii="Arial" w:eastAsia="Arial" w:hAnsi="Arial" w:cs="Arial"/>
+                <w:sz w:val="24"/>
+              </w:rPr>
+              <w:t xml:space="preserve">          LEVEL 4 DIPLOMA IN COMPUTING       </w:t>
+            </w:r>
+          </w:p>
+        </w:tc>
+      </w:tr>
+      <w:tr>
+        <w:trPr>
+          <w:trHeight w:val="755"/>
+        </w:trPr>
+        <w:tc>
+          <w:tcPr>
+            <w:tcW w:w="3101" w:type="dxa"/>
+            <w:tcBorders>
+              <w:top w:val="single" w:sz="4" w:space="0" w:color="000000"/>
+              <w:left w:val="single" w:sz="4" w:space="0" w:color="000000"/>
+              <w:bottom w:val="single" w:sz="4" w:space="0" w:color="000000"/>
+              <w:right w:val="single" w:sz="4" w:space="0" w:color="000000"/>
+            </w:tcBorders>
+            <w:vAlign w:val="center"/>
+          </w:tcPr>
+          <w:p>
+            <w:pPr>
+              <w:ind w:left="2"/>
+              <w:rPr>
+                <w:rFonts w:ascii="Arial" w:hAnsi="Arial" w:cs="Arial"/>
+              </w:rPr>
+            </w:pPr>
+            <w:r>
+              <w:rPr>
+                <w:rFonts w:ascii="Arial" w:eastAsia="Arial" w:hAnsi="Arial" w:cs="Arial"/>
+                <w:b/>
+                <w:sz w:val="24"/>
+              </w:rPr>
+              <w:t xml:space="preserve">Unit: </w:t>
+            </w:r>
+          </w:p>
+        </w:tc>
+        <w:tc>
+          <w:tcPr>
+            <w:tcW w:w="6355" w:type="dxa"/>
+            <w:tcBorders>
+              <w:top w:val="single" w:sz="4" w:space="0" w:color="000000"/>
+              <w:left w:val="single" w:sz="4" w:space="0" w:color="000000"/>
+              <w:bottom w:val="single" w:sz="4" w:space="0" w:color="000000"/>
+              <w:right w:val="single" w:sz="4" w:space="0" w:color="000000"/>
+            </w:tcBorders>
+            <w:vAlign w:val="center"/>
+          </w:tcPr>
+          <w:p>
+            <w:pPr>
+              <w:rPr>
+                <w:rFonts w:ascii="Arial" w:hAnsi="Arial" w:cs="Arial"/>
+              </w:rPr>
+            </w:pPr>
+            <w:r>
+              <w:rPr>
+                <w:rFonts w:ascii="Arial" w:eastAsia="Arial" w:hAnsi="Arial" w:cs="Arial"/>
+                <w:sz w:val="24"/>
+              </w:rPr>
+              <w:t xml:space="preserve">             L4DC/DCBM Computer Systems</w:t>
+            </w:r>
+          </w:p>
+        </w:tc>
+      </w:tr>
+      <w:tr>
+        <w:trPr>
+          <w:trHeight w:val="753"/>
+        </w:trPr>
+        <w:tc>
+          <w:tcPr>
+            <w:tcW w:w="3101" w:type="dxa"/>
+            <w:tcBorders>
+              <w:top w:val="single" w:sz="4" w:space="0" w:color="000000"/>
+              <w:left w:val="single" w:sz="4" w:space="0" w:color="000000"/>
+              <w:bottom w:val="single" w:sz="4" w:space="0" w:color="000000"/>
+              <w:right w:val="single" w:sz="4" w:space="0" w:color="000000"/>
+            </w:tcBorders>
+            <w:vAlign w:val="center"/>
+          </w:tcPr>
+          <w:p>
+            <w:pPr>
+              <w:ind w:left="2"/>
+              <w:rPr>
+                <w:rFonts w:ascii="Arial" w:hAnsi="Arial" w:cs="Arial"/>
+              </w:rPr>
+            </w:pPr>
+            <w:r>
+              <w:rPr>
+                <w:rFonts w:ascii="Arial" w:eastAsia="Arial" w:hAnsi="Arial" w:cs="Arial"/>
+                <w:b/>
+                <w:sz w:val="24"/>
+              </w:rPr>
+              <w:t xml:space="preserve">Centre: </w:t>
+            </w:r>
+          </w:p>
+        </w:tc>
+        <w:tc>
+          <w:tcPr>
+            <w:tcW w:w="6355" w:type="dxa"/>
+            <w:tcBorders>
+              <w:top w:val="single" w:sz="4" w:space="0" w:color="000000"/>
+              <w:left w:val="single" w:sz="4" w:space="0" w:color="000000"/>
+              <w:bottom w:val="single" w:sz="4" w:space="0" w:color="000000"/>
+              <w:right w:val="single" w:sz="4" w:space="0" w:color="000000"/>
+            </w:tcBorders>
+            <w:vAlign w:val="center"/>
+          </w:tcPr>
+          <w:p>
+            <w:pPr>
+              <w:rPr>
+                <w:rFonts w:ascii="Arial" w:hAnsi="Arial" w:cs="Arial"/>
+              </w:rPr>
+            </w:pPr>
+            <w:r>
+              <w:rPr>
+                <w:rFonts w:ascii="Arial" w:eastAsia="Arial" w:hAnsi="Arial" w:cs="Arial"/>
+                <w:sz w:val="24"/>
+              </w:rPr>
+              <w:t xml:space="preserve">          NACIT LL      </w:t>
+            </w:r>
+          </w:p>
+        </w:tc>
+      </w:tr>
+      <w:tr>
+        <w:trPr>
+          <w:trHeight w:val="753"/>
+        </w:trPr>
+        <w:tc>
+          <w:tcPr>
+            <w:tcW w:w="3101" w:type="dxa"/>
+            <w:tcBorders>
+              <w:top w:val="single" w:sz="4" w:space="0" w:color="000000"/>
+              <w:left w:val="single" w:sz="4" w:space="0" w:color="000000"/>
+              <w:bottom w:val="single" w:sz="4" w:space="0" w:color="000000"/>
+              <w:right w:val="single" w:sz="4" w:space="0" w:color="000000"/>
+            </w:tcBorders>
+            <w:vAlign w:val="center"/>
+          </w:tcPr>
+          <w:p>
+            <w:pPr>
+              <w:ind w:left="2"/>
+              <w:rPr>
+                <w:rFonts w:ascii="Arial" w:hAnsi="Arial" w:cs="Arial"/>
+              </w:rPr>
+            </w:pPr>
+            <w:r>
+              <w:rPr>
+                <w:rFonts w:ascii="Arial" w:eastAsia="Arial" w:hAnsi="Arial" w:cs="Arial"/>
+                <w:b/>
+                <w:sz w:val="24"/>
+              </w:rPr>
+              <w:t xml:space="preserve">Word Count: </w:t>
+            </w:r>
+          </w:p>
+        </w:tc>
+        <w:tc>
+          <w:tcPr>
+            <w:tcW w:w="6355" w:type="dxa"/>
+            <w:tcBorders>
+              <w:top w:val="single" w:sz="4" w:space="0" w:color="000000"/>
+              <w:left w:val="single" w:sz="4" w:space="0" w:color="000000"/>
+              <w:bottom w:val="single" w:sz="4" w:space="0" w:color="000000"/>
+              <w:right w:val="single" w:sz="4" w:space="0" w:color="000000"/>
+            </w:tcBorders>
+            <w:vAlign w:val="center"/>
+          </w:tcPr>
+          <w:p>
+            <w:pPr>
+              <w:rPr>
+                <w:rFonts w:ascii="Arial" w:hAnsi="Arial" w:cs="Arial"/>
+              </w:rPr>
+            </w:pPr>
+            <w:r>
+              <w:rPr>
+                <w:rFonts w:ascii="Arial" w:hAnsi="Arial" w:cs="Arial"/>
+              </w:rPr>
+              <w:t xml:space="preserve">       2800</w:t>
+            </w:r>
+          </w:p>
+        </w:tc>
+      </w:tr>
+      <w:tr>
+        <w:trPr>
+          <w:trHeight w:val="2507"/>
+        </w:trPr>
+        <w:tc>
+          <w:tcPr>
+            <w:tcW w:w="9456" w:type="dxa"/>
+            <w:gridSpan w:val="2"/>
+            <w:tcBorders>
+              <w:top w:val="single" w:sz="4" w:space="0" w:color="000000"/>
+              <w:left w:val="single" w:sz="4" w:space="0" w:color="000000"/>
+              <w:bottom w:val="single" w:sz="4" w:space="0" w:color="000000"/>
+              <w:right w:val="single" w:sz="4" w:space="0" w:color="000000"/>
+            </w:tcBorders>
+          </w:tcPr>
+          <w:p>
+            <w:pPr>
+              <w:spacing w:after="43"/>
+              <w:ind w:left="2"/>
+              <w:rPr>
+                <w:rFonts w:ascii="Arial" w:hAnsi="Arial" w:cs="Arial"/>
+              </w:rPr>
+            </w:pPr>
+            <w:r>
+              <w:rPr>
+                <w:rFonts w:ascii="Arial" w:eastAsia="Arial" w:hAnsi="Arial" w:cs="Arial"/>
+                <w:sz w:val="24"/>
+              </w:rPr>
+              <w:t xml:space="preserve"> </w:t>
+            </w:r>
+          </w:p>
+          <w:p>
+            <w:pPr>
+              <w:spacing w:after="239" w:line="277" w:lineRule="auto"/>
+              <w:ind w:left="2"/>
+              <w:rPr>
+                <w:rFonts w:ascii="Arial" w:hAnsi="Arial" w:cs="Arial"/>
+              </w:rPr>
+            </w:pPr>
+            <w:r>
+              <w:rPr>
+                <w:rFonts w:ascii="Arial" w:eastAsia="Arial" w:hAnsi="Arial" w:cs="Arial"/>
+                <w:sz w:val="24"/>
+              </w:rPr>
+              <w:t xml:space="preserve">I have read and understood both NCC Education’s </w:t>
+            </w:r>
+            <w:r>
+              <w:rPr>
+                <w:rFonts w:ascii="Arial" w:eastAsia="Arial" w:hAnsi="Arial" w:cs="Arial"/>
+                <w:i/>
+                <w:sz w:val="24"/>
+              </w:rPr>
+              <w:t>Academic Misconduct Policy</w:t>
+            </w:r>
+            <w:r>
+              <w:rPr>
+                <w:rFonts w:ascii="Arial" w:eastAsia="Arial" w:hAnsi="Arial" w:cs="Arial"/>
+                <w:sz w:val="24"/>
+              </w:rPr>
+              <w:t xml:space="preserve"> and the </w:t>
+            </w:r>
+            <w:r>
+              <w:rPr>
+                <w:rFonts w:ascii="Arial" w:eastAsia="Arial" w:hAnsi="Arial" w:cs="Arial"/>
+                <w:i/>
+                <w:sz w:val="24"/>
+              </w:rPr>
+              <w:t>Referencing and Bibliographies</w:t>
+            </w:r>
+            <w:r>
+              <w:rPr>
+                <w:rFonts w:ascii="Arial" w:eastAsia="Arial" w:hAnsi="Arial" w:cs="Arial"/>
+                <w:sz w:val="24"/>
+              </w:rPr>
+              <w:t xml:space="preserve"> document. To the best of my knowledge my work has been accurately referenced and all sources cited correctly. </w:t>
+            </w:r>
+          </w:p>
+          <w:p>
+            <w:pPr>
+              <w:spacing w:after="255"/>
+              <w:ind w:left="2"/>
+              <w:rPr>
+                <w:rFonts w:ascii="Arial" w:hAnsi="Arial" w:cs="Arial"/>
+              </w:rPr>
+            </w:pPr>
+            <w:r>
+              <w:rPr>
+                <w:rFonts w:ascii="Arial" w:eastAsia="Arial" w:hAnsi="Arial" w:cs="Arial"/>
+                <w:sz w:val="24"/>
+              </w:rPr>
+              <w:t xml:space="preserve">I confirm that I have not exceeded the stipulated word limit by more than 10%. </w:t>
+            </w:r>
+          </w:p>
+          <w:p>
+            <w:pPr>
+              <w:ind w:left="2"/>
+              <w:rPr>
+                <w:rFonts w:ascii="Arial" w:hAnsi="Arial" w:cs="Arial"/>
+              </w:rPr>
+            </w:pPr>
+            <w:r>
+              <w:rPr>
+                <w:rFonts w:ascii="Arial" w:eastAsia="Arial" w:hAnsi="Arial" w:cs="Arial"/>
+                <w:sz w:val="24"/>
+              </w:rPr>
+              <w:t xml:space="preserve">I confirm that this is my own work and that I have not colluded or </w:t>
+            </w:r>
+            <w:proofErr w:type="spellStart"/>
+            <w:r>
+              <w:rPr>
+                <w:rFonts w:ascii="Arial" w:eastAsia="Arial" w:hAnsi="Arial" w:cs="Arial"/>
+                <w:sz w:val="24"/>
+              </w:rPr>
+              <w:t>plagiarised</w:t>
+            </w:r>
+            <w:proofErr w:type="spellEnd"/>
+            <w:r>
+              <w:rPr>
+                <w:rFonts w:ascii="Arial" w:eastAsia="Arial" w:hAnsi="Arial" w:cs="Arial"/>
+                <w:sz w:val="24"/>
+              </w:rPr>
+              <w:t xml:space="preserve"> any part of it.</w:t>
+            </w:r>
+            <w:r>
+              <w:rPr>
+                <w:rFonts w:ascii="Arial" w:eastAsia="Arial" w:hAnsi="Arial" w:cs="Arial"/>
+                <w:sz w:val="28"/>
+              </w:rPr>
+              <w:t xml:space="preserve"> </w:t>
+            </w:r>
+          </w:p>
+        </w:tc>
+      </w:tr>
+      <w:tr>
+        <w:trPr>
+          <w:trHeight w:val="753"/>
+        </w:trPr>
+        <w:tc>
+          <w:tcPr>
+            <w:tcW w:w="3101" w:type="dxa"/>
+            <w:tcBorders>
+              <w:top w:val="single" w:sz="4" w:space="0" w:color="000000"/>
+              <w:left w:val="single" w:sz="4" w:space="0" w:color="000000"/>
+              <w:bottom w:val="single" w:sz="4" w:space="0" w:color="000000"/>
+              <w:right w:val="single" w:sz="4" w:space="0" w:color="000000"/>
+            </w:tcBorders>
+            <w:vAlign w:val="center"/>
+          </w:tcPr>
+          <w:p>
+            <w:pPr>
+              <w:ind w:left="2"/>
+              <w:rPr>
+                <w:rFonts w:ascii="Arial" w:hAnsi="Arial" w:cs="Arial"/>
+              </w:rPr>
+            </w:pPr>
+            <w:r>
+              <w:rPr>
+                <w:rFonts w:ascii="Arial" w:eastAsia="Arial" w:hAnsi="Arial" w:cs="Arial"/>
+                <w:b/>
+                <w:sz w:val="24"/>
+              </w:rPr>
+              <w:t xml:space="preserve">Candidate Signature: </w:t>
+            </w:r>
+          </w:p>
+        </w:tc>
+        <w:tc>
+          <w:tcPr>
+            <w:tcW w:w="6355" w:type="dxa"/>
+            <w:tcBorders>
+              <w:top w:val="single" w:sz="4" w:space="0" w:color="000000"/>
+              <w:left w:val="single" w:sz="4" w:space="0" w:color="000000"/>
+              <w:bottom w:val="single" w:sz="4" w:space="0" w:color="000000"/>
+              <w:right w:val="single" w:sz="4" w:space="0" w:color="000000"/>
+            </w:tcBorders>
+            <w:vAlign w:val="center"/>
+          </w:tcPr>
+          <w:p>
+            <w:pPr>
+              <w:rPr>
+                <w:rFonts w:ascii="Arial" w:hAnsi="Arial" w:cs="Arial"/>
+              </w:rPr>
+            </w:pPr>
+            <w:r>
+              <w:rPr>
+                <w:rFonts w:ascii="Arial" w:eastAsia="Arial" w:hAnsi="Arial" w:cs="Arial"/>
+                <w:sz w:val="24"/>
+              </w:rPr>
+              <w:t xml:space="preserve">               </w:t>
+            </w:r>
+          </w:p>
+        </w:tc>
+      </w:tr>
+      <w:tr>
+        <w:trPr>
+          <w:trHeight w:val="755"/>
+        </w:trPr>
+        <w:tc>
+          <w:tcPr>
+            <w:tcW w:w="3101" w:type="dxa"/>
+            <w:tcBorders>
+              <w:top w:val="single" w:sz="4" w:space="0" w:color="000000"/>
+              <w:left w:val="single" w:sz="4" w:space="0" w:color="000000"/>
+              <w:bottom w:val="single" w:sz="4" w:space="0" w:color="000000"/>
+              <w:right w:val="single" w:sz="4" w:space="0" w:color="000000"/>
+            </w:tcBorders>
+            <w:vAlign w:val="center"/>
+          </w:tcPr>
+          <w:p>
+            <w:pPr>
+              <w:ind w:left="2"/>
+              <w:rPr>
+                <w:rFonts w:ascii="Arial" w:hAnsi="Arial" w:cs="Arial"/>
+              </w:rPr>
+            </w:pPr>
+            <w:r>
+              <w:rPr>
+                <w:rFonts w:ascii="Arial" w:eastAsia="Arial" w:hAnsi="Arial" w:cs="Arial"/>
+                <w:b/>
+                <w:sz w:val="24"/>
+              </w:rPr>
+              <w:t xml:space="preserve">Date: </w:t>
+            </w:r>
+          </w:p>
+        </w:tc>
+        <w:tc>
+          <w:tcPr>
+            <w:tcW w:w="6355" w:type="dxa"/>
+            <w:tcBorders>
+              <w:top w:val="single" w:sz="4" w:space="0" w:color="000000"/>
+              <w:left w:val="single" w:sz="4" w:space="0" w:color="000000"/>
+              <w:bottom w:val="single" w:sz="4" w:space="0" w:color="000000"/>
+              <w:right w:val="single" w:sz="4" w:space="0" w:color="000000"/>
+            </w:tcBorders>
+            <w:vAlign w:val="center"/>
+          </w:tcPr>
+          <w:p>
+            <w:pPr>
+              <w:rPr>
+                <w:rFonts w:ascii="Arial" w:hAnsi="Arial" w:cs="Arial"/>
+              </w:rPr>
+            </w:pPr>
+            <w:r>
+              <w:rPr>
+                <w:rFonts w:ascii="Arial" w:eastAsia="Arial" w:hAnsi="Arial" w:cs="Arial"/>
+                <w:sz w:val="24"/>
+              </w:rPr>
+              <w:t xml:space="preserve">    </w:t>
+            </w:r>
+          </w:p>
+        </w:tc>
+      </w:tr>
+    </w:tbl>
+    <w:p>
+      <w:pPr>
+        <w:rPr>
+          <w:rFonts w:ascii="Arial" w:hAnsi="Arial" w:cs="Arial"/>
+        </w:rPr>
+      </w:pPr>
+    </w:p>
+    <w:sdt>
+      <w:sdtPr>
+        <w:rPr>
+          <w:rFonts w:ascii="Arial" w:eastAsiaTheme="minorHAnsi" w:hAnsi="Arial" w:cs="Arial"/>
+          <w:color w:val="auto"/>
+          <w:kern w:val="2"/>
+          <w:sz w:val="24"/>
+          <w:szCs w:val="24"/>
+          <w14:ligatures w14:val="standardContextual"/>
+        </w:rPr>
+        <w:id w:val="927466591"/>
+        <w:docPartObj>
+          <w:docPartGallery w:val="Table of Contents"/>
+          <w:docPartUnique/>
+        </w:docPartObj>
+      </w:sdtPr>
+      <w:sdtEndPr>
+        <w:rPr>
+          <w:b/>
+          <w:bCs/>
+          <w:noProof/>
+        </w:rPr>
+      </w:sdtEndPr>
+      <w:sdtContent>
+        <w:p>
+          <w:pPr>
+            <w:pStyle w:val="TOCHeading"/>
+            <w:rPr>
+              <w:rFonts w:ascii="Arial" w:hAnsi="Arial" w:cs="Arial"/>
+              <w:b/>
+              <w:color w:val="auto"/>
+            </w:rPr>
+          </w:pPr>
+          <w:r>
+            <w:rPr>
+              <w:rFonts w:ascii="Arial" w:hAnsi="Arial" w:cs="Arial"/>
+              <w:b/>
+              <w:color w:val="auto"/>
+            </w:rPr>
+            <w:t>Contents</w:t>
+          </w:r>
+        </w:p>
+        <w:p>
+          <w:pPr>
+            <w:pStyle w:val="TOC1"/>
+            <w:tabs>
+              <w:tab w:val="right" w:leader="dot" w:pos="9350"/>
+            </w:tabs>
+            <w:rPr>
+              <w:rFonts w:ascii="Arial" w:hAnsi="Arial" w:cs="Arial"/>
+              <w:noProof/>
+            </w:rPr>
+          </w:pPr>
+          <w:r>
+            <w:rPr>
+              <w:rFonts w:ascii="Arial" w:hAnsi="Arial" w:cs="Arial"/>
+            </w:rPr>
+            <w:fldChar w:fldCharType="begin"/>
+          </w:r>
+          <w:r>
+            <w:rPr>
+              <w:rFonts w:ascii="Arial" w:hAnsi="Arial" w:cs="Arial"/>
+            </w:rPr>
+            <w:instrText xml:space="preserve"> TOC \o "1-3" \h \z \u </w:instrText>
+          </w:r>
+          <w:r>
+            <w:rPr>
+              <w:rFonts w:ascii="Arial" w:hAnsi="Arial" w:cs="Arial"/>
+            </w:rPr>
+            <w:fldChar w:fldCharType="separate"/>
+          </w:r>
+          <w:hyperlink w:anchor="_Toc236855906" w:history="1">
+            <w:r>
+              <w:rPr>
+                <w:rStyle w:val="Hyperlink"/>
+                <w:rFonts w:ascii="Arial" w:hAnsi="Arial" w:cs="Arial"/>
+                <w:b/>
+                <w:noProof/>
+              </w:rPr>
+              <w:t>Introduction</w:t>
+            </w:r>
+            <w:r>
+              <w:rPr>
+                <w:rFonts w:ascii="Arial" w:hAnsi="Arial" w:cs="Arial"/>
+                <w:noProof/>
+                <w:webHidden/>
+              </w:rPr>
+              <w:tab/>
+            </w:r>
+            <w:r>
+              <w:rPr>
+                <w:rFonts w:ascii="Arial" w:hAnsi="Arial" w:cs="Arial"/>
+                <w:noProof/>
+                <w:webHidden/>
+              </w:rPr>
+              <w:fldChar w:fldCharType="begin"/>
+            </w:r>
+            <w:r>
+              <w:rPr>
+                <w:rFonts w:ascii="Arial" w:hAnsi="Arial" w:cs="Arial"/>
+                <w:noProof/>
+                <w:webHidden/>
+              </w:rPr>
+              <w:instrText xml:space="preserve"> PAGEREF _Toc236855906 \h </w:instrText>
+            </w:r>
+            <w:r>
+              <w:rPr>
+                <w:rFonts w:ascii="Arial" w:hAnsi="Arial" w:cs="Arial"/>
+                <w:noProof/>
+                <w:webHidden/>
+              </w:rPr>
+            </w:r>
+            <w:r>
+              <w:rPr>
+                <w:rFonts w:ascii="Arial" w:hAnsi="Arial" w:cs="Arial"/>
+                <w:noProof/>
+                <w:webHidden/>
+              </w:rPr>
+              <w:fldChar w:fldCharType="separate"/>
+            </w:r>
+            <w:r>
+              <w:rPr>
+                <w:rFonts w:ascii="Arial" w:hAnsi="Arial" w:cs="Arial"/>
+                <w:noProof/>
+                <w:webHidden/>
+              </w:rPr>
+              <w:t>3</w:t>
+            </w:r>
+            <w:r>
+              <w:rPr>
+                <w:rFonts w:ascii="Arial" w:hAnsi="Arial" w:cs="Arial"/>
+                <w:noProof/>
+                <w:webHidden/>
+              </w:rPr>
+              <w:fldChar w:fldCharType="end"/>
+            </w:r>
+          </w:hyperlink>
+        </w:p>
+        <w:p>
+          <w:pPr>
+            <w:pStyle w:val="TOC1"/>
+            <w:tabs>
+              <w:tab w:val="right" w:leader="dot" w:pos="9350"/>
+            </w:tabs>
+            <w:rPr>
+              <w:rFonts w:ascii="Arial" w:hAnsi="Arial" w:cs="Arial"/>
+              <w:noProof/>
+            </w:rPr>
+          </w:pPr>
+          <w:hyperlink w:anchor="_Toc236855907" w:history="1">
+            <w:r>
+              <w:rPr>
+                <w:rStyle w:val="Hyperlink"/>
+                <w:rFonts w:ascii="Arial" w:hAnsi="Arial" w:cs="Arial"/>
+                <w:b/>
+                <w:noProof/>
+              </w:rPr>
+              <w:t>The QuantumX</w:t>
+            </w:r>
+            <w:r>
+              <w:rPr>
+                <w:rFonts w:ascii="Arial" w:hAnsi="Arial" w:cs="Arial"/>
+                <w:noProof/>
+                <w:webHidden/>
+              </w:rPr>
+              <w:tab/>
+            </w:r>
+            <w:r>
+              <w:rPr>
+                <w:rFonts w:ascii="Arial" w:hAnsi="Arial" w:cs="Arial"/>
+                <w:noProof/>
+                <w:webHidden/>
+              </w:rPr>
+              <w:fldChar w:fldCharType="begin"/>
+            </w:r>
+            <w:r>
+              <w:rPr>
+                <w:rFonts w:ascii="Arial" w:hAnsi="Arial" w:cs="Arial"/>
+                <w:noProof/>
+                <w:webHidden/>
+              </w:rPr>
+              <w:instrText xml:space="preserve"> PAGEREF _Toc236855907 \h </w:instrText>
+            </w:r>
+            <w:r>
+              <w:rPr>
+                <w:rFonts w:ascii="Arial" w:hAnsi="Arial" w:cs="Arial"/>
+                <w:noProof/>
+                <w:webHidden/>
+              </w:rPr>
+            </w:r>
+            <w:r>
+              <w:rPr>
+                <w:rFonts w:ascii="Arial" w:hAnsi="Arial" w:cs="Arial"/>
+                <w:noProof/>
+                <w:webHidden/>
+              </w:rPr>
+              <w:fldChar w:fldCharType="separate"/>
+            </w:r>
+            <w:r>
+              <w:rPr>
+                <w:rFonts w:ascii="Arial" w:hAnsi="Arial" w:cs="Arial"/>
+                <w:noProof/>
+                <w:webHidden/>
+              </w:rPr>
+              <w:t>4</w:t>
+            </w:r>
+            <w:r>
+              <w:rPr>
+                <w:rFonts w:ascii="Arial" w:hAnsi="Arial" w:cs="Arial"/>
+                <w:noProof/>
+                <w:webHidden/>
+              </w:rPr>
+              <w:fldChar w:fldCharType="end"/>
+            </w:r>
+          </w:hyperlink>
+        </w:p>
+        <w:p>
+          <w:pPr>
+            <w:pStyle w:val="TOC2"/>
+            <w:tabs>
+              <w:tab w:val="left" w:pos="1440"/>
+              <w:tab w:val="right" w:leader="dot" w:pos="9350"/>
+            </w:tabs>
+            <w:rPr>
+              <w:rFonts w:ascii="Arial" w:hAnsi="Arial" w:cs="Arial"/>
+              <w:noProof/>
+            </w:rPr>
+          </w:pPr>
+          <w:hyperlink w:anchor="_Toc236855908" w:history="1">
+            <w:r>
+              <w:rPr>
+                <w:rStyle w:val="Hyperlink"/>
+                <w:rFonts w:ascii="Arial" w:hAnsi="Arial" w:cs="Arial"/>
+                <w:b/>
+                <w:bCs/>
+                <w:noProof/>
+              </w:rPr>
+              <w:t>Task 1.0</w:t>
+            </w:r>
+            <w:r>
+              <w:rPr>
+                <w:rFonts w:ascii="Arial" w:hAnsi="Arial" w:cs="Arial"/>
+                <w:noProof/>
+              </w:rPr>
+              <w:tab/>
+            </w:r>
+            <w:r>
+              <w:rPr>
+                <w:rStyle w:val="Hyperlink"/>
+                <w:rFonts w:ascii="Arial" w:hAnsi="Arial" w:cs="Arial"/>
+                <w:b/>
+                <w:bCs/>
+                <w:noProof/>
+              </w:rPr>
+              <w:t>Hardware Components and Expansion Options</w:t>
+            </w:r>
+            <w:r>
+              <w:rPr>
+                <w:rFonts w:ascii="Arial" w:hAnsi="Arial" w:cs="Arial"/>
+                <w:noProof/>
+                <w:webHidden/>
+              </w:rPr>
+              <w:tab/>
+            </w:r>
+            <w:r>
+              <w:rPr>
+                <w:rFonts w:ascii="Arial" w:hAnsi="Arial" w:cs="Arial"/>
+                <w:noProof/>
+                <w:webHidden/>
+              </w:rPr>
+              <w:fldChar w:fldCharType="begin"/>
+            </w:r>
+            <w:r>
+              <w:rPr>
+                <w:rFonts w:ascii="Arial" w:hAnsi="Arial" w:cs="Arial"/>
+                <w:noProof/>
+                <w:webHidden/>
+              </w:rPr>
+              <w:instrText xml:space="preserve"> PAGEREF _Toc236855908 \h </w:instrText>
+            </w:r>
+            <w:r>
+              <w:rPr>
+                <w:rFonts w:ascii="Arial" w:hAnsi="Arial" w:cs="Arial"/>
+                <w:noProof/>
+                <w:webHidden/>
+              </w:rPr>
+            </w:r>
+            <w:r>
+              <w:rPr>
+                <w:rFonts w:ascii="Arial" w:hAnsi="Arial" w:cs="Arial"/>
+                <w:noProof/>
+                <w:webHidden/>
+              </w:rPr>
+              <w:fldChar w:fldCharType="separate"/>
+            </w:r>
+            <w:r>
+              <w:rPr>
+                <w:rFonts w:ascii="Arial" w:hAnsi="Arial" w:cs="Arial"/>
+                <w:noProof/>
+                <w:webHidden/>
+              </w:rPr>
+              <w:t>4</w:t>
+            </w:r>
+            <w:r>
+              <w:rPr>
+                <w:rFonts w:ascii="Arial" w:hAnsi="Arial" w:cs="Arial"/>
+                <w:noProof/>
+                <w:webHidden/>
+              </w:rPr>
+              <w:fldChar w:fldCharType="end"/>
+            </w:r>
+          </w:hyperlink>
+        </w:p>
+        <w:p>
+          <w:pPr>
+            <w:pStyle w:val="TOC1"/>
+            <w:tabs>
+              <w:tab w:val="left" w:pos="720"/>
+              <w:tab w:val="right" w:leader="dot" w:pos="9350"/>
+            </w:tabs>
+            <w:rPr>
+              <w:rFonts w:ascii="Arial" w:hAnsi="Arial" w:cs="Arial"/>
+              <w:noProof/>
+            </w:rPr>
+          </w:pPr>
+          <w:hyperlink w:anchor="_Toc236855909" w:history="1">
+            <w:r>
+              <w:rPr>
+                <w:rStyle w:val="Hyperlink"/>
+                <w:rFonts w:ascii="Arial" w:hAnsi="Arial" w:cs="Arial"/>
+                <w:b/>
+                <w:noProof/>
+              </w:rPr>
+              <w:t>1.2</w:t>
+            </w:r>
+            <w:r>
+              <w:rPr>
+                <w:rFonts w:ascii="Arial" w:hAnsi="Arial" w:cs="Arial"/>
+                <w:noProof/>
+              </w:rPr>
+              <w:tab/>
+            </w:r>
+            <w:r>
+              <w:rPr>
+                <w:rStyle w:val="Hyperlink"/>
+                <w:rFonts w:ascii="Arial" w:hAnsi="Arial" w:cs="Arial"/>
+                <w:b/>
+                <w:noProof/>
+              </w:rPr>
+              <w:t>Operating System Functionalities and Hardware</w:t>
+            </w:r>
+            <w:r>
+              <w:rPr>
+                <w:rFonts w:ascii="Arial" w:hAnsi="Arial" w:cs="Arial"/>
+                <w:noProof/>
+                <w:webHidden/>
+              </w:rPr>
+              <w:tab/>
+            </w:r>
+            <w:r>
+              <w:rPr>
+                <w:rFonts w:ascii="Arial" w:hAnsi="Arial" w:cs="Arial"/>
+                <w:noProof/>
+                <w:webHidden/>
+              </w:rPr>
+              <w:fldChar w:fldCharType="begin"/>
+            </w:r>
+            <w:r>
+              <w:rPr>
+                <w:rFonts w:ascii="Arial" w:hAnsi="Arial" w:cs="Arial"/>
+                <w:noProof/>
+                <w:webHidden/>
+              </w:rPr>
+              <w:instrText xml:space="preserve"> PAGEREF _Toc236855909 \h </w:instrText>
+            </w:r>
+            <w:r>
+              <w:rPr>
+                <w:rFonts w:ascii="Arial" w:hAnsi="Arial" w:cs="Arial"/>
+                <w:noProof/>
+                <w:webHidden/>
+              </w:rPr>
+            </w:r>
+            <w:r>
+              <w:rPr>
+                <w:rFonts w:ascii="Arial" w:hAnsi="Arial" w:cs="Arial"/>
+                <w:noProof/>
+                <w:webHidden/>
+              </w:rPr>
+              <w:fldChar w:fldCharType="separate"/>
+            </w:r>
+            <w:r>
+              <w:rPr>
+                <w:rFonts w:ascii="Arial" w:hAnsi="Arial" w:cs="Arial"/>
+                <w:noProof/>
+                <w:webHidden/>
+              </w:rPr>
+              <w:t>6</w:t>
+            </w:r>
+            <w:r>
+              <w:rPr>
+                <w:rFonts w:ascii="Arial" w:hAnsi="Arial" w:cs="Arial"/>
+                <w:noProof/>
+                <w:webHidden/>
+              </w:rPr>
+              <w:fldChar w:fldCharType="end"/>
+            </w:r>
+          </w:hyperlink>
+        </w:p>
+        <w:p>
+          <w:pPr>
+            <w:pStyle w:val="TOC2"/>
+            <w:tabs>
+              <w:tab w:val="left" w:pos="1440"/>
+              <w:tab w:val="right" w:leader="dot" w:pos="9350"/>
+            </w:tabs>
+            <w:rPr>
+              <w:rFonts w:ascii="Arial" w:hAnsi="Arial" w:cs="Arial"/>
+              <w:noProof/>
+            </w:rPr>
+          </w:pPr>
+          <w:hyperlink w:anchor="_Toc236855910" w:history="1">
+            <w:r>
+              <w:rPr>
+                <w:rStyle w:val="Hyperlink"/>
+                <w:rFonts w:ascii="Arial" w:hAnsi="Arial" w:cs="Arial"/>
+                <w:b/>
+                <w:bCs/>
+                <w:noProof/>
+              </w:rPr>
+              <w:t>Task 2.0</w:t>
+            </w:r>
+            <w:r>
+              <w:rPr>
+                <w:rFonts w:ascii="Arial" w:hAnsi="Arial" w:cs="Arial"/>
+                <w:noProof/>
+              </w:rPr>
+              <w:tab/>
+            </w:r>
+            <w:r>
+              <w:rPr>
+                <w:rStyle w:val="Hyperlink"/>
+                <w:rFonts w:ascii="Arial" w:hAnsi="Arial" w:cs="Arial"/>
+                <w:b/>
+                <w:bCs/>
+                <w:noProof/>
+              </w:rPr>
+              <w:t>Software Bundling</w:t>
+            </w:r>
+            <w:r>
+              <w:rPr>
+                <w:rFonts w:ascii="Arial" w:hAnsi="Arial" w:cs="Arial"/>
+                <w:noProof/>
+                <w:webHidden/>
+              </w:rPr>
+              <w:tab/>
+            </w:r>
+            <w:r>
+              <w:rPr>
+                <w:rFonts w:ascii="Arial" w:hAnsi="Arial" w:cs="Arial"/>
+                <w:noProof/>
+                <w:webHidden/>
+              </w:rPr>
+              <w:fldChar w:fldCharType="begin"/>
+            </w:r>
+            <w:r>
+              <w:rPr>
+                <w:rFonts w:ascii="Arial" w:hAnsi="Arial" w:cs="Arial"/>
+                <w:noProof/>
+                <w:webHidden/>
+              </w:rPr>
+              <w:instrText xml:space="preserve"> PAGEREF _Toc236855910 \h </w:instrText>
+            </w:r>
+            <w:r>
+              <w:rPr>
+                <w:rFonts w:ascii="Arial" w:hAnsi="Arial" w:cs="Arial"/>
+                <w:noProof/>
+                <w:webHidden/>
+              </w:rPr>
+            </w:r>
+            <w:r>
+              <w:rPr>
+                <w:rFonts w:ascii="Arial" w:hAnsi="Arial" w:cs="Arial"/>
+                <w:noProof/>
+                <w:webHidden/>
+              </w:rPr>
+              <w:fldChar w:fldCharType="separate"/>
+            </w:r>
+            <w:r>
+              <w:rPr>
+                <w:rFonts w:ascii="Arial" w:hAnsi="Arial" w:cs="Arial"/>
+                <w:noProof/>
+                <w:webHidden/>
+              </w:rPr>
+              <w:t>9</w:t>
+            </w:r>
+            <w:r>
+              <w:rPr>
+                <w:rFonts w:ascii="Arial" w:hAnsi="Arial" w:cs="Arial"/>
+                <w:noProof/>
+                <w:webHidden/>
+              </w:rPr>
+              <w:fldChar w:fldCharType="end"/>
+            </w:r>
+          </w:hyperlink>
+        </w:p>
+        <w:p>
+          <w:pPr>
+            <w:pStyle w:val="TOC1"/>
+            <w:tabs>
+              <w:tab w:val="left" w:pos="720"/>
+              <w:tab w:val="right" w:leader="dot" w:pos="9350"/>
+            </w:tabs>
+            <w:rPr>
+              <w:rFonts w:ascii="Arial" w:hAnsi="Arial" w:cs="Arial"/>
+              <w:noProof/>
+            </w:rPr>
+          </w:pPr>
+          <w:hyperlink w:anchor="_Toc236855911" w:history="1">
+            <w:r>
+              <w:rPr>
+                <w:rStyle w:val="Hyperlink"/>
+                <w:rFonts w:ascii="Arial" w:hAnsi="Arial" w:cs="Arial"/>
+                <w:b/>
+                <w:noProof/>
+              </w:rPr>
+              <w:t>2.1</w:t>
+            </w:r>
+            <w:r>
+              <w:rPr>
+                <w:rFonts w:ascii="Arial" w:hAnsi="Arial" w:cs="Arial"/>
+                <w:noProof/>
+              </w:rPr>
+              <w:tab/>
+            </w:r>
+            <w:r>
+              <w:rPr>
+                <w:rStyle w:val="Hyperlink"/>
+                <w:rFonts w:ascii="Arial" w:hAnsi="Arial" w:cs="Arial"/>
+                <w:b/>
+                <w:noProof/>
+              </w:rPr>
+              <w:t>Software categories</w:t>
+            </w:r>
+            <w:r>
+              <w:rPr>
+                <w:rFonts w:ascii="Arial" w:hAnsi="Arial" w:cs="Arial"/>
+                <w:noProof/>
+                <w:webHidden/>
+              </w:rPr>
+              <w:tab/>
+            </w:r>
+            <w:r>
+              <w:rPr>
+                <w:rFonts w:ascii="Arial" w:hAnsi="Arial" w:cs="Arial"/>
+                <w:noProof/>
+                <w:webHidden/>
+              </w:rPr>
+              <w:fldChar w:fldCharType="begin"/>
+            </w:r>
+            <w:r>
+              <w:rPr>
+                <w:rFonts w:ascii="Arial" w:hAnsi="Arial" w:cs="Arial"/>
+                <w:noProof/>
+                <w:webHidden/>
+              </w:rPr>
+              <w:instrText xml:space="preserve"> PAGEREF _Toc236855911 \h </w:instrText>
+            </w:r>
+            <w:r>
+              <w:rPr>
+                <w:rFonts w:ascii="Arial" w:hAnsi="Arial" w:cs="Arial"/>
+                <w:noProof/>
+                <w:webHidden/>
+              </w:rPr>
+            </w:r>
+            <w:r>
+              <w:rPr>
+                <w:rFonts w:ascii="Arial" w:hAnsi="Arial" w:cs="Arial"/>
+                <w:noProof/>
+                <w:webHidden/>
+              </w:rPr>
+              <w:fldChar w:fldCharType="separate"/>
+            </w:r>
+            <w:r>
+              <w:rPr>
+                <w:rFonts w:ascii="Arial" w:hAnsi="Arial" w:cs="Arial"/>
+                <w:noProof/>
+                <w:webHidden/>
+              </w:rPr>
+              <w:t>9</w:t>
+            </w:r>
+            <w:r>
+              <w:rPr>
+                <w:rFonts w:ascii="Arial" w:hAnsi="Arial" w:cs="Arial"/>
+                <w:noProof/>
+                <w:webHidden/>
+              </w:rPr>
+              <w:fldChar w:fldCharType="end"/>
+            </w:r>
+          </w:hyperlink>
+        </w:p>
+        <w:p>
+          <w:pPr>
+            <w:pStyle w:val="TOC1"/>
+            <w:tabs>
+              <w:tab w:val="left" w:pos="720"/>
+              <w:tab w:val="right" w:leader="dot" w:pos="9350"/>
+            </w:tabs>
+            <w:rPr>
+              <w:rFonts w:ascii="Arial" w:hAnsi="Arial" w:cs="Arial"/>
+              <w:noProof/>
+            </w:rPr>
+          </w:pPr>
+          <w:hyperlink w:anchor="_Toc236855912" w:history="1">
+            <w:r>
+              <w:rPr>
+                <w:rStyle w:val="Hyperlink"/>
+                <w:rFonts w:ascii="Arial" w:hAnsi="Arial" w:cs="Arial"/>
+                <w:b/>
+                <w:noProof/>
+              </w:rPr>
+              <w:t>2.2</w:t>
+            </w:r>
+            <w:r>
+              <w:rPr>
+                <w:rFonts w:ascii="Arial" w:hAnsi="Arial" w:cs="Arial"/>
+                <w:noProof/>
+              </w:rPr>
+              <w:tab/>
+            </w:r>
+            <w:r>
+              <w:rPr>
+                <w:rStyle w:val="Hyperlink"/>
+                <w:rFonts w:ascii="Arial" w:hAnsi="Arial" w:cs="Arial"/>
+                <w:b/>
+                <w:noProof/>
+              </w:rPr>
+              <w:t>Development Tools for custom software</w:t>
+            </w:r>
+            <w:r>
+              <w:rPr>
+                <w:rFonts w:ascii="Arial" w:hAnsi="Arial" w:cs="Arial"/>
+                <w:noProof/>
+                <w:webHidden/>
+              </w:rPr>
+              <w:tab/>
+            </w:r>
+            <w:r>
+              <w:rPr>
+                <w:rFonts w:ascii="Arial" w:hAnsi="Arial" w:cs="Arial"/>
+                <w:noProof/>
+                <w:webHidden/>
+              </w:rPr>
+              <w:fldChar w:fldCharType="begin"/>
+            </w:r>
+            <w:r>
+              <w:rPr>
+                <w:rFonts w:ascii="Arial" w:hAnsi="Arial" w:cs="Arial"/>
+                <w:noProof/>
+                <w:webHidden/>
+              </w:rPr>
+              <w:instrText xml:space="preserve"> PAGEREF _Toc236855912 \h </w:instrText>
+            </w:r>
+            <w:r>
+              <w:rPr>
+                <w:rFonts w:ascii="Arial" w:hAnsi="Arial" w:cs="Arial"/>
+                <w:noProof/>
+                <w:webHidden/>
+              </w:rPr>
+            </w:r>
+            <w:r>
+              <w:rPr>
+                <w:rFonts w:ascii="Arial" w:hAnsi="Arial" w:cs="Arial"/>
+                <w:noProof/>
+                <w:webHidden/>
+              </w:rPr>
+              <w:fldChar w:fldCharType="separate"/>
+            </w:r>
+            <w:r>
+              <w:rPr>
+                <w:rFonts w:ascii="Arial" w:hAnsi="Arial" w:cs="Arial"/>
+                <w:noProof/>
+                <w:webHidden/>
+              </w:rPr>
+              <w:t>10</w:t>
+            </w:r>
+            <w:r>
+              <w:rPr>
+                <w:rFonts w:ascii="Arial" w:hAnsi="Arial" w:cs="Arial"/>
+                <w:noProof/>
+                <w:webHidden/>
+              </w:rPr>
+              <w:fldChar w:fldCharType="end"/>
+            </w:r>
+          </w:hyperlink>
+        </w:p>
+        <w:p>
+          <w:pPr>
+            <w:pStyle w:val="TOC1"/>
+            <w:tabs>
+              <w:tab w:val="left" w:pos="1200"/>
+              <w:tab w:val="right" w:leader="dot" w:pos="9350"/>
+            </w:tabs>
+            <w:rPr>
+              <w:rFonts w:ascii="Arial" w:hAnsi="Arial" w:cs="Arial"/>
+              <w:noProof/>
+            </w:rPr>
+          </w:pPr>
+          <w:hyperlink w:anchor="_Toc236855913" w:history="1">
+            <w:r>
+              <w:rPr>
+                <w:rStyle w:val="Hyperlink"/>
+                <w:rFonts w:ascii="Arial" w:hAnsi="Arial" w:cs="Arial"/>
+                <w:b/>
+                <w:noProof/>
+              </w:rPr>
+              <w:t>Task 3.0</w:t>
+            </w:r>
+            <w:r>
+              <w:rPr>
+                <w:rFonts w:ascii="Arial" w:hAnsi="Arial" w:cs="Arial"/>
+                <w:noProof/>
+              </w:rPr>
+              <w:tab/>
+            </w:r>
+            <w:r>
+              <w:rPr>
+                <w:rStyle w:val="Hyperlink"/>
+                <w:rFonts w:ascii="Arial" w:hAnsi="Arial" w:cs="Arial"/>
+                <w:b/>
+                <w:noProof/>
+              </w:rPr>
+              <w:t>Networking Opportunities</w:t>
+            </w:r>
+            <w:r>
+              <w:rPr>
+                <w:rFonts w:ascii="Arial" w:hAnsi="Arial" w:cs="Arial"/>
+                <w:noProof/>
+                <w:webHidden/>
+              </w:rPr>
+              <w:tab/>
+            </w:r>
+            <w:r>
+              <w:rPr>
+                <w:rFonts w:ascii="Arial" w:hAnsi="Arial" w:cs="Arial"/>
+                <w:noProof/>
+                <w:webHidden/>
+              </w:rPr>
+              <w:fldChar w:fldCharType="begin"/>
+            </w:r>
+            <w:r>
+              <w:rPr>
+                <w:rFonts w:ascii="Arial" w:hAnsi="Arial" w:cs="Arial"/>
+                <w:noProof/>
+                <w:webHidden/>
+              </w:rPr>
+              <w:instrText xml:space="preserve"> PAGEREF _Toc236855913 \h </w:instrText>
+            </w:r>
+            <w:r>
+              <w:rPr>
+                <w:rFonts w:ascii="Arial" w:hAnsi="Arial" w:cs="Arial"/>
+                <w:noProof/>
+                <w:webHidden/>
+              </w:rPr>
+            </w:r>
+            <w:r>
+              <w:rPr>
+                <w:rFonts w:ascii="Arial" w:hAnsi="Arial" w:cs="Arial"/>
+                <w:noProof/>
+                <w:webHidden/>
+              </w:rPr>
+              <w:fldChar w:fldCharType="separate"/>
+            </w:r>
+            <w:r>
+              <w:rPr>
+                <w:rFonts w:ascii="Arial" w:hAnsi="Arial" w:cs="Arial"/>
+                <w:noProof/>
+                <w:webHidden/>
+              </w:rPr>
+              <w:t>12</w:t>
+            </w:r>
+            <w:r>
+              <w:rPr>
+                <w:rFonts w:ascii="Arial" w:hAnsi="Arial" w:cs="Arial"/>
+                <w:noProof/>
+                <w:webHidden/>
+              </w:rPr>
+              <w:fldChar w:fldCharType="end"/>
+            </w:r>
+          </w:hyperlink>
+        </w:p>
+        <w:p>
+          <w:pPr>
+            <w:pStyle w:val="TOC1"/>
+            <w:tabs>
+              <w:tab w:val="left" w:pos="720"/>
+              <w:tab w:val="right" w:leader="dot" w:pos="9350"/>
+            </w:tabs>
+            <w:rPr>
+              <w:rFonts w:ascii="Arial" w:hAnsi="Arial" w:cs="Arial"/>
+              <w:noProof/>
+            </w:rPr>
+          </w:pPr>
+          <w:hyperlink w:anchor="_Toc236855914" w:history="1">
+            <w:r>
+              <w:rPr>
+                <w:rStyle w:val="Hyperlink"/>
+                <w:rFonts w:ascii="Arial" w:hAnsi="Arial" w:cs="Arial"/>
+                <w:b/>
+                <w:noProof/>
+              </w:rPr>
+              <w:t>3.1</w:t>
+            </w:r>
+            <w:r>
+              <w:rPr>
+                <w:rFonts w:ascii="Arial" w:hAnsi="Arial" w:cs="Arial"/>
+                <w:noProof/>
+              </w:rPr>
+              <w:tab/>
+            </w:r>
+            <w:r>
+              <w:rPr>
+                <w:rStyle w:val="Hyperlink"/>
+                <w:rFonts w:ascii="Arial" w:hAnsi="Arial" w:cs="Arial"/>
+                <w:b/>
+                <w:noProof/>
+              </w:rPr>
+              <w:t>Networking Configurations</w:t>
+            </w:r>
+            <w:r>
+              <w:rPr>
+                <w:rFonts w:ascii="Arial" w:hAnsi="Arial" w:cs="Arial"/>
+                <w:noProof/>
+                <w:webHidden/>
+              </w:rPr>
+              <w:tab/>
+            </w:r>
+            <w:r>
+              <w:rPr>
+                <w:rFonts w:ascii="Arial" w:hAnsi="Arial" w:cs="Arial"/>
+                <w:noProof/>
+                <w:webHidden/>
+              </w:rPr>
+              <w:fldChar w:fldCharType="begin"/>
+            </w:r>
+            <w:r>
+              <w:rPr>
+                <w:rFonts w:ascii="Arial" w:hAnsi="Arial" w:cs="Arial"/>
+                <w:noProof/>
+                <w:webHidden/>
+              </w:rPr>
+              <w:instrText xml:space="preserve"> PAGEREF _Toc236855914 \h </w:instrText>
+            </w:r>
+            <w:r>
+              <w:rPr>
+                <w:rFonts w:ascii="Arial" w:hAnsi="Arial" w:cs="Arial"/>
+                <w:noProof/>
+                <w:webHidden/>
+              </w:rPr>
+            </w:r>
+            <w:r>
+              <w:rPr>
+                <w:rFonts w:ascii="Arial" w:hAnsi="Arial" w:cs="Arial"/>
+                <w:noProof/>
+                <w:webHidden/>
+              </w:rPr>
+              <w:fldChar w:fldCharType="separate"/>
+            </w:r>
+            <w:r>
+              <w:rPr>
+                <w:rFonts w:ascii="Arial" w:hAnsi="Arial" w:cs="Arial"/>
+                <w:noProof/>
+                <w:webHidden/>
+              </w:rPr>
+              <w:t>12</w:t>
+            </w:r>
+            <w:r>
+              <w:rPr>
+                <w:rFonts w:ascii="Arial" w:hAnsi="Arial" w:cs="Arial"/>
+                <w:noProof/>
+                <w:webHidden/>
+              </w:rPr>
+              <w:fldChar w:fldCharType="end"/>
+            </w:r>
+          </w:hyperlink>
+        </w:p>
+        <w:p>
+          <w:pPr>
+            <w:pStyle w:val="TOC1"/>
+            <w:tabs>
+              <w:tab w:val="left" w:pos="720"/>
+              <w:tab w:val="right" w:leader="dot" w:pos="9350"/>
+            </w:tabs>
+            <w:rPr>
+              <w:rFonts w:ascii="Arial" w:hAnsi="Arial" w:cs="Arial"/>
+              <w:noProof/>
+            </w:rPr>
+          </w:pPr>
+          <w:hyperlink w:anchor="_Toc236855915" w:history="1">
+            <w:r>
+              <w:rPr>
+                <w:rStyle w:val="Hyperlink"/>
+                <w:rFonts w:ascii="Arial" w:hAnsi="Arial" w:cs="Arial"/>
+                <w:b/>
+                <w:noProof/>
+              </w:rPr>
+              <w:t>3.2</w:t>
+            </w:r>
+            <w:r>
+              <w:rPr>
+                <w:rFonts w:ascii="Arial" w:hAnsi="Arial" w:cs="Arial"/>
+                <w:noProof/>
+              </w:rPr>
+              <w:tab/>
+            </w:r>
+            <w:r>
+              <w:rPr>
+                <w:rStyle w:val="Hyperlink"/>
+                <w:rFonts w:ascii="Arial" w:hAnsi="Arial" w:cs="Arial"/>
+                <w:b/>
+                <w:noProof/>
+              </w:rPr>
+              <w:t>LAN Networking Topologies</w:t>
+            </w:r>
+            <w:r>
+              <w:rPr>
+                <w:rFonts w:ascii="Arial" w:hAnsi="Arial" w:cs="Arial"/>
+                <w:noProof/>
+                <w:webHidden/>
+              </w:rPr>
+              <w:tab/>
+            </w:r>
+            <w:r>
+              <w:rPr>
+                <w:rFonts w:ascii="Arial" w:hAnsi="Arial" w:cs="Arial"/>
+                <w:noProof/>
+                <w:webHidden/>
+              </w:rPr>
+              <w:fldChar w:fldCharType="begin"/>
+            </w:r>
+            <w:r>
+              <w:rPr>
+                <w:rFonts w:ascii="Arial" w:hAnsi="Arial" w:cs="Arial"/>
+                <w:noProof/>
+                <w:webHidden/>
+              </w:rPr>
+              <w:instrText xml:space="preserve"> PAGEREF _Toc236855915 \h </w:instrText>
+            </w:r>
+            <w:r>
+              <w:rPr>
+                <w:rFonts w:ascii="Arial" w:hAnsi="Arial" w:cs="Arial"/>
+                <w:noProof/>
+                <w:webHidden/>
+              </w:rPr>
+            </w:r>
+            <w:r>
+              <w:rPr>
+                <w:rFonts w:ascii="Arial" w:hAnsi="Arial" w:cs="Arial"/>
+                <w:noProof/>
+                <w:webHidden/>
+              </w:rPr>
+              <w:fldChar w:fldCharType="separate"/>
+            </w:r>
+            <w:r>
+              <w:rPr>
+                <w:rFonts w:ascii="Arial" w:hAnsi="Arial" w:cs="Arial"/>
+                <w:noProof/>
+                <w:webHidden/>
+              </w:rPr>
+              <w:t>13</w:t>
+            </w:r>
+            <w:r>
+              <w:rPr>
+                <w:rFonts w:ascii="Arial" w:hAnsi="Arial" w:cs="Arial"/>
+                <w:noProof/>
+                <w:webHidden/>
+              </w:rPr>
+              <w:fldChar w:fldCharType="end"/>
+            </w:r>
+          </w:hyperlink>
+        </w:p>
+        <w:p>
+          <w:pPr>
+            <w:pStyle w:val="TOC1"/>
+            <w:tabs>
+              <w:tab w:val="left" w:pos="720"/>
+              <w:tab w:val="right" w:leader="dot" w:pos="9350"/>
+            </w:tabs>
+            <w:rPr>
+              <w:rFonts w:ascii="Arial" w:hAnsi="Arial" w:cs="Arial"/>
+              <w:noProof/>
+            </w:rPr>
+          </w:pPr>
+          <w:hyperlink w:anchor="_Toc236855916" w:history="1">
+            <w:r>
+              <w:rPr>
+                <w:rStyle w:val="Hyperlink"/>
+                <w:rFonts w:ascii="Arial" w:hAnsi="Arial" w:cs="Arial"/>
+                <w:b/>
+                <w:noProof/>
+              </w:rPr>
+              <w:t>3.3</w:t>
+            </w:r>
+            <w:r>
+              <w:rPr>
+                <w:rFonts w:ascii="Arial" w:hAnsi="Arial" w:cs="Arial"/>
+                <w:noProof/>
+              </w:rPr>
+              <w:tab/>
+            </w:r>
+            <w:r>
+              <w:rPr>
+                <w:rStyle w:val="Hyperlink"/>
+                <w:rFonts w:ascii="Arial" w:hAnsi="Arial" w:cs="Arial"/>
+                <w:b/>
+                <w:noProof/>
+              </w:rPr>
+              <w:t>The OSI Model as a Global Standard</w:t>
+            </w:r>
+            <w:r>
+              <w:rPr>
+                <w:rFonts w:ascii="Arial" w:hAnsi="Arial" w:cs="Arial"/>
+                <w:noProof/>
+                <w:webHidden/>
+              </w:rPr>
+              <w:tab/>
+            </w:r>
+            <w:r>
+              <w:rPr>
+                <w:rFonts w:ascii="Arial" w:hAnsi="Arial" w:cs="Arial"/>
+                <w:noProof/>
+                <w:webHidden/>
+              </w:rPr>
+              <w:fldChar w:fldCharType="begin"/>
+            </w:r>
+            <w:r>
+              <w:rPr>
+                <w:rFonts w:ascii="Arial" w:hAnsi="Arial" w:cs="Arial"/>
+                <w:noProof/>
+                <w:webHidden/>
+              </w:rPr>
+              <w:instrText xml:space="preserve"> PAGEREF _Toc236855916 \h </w:instrText>
+            </w:r>
+            <w:r>
+              <w:rPr>
+                <w:rFonts w:ascii="Arial" w:hAnsi="Arial" w:cs="Arial"/>
+                <w:noProof/>
+                <w:webHidden/>
+              </w:rPr>
+            </w:r>
+            <w:r>
+              <w:rPr>
+                <w:rFonts w:ascii="Arial" w:hAnsi="Arial" w:cs="Arial"/>
+                <w:noProof/>
+                <w:webHidden/>
+              </w:rPr>
+              <w:fldChar w:fldCharType="separate"/>
+            </w:r>
+            <w:r>
+              <w:rPr>
+                <w:rFonts w:ascii="Arial" w:hAnsi="Arial" w:cs="Arial"/>
+                <w:noProof/>
+                <w:webHidden/>
+              </w:rPr>
+              <w:t>14</w:t>
+            </w:r>
+            <w:r>
+              <w:rPr>
+                <w:rFonts w:ascii="Arial" w:hAnsi="Arial" w:cs="Arial"/>
+                <w:noProof/>
+                <w:webHidden/>
+              </w:rPr>
+              <w:fldChar w:fldCharType="end"/>
+            </w:r>
+          </w:hyperlink>
+        </w:p>
+        <w:p>
+          <w:pPr>
+            <w:pStyle w:val="TOC1"/>
+            <w:tabs>
+              <w:tab w:val="left" w:pos="1200"/>
+              <w:tab w:val="right" w:leader="dot" w:pos="9350"/>
+            </w:tabs>
+            <w:rPr>
+              <w:rFonts w:ascii="Arial" w:hAnsi="Arial" w:cs="Arial"/>
+              <w:noProof/>
+            </w:rPr>
+          </w:pPr>
+          <w:hyperlink w:anchor="_Toc236855917" w:history="1">
+            <w:r>
+              <w:rPr>
+                <w:rStyle w:val="Hyperlink"/>
+                <w:rFonts w:ascii="Arial" w:hAnsi="Arial" w:cs="Arial"/>
+                <w:b/>
+                <w:noProof/>
+              </w:rPr>
+              <w:t>Task 4.0</w:t>
+            </w:r>
+            <w:r>
+              <w:rPr>
+                <w:rFonts w:ascii="Arial" w:hAnsi="Arial" w:cs="Arial"/>
+                <w:noProof/>
+              </w:rPr>
+              <w:tab/>
+            </w:r>
+            <w:r>
+              <w:rPr>
+                <w:rStyle w:val="Hyperlink"/>
+                <w:rFonts w:ascii="Arial" w:hAnsi="Arial" w:cs="Arial"/>
+                <w:b/>
+                <w:noProof/>
+              </w:rPr>
+              <w:t>Future Computing Services</w:t>
+            </w:r>
+            <w:r>
+              <w:rPr>
+                <w:rFonts w:ascii="Arial" w:hAnsi="Arial" w:cs="Arial"/>
+                <w:noProof/>
+                <w:webHidden/>
+              </w:rPr>
+              <w:tab/>
+            </w:r>
+            <w:r>
+              <w:rPr>
+                <w:rFonts w:ascii="Arial" w:hAnsi="Arial" w:cs="Arial"/>
+                <w:noProof/>
+                <w:webHidden/>
+              </w:rPr>
+              <w:fldChar w:fldCharType="begin"/>
+            </w:r>
+            <w:r>
+              <w:rPr>
+                <w:rFonts w:ascii="Arial" w:hAnsi="Arial" w:cs="Arial"/>
+                <w:noProof/>
+                <w:webHidden/>
+              </w:rPr>
+              <w:instrText xml:space="preserve"> PAGEREF _Toc236855917 \h </w:instrText>
+            </w:r>
+            <w:r>
+              <w:rPr>
+                <w:rFonts w:ascii="Arial" w:hAnsi="Arial" w:cs="Arial"/>
+                <w:noProof/>
+                <w:webHidden/>
+              </w:rPr>
+            </w:r>
+            <w:r>
+              <w:rPr>
+                <w:rFonts w:ascii="Arial" w:hAnsi="Arial" w:cs="Arial"/>
+                <w:noProof/>
+                <w:webHidden/>
+              </w:rPr>
+              <w:fldChar w:fldCharType="separate"/>
+            </w:r>
+            <w:r>
+              <w:rPr>
+                <w:rFonts w:ascii="Arial" w:hAnsi="Arial" w:cs="Arial"/>
+                <w:noProof/>
+                <w:webHidden/>
+              </w:rPr>
+              <w:t>17</w:t>
+            </w:r>
+            <w:r>
+              <w:rPr>
+                <w:rFonts w:ascii="Arial" w:hAnsi="Arial" w:cs="Arial"/>
+                <w:noProof/>
+                <w:webHidden/>
+              </w:rPr>
+              <w:fldChar w:fldCharType="end"/>
+            </w:r>
+          </w:hyperlink>
+        </w:p>
+        <w:p>
+          <w:pPr>
+            <w:pStyle w:val="TOC1"/>
+            <w:tabs>
+              <w:tab w:val="left" w:pos="720"/>
+              <w:tab w:val="right" w:leader="dot" w:pos="9350"/>
+            </w:tabs>
+            <w:rPr>
+              <w:rFonts w:ascii="Arial" w:hAnsi="Arial" w:cs="Arial"/>
+              <w:noProof/>
+            </w:rPr>
+          </w:pPr>
+          <w:hyperlink w:anchor="_Toc236855918" w:history="1">
+            <w:r>
+              <w:rPr>
+                <w:rStyle w:val="Hyperlink"/>
+                <w:rFonts w:ascii="Arial" w:hAnsi="Arial" w:cs="Arial"/>
+                <w:b/>
+                <w:noProof/>
+              </w:rPr>
+              <w:t>4.1</w:t>
+            </w:r>
+            <w:r>
+              <w:rPr>
+                <w:rFonts w:ascii="Arial" w:hAnsi="Arial" w:cs="Arial"/>
+                <w:noProof/>
+              </w:rPr>
+              <w:tab/>
+            </w:r>
+            <w:r>
+              <w:rPr>
+                <w:rStyle w:val="Hyperlink"/>
+                <w:rFonts w:ascii="Arial" w:hAnsi="Arial" w:cs="Arial"/>
+                <w:b/>
+                <w:noProof/>
+              </w:rPr>
+              <w:t>Distributed Computing Services</w:t>
+            </w:r>
+            <w:r>
+              <w:rPr>
+                <w:rFonts w:ascii="Arial" w:hAnsi="Arial" w:cs="Arial"/>
+                <w:noProof/>
+                <w:webHidden/>
+              </w:rPr>
+              <w:tab/>
+            </w:r>
+            <w:r>
+              <w:rPr>
+                <w:rFonts w:ascii="Arial" w:hAnsi="Arial" w:cs="Arial"/>
+                <w:noProof/>
+                <w:webHidden/>
+              </w:rPr>
+              <w:fldChar w:fldCharType="begin"/>
+            </w:r>
+            <w:r>
+              <w:rPr>
+                <w:rFonts w:ascii="Arial" w:hAnsi="Arial" w:cs="Arial"/>
+                <w:noProof/>
+                <w:webHidden/>
+              </w:rPr>
+              <w:instrText xml:space="preserve"> PAGEREF _Toc236855918 \h </w:instrText>
+            </w:r>
+            <w:r>
+              <w:rPr>
+                <w:rFonts w:ascii="Arial" w:hAnsi="Arial" w:cs="Arial"/>
+                <w:noProof/>
+                <w:webHidden/>
+              </w:rPr>
+            </w:r>
+            <w:r>
+              <w:rPr>
+                <w:rFonts w:ascii="Arial" w:hAnsi="Arial" w:cs="Arial"/>
+                <w:noProof/>
+                <w:webHidden/>
+              </w:rPr>
+              <w:fldChar w:fldCharType="separate"/>
+            </w:r>
+            <w:r>
+              <w:rPr>
+                <w:rFonts w:ascii="Arial" w:hAnsi="Arial" w:cs="Arial"/>
+                <w:noProof/>
+                <w:webHidden/>
+              </w:rPr>
+              <w:t>17</w:t>
+            </w:r>
+            <w:r>
+              <w:rPr>
+                <w:rFonts w:ascii="Arial" w:hAnsi="Arial" w:cs="Arial"/>
+                <w:noProof/>
+                <w:webHidden/>
+              </w:rPr>
+              <w:fldChar w:fldCharType="end"/>
+            </w:r>
+          </w:hyperlink>
+        </w:p>
+        <w:p>
+          <w:pPr>
+            <w:pStyle w:val="TOC1"/>
+            <w:tabs>
+              <w:tab w:val="left" w:pos="720"/>
+              <w:tab w:val="right" w:leader="dot" w:pos="9350"/>
+            </w:tabs>
+            <w:rPr>
+              <w:rFonts w:ascii="Arial" w:hAnsi="Arial" w:cs="Arial"/>
+              <w:noProof/>
+            </w:rPr>
+          </w:pPr>
+          <w:hyperlink w:anchor="_Toc236855919" w:history="1">
+            <w:r>
+              <w:rPr>
+                <w:rStyle w:val="Hyperlink"/>
+                <w:rFonts w:ascii="Arial" w:hAnsi="Arial" w:cs="Arial"/>
+                <w:b/>
+                <w:noProof/>
+              </w:rPr>
+              <w:t>4.2</w:t>
+            </w:r>
+            <w:r>
+              <w:rPr>
+                <w:rFonts w:ascii="Arial" w:hAnsi="Arial" w:cs="Arial"/>
+                <w:noProof/>
+              </w:rPr>
+              <w:tab/>
+            </w:r>
+            <w:r>
+              <w:rPr>
+                <w:rStyle w:val="Hyperlink"/>
+                <w:rFonts w:ascii="Arial" w:hAnsi="Arial" w:cs="Arial"/>
+                <w:b/>
+                <w:noProof/>
+              </w:rPr>
+              <w:t>Quantum Computing Advancements</w:t>
+            </w:r>
+            <w:r>
+              <w:rPr>
+                <w:rFonts w:ascii="Arial" w:hAnsi="Arial" w:cs="Arial"/>
+                <w:noProof/>
+                <w:webHidden/>
+              </w:rPr>
+              <w:tab/>
+            </w:r>
+            <w:r>
+              <w:rPr>
+                <w:rFonts w:ascii="Arial" w:hAnsi="Arial" w:cs="Arial"/>
+                <w:noProof/>
+                <w:webHidden/>
+              </w:rPr>
+              <w:fldChar w:fldCharType="begin"/>
+            </w:r>
+            <w:r>
+              <w:rPr>
+                <w:rFonts w:ascii="Arial" w:hAnsi="Arial" w:cs="Arial"/>
+                <w:noProof/>
+                <w:webHidden/>
+              </w:rPr>
+              <w:instrText xml:space="preserve"> PAGEREF _Toc236855919 \h </w:instrText>
+            </w:r>
+            <w:r>
+              <w:rPr>
+                <w:rFonts w:ascii="Arial" w:hAnsi="Arial" w:cs="Arial"/>
+                <w:noProof/>
+                <w:webHidden/>
+              </w:rPr>
+            </w:r>
+            <w:r>
+              <w:rPr>
+                <w:rFonts w:ascii="Arial" w:hAnsi="Arial" w:cs="Arial"/>
+                <w:noProof/>
+                <w:webHidden/>
+              </w:rPr>
+              <w:fldChar w:fldCharType="separate"/>
+            </w:r>
+            <w:r>
+              <w:rPr>
+                <w:rFonts w:ascii="Arial" w:hAnsi="Arial" w:cs="Arial"/>
+                <w:noProof/>
+                <w:webHidden/>
+              </w:rPr>
+              <w:t>18</w:t>
+            </w:r>
+            <w:r>
+              <w:rPr>
+                <w:rFonts w:ascii="Arial" w:hAnsi="Arial" w:cs="Arial"/>
+                <w:noProof/>
+                <w:webHidden/>
+              </w:rPr>
+              <w:fldChar w:fldCharType="end"/>
+            </w:r>
+          </w:hyperlink>
+        </w:p>
+        <w:p>
+          <w:pPr>
+            <w:rPr>
+              <w:rFonts w:ascii="Arial" w:hAnsi="Arial" w:cs="Arial"/>
+            </w:rPr>
+          </w:pPr>
+          <w:r>
+            <w:rPr>
+              <w:rFonts w:ascii="Arial" w:hAnsi="Arial" w:cs="Arial"/>
+              <w:b/>
+              <w:bCs/>
+              <w:noProof/>
+            </w:rPr>
+            <w:fldChar w:fldCharType="end"/>
+          </w:r>
+        </w:p>
+      </w:sdtContent>
+    </w:sdt>
+    <w:p>
+      <w:pPr>
+        <w:rPr>
+          <w:rFonts w:ascii="Arial" w:hAnsi="Arial" w:cs="Arial"/>
+        </w:rPr>
+      </w:pPr>
+    </w:p>
+    <w:p>
+      <w:pPr>
+        <w:rPr>
+          <w:rFonts w:ascii="Arial" w:hAnsi="Arial" w:cs="Arial"/>
+        </w:rPr>
+      </w:pPr>
+    </w:p>
+    <w:p>
+      <w:pPr>
+        <w:rPr>
+          <w:rFonts w:ascii="Arial" w:hAnsi="Arial" w:cs="Arial"/>
+        </w:rPr>
+      </w:pPr>
+    </w:p>
+    <w:p>
+      <w:pPr>
+        <w:rPr>
+          <w:rFonts w:ascii="Arial" w:hAnsi="Arial" w:cs="Arial"/>
+        </w:rPr>
+      </w:pPr>
+    </w:p>
+    <w:p>
+      <w:pPr>
+        <w:rPr>
+          <w:rFonts w:ascii="Arial" w:hAnsi="Arial" w:cs="Arial"/>
+        </w:rPr>
+      </w:pPr>
+    </w:p>
+    <w:p>
+      <w:pPr>
+        <w:rPr>
+          <w:rFonts w:ascii="Arial" w:hAnsi="Arial" w:cs="Arial"/>
+        </w:rPr>
+      </w:pPr>
+    </w:p>
+    <w:p>
+      <w:pPr>
+        <w:rPr>
+          <w:rFonts w:ascii="Arial" w:hAnsi="Arial" w:cs="Arial"/>
+        </w:rPr>
+      </w:pPr>
+    </w:p>
+    <w:p>
+      <w:pPr>
+        <w:rPr>
+          <w:rFonts w:ascii="Arial" w:hAnsi="Arial" w:cs="Arial"/>
+        </w:rPr>
+      </w:pPr>
+    </w:p>
+    <w:p>
+      <w:pPr>
+        <w:rPr>
+          <w:rFonts w:ascii="Arial" w:hAnsi="Arial" w:cs="Arial"/>
+        </w:rPr>
+      </w:pPr>
+    </w:p>
+    <w:p>
+      <w:pPr>
+        <w:rPr>
+          <w:rFonts w:ascii="Arial" w:hAnsi="Arial" w:cs="Arial"/>
+        </w:rPr>
+      </w:pPr>
+    </w:p>
+    <w:p>
+      <w:pPr>
+        <w:rPr>
+          <w:rFonts w:ascii="Arial" w:hAnsi="Arial" w:cs="Arial"/>
+        </w:rPr>
+      </w:pPr>
+    </w:p>
+    <w:p>
+      <w:pPr>
+        <w:rPr>
+          <w:rFonts w:ascii="Arial" w:hAnsi="Arial" w:cs="Arial"/>
+        </w:rPr>
+      </w:pPr>
+    </w:p>
+    <w:p>
+      <w:pPr>
+        <w:rPr>
+          <w:rFonts w:ascii="Arial" w:hAnsi="Arial" w:cs="Arial"/>
+        </w:rPr>
+      </w:pPr>
+    </w:p>
     <w:p>
       <w:pPr>
         <w:pStyle w:val="Heading1"/>
@@ -17,6 +2497,7 @@
           <w:szCs w:val="32"/>
         </w:rPr>
       </w:pPr>
+      <w:bookmarkStart w:id="0" w:name="_Toc236855906"/>
       <w:r>
         <w:rPr>
           <w:rFonts w:ascii="Arial" w:hAnsi="Arial" w:cs="Arial"/>
@@ -25,8 +2506,10 @@
           <w:sz w:val="32"/>
           <w:szCs w:val="32"/>
         </w:rPr>
+        <w:lastRenderedPageBreak/>
         <w:t>Introduction</w:t>
       </w:r>
+      <w:bookmarkEnd w:id="0"/>
     </w:p>
     <w:p>
       <w:pPr>
@@ -826,9 +3309,27 @@
         </w:rPr>
       </w:pPr>
     </w:p>
-    <w:p/>
-    <w:p/>
-    <w:p/>
+    <w:p>
+      <w:pPr>
+        <w:rPr>
+          <w:rFonts w:ascii="Arial" w:hAnsi="Arial" w:cs="Arial"/>
+        </w:rPr>
+      </w:pPr>
+    </w:p>
+    <w:p>
+      <w:pPr>
+        <w:rPr>
+          <w:rFonts w:ascii="Arial" w:hAnsi="Arial" w:cs="Arial"/>
+        </w:rPr>
+      </w:pPr>
+    </w:p>
+    <w:p>
+      <w:pPr>
+        <w:rPr>
+          <w:rFonts w:ascii="Arial" w:hAnsi="Arial" w:cs="Arial"/>
+        </w:rPr>
+      </w:pPr>
+    </w:p>
     <w:p>
       <w:pPr>
         <w:rPr>
@@ -849,6 +3350,7 @@
           <w:color w:val="auto"/>
         </w:rPr>
       </w:pPr>
+      <w:bookmarkStart w:id="1" w:name="_Toc236855907"/>
       <w:r>
         <w:rPr>
           <w:rFonts w:ascii="Arial" w:hAnsi="Arial" w:cs="Arial"/>
@@ -867,6 +3369,7 @@
         </w:rPr>
         <w:t>QuantumX</w:t>
       </w:r>
+      <w:bookmarkEnd w:id="1"/>
       <w:proofErr w:type="spellEnd"/>
     </w:p>
     <w:p>
@@ -940,6 +3443,7 @@
           <w:color w:val="auto"/>
         </w:rPr>
       </w:pPr>
+      <w:bookmarkStart w:id="2" w:name="_Toc236855908"/>
       <w:r>
         <w:rPr>
           <w:rFonts w:ascii="Arial" w:hAnsi="Arial" w:cs="Arial"/>
@@ -949,6 +3453,7 @@
         </w:rPr>
         <w:t>Hardware Components and Expansion Options</w:t>
       </w:r>
+      <w:bookmarkEnd w:id="2"/>
     </w:p>
     <w:p>
       <w:pPr>
@@ -1332,13 +3837,7 @@
         <w:rPr>
           <w:rFonts w:ascii="Arial" w:hAnsi="Arial" w:cs="Arial"/>
         </w:rPr>
-        <w:t>-core CPU</w:t>
-      </w:r>
-      <w:r>
-        <w:rPr>
-          <w:rFonts w:ascii="Arial" w:hAnsi="Arial" w:cs="Arial"/>
-        </w:rPr>
-        <w:t>,</w:t>
+        <w:t>-core CPU,</w:t>
       </w:r>
       <w:r>
         <w:rPr>
@@ -1775,13 +4274,7 @@
         <w:rPr>
           <w:rFonts w:ascii="Arial" w:hAnsi="Arial" w:cs="Arial"/>
         </w:rPr>
-        <w:t>high</w:t>
-      </w:r>
-      <w:r>
-        <w:rPr>
-          <w:rFonts w:ascii="Arial" w:hAnsi="Arial" w:cs="Arial"/>
-        </w:rPr>
-        <w:t>-capacity</w:t>
+        <w:t>high-capacity</w:t>
       </w:r>
       <w:r>
         <w:rPr>
@@ -2281,25 +4774,7 @@
         <w:rPr>
           <w:rFonts w:ascii="Arial" w:hAnsi="Arial" w:cs="Arial"/>
         </w:rPr>
-        <w:t xml:space="preserve"> </w:t>
-      </w:r>
-      <w:r>
-        <w:rPr>
-          <w:rFonts w:ascii="Arial" w:hAnsi="Arial" w:cs="Arial"/>
-        </w:rPr>
-        <w:t xml:space="preserve">Microcomputers are based on a microprocessor which integrates the functions of a computer’s Central Processing Unit (CPU) on a single chip. Microcomputers are typically smaller, affordable and are commonly found in homes. </w:t>
-      </w:r>
-      <w:r>
-        <w:rPr>
-          <w:rFonts w:ascii="Arial" w:hAnsi="Arial" w:cs="Arial"/>
-        </w:rPr>
-        <w:t>Microcomputers</w:t>
-      </w:r>
-      <w:r>
-        <w:rPr>
-          <w:rFonts w:ascii="Arial" w:hAnsi="Arial" w:cs="Arial"/>
-        </w:rPr>
-        <w:t xml:space="preserve"> include</w:t>
+        <w:t xml:space="preserve"> Microcomputers are based on a microprocessor which integrates the functions of a computer’s Central Processing Unit (CPU) on a single chip. Microcomputers are typically smaller, affordable and are commonly found in homes. Microcomputers include</w:t>
       </w:r>
       <w:r>
         <w:rPr>
@@ -2395,19 +4870,7 @@
         <w:rPr>
           <w:rFonts w:ascii="Arial" w:hAnsi="Arial" w:cs="Arial"/>
         </w:rPr>
-        <w:t xml:space="preserve"> have high processing power</w:t>
-      </w:r>
-      <w:r>
-        <w:rPr>
-          <w:rFonts w:ascii="Arial" w:hAnsi="Arial" w:cs="Arial"/>
-        </w:rPr>
-        <w:t xml:space="preserve"> than microcomputers</w:t>
-      </w:r>
-      <w:r>
-        <w:rPr>
-          <w:rFonts w:ascii="Arial" w:hAnsi="Arial" w:cs="Arial"/>
-        </w:rPr>
-        <w:t xml:space="preserve"> </w:t>
+        <w:t xml:space="preserve"> have high processing power than microcomputers </w:t>
       </w:r>
       <w:r>
         <w:rPr>
@@ -3136,6 +5599,7 @@
         </w:rPr>
         <w:t xml:space="preserve"> </w:t>
       </w:r>
+      <w:bookmarkStart w:id="3" w:name="_Toc236855909"/>
       <w:r>
         <w:rPr>
           <w:rFonts w:ascii="Arial" w:hAnsi="Arial" w:cs="Arial"/>
@@ -3146,6 +5610,7 @@
         </w:rPr>
         <w:t>Operating System Functionalities and Hardware</w:t>
       </w:r>
+      <w:bookmarkEnd w:id="3"/>
     </w:p>
     <w:p>
       <w:pPr>
@@ -4360,6 +6825,7 @@
           <w:szCs w:val="36"/>
         </w:rPr>
       </w:pPr>
+      <w:bookmarkStart w:id="4" w:name="_Toc236855910"/>
       <w:r>
         <w:rPr>
           <w:rFonts w:ascii="Arial" w:hAnsi="Arial" w:cs="Arial"/>
@@ -4370,19 +6836,9 @@
           <w:szCs w:val="36"/>
         </w:rPr>
         <w:lastRenderedPageBreak/>
-        <w:t xml:space="preserve"> </w:t>
-      </w:r>
-      <w:r>
-        <w:rPr>
-          <w:rFonts w:ascii="Arial" w:hAnsi="Arial" w:cs="Arial"/>
-          <w:b/>
-          <w:bCs/>
-          <w:color w:val="auto"/>
-          <w:sz w:val="36"/>
-          <w:szCs w:val="36"/>
-        </w:rPr>
         <w:t>Software Bundling</w:t>
       </w:r>
+      <w:bookmarkEnd w:id="4"/>
     </w:p>
     <w:p>
       <w:pPr>
@@ -4456,6 +6912,7 @@
         </w:rPr>
         <w:t xml:space="preserve"> </w:t>
       </w:r>
+      <w:bookmarkStart w:id="5" w:name="_Toc236855911"/>
       <w:r>
         <w:rPr>
           <w:rFonts w:ascii="Arial" w:hAnsi="Arial" w:cs="Arial"/>
@@ -4464,7 +6921,18 @@
           <w:sz w:val="32"/>
           <w:szCs w:val="32"/>
         </w:rPr>
-        <w:t xml:space="preserve">Software categories </w:t>
+        <w:t>Software categories</w:t>
+      </w:r>
+      <w:bookmarkEnd w:id="5"/>
+      <w:r>
+        <w:rPr>
+          <w:rFonts w:ascii="Arial" w:hAnsi="Arial" w:cs="Arial"/>
+          <w:b/>
+          <w:color w:val="auto"/>
+          <w:sz w:val="32"/>
+          <w:szCs w:val="32"/>
+        </w:rPr>
+        <w:t xml:space="preserve"> </w:t>
       </w:r>
     </w:p>
     <w:p>
@@ -5234,6 +7702,7 @@
           <w:color w:val="auto"/>
         </w:rPr>
       </w:pPr>
+      <w:bookmarkStart w:id="6" w:name="_Toc236855912"/>
       <w:r>
         <w:rPr>
           <w:rFonts w:ascii="Arial" w:hAnsi="Arial" w:cs="Arial"/>
@@ -5244,6 +7713,7 @@
         </w:rPr>
         <w:t>Development Tools for custom software</w:t>
       </w:r>
+      <w:bookmarkEnd w:id="6"/>
     </w:p>
     <w:p>
       <w:pPr>
@@ -6069,6 +8539,34 @@
     </w:p>
     <w:p>
       <w:pPr>
+        <w:rPr>
+          <w:rFonts w:ascii="Arial" w:hAnsi="Arial" w:cs="Arial"/>
+        </w:rPr>
+      </w:pPr>
+    </w:p>
+    <w:p>
+      <w:pPr>
+        <w:rPr>
+          <w:rFonts w:ascii="Arial" w:hAnsi="Arial" w:cs="Arial"/>
+        </w:rPr>
+      </w:pPr>
+    </w:p>
+    <w:p>
+      <w:pPr>
+        <w:rPr>
+          <w:rFonts w:ascii="Arial" w:hAnsi="Arial" w:cs="Arial"/>
+        </w:rPr>
+      </w:pPr>
+    </w:p>
+    <w:p>
+      <w:pPr>
+        <w:rPr>
+          <w:rFonts w:ascii="Arial" w:hAnsi="Arial" w:cs="Arial"/>
+        </w:rPr>
+      </w:pPr>
+    </w:p>
+    <w:p>
+      <w:pPr>
         <w:pStyle w:val="Heading1"/>
         <w:numPr>
           <w:ilvl w:val="2"/>
@@ -6082,6 +8580,7 @@
           <w:szCs w:val="32"/>
         </w:rPr>
       </w:pPr>
+      <w:bookmarkStart w:id="7" w:name="_Toc236855913"/>
       <w:r>
         <w:rPr>
           <w:rFonts w:ascii="Arial" w:hAnsi="Arial" w:cs="Arial"/>
@@ -6090,8 +8589,10 @@
           <w:sz w:val="32"/>
           <w:szCs w:val="32"/>
         </w:rPr>
+        <w:lastRenderedPageBreak/>
         <w:t>Networking Opportunities</w:t>
       </w:r>
+      <w:bookmarkEnd w:id="7"/>
     </w:p>
     <w:p>
       <w:pPr>
@@ -6191,14 +8692,7 @@
         <w:rPr>
           <w:rFonts w:ascii="Arial" w:hAnsi="Arial" w:cs="Arial"/>
         </w:rPr>
-        <w:t xml:space="preserve">. This section explains the networking configurations, </w:t>
-      </w:r>
-      <w:r>
-        <w:rPr>
-          <w:rFonts w:ascii="Arial" w:hAnsi="Arial" w:cs="Arial"/>
-        </w:rPr>
-        <w:lastRenderedPageBreak/>
-        <w:t>protocols, standards and equipment required as the part of the move to offer networking installation services.</w:t>
+        <w:t>. This section explains the networking configurations, protocols, standards and equipment required as the part of the move to offer networking installation services.</w:t>
       </w:r>
     </w:p>
     <w:p>
@@ -6216,6 +8710,7 @@
           <w:szCs w:val="32"/>
         </w:rPr>
       </w:pPr>
+      <w:bookmarkStart w:id="8" w:name="_Toc236855914"/>
       <w:r>
         <w:rPr>
           <w:rFonts w:ascii="Arial" w:hAnsi="Arial" w:cs="Arial"/>
@@ -6226,6 +8721,7 @@
         </w:rPr>
         <w:t>Networking Configurations</w:t>
       </w:r>
+      <w:bookmarkEnd w:id="8"/>
     </w:p>
     <w:p>
       <w:pPr>
@@ -6681,6 +9177,7 @@
           <w:rFonts w:ascii="Arial" w:hAnsi="Arial" w:cs="Arial"/>
           <w:bCs/>
         </w:rPr>
+        <w:lastRenderedPageBreak/>
         <w:t>The main difference between the</w:t>
       </w:r>
       <w:r>
@@ -6718,7 +9215,6 @@
           <w:rFonts w:ascii="Arial" w:hAnsi="Arial" w:cs="Arial"/>
           <w:bCs/>
         </w:rPr>
-        <w:lastRenderedPageBreak/>
         <w:t xml:space="preserve">For </w:t>
       </w:r>
       <w:proofErr w:type="spellStart"/>
@@ -6773,6 +9269,9 @@
         <w:t>, reliable and simple to maintain and scale. In star topology if one node fails, the rest of the network continues to operate normally. This means businesses can continue operating without disruptions.</w:t>
       </w:r>
       <w:r>
+        <w:rPr>
+          <w:rFonts w:ascii="Arial" w:hAnsi="Arial" w:cs="Arial"/>
+        </w:rPr>
         <w:t xml:space="preserve"> </w:t>
       </w:r>
       <w:r>
@@ -6808,6 +9307,7 @@
         </w:rPr>
         <w:t xml:space="preserve"> </w:t>
       </w:r>
+      <w:bookmarkStart w:id="9" w:name="_Toc236855915"/>
       <w:r>
         <w:rPr>
           <w:rFonts w:ascii="Arial" w:hAnsi="Arial" w:cs="Arial"/>
@@ -6828,6 +9328,7 @@
         </w:rPr>
         <w:t>Networking Topologies</w:t>
       </w:r>
+      <w:bookmarkEnd w:id="9"/>
     </w:p>
     <w:p>
       <w:pPr>
@@ -7090,6 +9591,7 @@
           <w:sz w:val="28"/>
           <w:szCs w:val="28"/>
         </w:rPr>
+        <w:lastRenderedPageBreak/>
         <w:t>Tree</w:t>
       </w:r>
       <w:r>
@@ -7148,14 +9650,7 @@
         <w:rPr>
           <w:rFonts w:ascii="Arial" w:hAnsi="Arial" w:cs="Arial"/>
         </w:rPr>
-        <w:t xml:space="preserve">Tree topology allows more devices to be attached to a </w:t>
-      </w:r>
-      <w:r>
-        <w:rPr>
-          <w:rFonts w:ascii="Arial" w:hAnsi="Arial" w:cs="Arial"/>
-        </w:rPr>
-        <w:lastRenderedPageBreak/>
-        <w:t>single central hub which reduces the distance travelled by the signal to come to the devices and it</w:t>
+        <w:t>Tree topology allows more devices to be attached to a single central hub which reduces the distance travelled by the signal to come to the devices and it</w:t>
       </w:r>
       <w:r>
         <w:rPr>
@@ -7230,14 +9725,18 @@
         </w:rPr>
         <w:t xml:space="preserve"> Hybrid technologies are free to take any form. Hybrid technologies are flexible and can easily been expanded by adding new devices. Therefore, </w:t>
       </w:r>
-      <w:proofErr w:type="gramStart"/>
-      <w:r>
-        <w:rPr>
-          <w:rFonts w:ascii="Arial" w:hAnsi="Arial" w:cs="Arial"/>
-        </w:rPr>
-        <w:t>It</w:t>
-      </w:r>
-      <w:proofErr w:type="gramEnd"/>
+      <w:r>
+        <w:rPr>
+          <w:rFonts w:ascii="Arial" w:hAnsi="Arial" w:cs="Arial"/>
+        </w:rPr>
+        <w:t>i</w:t>
+      </w:r>
+      <w:r>
+        <w:rPr>
+          <w:rFonts w:ascii="Arial" w:hAnsi="Arial" w:cs="Arial"/>
+        </w:rPr>
+        <w:t>t</w:t>
+      </w:r>
       <w:r>
         <w:rPr>
           <w:rFonts w:ascii="Arial" w:hAnsi="Arial" w:cs="Arial"/>
@@ -7287,25 +9786,7 @@
           <w:sz w:val="28"/>
           <w:szCs w:val="28"/>
         </w:rPr>
-        <w:t>P</w:t>
-      </w:r>
-      <w:r>
-        <w:rPr>
-          <w:rFonts w:ascii="Arial" w:hAnsi="Arial" w:cs="Arial"/>
-          <w:b/>
-          <w:sz w:val="28"/>
-          <w:szCs w:val="28"/>
-        </w:rPr>
-        <w:t>h</w:t>
-      </w:r>
-      <w:r>
-        <w:rPr>
-          <w:rFonts w:ascii="Arial" w:hAnsi="Arial" w:cs="Arial"/>
-          <w:b/>
-          <w:sz w:val="28"/>
-          <w:szCs w:val="28"/>
-        </w:rPr>
-        <w:t>ysical Networking Equipment Required</w:t>
+        <w:t>Physical Networking Equipment Required</w:t>
       </w:r>
     </w:p>
     <w:p>
@@ -7540,6 +10021,7 @@
           <w:szCs w:val="32"/>
         </w:rPr>
       </w:pPr>
+      <w:bookmarkStart w:id="10" w:name="_Toc236855916"/>
       <w:r>
         <w:rPr>
           <w:rFonts w:ascii="Arial" w:hAnsi="Arial" w:cs="Arial"/>
@@ -7550,6 +10032,7 @@
         </w:rPr>
         <w:t>The OSI Model as a Global Standard</w:t>
       </w:r>
+      <w:bookmarkEnd w:id="10"/>
     </w:p>
     <w:p>
       <w:pPr>
@@ -7642,6 +10125,7 @@
         <w:rPr>
           <w:rFonts w:ascii="Arial" w:hAnsi="Arial" w:cs="Arial"/>
         </w:rPr>
+        <w:lastRenderedPageBreak/>
         <w:t xml:space="preserve">This is the </w:t>
       </w:r>
       <w:r>
@@ -7691,7 +10175,6 @@
         <w:rPr>
           <w:rFonts w:ascii="Arial" w:hAnsi="Arial" w:cs="Arial"/>
         </w:rPr>
-        <w:lastRenderedPageBreak/>
         <w:t>This is the second layer in the OSI Model. It ensured that data Is transferred accurately between devices connected to same local network.</w:t>
       </w:r>
       <w:r>
@@ -7909,6 +10392,7 @@
         <w:rPr>
           <w:rFonts w:ascii="Arial" w:hAnsi="Arial" w:cs="Arial"/>
         </w:rPr>
+        <w:lastRenderedPageBreak/>
         <w:t>The sixth layer of the OSI model is the presentation layer. This layer is responsible for translating data into a format that both communicating devices can understand. It also performs functions such as data encryption, compression and decryption. This ensures that information remains secure du</w:t>
       </w:r>
       <w:r>
@@ -7988,7 +10472,6 @@
         <w:rPr>
           <w:rFonts w:ascii="Arial" w:hAnsi="Arial" w:cs="Arial"/>
         </w:rPr>
-        <w:lastRenderedPageBreak/>
         <w:t>The application layer, the seventh layer is the layer closest layer to the user. It provides services directly to software application such as web browsers, file transfer programs and cloud applications. Common protocols operating at this protocol include HTTP, HTTPS and DNS. These protocols</w:t>
       </w:r>
       <w:r>
@@ -8074,62 +10557,27 @@
     </w:p>
     <w:p>
       <w:pPr>
-        <w:pStyle w:val="ListParagraph"/>
-        <w:ind w:left="1080"/>
-        <w:rPr>
-          <w:rFonts w:ascii="Arial" w:hAnsi="Arial" w:cs="Arial"/>
-        </w:rPr>
-      </w:pPr>
-    </w:p>
-    <w:p>
-      <w:pPr>
-        <w:pStyle w:val="ListParagraph"/>
-        <w:ind w:left="1080"/>
-        <w:rPr>
-          <w:rFonts w:ascii="Arial" w:hAnsi="Arial" w:cs="Arial"/>
-        </w:rPr>
-      </w:pPr>
-    </w:p>
-    <w:p>
-      <w:pPr>
-        <w:pStyle w:val="ListParagraph"/>
-        <w:ind w:left="1080"/>
-        <w:rPr>
-          <w:rFonts w:ascii="Arial" w:hAnsi="Arial" w:cs="Arial"/>
-        </w:rPr>
-      </w:pPr>
-    </w:p>
-    <w:p>
-      <w:pPr>
-        <w:pStyle w:val="ListParagraph"/>
-        <w:ind w:left="1080"/>
-        <w:rPr>
-          <w:rFonts w:ascii="Arial" w:hAnsi="Arial" w:cs="Arial"/>
-        </w:rPr>
-      </w:pPr>
-    </w:p>
-    <w:p>
-      <w:pPr>
-        <w:pStyle w:val="ListParagraph"/>
-        <w:ind w:left="1080"/>
-        <w:rPr>
-          <w:rFonts w:ascii="Arial" w:hAnsi="Arial" w:cs="Arial"/>
-        </w:rPr>
-      </w:pPr>
-    </w:p>
-    <w:p>
-      <w:pPr>
-        <w:pStyle w:val="ListParagraph"/>
-        <w:ind w:left="1080"/>
-        <w:rPr>
-          <w:rFonts w:ascii="Arial" w:hAnsi="Arial" w:cs="Arial"/>
-        </w:rPr>
-      </w:pPr>
-    </w:p>
-    <w:p>
-      <w:pPr>
-        <w:pStyle w:val="ListParagraph"/>
-        <w:ind w:left="1080"/>
+        <w:rPr>
+          <w:rFonts w:ascii="Arial" w:hAnsi="Arial" w:cs="Arial"/>
+        </w:rPr>
+      </w:pPr>
+    </w:p>
+    <w:p>
+      <w:pPr>
+        <w:rPr>
+          <w:rFonts w:ascii="Arial" w:hAnsi="Arial" w:cs="Arial"/>
+        </w:rPr>
+      </w:pPr>
+    </w:p>
+    <w:p>
+      <w:pPr>
+        <w:rPr>
+          <w:rFonts w:ascii="Arial" w:hAnsi="Arial" w:cs="Arial"/>
+        </w:rPr>
+      </w:pPr>
+    </w:p>
+    <w:p>
+      <w:pPr>
         <w:rPr>
           <w:rFonts w:ascii="Arial" w:hAnsi="Arial" w:cs="Arial"/>
         </w:rPr>
@@ -8171,6 +10619,7 @@
           <w:szCs w:val="32"/>
         </w:rPr>
       </w:pPr>
+      <w:bookmarkStart w:id="11" w:name="_Toc236855917"/>
       <w:r>
         <w:rPr>
           <w:rFonts w:ascii="Arial" w:hAnsi="Arial" w:cs="Arial"/>
@@ -8179,8 +10628,10 @@
           <w:sz w:val="32"/>
           <w:szCs w:val="32"/>
         </w:rPr>
+        <w:lastRenderedPageBreak/>
         <w:t>Future Computing Services</w:t>
       </w:r>
+      <w:bookmarkEnd w:id="11"/>
     </w:p>
     <w:p>
       <w:pPr>
@@ -8302,9 +10753,20 @@
           <w:sz w:val="32"/>
           <w:szCs w:val="32"/>
         </w:rPr>
-        <w:lastRenderedPageBreak/>
-        <w:t xml:space="preserve"> Distributed Computing Services</w:t>
-      </w:r>
+        <w:t xml:space="preserve"> </w:t>
+      </w:r>
+      <w:bookmarkStart w:id="12" w:name="_Toc236855918"/>
+      <w:r>
+        <w:rPr>
+          <w:rFonts w:ascii="Arial" w:hAnsi="Arial" w:cs="Arial"/>
+          <w:b/>
+          <w:color w:val="auto"/>
+          <w:sz w:val="32"/>
+          <w:szCs w:val="32"/>
+        </w:rPr>
+        <w:t>Distributed Computing Services</w:t>
+      </w:r>
+      <w:bookmarkEnd w:id="12"/>
     </w:p>
     <w:p>
       <w:pPr>
@@ -8352,15 +10814,7 @@
               <w:noProof/>
               <w:lang w:val="en-GB"/>
             </w:rPr>
-            <w:t xml:space="preserve"> </w:t>
-          </w:r>
-          <w:r>
-            <w:rPr>
-              <w:rFonts w:ascii="Arial" w:hAnsi="Arial" w:cs="Arial"/>
-              <w:noProof/>
-              <w:lang w:val="en-GB"/>
-            </w:rPr>
-            <w:t>(GeeksforGeeks, 2025)</w:t>
+            <w:t xml:space="preserve"> (GeeksforGeeks, 2025)</w:t>
           </w:r>
           <w:r>
             <w:rPr>
@@ -8762,6 +11216,7 @@
         <w:rPr>
           <w:rFonts w:ascii="Arial" w:hAnsi="Arial" w:cs="Arial"/>
         </w:rPr>
+        <w:lastRenderedPageBreak/>
         <w:t>Scalability means the ability for a system to add more nodes to a network without replacing the existing infrastructure. This benefits Big Data startups as they can seamlessly increase their storage and processing capacity as their data volumes expands.</w:t>
       </w:r>
     </w:p>
@@ -8806,7 +11261,6 @@
         <w:rPr>
           <w:rFonts w:ascii="Arial" w:hAnsi="Arial" w:cs="Arial"/>
         </w:rPr>
-        <w:lastRenderedPageBreak/>
         <w:t xml:space="preserve">Fault tolerance means the ability of the system to keep running even if there is a fault occurring in the system, preventing total </w:t>
       </w:r>
       <w:r>
@@ -8888,6 +11342,7 @@
           <w:szCs w:val="32"/>
         </w:rPr>
       </w:pPr>
+      <w:bookmarkStart w:id="13" w:name="_Toc236855919"/>
       <w:r>
         <w:rPr>
           <w:rFonts w:ascii="Arial" w:hAnsi="Arial" w:cs="Arial"/>
@@ -8898,6 +11353,7 @@
         </w:rPr>
         <w:t>Quantum Computing Advancements</w:t>
       </w:r>
+      <w:bookmarkEnd w:id="13"/>
     </w:p>
     <w:p>
       <w:pPr>
@@ -9203,6 +11659,7 @@
         <w:rPr>
           <w:rFonts w:ascii="Arial" w:hAnsi="Arial" w:cs="Arial"/>
         </w:rPr>
+        <w:lastRenderedPageBreak/>
         <w:t xml:space="preserve">Due to superposition. </w:t>
       </w:r>
       <w:r>
@@ -9265,7 +11722,6 @@
         <w:rPr>
           <w:rFonts w:ascii="Arial" w:hAnsi="Arial" w:cs="Arial"/>
         </w:rPr>
-        <w:lastRenderedPageBreak/>
         <w:t xml:space="preserve">Quantum computers can find the absolute best solution among millions of variables. This is </w:t>
       </w:r>
       <w:r>
@@ -9458,7 +11914,1368 @@
         <w:t>.</w:t>
       </w:r>
     </w:p>
+    <w:p>
+      <w:pPr>
+        <w:tabs>
+          <w:tab w:val="left" w:pos="5613"/>
+        </w:tabs>
+        <w:rPr>
+          <w:rFonts w:ascii="Arial" w:hAnsi="Arial" w:cs="Arial"/>
+        </w:rPr>
+      </w:pPr>
+    </w:p>
+    <w:p>
+      <w:pPr>
+        <w:tabs>
+          <w:tab w:val="left" w:pos="5613"/>
+        </w:tabs>
+        <w:rPr>
+          <w:rFonts w:ascii="Arial" w:hAnsi="Arial" w:cs="Arial"/>
+        </w:rPr>
+      </w:pPr>
+    </w:p>
+    <w:p>
+      <w:pPr>
+        <w:tabs>
+          <w:tab w:val="left" w:pos="5613"/>
+        </w:tabs>
+        <w:rPr>
+          <w:rFonts w:ascii="Arial" w:hAnsi="Arial" w:cs="Arial"/>
+        </w:rPr>
+      </w:pPr>
+    </w:p>
+    <w:p>
+      <w:pPr>
+        <w:tabs>
+          <w:tab w:val="left" w:pos="5613"/>
+        </w:tabs>
+        <w:rPr>
+          <w:rFonts w:ascii="Arial" w:hAnsi="Arial" w:cs="Arial"/>
+        </w:rPr>
+      </w:pPr>
+    </w:p>
+    <w:p>
+      <w:pPr>
+        <w:tabs>
+          <w:tab w:val="left" w:pos="5613"/>
+        </w:tabs>
+        <w:rPr>
+          <w:rFonts w:ascii="Arial" w:hAnsi="Arial" w:cs="Arial"/>
+        </w:rPr>
+      </w:pPr>
+    </w:p>
+    <w:p>
+      <w:pPr>
+        <w:tabs>
+          <w:tab w:val="left" w:pos="5613"/>
+        </w:tabs>
+        <w:rPr>
+          <w:rFonts w:ascii="Arial" w:hAnsi="Arial" w:cs="Arial"/>
+        </w:rPr>
+      </w:pPr>
+    </w:p>
+    <w:p>
+      <w:pPr>
+        <w:tabs>
+          <w:tab w:val="left" w:pos="5613"/>
+        </w:tabs>
+        <w:rPr>
+          <w:rFonts w:ascii="Arial" w:hAnsi="Arial" w:cs="Arial"/>
+        </w:rPr>
+      </w:pPr>
+    </w:p>
+    <w:p>
+      <w:pPr>
+        <w:tabs>
+          <w:tab w:val="left" w:pos="5613"/>
+        </w:tabs>
+        <w:rPr>
+          <w:rFonts w:ascii="Arial" w:hAnsi="Arial" w:cs="Arial"/>
+        </w:rPr>
+      </w:pPr>
+    </w:p>
+    <w:p>
+      <w:pPr>
+        <w:tabs>
+          <w:tab w:val="left" w:pos="5613"/>
+        </w:tabs>
+        <w:rPr>
+          <w:rFonts w:ascii="Arial" w:hAnsi="Arial" w:cs="Arial"/>
+        </w:rPr>
+      </w:pPr>
+    </w:p>
+    <w:p>
+      <w:pPr>
+        <w:tabs>
+          <w:tab w:val="left" w:pos="5613"/>
+        </w:tabs>
+        <w:rPr>
+          <w:rFonts w:ascii="Arial" w:hAnsi="Arial" w:cs="Arial"/>
+        </w:rPr>
+      </w:pPr>
+    </w:p>
+    <w:p>
+      <w:pPr>
+        <w:tabs>
+          <w:tab w:val="left" w:pos="5613"/>
+        </w:tabs>
+        <w:rPr>
+          <w:rFonts w:ascii="Arial" w:hAnsi="Arial" w:cs="Arial"/>
+        </w:rPr>
+      </w:pPr>
+    </w:p>
+    <w:p>
+      <w:pPr>
+        <w:tabs>
+          <w:tab w:val="left" w:pos="5613"/>
+        </w:tabs>
+        <w:rPr>
+          <w:rFonts w:ascii="Arial" w:hAnsi="Arial" w:cs="Arial"/>
+        </w:rPr>
+      </w:pPr>
+    </w:p>
+    <w:p>
+      <w:pPr>
+        <w:tabs>
+          <w:tab w:val="left" w:pos="5613"/>
+        </w:tabs>
+        <w:rPr>
+          <w:rFonts w:ascii="Arial" w:hAnsi="Arial" w:cs="Arial"/>
+        </w:rPr>
+      </w:pPr>
+    </w:p>
+    <w:p>
+      <w:pPr>
+        <w:tabs>
+          <w:tab w:val="left" w:pos="5613"/>
+        </w:tabs>
+        <w:rPr>
+          <w:rFonts w:ascii="Arial" w:hAnsi="Arial" w:cs="Arial"/>
+        </w:rPr>
+      </w:pPr>
+    </w:p>
+    <w:sdt>
+      <w:sdtPr>
+        <w:rPr>
+          <w:rFonts w:ascii="Arial" w:eastAsiaTheme="minorHAnsi" w:hAnsi="Arial" w:cs="Arial"/>
+          <w:color w:val="auto"/>
+          <w:sz w:val="24"/>
+          <w:szCs w:val="24"/>
+        </w:rPr>
+        <w:id w:val="-1970971791"/>
+        <w:docPartObj>
+          <w:docPartGallery w:val="Bibliographies"/>
+          <w:docPartUnique/>
+        </w:docPartObj>
+      </w:sdtPr>
+      <w:sdtContent>
+        <w:p>
+          <w:pPr>
+            <w:pStyle w:val="Heading1"/>
+            <w:numPr>
+              <w:ilvl w:val="0"/>
+              <w:numId w:val="0"/>
+            </w:numPr>
+            <w:ind w:left="432"/>
+            <w:rPr>
+              <w:rFonts w:ascii="Arial" w:hAnsi="Arial" w:cs="Arial"/>
+              <w:b/>
+              <w:color w:val="auto"/>
+            </w:rPr>
+          </w:pPr>
+          <w:r>
+            <w:rPr>
+              <w:rFonts w:ascii="Arial" w:hAnsi="Arial" w:cs="Arial"/>
+              <w:b/>
+              <w:color w:val="auto"/>
+            </w:rPr>
+            <w:t>References</w:t>
+          </w:r>
+        </w:p>
+        <w:sdt>
+          <w:sdtPr>
+            <w:rPr>
+              <w:rFonts w:ascii="Arial" w:hAnsi="Arial" w:cs="Arial"/>
+            </w:rPr>
+            <w:id w:val="-573587230"/>
+            <w:bibliography/>
+          </w:sdtPr>
+          <w:sdtContent>
+            <w:p>
+              <w:pPr>
+                <w:pStyle w:val="Bibliography"/>
+                <w:rPr>
+                  <w:rFonts w:ascii="Arial" w:hAnsi="Arial" w:cs="Arial"/>
+                  <w:noProof/>
+                  <w:kern w:val="0"/>
+                  <w14:ligatures w14:val="none"/>
+                </w:rPr>
+              </w:pPr>
+              <w:r>
+                <w:rPr>
+                  <w:rFonts w:ascii="Arial" w:hAnsi="Arial" w:cs="Arial"/>
+                </w:rPr>
+                <w:fldChar w:fldCharType="begin"/>
+              </w:r>
+              <w:r>
+                <w:rPr>
+                  <w:rFonts w:ascii="Arial" w:hAnsi="Arial" w:cs="Arial"/>
+                </w:rPr>
+                <w:instrText xml:space="preserve"> BIBLIOGRAPHY </w:instrText>
+              </w:r>
+              <w:r>
+                <w:rPr>
+                  <w:rFonts w:ascii="Arial" w:hAnsi="Arial" w:cs="Arial"/>
+                </w:rPr>
+                <w:fldChar w:fldCharType="separate"/>
+              </w:r>
+              <w:r>
+                <w:rPr>
+                  <w:rFonts w:ascii="Arial" w:hAnsi="Arial" w:cs="Arial"/>
+                  <w:noProof/>
+                </w:rPr>
+                <w:t xml:space="preserve">Atlassian, 2026. </w:t>
+              </w:r>
+              <w:r>
+                <w:rPr>
+                  <w:rFonts w:ascii="Arial" w:hAnsi="Arial" w:cs="Arial"/>
+                  <w:i/>
+                  <w:iCs/>
+                  <w:noProof/>
+                </w:rPr>
+                <w:t xml:space="preserve">Atlassian. </w:t>
+              </w:r>
+              <w:r>
+                <w:rPr>
+                  <w:rFonts w:ascii="Arial" w:hAnsi="Arial" w:cs="Arial"/>
+                  <w:noProof/>
+                </w:rPr>
+                <w:t xml:space="preserve">[Online] </w:t>
+              </w:r>
+              <w:r>
+                <w:rPr>
+                  <w:rFonts w:ascii="Arial" w:hAnsi="Arial" w:cs="Arial"/>
+                  <w:noProof/>
+                </w:rPr>
+                <w:br/>
+                <w:t xml:space="preserve">Available at: </w:t>
+              </w:r>
+              <w:r>
+                <w:rPr>
+                  <w:rFonts w:ascii="Arial" w:hAnsi="Arial" w:cs="Arial"/>
+                  <w:noProof/>
+                  <w:u w:val="single"/>
+                </w:rPr>
+                <w:t>https://www.atlassian.com/git/tutorials/what-is-version-control</w:t>
+              </w:r>
+              <w:r>
+                <w:rPr>
+                  <w:rFonts w:ascii="Arial" w:hAnsi="Arial" w:cs="Arial"/>
+                  <w:noProof/>
+                </w:rPr>
+                <w:br/>
+                <w:t>[Accessed 4 July 2026].</w:t>
+              </w:r>
+            </w:p>
+            <w:p>
+              <w:pPr>
+                <w:pStyle w:val="Bibliography"/>
+                <w:rPr>
+                  <w:rFonts w:ascii="Arial" w:hAnsi="Arial" w:cs="Arial"/>
+                  <w:noProof/>
+                </w:rPr>
+              </w:pPr>
+              <w:r>
+                <w:rPr>
+                  <w:rFonts w:ascii="Arial" w:hAnsi="Arial" w:cs="Arial"/>
+                  <w:noProof/>
+                </w:rPr>
+                <w:t xml:space="preserve">Commerce Engine, 2026. </w:t>
+              </w:r>
+              <w:r>
+                <w:rPr>
+                  <w:rFonts w:ascii="Arial" w:hAnsi="Arial" w:cs="Arial"/>
+                  <w:i/>
+                  <w:iCs/>
+                  <w:noProof/>
+                </w:rPr>
+                <w:t xml:space="preserve">Commerce Engine. </w:t>
+              </w:r>
+              <w:r>
+                <w:rPr>
+                  <w:rFonts w:ascii="Arial" w:hAnsi="Arial" w:cs="Arial"/>
+                  <w:noProof/>
+                </w:rPr>
+                <w:t xml:space="preserve">[Online] </w:t>
+              </w:r>
+              <w:r>
+                <w:rPr>
+                  <w:rFonts w:ascii="Arial" w:hAnsi="Arial" w:cs="Arial"/>
+                  <w:noProof/>
+                </w:rPr>
+                <w:br/>
+                <w:t xml:space="preserve">Available at: </w:t>
+              </w:r>
+              <w:r>
+                <w:rPr>
+                  <w:rFonts w:ascii="Arial" w:hAnsi="Arial" w:cs="Arial"/>
+                  <w:noProof/>
+                  <w:u w:val="single"/>
+                </w:rPr>
+                <w:t>https://www.commercengine.io/blog/star-topology</w:t>
+              </w:r>
+              <w:r>
+                <w:rPr>
+                  <w:rFonts w:ascii="Arial" w:hAnsi="Arial" w:cs="Arial"/>
+                  <w:noProof/>
+                </w:rPr>
+                <w:br/>
+                <w:t>[Accessed 29 July 2026].</w:t>
+              </w:r>
+            </w:p>
+            <w:p>
+              <w:pPr>
+                <w:pStyle w:val="Bibliography"/>
+                <w:rPr>
+                  <w:rFonts w:ascii="Arial" w:hAnsi="Arial" w:cs="Arial"/>
+                  <w:noProof/>
+                </w:rPr>
+              </w:pPr>
+              <w:r>
+                <w:rPr>
+                  <w:rFonts w:ascii="Arial" w:hAnsi="Arial" w:cs="Arial"/>
+                  <w:noProof/>
+                </w:rPr>
+                <w:t xml:space="preserve">COMPUTER PERFOMANCE, 2025. </w:t>
+              </w:r>
+              <w:r>
+                <w:rPr>
+                  <w:rFonts w:ascii="Arial" w:hAnsi="Arial" w:cs="Arial"/>
+                  <w:i/>
+                  <w:iCs/>
+                  <w:noProof/>
+                </w:rPr>
+                <w:t xml:space="preserve">computerperfomance. </w:t>
+              </w:r>
+              <w:r>
+                <w:rPr>
+                  <w:rFonts w:ascii="Arial" w:hAnsi="Arial" w:cs="Arial"/>
+                  <w:noProof/>
+                </w:rPr>
+                <w:t xml:space="preserve">[Online] </w:t>
+              </w:r>
+              <w:r>
+                <w:rPr>
+                  <w:rFonts w:ascii="Arial" w:hAnsi="Arial" w:cs="Arial"/>
+                  <w:noProof/>
+                </w:rPr>
+                <w:br/>
+                <w:t xml:space="preserve">Available at: </w:t>
+              </w:r>
+              <w:r>
+                <w:rPr>
+                  <w:rFonts w:ascii="Arial" w:hAnsi="Arial" w:cs="Arial"/>
+                  <w:noProof/>
+                  <w:u w:val="single"/>
+                </w:rPr>
+                <w:t>https://www.computerperformance.org/understanding-cpu-cores-the-heart-of-modern-computing/</w:t>
+              </w:r>
+              <w:r>
+                <w:rPr>
+                  <w:rFonts w:ascii="Arial" w:hAnsi="Arial" w:cs="Arial"/>
+                  <w:noProof/>
+                </w:rPr>
+                <w:br/>
+                <w:t>[Accessed 23 July 2026].</w:t>
+              </w:r>
+            </w:p>
+            <w:p>
+              <w:pPr>
+                <w:pStyle w:val="Bibliography"/>
+                <w:rPr>
+                  <w:rFonts w:ascii="Arial" w:hAnsi="Arial" w:cs="Arial"/>
+                  <w:noProof/>
+                </w:rPr>
+              </w:pPr>
+              <w:r>
+                <w:rPr>
+                  <w:rFonts w:ascii="Arial" w:hAnsi="Arial" w:cs="Arial"/>
+                  <w:noProof/>
+                </w:rPr>
+                <w:t xml:space="preserve">Ellery, M., 2025. </w:t>
+              </w:r>
+              <w:r>
+                <w:rPr>
+                  <w:rFonts w:ascii="Arial" w:hAnsi="Arial" w:cs="Arial"/>
+                  <w:i/>
+                  <w:iCs/>
+                  <w:noProof/>
+                </w:rPr>
+                <w:t xml:space="preserve">serverpipline.com. </w:t>
+              </w:r>
+              <w:r>
+                <w:rPr>
+                  <w:rFonts w:ascii="Arial" w:hAnsi="Arial" w:cs="Arial"/>
+                  <w:noProof/>
+                </w:rPr>
+                <w:t xml:space="preserve">[Online] </w:t>
+              </w:r>
+              <w:r>
+                <w:rPr>
+                  <w:rFonts w:ascii="Arial" w:hAnsi="Arial" w:cs="Arial"/>
+                  <w:noProof/>
+                </w:rPr>
+                <w:br/>
+                <w:t xml:space="preserve">Available at: </w:t>
+              </w:r>
+              <w:r>
+                <w:rPr>
+                  <w:rFonts w:ascii="Arial" w:hAnsi="Arial" w:cs="Arial"/>
+                  <w:noProof/>
+                  <w:u w:val="single"/>
+                </w:rPr>
+                <w:t>https://serverpipeline.com/network-infrastructure-services-components-design-considerations-and-maintenance-strategies/</w:t>
+              </w:r>
+              <w:r>
+                <w:rPr>
+                  <w:rFonts w:ascii="Arial" w:hAnsi="Arial" w:cs="Arial"/>
+                  <w:noProof/>
+                </w:rPr>
+                <w:br/>
+                <w:t>[Accessed 24 July 2026].</w:t>
+              </w:r>
+            </w:p>
+            <w:p>
+              <w:pPr>
+                <w:pStyle w:val="Bibliography"/>
+                <w:rPr>
+                  <w:rFonts w:ascii="Arial" w:hAnsi="Arial" w:cs="Arial"/>
+                  <w:noProof/>
+                </w:rPr>
+              </w:pPr>
+              <w:r>
+                <w:rPr>
+                  <w:rFonts w:ascii="Arial" w:hAnsi="Arial" w:cs="Arial"/>
+                  <w:noProof/>
+                </w:rPr>
+                <w:t xml:space="preserve">FreeCodeCamp, 2020. </w:t>
+              </w:r>
+              <w:r>
+                <w:rPr>
+                  <w:rFonts w:ascii="Arial" w:hAnsi="Arial" w:cs="Arial"/>
+                  <w:i/>
+                  <w:iCs/>
+                  <w:noProof/>
+                </w:rPr>
+                <w:t xml:space="preserve">FreeCodeCamp. </w:t>
+              </w:r>
+              <w:r>
+                <w:rPr>
+                  <w:rFonts w:ascii="Arial" w:hAnsi="Arial" w:cs="Arial"/>
+                  <w:noProof/>
+                </w:rPr>
+                <w:t xml:space="preserve">[Online] </w:t>
+              </w:r>
+              <w:r>
+                <w:rPr>
+                  <w:rFonts w:ascii="Arial" w:hAnsi="Arial" w:cs="Arial"/>
+                  <w:noProof/>
+                </w:rPr>
+                <w:br/>
+                <w:t xml:space="preserve">Available at: </w:t>
+              </w:r>
+              <w:r>
+                <w:rPr>
+                  <w:rFonts w:ascii="Arial" w:hAnsi="Arial" w:cs="Arial"/>
+                  <w:noProof/>
+                  <w:u w:val="single"/>
+                </w:rPr>
+                <w:t>https://www.freecodecamp.org/news/compiled-versus-interpreted-languages/</w:t>
+              </w:r>
+              <w:r>
+                <w:rPr>
+                  <w:rFonts w:ascii="Arial" w:hAnsi="Arial" w:cs="Arial"/>
+                  <w:noProof/>
+                </w:rPr>
+                <w:br/>
+                <w:t>[Accessed 25 July 2026].</w:t>
+              </w:r>
+            </w:p>
+            <w:p>
+              <w:pPr>
+                <w:pStyle w:val="Bibliography"/>
+                <w:rPr>
+                  <w:rFonts w:ascii="Arial" w:hAnsi="Arial" w:cs="Arial"/>
+                  <w:noProof/>
+                </w:rPr>
+              </w:pPr>
+              <w:r>
+                <w:rPr>
+                  <w:rFonts w:ascii="Arial" w:hAnsi="Arial" w:cs="Arial"/>
+                  <w:noProof/>
+                </w:rPr>
+                <w:t xml:space="preserve">GeeksforGeeks, 2025. </w:t>
+              </w:r>
+              <w:r>
+                <w:rPr>
+                  <w:rFonts w:ascii="Arial" w:hAnsi="Arial" w:cs="Arial"/>
+                  <w:i/>
+                  <w:iCs/>
+                  <w:noProof/>
+                </w:rPr>
+                <w:t xml:space="preserve">GeeksforGeeks. </w:t>
+              </w:r>
+              <w:r>
+                <w:rPr>
+                  <w:rFonts w:ascii="Arial" w:hAnsi="Arial" w:cs="Arial"/>
+                  <w:noProof/>
+                </w:rPr>
+                <w:t xml:space="preserve">[Online] </w:t>
+              </w:r>
+              <w:r>
+                <w:rPr>
+                  <w:rFonts w:ascii="Arial" w:hAnsi="Arial" w:cs="Arial"/>
+                  <w:noProof/>
+                </w:rPr>
+                <w:br/>
+                <w:t xml:space="preserve">Available at: </w:t>
+              </w:r>
+              <w:r>
+                <w:rPr>
+                  <w:rFonts w:ascii="Arial" w:hAnsi="Arial" w:cs="Arial"/>
+                  <w:noProof/>
+                  <w:u w:val="single"/>
+                </w:rPr>
+                <w:t>https://www.geeksforgeeks.org/computer-science-fundamentals/classification-of-computers/</w:t>
+              </w:r>
+              <w:r>
+                <w:rPr>
+                  <w:rFonts w:ascii="Arial" w:hAnsi="Arial" w:cs="Arial"/>
+                  <w:noProof/>
+                </w:rPr>
+                <w:br/>
+                <w:t>[Accessed 23 July 2026].</w:t>
+              </w:r>
+            </w:p>
+            <w:p>
+              <w:pPr>
+                <w:pStyle w:val="Bibliography"/>
+                <w:rPr>
+                  <w:rFonts w:ascii="Arial" w:hAnsi="Arial" w:cs="Arial"/>
+                  <w:noProof/>
+                </w:rPr>
+              </w:pPr>
+              <w:r>
+                <w:rPr>
+                  <w:rFonts w:ascii="Arial" w:hAnsi="Arial" w:cs="Arial"/>
+                  <w:noProof/>
+                </w:rPr>
+                <w:t xml:space="preserve">GeeksforGeeks, 2025. </w:t>
+              </w:r>
+              <w:r>
+                <w:rPr>
+                  <w:rFonts w:ascii="Arial" w:hAnsi="Arial" w:cs="Arial"/>
+                  <w:i/>
+                  <w:iCs/>
+                  <w:noProof/>
+                </w:rPr>
+                <w:t xml:space="preserve">GeeksforGeeks. </w:t>
+              </w:r>
+              <w:r>
+                <w:rPr>
+                  <w:rFonts w:ascii="Arial" w:hAnsi="Arial" w:cs="Arial"/>
+                  <w:noProof/>
+                </w:rPr>
+                <w:t xml:space="preserve">[Online] </w:t>
+              </w:r>
+              <w:r>
+                <w:rPr>
+                  <w:rFonts w:ascii="Arial" w:hAnsi="Arial" w:cs="Arial"/>
+                  <w:noProof/>
+                </w:rPr>
+                <w:br/>
+                <w:t xml:space="preserve">Available at: </w:t>
+              </w:r>
+              <w:r>
+                <w:rPr>
+                  <w:rFonts w:ascii="Arial" w:hAnsi="Arial" w:cs="Arial"/>
+                  <w:noProof/>
+                  <w:u w:val="single"/>
+                </w:rPr>
+                <w:t>https://www.geeksforgeeks.org/operating-systems/operating-systems/</w:t>
+              </w:r>
+              <w:r>
+                <w:rPr>
+                  <w:rFonts w:ascii="Arial" w:hAnsi="Arial" w:cs="Arial"/>
+                  <w:noProof/>
+                </w:rPr>
+                <w:br/>
+                <w:t>[Accessed 24 July 2026].</w:t>
+              </w:r>
+            </w:p>
+            <w:p>
+              <w:pPr>
+                <w:pStyle w:val="Bibliography"/>
+                <w:rPr>
+                  <w:rFonts w:ascii="Arial" w:hAnsi="Arial" w:cs="Arial"/>
+                  <w:noProof/>
+                </w:rPr>
+              </w:pPr>
+              <w:r>
+                <w:rPr>
+                  <w:rFonts w:ascii="Arial" w:hAnsi="Arial" w:cs="Arial"/>
+                  <w:noProof/>
+                </w:rPr>
+                <w:t xml:space="preserve">GeeksforGeeks, 2025. </w:t>
+              </w:r>
+              <w:r>
+                <w:rPr>
+                  <w:rFonts w:ascii="Arial" w:hAnsi="Arial" w:cs="Arial"/>
+                  <w:i/>
+                  <w:iCs/>
+                  <w:noProof/>
+                </w:rPr>
+                <w:t xml:space="preserve">GeeksforGeeks. </w:t>
+              </w:r>
+              <w:r>
+                <w:rPr>
+                  <w:rFonts w:ascii="Arial" w:hAnsi="Arial" w:cs="Arial"/>
+                  <w:noProof/>
+                </w:rPr>
+                <w:t xml:space="preserve">[Online] </w:t>
+              </w:r>
+              <w:r>
+                <w:rPr>
+                  <w:rFonts w:ascii="Arial" w:hAnsi="Arial" w:cs="Arial"/>
+                  <w:noProof/>
+                </w:rPr>
+                <w:br/>
+                <w:t xml:space="preserve">Available at: </w:t>
+              </w:r>
+              <w:r>
+                <w:rPr>
+                  <w:rFonts w:ascii="Arial" w:hAnsi="Arial" w:cs="Arial"/>
+                  <w:noProof/>
+                  <w:u w:val="single"/>
+                </w:rPr>
+                <w:t>https://www.geeksforgeeks.org/operating-systems/functions-of-operating-system/</w:t>
+              </w:r>
+              <w:r>
+                <w:rPr>
+                  <w:rFonts w:ascii="Arial" w:hAnsi="Arial" w:cs="Arial"/>
+                  <w:noProof/>
+                </w:rPr>
+                <w:br/>
+                <w:t>[Accessed 24 July 2026].</w:t>
+              </w:r>
+            </w:p>
+            <w:p>
+              <w:pPr>
+                <w:pStyle w:val="Bibliography"/>
+                <w:rPr>
+                  <w:rFonts w:ascii="Arial" w:hAnsi="Arial" w:cs="Arial"/>
+                  <w:noProof/>
+                </w:rPr>
+              </w:pPr>
+              <w:r>
+                <w:rPr>
+                  <w:rFonts w:ascii="Arial" w:hAnsi="Arial" w:cs="Arial"/>
+                  <w:noProof/>
+                </w:rPr>
+                <w:t xml:space="preserve">GeeksforGeeks, 2025. </w:t>
+              </w:r>
+              <w:r>
+                <w:rPr>
+                  <w:rFonts w:ascii="Arial" w:hAnsi="Arial" w:cs="Arial"/>
+                  <w:i/>
+                  <w:iCs/>
+                  <w:noProof/>
+                </w:rPr>
+                <w:t xml:space="preserve">GeeksforGeeks. </w:t>
+              </w:r>
+              <w:r>
+                <w:rPr>
+                  <w:rFonts w:ascii="Arial" w:hAnsi="Arial" w:cs="Arial"/>
+                  <w:noProof/>
+                </w:rPr>
+                <w:t xml:space="preserve">[Online] </w:t>
+              </w:r>
+              <w:r>
+                <w:rPr>
+                  <w:rFonts w:ascii="Arial" w:hAnsi="Arial" w:cs="Arial"/>
+                  <w:noProof/>
+                </w:rPr>
+                <w:br/>
+                <w:t xml:space="preserve">Available at: </w:t>
+              </w:r>
+              <w:r>
+                <w:rPr>
+                  <w:rFonts w:ascii="Arial" w:hAnsi="Arial" w:cs="Arial"/>
+                  <w:noProof/>
+                  <w:u w:val="single"/>
+                </w:rPr>
+                <w:t>https://www.geeksforgeeks.org/compiler-design/introduction-to-interpreters/</w:t>
+              </w:r>
+              <w:r>
+                <w:rPr>
+                  <w:rFonts w:ascii="Arial" w:hAnsi="Arial" w:cs="Arial"/>
+                  <w:noProof/>
+                </w:rPr>
+                <w:br/>
+                <w:t>[Accessed 24 July 2026].</w:t>
+              </w:r>
+            </w:p>
+            <w:p>
+              <w:pPr>
+                <w:pStyle w:val="Bibliography"/>
+                <w:rPr>
+                  <w:rFonts w:ascii="Arial" w:hAnsi="Arial" w:cs="Arial"/>
+                  <w:noProof/>
+                </w:rPr>
+              </w:pPr>
+              <w:r>
+                <w:rPr>
+                  <w:rFonts w:ascii="Arial" w:hAnsi="Arial" w:cs="Arial"/>
+                  <w:noProof/>
+                </w:rPr>
+                <w:lastRenderedPageBreak/>
+                <w:t xml:space="preserve">GeeksforGeeks, 2025. </w:t>
+              </w:r>
+              <w:r>
+                <w:rPr>
+                  <w:rFonts w:ascii="Arial" w:hAnsi="Arial" w:cs="Arial"/>
+                  <w:i/>
+                  <w:iCs/>
+                  <w:noProof/>
+                </w:rPr>
+                <w:t xml:space="preserve">GeeksforGeeks. </w:t>
+              </w:r>
+              <w:r>
+                <w:rPr>
+                  <w:rFonts w:ascii="Arial" w:hAnsi="Arial" w:cs="Arial"/>
+                  <w:noProof/>
+                </w:rPr>
+                <w:t xml:space="preserve">[Online] </w:t>
+              </w:r>
+              <w:r>
+                <w:rPr>
+                  <w:rFonts w:ascii="Arial" w:hAnsi="Arial" w:cs="Arial"/>
+                  <w:noProof/>
+                </w:rPr>
+                <w:br/>
+                <w:t xml:space="preserve">Available at: </w:t>
+              </w:r>
+              <w:r>
+                <w:rPr>
+                  <w:rFonts w:ascii="Arial" w:hAnsi="Arial" w:cs="Arial"/>
+                  <w:noProof/>
+                  <w:u w:val="single"/>
+                </w:rPr>
+                <w:t>https://www.geeksforgeeks.org/devops/what-is-distributed-computing/</w:t>
+              </w:r>
+              <w:r>
+                <w:rPr>
+                  <w:rFonts w:ascii="Arial" w:hAnsi="Arial" w:cs="Arial"/>
+                  <w:noProof/>
+                </w:rPr>
+                <w:br/>
+                <w:t>[Accessed 23 July 2026].</w:t>
+              </w:r>
+            </w:p>
+            <w:p>
+              <w:pPr>
+                <w:pStyle w:val="Bibliography"/>
+                <w:rPr>
+                  <w:rFonts w:ascii="Arial" w:hAnsi="Arial" w:cs="Arial"/>
+                  <w:noProof/>
+                </w:rPr>
+              </w:pPr>
+              <w:r>
+                <w:rPr>
+                  <w:rFonts w:ascii="Arial" w:hAnsi="Arial" w:cs="Arial"/>
+                  <w:noProof/>
+                </w:rPr>
+                <w:t xml:space="preserve">GeeksforGeeks, 2026. </w:t>
+              </w:r>
+              <w:r>
+                <w:rPr>
+                  <w:rFonts w:ascii="Arial" w:hAnsi="Arial" w:cs="Arial"/>
+                  <w:i/>
+                  <w:iCs/>
+                  <w:noProof/>
+                </w:rPr>
+                <w:t xml:space="preserve">GeeksforGeeks. </w:t>
+              </w:r>
+              <w:r>
+                <w:rPr>
+                  <w:rFonts w:ascii="Arial" w:hAnsi="Arial" w:cs="Arial"/>
+                  <w:noProof/>
+                </w:rPr>
+                <w:t xml:space="preserve">[Online] </w:t>
+              </w:r>
+              <w:r>
+                <w:rPr>
+                  <w:rFonts w:ascii="Arial" w:hAnsi="Arial" w:cs="Arial"/>
+                  <w:noProof/>
+                </w:rPr>
+                <w:br/>
+                <w:t xml:space="preserve">Available at: </w:t>
+              </w:r>
+              <w:r>
+                <w:rPr>
+                  <w:rFonts w:ascii="Arial" w:hAnsi="Arial" w:cs="Arial"/>
+                  <w:noProof/>
+                  <w:u w:val="single"/>
+                </w:rPr>
+                <w:t>https://www.geeksforgeeks.org/computer-networks/types-of-network-topology/</w:t>
+              </w:r>
+              <w:r>
+                <w:rPr>
+                  <w:rFonts w:ascii="Arial" w:hAnsi="Arial" w:cs="Arial"/>
+                  <w:noProof/>
+                </w:rPr>
+                <w:br/>
+                <w:t>[Accessed 20 July 2026].</w:t>
+              </w:r>
+            </w:p>
+            <w:p>
+              <w:pPr>
+                <w:pStyle w:val="Bibliography"/>
+                <w:rPr>
+                  <w:rFonts w:ascii="Arial" w:hAnsi="Arial" w:cs="Arial"/>
+                  <w:noProof/>
+                </w:rPr>
+              </w:pPr>
+              <w:r>
+                <w:rPr>
+                  <w:rFonts w:ascii="Arial" w:hAnsi="Arial" w:cs="Arial"/>
+                  <w:noProof/>
+                </w:rPr>
+                <w:t xml:space="preserve">GeeksforGeeks, 2026. </w:t>
+              </w:r>
+              <w:r>
+                <w:rPr>
+                  <w:rFonts w:ascii="Arial" w:hAnsi="Arial" w:cs="Arial"/>
+                  <w:i/>
+                  <w:iCs/>
+                  <w:noProof/>
+                </w:rPr>
+                <w:t xml:space="preserve">GeeksforGeeks. </w:t>
+              </w:r>
+              <w:r>
+                <w:rPr>
+                  <w:rFonts w:ascii="Arial" w:hAnsi="Arial" w:cs="Arial"/>
+                  <w:noProof/>
+                </w:rPr>
+                <w:t xml:space="preserve">[Online] </w:t>
+              </w:r>
+              <w:r>
+                <w:rPr>
+                  <w:rFonts w:ascii="Arial" w:hAnsi="Arial" w:cs="Arial"/>
+                  <w:noProof/>
+                </w:rPr>
+                <w:br/>
+                <w:t xml:space="preserve">Available at: </w:t>
+              </w:r>
+              <w:r>
+                <w:rPr>
+                  <w:rFonts w:ascii="Arial" w:hAnsi="Arial" w:cs="Arial"/>
+                  <w:noProof/>
+                  <w:u w:val="single"/>
+                </w:rPr>
+                <w:t>https://www.geeksforgeeks.org/computer-science-fundamentals/random-access-memory-ram/</w:t>
+              </w:r>
+              <w:r>
+                <w:rPr>
+                  <w:rFonts w:ascii="Arial" w:hAnsi="Arial" w:cs="Arial"/>
+                  <w:noProof/>
+                </w:rPr>
+                <w:br/>
+                <w:t>[Accessed 7 July 2026].</w:t>
+              </w:r>
+            </w:p>
+            <w:p>
+              <w:pPr>
+                <w:pStyle w:val="Bibliography"/>
+                <w:rPr>
+                  <w:rFonts w:ascii="Arial" w:hAnsi="Arial" w:cs="Arial"/>
+                  <w:noProof/>
+                </w:rPr>
+              </w:pPr>
+              <w:r>
+                <w:rPr>
+                  <w:rFonts w:ascii="Arial" w:hAnsi="Arial" w:cs="Arial"/>
+                  <w:noProof/>
+                </w:rPr>
+                <w:t xml:space="preserve">Github, 2025. </w:t>
+              </w:r>
+              <w:r>
+                <w:rPr>
+                  <w:rFonts w:ascii="Arial" w:hAnsi="Arial" w:cs="Arial"/>
+                  <w:i/>
+                  <w:iCs/>
+                  <w:noProof/>
+                </w:rPr>
+                <w:t xml:space="preserve">Github. </w:t>
+              </w:r>
+              <w:r>
+                <w:rPr>
+                  <w:rFonts w:ascii="Arial" w:hAnsi="Arial" w:cs="Arial"/>
+                  <w:noProof/>
+                </w:rPr>
+                <w:t xml:space="preserve">[Online] </w:t>
+              </w:r>
+              <w:r>
+                <w:rPr>
+                  <w:rFonts w:ascii="Arial" w:hAnsi="Arial" w:cs="Arial"/>
+                  <w:noProof/>
+                </w:rPr>
+                <w:br/>
+                <w:t xml:space="preserve">Available at: </w:t>
+              </w:r>
+              <w:r>
+                <w:rPr>
+                  <w:rFonts w:ascii="Arial" w:hAnsi="Arial" w:cs="Arial"/>
+                  <w:noProof/>
+                  <w:u w:val="single"/>
+                </w:rPr>
+                <w:t>https://github.com/resources/articles/what-is-an-ide</w:t>
+              </w:r>
+              <w:r>
+                <w:rPr>
+                  <w:rFonts w:ascii="Arial" w:hAnsi="Arial" w:cs="Arial"/>
+                  <w:noProof/>
+                </w:rPr>
+                <w:br/>
+                <w:t>[Accessed 24 July 2026].</w:t>
+              </w:r>
+            </w:p>
+            <w:p>
+              <w:pPr>
+                <w:pStyle w:val="Bibliography"/>
+                <w:rPr>
+                  <w:rFonts w:ascii="Arial" w:hAnsi="Arial" w:cs="Arial"/>
+                  <w:noProof/>
+                </w:rPr>
+              </w:pPr>
+              <w:r>
+                <w:rPr>
+                  <w:rFonts w:ascii="Arial" w:hAnsi="Arial" w:cs="Arial"/>
+                  <w:noProof/>
+                </w:rPr>
+                <w:t xml:space="preserve">Google Cloud, n.d. </w:t>
+              </w:r>
+              <w:r>
+                <w:rPr>
+                  <w:rFonts w:ascii="Arial" w:hAnsi="Arial" w:cs="Arial"/>
+                  <w:i/>
+                  <w:iCs/>
+                  <w:noProof/>
+                </w:rPr>
+                <w:t xml:space="preserve">Google Cloud. </w:t>
+              </w:r>
+              <w:r>
+                <w:rPr>
+                  <w:rFonts w:ascii="Arial" w:hAnsi="Arial" w:cs="Arial"/>
+                  <w:noProof/>
+                </w:rPr>
+                <w:t xml:space="preserve">[Online] </w:t>
+              </w:r>
+              <w:r>
+                <w:rPr>
+                  <w:rFonts w:ascii="Arial" w:hAnsi="Arial" w:cs="Arial"/>
+                  <w:noProof/>
+                </w:rPr>
+                <w:br/>
+                <w:t xml:space="preserve">Available at: </w:t>
+              </w:r>
+              <w:r>
+                <w:rPr>
+                  <w:rFonts w:ascii="Arial" w:hAnsi="Arial" w:cs="Arial"/>
+                  <w:noProof/>
+                  <w:u w:val="single"/>
+                </w:rPr>
+                <w:t>https://cloud.google.com/discover/what-is-server-hosting</w:t>
+              </w:r>
+              <w:r>
+                <w:rPr>
+                  <w:rFonts w:ascii="Arial" w:hAnsi="Arial" w:cs="Arial"/>
+                  <w:noProof/>
+                </w:rPr>
+                <w:br/>
+                <w:t>[Accessed 24 July 2026].</w:t>
+              </w:r>
+            </w:p>
+            <w:p>
+              <w:pPr>
+                <w:pStyle w:val="Bibliography"/>
+                <w:rPr>
+                  <w:rFonts w:ascii="Arial" w:hAnsi="Arial" w:cs="Arial"/>
+                  <w:noProof/>
+                </w:rPr>
+              </w:pPr>
+              <w:r>
+                <w:rPr>
+                  <w:rFonts w:ascii="Arial" w:hAnsi="Arial" w:cs="Arial"/>
+                  <w:noProof/>
+                </w:rPr>
+                <w:t xml:space="preserve">kerem-gulen, 2022. </w:t>
+              </w:r>
+              <w:r>
+                <w:rPr>
+                  <w:rFonts w:ascii="Arial" w:hAnsi="Arial" w:cs="Arial"/>
+                  <w:i/>
+                  <w:iCs/>
+                  <w:noProof/>
+                </w:rPr>
+                <w:t xml:space="preserve">Dataconomy. </w:t>
+              </w:r>
+              <w:r>
+                <w:rPr>
+                  <w:rFonts w:ascii="Arial" w:hAnsi="Arial" w:cs="Arial"/>
+                  <w:noProof/>
+                </w:rPr>
+                <w:t xml:space="preserve">[Online] </w:t>
+              </w:r>
+              <w:r>
+                <w:rPr>
+                  <w:rFonts w:ascii="Arial" w:hAnsi="Arial" w:cs="Arial"/>
+                  <w:noProof/>
+                </w:rPr>
+                <w:br/>
+                <w:t xml:space="preserve">Available at: </w:t>
+              </w:r>
+              <w:r>
+                <w:rPr>
+                  <w:rFonts w:ascii="Arial" w:hAnsi="Arial" w:cs="Arial"/>
+                  <w:noProof/>
+                  <w:u w:val="single"/>
+                </w:rPr>
+                <w:t>https://dataconomy.com/2022/12/28/what-are-microcomputers-history-examples/</w:t>
+              </w:r>
+              <w:r>
+                <w:rPr>
+                  <w:rFonts w:ascii="Arial" w:hAnsi="Arial" w:cs="Arial"/>
+                  <w:noProof/>
+                </w:rPr>
+                <w:br/>
+                <w:t>[Accessed 23 July 2026].</w:t>
+              </w:r>
+            </w:p>
+            <w:p>
+              <w:pPr>
+                <w:pStyle w:val="Bibliography"/>
+                <w:rPr>
+                  <w:rFonts w:ascii="Arial" w:hAnsi="Arial" w:cs="Arial"/>
+                  <w:noProof/>
+                </w:rPr>
+              </w:pPr>
+              <w:r>
+                <w:rPr>
+                  <w:rFonts w:ascii="Arial" w:hAnsi="Arial" w:cs="Arial"/>
+                  <w:noProof/>
+                </w:rPr>
+                <w:t xml:space="preserve">Microsoft, 2026. </w:t>
+              </w:r>
+              <w:r>
+                <w:rPr>
+                  <w:rFonts w:ascii="Arial" w:hAnsi="Arial" w:cs="Arial"/>
+                  <w:i/>
+                  <w:iCs/>
+                  <w:noProof/>
+                </w:rPr>
+                <w:t xml:space="preserve">2025. </w:t>
+              </w:r>
+              <w:r>
+                <w:rPr>
+                  <w:rFonts w:ascii="Arial" w:hAnsi="Arial" w:cs="Arial"/>
+                  <w:noProof/>
+                </w:rPr>
+                <w:t xml:space="preserve">[Online] </w:t>
+              </w:r>
+              <w:r>
+                <w:rPr>
+                  <w:rFonts w:ascii="Arial" w:hAnsi="Arial" w:cs="Arial"/>
+                  <w:noProof/>
+                </w:rPr>
+                <w:br/>
+                <w:t xml:space="preserve">Available at: </w:t>
+              </w:r>
+              <w:r>
+                <w:rPr>
+                  <w:rFonts w:ascii="Arial" w:hAnsi="Arial" w:cs="Arial"/>
+                  <w:noProof/>
+                  <w:u w:val="single"/>
+                </w:rPr>
+                <w:t>https://www.microsoft.com/en-us/windows/learning-center/operating-systems-os-explained?msockid=03139d965e8760960f668be55f176156</w:t>
+              </w:r>
+              <w:r>
+                <w:rPr>
+                  <w:rFonts w:ascii="Arial" w:hAnsi="Arial" w:cs="Arial"/>
+                  <w:noProof/>
+                </w:rPr>
+                <w:br/>
+                <w:t>[Accessed 24 July 24].</w:t>
+              </w:r>
+            </w:p>
+            <w:p>
+              <w:pPr>
+                <w:pStyle w:val="Bibliography"/>
+                <w:rPr>
+                  <w:rFonts w:ascii="Arial" w:hAnsi="Arial" w:cs="Arial"/>
+                  <w:noProof/>
+                </w:rPr>
+              </w:pPr>
+              <w:r>
+                <w:rPr>
+                  <w:rFonts w:ascii="Arial" w:hAnsi="Arial" w:cs="Arial"/>
+                  <w:noProof/>
+                </w:rPr>
+                <w:t xml:space="preserve">Phill Powell, I. S., n.d. </w:t>
+              </w:r>
+              <w:r>
+                <w:rPr>
+                  <w:rFonts w:ascii="Arial" w:hAnsi="Arial" w:cs="Arial"/>
+                  <w:i/>
+                  <w:iCs/>
+                  <w:noProof/>
+                </w:rPr>
+                <w:t xml:space="preserve">IBM. </w:t>
+              </w:r>
+              <w:r>
+                <w:rPr>
+                  <w:rFonts w:ascii="Arial" w:hAnsi="Arial" w:cs="Arial"/>
+                  <w:noProof/>
+                </w:rPr>
+                <w:t xml:space="preserve">[Online] </w:t>
+              </w:r>
+              <w:r>
+                <w:rPr>
+                  <w:rFonts w:ascii="Arial" w:hAnsi="Arial" w:cs="Arial"/>
+                  <w:noProof/>
+                </w:rPr>
+                <w:br/>
+                <w:t xml:space="preserve">Available at: </w:t>
+              </w:r>
+              <w:r>
+                <w:rPr>
+                  <w:rFonts w:ascii="Arial" w:hAnsi="Arial" w:cs="Arial"/>
+                  <w:noProof/>
+                  <w:u w:val="single"/>
+                </w:rPr>
+                <w:t>https://www.ibm.com/think/topics/distributed-computing</w:t>
+              </w:r>
+              <w:r>
+                <w:rPr>
+                  <w:rFonts w:ascii="Arial" w:hAnsi="Arial" w:cs="Arial"/>
+                  <w:noProof/>
+                </w:rPr>
+                <w:br/>
+                <w:t>[Accessed 23 July 2026].</w:t>
+              </w:r>
+            </w:p>
+            <w:p>
+              <w:pPr>
+                <w:pStyle w:val="Bibliography"/>
+                <w:rPr>
+                  <w:rFonts w:ascii="Arial" w:hAnsi="Arial" w:cs="Arial"/>
+                  <w:noProof/>
+                </w:rPr>
+              </w:pPr>
+              <w:r>
+                <w:rPr>
+                  <w:rFonts w:ascii="Arial" w:hAnsi="Arial" w:cs="Arial"/>
+                  <w:noProof/>
+                </w:rPr>
+                <w:t xml:space="preserve">Sciencenewstoday, 2025. </w:t>
+              </w:r>
+              <w:r>
+                <w:rPr>
+                  <w:rFonts w:ascii="Arial" w:hAnsi="Arial" w:cs="Arial"/>
+                  <w:i/>
+                  <w:iCs/>
+                  <w:noProof/>
+                </w:rPr>
+                <w:t xml:space="preserve">Sciencenewstoday. </w:t>
+              </w:r>
+              <w:r>
+                <w:rPr>
+                  <w:rFonts w:ascii="Arial" w:hAnsi="Arial" w:cs="Arial"/>
+                  <w:noProof/>
+                </w:rPr>
+                <w:t xml:space="preserve">[Online] </w:t>
+              </w:r>
+              <w:r>
+                <w:rPr>
+                  <w:rFonts w:ascii="Arial" w:hAnsi="Arial" w:cs="Arial"/>
+                  <w:noProof/>
+                </w:rPr>
+                <w:br/>
+                <w:t xml:space="preserve">Available at: </w:t>
+              </w:r>
+              <w:r>
+                <w:rPr>
+                  <w:rFonts w:ascii="Arial" w:hAnsi="Arial" w:cs="Arial"/>
+                  <w:noProof/>
+                  <w:u w:val="single"/>
+                </w:rPr>
+                <w:t>https://www.sciencenewstoday.org/what-is-a-central-processing-unit-cpu-the-brain-of-modern-computing</w:t>
+              </w:r>
+              <w:r>
+                <w:rPr>
+                  <w:rFonts w:ascii="Arial" w:hAnsi="Arial" w:cs="Arial"/>
+                  <w:noProof/>
+                </w:rPr>
+                <w:br/>
+                <w:t>[Accessed 23 July 2026].</w:t>
+              </w:r>
+            </w:p>
+            <w:p>
+              <w:pPr>
+                <w:pStyle w:val="Bibliography"/>
+                <w:rPr>
+                  <w:rFonts w:ascii="Arial" w:hAnsi="Arial" w:cs="Arial"/>
+                  <w:noProof/>
+                </w:rPr>
+              </w:pPr>
+              <w:r>
+                <w:rPr>
+                  <w:rFonts w:ascii="Arial" w:hAnsi="Arial" w:cs="Arial"/>
+                  <w:noProof/>
+                </w:rPr>
+                <w:t xml:space="preserve">Simplilearn, 2026. </w:t>
+              </w:r>
+              <w:r>
+                <w:rPr>
+                  <w:rFonts w:ascii="Arial" w:hAnsi="Arial" w:cs="Arial"/>
+                  <w:i/>
+                  <w:iCs/>
+                  <w:noProof/>
+                </w:rPr>
+                <w:t xml:space="preserve">Simplilearn. </w:t>
+              </w:r>
+              <w:r>
+                <w:rPr>
+                  <w:rFonts w:ascii="Arial" w:hAnsi="Arial" w:cs="Arial"/>
+                  <w:noProof/>
+                </w:rPr>
+                <w:t xml:space="preserve">[Online] </w:t>
+              </w:r>
+              <w:r>
+                <w:rPr>
+                  <w:rFonts w:ascii="Arial" w:hAnsi="Arial" w:cs="Arial"/>
+                  <w:noProof/>
+                </w:rPr>
+                <w:br/>
+                <w:t xml:space="preserve">Available at: </w:t>
+              </w:r>
+              <w:r>
+                <w:rPr>
+                  <w:rFonts w:ascii="Arial" w:hAnsi="Arial" w:cs="Arial"/>
+                  <w:noProof/>
+                  <w:u w:val="single"/>
+                </w:rPr>
+                <w:t>https://www.simplilearn.com/tutorials/networking-tutorial/importance-of-types-of-networks-lan-man-wan</w:t>
+              </w:r>
+              <w:r>
+                <w:rPr>
+                  <w:rFonts w:ascii="Arial" w:hAnsi="Arial" w:cs="Arial"/>
+                  <w:noProof/>
+                </w:rPr>
+                <w:br/>
+                <w:t>[Accessed 24 July 2026].</w:t>
+              </w:r>
+            </w:p>
+            <w:p>
+              <w:pPr>
+                <w:pStyle w:val="Bibliography"/>
+                <w:rPr>
+                  <w:rFonts w:ascii="Arial" w:hAnsi="Arial" w:cs="Arial"/>
+                  <w:noProof/>
+                </w:rPr>
+              </w:pPr>
+              <w:r>
+                <w:rPr>
+                  <w:rFonts w:ascii="Arial" w:hAnsi="Arial" w:cs="Arial"/>
+                  <w:noProof/>
+                </w:rPr>
+                <w:lastRenderedPageBreak/>
+                <w:t xml:space="preserve">Unremot, 2024. </w:t>
+              </w:r>
+              <w:r>
+                <w:rPr>
+                  <w:rFonts w:ascii="Arial" w:hAnsi="Arial" w:cs="Arial"/>
+                  <w:i/>
+                  <w:iCs/>
+                  <w:noProof/>
+                </w:rPr>
+                <w:t xml:space="preserve">Unremot. </w:t>
+              </w:r>
+              <w:r>
+                <w:rPr>
+                  <w:rFonts w:ascii="Arial" w:hAnsi="Arial" w:cs="Arial"/>
+                  <w:noProof/>
+                </w:rPr>
+                <w:t xml:space="preserve">[Online] </w:t>
+              </w:r>
+              <w:r>
+                <w:rPr>
+                  <w:rFonts w:ascii="Arial" w:hAnsi="Arial" w:cs="Arial"/>
+                  <w:noProof/>
+                </w:rPr>
+                <w:br/>
+                <w:t xml:space="preserve">Available at: </w:t>
+              </w:r>
+              <w:r>
+                <w:rPr>
+                  <w:rFonts w:ascii="Arial" w:hAnsi="Arial" w:cs="Arial"/>
+                  <w:noProof/>
+                  <w:u w:val="single"/>
+                </w:rPr>
+                <w:t>https://unremot.com/blog/the-evolution-of-computing/</w:t>
+              </w:r>
+              <w:r>
+                <w:rPr>
+                  <w:rFonts w:ascii="Arial" w:hAnsi="Arial" w:cs="Arial"/>
+                  <w:noProof/>
+                </w:rPr>
+                <w:br/>
+                <w:t>[Accessed 23 07 2026].</w:t>
+              </w:r>
+            </w:p>
+            <w:p>
+              <w:pPr>
+                <w:rPr>
+                  <w:rFonts w:ascii="Arial" w:hAnsi="Arial" w:cs="Arial"/>
+                </w:rPr>
+              </w:pPr>
+              <w:r>
+                <w:rPr>
+                  <w:rFonts w:ascii="Arial" w:hAnsi="Arial" w:cs="Arial"/>
+                  <w:b/>
+                  <w:bCs/>
+                  <w:noProof/>
+                </w:rPr>
+                <w:fldChar w:fldCharType="end"/>
+              </w:r>
+            </w:p>
+          </w:sdtContent>
+        </w:sdt>
+      </w:sdtContent>
+    </w:sdt>
+    <w:p>
+      <w:pPr>
+        <w:tabs>
+          <w:tab w:val="left" w:pos="5613"/>
+        </w:tabs>
+        <w:rPr>
+          <w:rFonts w:ascii="Arial" w:hAnsi="Arial" w:cs="Arial"/>
+        </w:rPr>
+      </w:pPr>
+    </w:p>
     <w:sectPr>
+      <w:headerReference w:type="default" r:id="rId10"/>
+      <w:footerReference w:type="default" r:id="rId11"/>
       <w:pgSz w:w="12240" w:h="15840"/>
       <w:pgMar w:top="1440" w:right="1440" w:bottom="1440" w:left="1440" w:header="720" w:footer="720" w:gutter="0"/>
       <w:cols w:space="720"/>
@@ -9493,6 +13310,87 @@
 </w:endnotes>
 </file>
 
+<file path=word/footer1.xml><?xml version="1.0" encoding="utf-8"?>
+<w:ftr xmlns:wpc="http://schemas.microsoft.com/office/word/2010/wordprocessingCanvas" xmlns:cx="http://schemas.microsoft.com/office/drawing/2014/chartex" xmlns:cx1="http://schemas.microsoft.com/office/drawing/2015/9/8/chartex" xmlns:cx2="http://schemas.microsoft.com/office/drawing/2015/10/21/chartex" xmlns:cx3="http://schemas.microsoft.com/office/drawing/2016/5/9/chartex" xmlns:cx4="http://schemas.microsoft.com/office/drawing/2016/5/10/chartex" xmlns:cx5="http://schemas.microsoft.com/office/drawing/2016/5/11/chartex" xmlns:cx6="http://schemas.microsoft.com/office/drawing/2016/5/12/chartex" xmlns:cx7="http://schemas.microsoft.com/office/drawing/2016/5/13/chartex" xmlns:cx8="http://schemas.microsoft.com/office/drawing/2016/5/14/chartex" xmlns:mc="http://schemas.openxmlformats.org/markup-compatibility/2006" xmlns:aink="http://schemas.microsoft.com/office/drawing/2016/ink" xmlns:am3d="http://schemas.microsoft.com/office/drawing/2017/model3d" xmlns:o="urn:schemas-microsoft-com:office:office" xmlns:oel="http://schemas.microsoft.com/office/2019/extlst" xmlns:r="http://schemas.openxmlformats.org/officeDocument/2006/relationships" xmlns:m="http://schemas.openxmlformats.org/officeDocument/2006/math" xmlns:v="urn:schemas-microsoft-com:vml" xmlns:wp14="http://schemas.microsoft.com/office/word/2010/wordprocessingDrawing" xmlns:wp="http://schemas.openxmlformats.org/drawingml/2006/wordprocessingDrawing" xmlns:w10="urn:schemas-microsoft-com:office:word" xmlns:w="http://schemas.openxmlformats.org/wordprocessingml/2006/main" xmlns:w14="http://schemas.microsoft.com/office/word/2010/wordml" xmlns:w15="http://schemas.microsoft.com/office/word/2012/wordml" xmlns:w16cei="http://schemas.microsoft.com/office/word/2026/wordml/cei" xmlns:w16cex="http://schemas.microsoft.com/office/word/2018/wordml/cex" xmlns:w16cid="http://schemas.microsoft.com/office/word/2016/wordml/cid" xmlns:w16="http://schemas.microsoft.com/office/word/2018/wordml" xmlns:w16du="http://schemas.microsoft.com/office/word/2023/wordml/word16du" xmlns:w16sdtdh="http://schemas.microsoft.com/office/word/2020/wordml/sdtdatahash" xmlns:w16sdtfl="http://schemas.microsoft.com/office/word/2024/wordml/sdtformatlock" xmlns:w16se="http://schemas.microsoft.com/office/word/2015/wordml/symex" xmlns:wpg="http://schemas.microsoft.com/office/word/2010/wordprocessingGroup" xmlns:wpi="http://schemas.microsoft.com/office/word/2010/wordprocessingInk" xmlns:wne="http://schemas.microsoft.com/office/word/2006/wordml" xmlns:wps="http://schemas.microsoft.com/office/word/2010/wordprocessingShape" mc:Ignorable="w14 w15 w16se w16cid w16 w16cex w16sdtdh w16sdtfl w16du wp14">
+  <w:sdt>
+    <w:sdtPr>
+      <w:rPr>
+        <w:rFonts w:asciiTheme="majorHAnsi" w:eastAsiaTheme="majorEastAsia" w:hAnsiTheme="majorHAnsi" w:cstheme="majorBidi"/>
+        <w:sz w:val="28"/>
+        <w:szCs w:val="28"/>
+      </w:rPr>
+      <w:id w:val="96379877"/>
+      <w:docPartObj>
+        <w:docPartGallery w:val="Page Numbers (Bottom of Page)"/>
+        <w:docPartUnique/>
+      </w:docPartObj>
+    </w:sdtPr>
+    <w:sdtEndPr>
+      <w:rPr>
+        <w:noProof/>
+      </w:rPr>
+    </w:sdtEndPr>
+    <w:sdtContent>
+      <w:p>
+        <w:pPr>
+          <w:pStyle w:val="Footer"/>
+        </w:pPr>
+        <w:r>
+          <w:rPr>
+            <w:rFonts w:asciiTheme="majorHAnsi" w:eastAsiaTheme="majorEastAsia" w:hAnsiTheme="majorHAnsi" w:cstheme="majorBidi"/>
+            <w:sz w:val="28"/>
+            <w:szCs w:val="28"/>
+          </w:rPr>
+          <w:t xml:space="preserve">pg. </w:t>
+        </w:r>
+        <w:r>
+          <w:rPr>
+            <w:rFonts w:eastAsiaTheme="minorEastAsia" w:cs="Times New Roman"/>
+            <w:sz w:val="22"/>
+            <w:szCs w:val="22"/>
+          </w:rPr>
+          <w:fldChar w:fldCharType="begin"/>
+        </w:r>
+        <w:r>
+          <w:instrText xml:space="preserve"> PAGE    \* MERGEFORMAT </w:instrText>
+        </w:r>
+        <w:r>
+          <w:rPr>
+            <w:rFonts w:eastAsiaTheme="minorEastAsia" w:cs="Times New Roman"/>
+            <w:sz w:val="22"/>
+            <w:szCs w:val="22"/>
+          </w:rPr>
+          <w:fldChar w:fldCharType="separate"/>
+        </w:r>
+        <w:r>
+          <w:rPr>
+            <w:rFonts w:asciiTheme="majorHAnsi" w:eastAsiaTheme="majorEastAsia" w:hAnsiTheme="majorHAnsi" w:cstheme="majorBidi"/>
+            <w:noProof/>
+            <w:sz w:val="28"/>
+            <w:szCs w:val="28"/>
+          </w:rPr>
+          <w:t>2</w:t>
+        </w:r>
+        <w:r>
+          <w:rPr>
+            <w:rFonts w:asciiTheme="majorHAnsi" w:eastAsiaTheme="majorEastAsia" w:hAnsiTheme="majorHAnsi" w:cstheme="majorBidi"/>
+            <w:noProof/>
+            <w:sz w:val="28"/>
+            <w:szCs w:val="28"/>
+          </w:rPr>
+          <w:fldChar w:fldCharType="end"/>
+        </w:r>
+      </w:p>
+    </w:sdtContent>
+  </w:sdt>
+  <w:p>
+    <w:pPr>
+      <w:pStyle w:val="Footer"/>
+    </w:pPr>
+  </w:p>
+</w:ftr>
+</file>
+
 <file path=word/footnotes.xml><?xml version="1.0" encoding="utf-8"?>
 <w:footnotes xmlns:wpc="http://schemas.microsoft.com/office/word/2010/wordprocessingCanvas" xmlns:cx="http://schemas.microsoft.com/office/drawing/2014/chartex" xmlns:cx1="http://schemas.microsoft.com/office/drawing/2015/9/8/chartex" xmlns:cx2="http://schemas.microsoft.com/office/drawing/2015/10/21/chartex" xmlns:cx3="http://schemas.microsoft.com/office/drawing/2016/5/9/chartex" xmlns:cx4="http://schemas.microsoft.com/office/drawing/2016/5/10/chartex" xmlns:cx5="http://schemas.microsoft.com/office/drawing/2016/5/11/chartex" xmlns:cx6="http://schemas.microsoft.com/office/drawing/2016/5/12/chartex" xmlns:cx7="http://schemas.microsoft.com/office/drawing/2016/5/13/chartex" xmlns:cx8="http://schemas.microsoft.com/office/drawing/2016/5/14/chartex" xmlns:mc="http://schemas.openxmlformats.org/markup-compatibility/2006" xmlns:aink="http://schemas.microsoft.com/office/drawing/2016/ink" xmlns:am3d="http://schemas.microsoft.com/office/drawing/2017/model3d" xmlns:o="urn:schemas-microsoft-com:office:office" xmlns:oel="http://schemas.microsoft.com/office/2019/extlst" xmlns:r="http://schemas.openxmlformats.org/officeDocument/2006/relationships" xmlns:m="http://schemas.openxmlformats.org/officeDocument/2006/math" xmlns:v="urn:schemas-microsoft-com:vml" xmlns:wp14="http://schemas.microsoft.com/office/word/2010/wordprocessingDrawing" xmlns:wp="http://schemas.openxmlformats.org/drawingml/2006/wordprocessingDrawing" xmlns:w10="urn:schemas-microsoft-com:office:word" xmlns:w="http://schemas.openxmlformats.org/wordprocessingml/2006/main" xmlns:w14="http://schemas.microsoft.com/office/word/2010/wordml" xmlns:w15="http://schemas.microsoft.com/office/word/2012/wordml" xmlns:w16cei="http://schemas.microsoft.com/office/word/2026/wordml/cei" xmlns:w16cex="http://schemas.microsoft.com/office/word/2018/wordml/cex" xmlns:w16cid="http://schemas.microsoft.com/office/word/2016/wordml/cid" xmlns:w16="http://schemas.microsoft.com/office/word/2018/wordml" xmlns:w16du="http://schemas.microsoft.com/office/word/2023/wordml/word16du" xmlns:w16sdtdh="http://schemas.microsoft.com/office/word/2020/wordml/sdtdatahash" xmlns:w16sdtfl="http://schemas.microsoft.com/office/word/2024/wordml/sdtformatlock" xmlns:w16se="http://schemas.microsoft.com/office/word/2015/wordml/symex" xmlns:wpg="http://schemas.microsoft.com/office/word/2010/wordprocessingGroup" xmlns:wpi="http://schemas.microsoft.com/office/word/2010/wordprocessingInk" xmlns:wne="http://schemas.microsoft.com/office/word/2006/wordml" xmlns:wps="http://schemas.microsoft.com/office/word/2010/wordprocessingShape" mc:Ignorable="w14 w15 w16se w16cid w16 w16cex w16sdtdh w16sdtfl w16du wp14">
   <w:footnote w:type="separator" w:id="-1">
@@ -9516,6 +13414,54 @@
     </w:p>
   </w:footnote>
 </w:footnotes>
+</file>
+
+<file path=word/header1.xml><?xml version="1.0" encoding="utf-8"?>
+<w:hdr xmlns:wpc="http://schemas.microsoft.com/office/word/2010/wordprocessingCanvas" xmlns:cx="http://schemas.microsoft.com/office/drawing/2014/chartex" xmlns:cx1="http://schemas.microsoft.com/office/drawing/2015/9/8/chartex" xmlns:cx2="http://schemas.microsoft.com/office/drawing/2015/10/21/chartex" xmlns:cx3="http://schemas.microsoft.com/office/drawing/2016/5/9/chartex" xmlns:cx4="http://schemas.microsoft.com/office/drawing/2016/5/10/chartex" xmlns:cx5="http://schemas.microsoft.com/office/drawing/2016/5/11/chartex" xmlns:cx6="http://schemas.microsoft.com/office/drawing/2016/5/12/chartex" xmlns:cx7="http://schemas.microsoft.com/office/drawing/2016/5/13/chartex" xmlns:cx8="http://schemas.microsoft.com/office/drawing/2016/5/14/chartex" xmlns:mc="http://schemas.openxmlformats.org/markup-compatibility/2006" xmlns:aink="http://schemas.microsoft.com/office/drawing/2016/ink" xmlns:am3d="http://schemas.microsoft.com/office/drawing/2017/model3d" xmlns:o="urn:schemas-microsoft-com:office:office" xmlns:oel="http://schemas.microsoft.com/office/2019/extlst" xmlns:r="http://schemas.openxmlformats.org/officeDocument/2006/relationships" xmlns:m="http://schemas.openxmlformats.org/officeDocument/2006/math" xmlns:v="urn:schemas-microsoft-com:vml" xmlns:wp14="http://schemas.microsoft.com/office/word/2010/wordprocessingDrawing" xmlns:wp="http://schemas.openxmlformats.org/drawingml/2006/wordprocessingDrawing" xmlns:w10="urn:schemas-microsoft-com:office:word" xmlns:w="http://schemas.openxmlformats.org/wordprocessingml/2006/main" xmlns:w14="http://schemas.microsoft.com/office/word/2010/wordml" xmlns:w15="http://schemas.microsoft.com/office/word/2012/wordml" xmlns:w16cei="http://schemas.microsoft.com/office/word/2026/wordml/cei" xmlns:w16cex="http://schemas.microsoft.com/office/word/2018/wordml/cex" xmlns:w16cid="http://schemas.microsoft.com/office/word/2016/wordml/cid" xmlns:w16="http://schemas.microsoft.com/office/word/2018/wordml" xmlns:w16du="http://schemas.microsoft.com/office/word/2023/wordml/word16du" xmlns:w16sdtdh="http://schemas.microsoft.com/office/word/2020/wordml/sdtdatahash" xmlns:w16sdtfl="http://schemas.microsoft.com/office/word/2024/wordml/sdtformatlock" xmlns:w16se="http://schemas.microsoft.com/office/word/2015/wordml/symex" xmlns:wpg="http://schemas.microsoft.com/office/word/2010/wordprocessingGroup" xmlns:wpi="http://schemas.microsoft.com/office/word/2010/wordprocessingInk" xmlns:wne="http://schemas.microsoft.com/office/word/2006/wordml" xmlns:wps="http://schemas.microsoft.com/office/word/2010/wordprocessingShape" mc:Ignorable="w14 w15 w16se w16cid w16 w16cex w16sdtdh w16sdtfl w16du wp14">
+  <w:p>
+    <w:pPr>
+      <w:pStyle w:val="Header"/>
+      <w:tabs>
+        <w:tab w:val="clear" w:pos="4680"/>
+        <w:tab w:val="clear" w:pos="9360"/>
+        <w:tab w:val="left" w:pos="8196"/>
+      </w:tabs>
+      <w:rPr>
+        <w:rFonts w:ascii="Arial" w:hAnsi="Arial" w:cs="Arial"/>
+        <w:b/>
+      </w:rPr>
+    </w:pPr>
+    <w:r>
+      <w:rPr>
+        <w:rFonts w:ascii="Arial" w:hAnsi="Arial" w:cs="Arial"/>
+        <w:b/>
+      </w:rPr>
+      <w:t>Blessings Tamanga</w:t>
+    </w:r>
+    <w:r>
+      <w:rPr>
+        <w:rFonts w:ascii="Arial" w:hAnsi="Arial" w:cs="Arial"/>
+        <w:b/>
+      </w:rPr>
+      <w:t xml:space="preserve">                                                                                        </w:t>
+    </w:r>
+    <w:r>
+      <w:rPr>
+        <w:rFonts w:ascii="Arial" w:hAnsi="Arial" w:cs="Arial"/>
+        <w:b/>
+      </w:rPr>
+      <w:t>P00221220</w:t>
+    </w:r>
+  </w:p>
+  <w:p>
+    <w:pPr>
+      <w:pStyle w:val="Header"/>
+      <w:rPr>
+        <w:rFonts w:ascii="Arial" w:hAnsi="Arial" w:cs="Arial"/>
+      </w:rPr>
+    </w:pPr>
+  </w:p>
+</w:hdr>
 </file>
 
 <file path=word/numbering.xml><?xml version="1.0" encoding="utf-8"?>
@@ -13988,6 +17934,94 @@
     <w:uiPriority w:val="99"/>
     <w:rsid w:val="00C61BF4"/>
   </w:style>
+  <w:style w:type="table" w:customStyle="1" w:styleId="TableGrid">
+    <w:name w:val="TableGrid"/>
+    <w:rsid w:val="00966B56"/>
+    <w:pPr>
+      <w:spacing w:after="0" w:line="240" w:lineRule="auto"/>
+    </w:pPr>
+    <w:rPr>
+      <w:rFonts w:eastAsiaTheme="minorEastAsia"/>
+      <w:kern w:val="0"/>
+      <w:sz w:val="22"/>
+      <w:szCs w:val="22"/>
+      <w14:ligatures w14:val="none"/>
+    </w:rPr>
+    <w:tblPr>
+      <w:tblCellMar>
+        <w:top w:w="0" w:type="dxa"/>
+        <w:left w:w="0" w:type="dxa"/>
+        <w:bottom w:w="0" w:type="dxa"/>
+        <w:right w:w="0" w:type="dxa"/>
+      </w:tblCellMar>
+    </w:tblPr>
+  </w:style>
+  <w:style w:type="paragraph" w:styleId="TOCHeading">
+    <w:name w:val="TOC Heading"/>
+    <w:basedOn w:val="Heading1"/>
+    <w:next w:val="Normal"/>
+    <w:uiPriority w:val="39"/>
+    <w:unhideWhenUsed/>
+    <w:qFormat/>
+    <w:rsid w:val="00966B56"/>
+    <w:pPr>
+      <w:numPr>
+        <w:numId w:val="0"/>
+      </w:numPr>
+      <w:spacing w:before="240" w:after="0" w:line="259" w:lineRule="auto"/>
+      <w:outlineLvl w:val="9"/>
+    </w:pPr>
+    <w:rPr>
+      <w:kern w:val="0"/>
+      <w:sz w:val="32"/>
+      <w:szCs w:val="32"/>
+      <w14:ligatures w14:val="none"/>
+    </w:rPr>
+  </w:style>
+  <w:style w:type="paragraph" w:styleId="TOC1">
+    <w:name w:val="toc 1"/>
+    <w:basedOn w:val="Normal"/>
+    <w:next w:val="Normal"/>
+    <w:autoRedefine/>
+    <w:uiPriority w:val="39"/>
+    <w:unhideWhenUsed/>
+    <w:rsid w:val="00966B56"/>
+    <w:pPr>
+      <w:spacing w:after="100"/>
+    </w:pPr>
+  </w:style>
+  <w:style w:type="paragraph" w:styleId="TOC2">
+    <w:name w:val="toc 2"/>
+    <w:basedOn w:val="Normal"/>
+    <w:next w:val="Normal"/>
+    <w:autoRedefine/>
+    <w:uiPriority w:val="39"/>
+    <w:unhideWhenUsed/>
+    <w:rsid w:val="00966B56"/>
+    <w:pPr>
+      <w:spacing w:after="100"/>
+      <w:ind w:left="240"/>
+    </w:pPr>
+  </w:style>
+  <w:style w:type="character" w:styleId="Hyperlink">
+    <w:name w:val="Hyperlink"/>
+    <w:basedOn w:val="DefaultParagraphFont"/>
+    <w:uiPriority w:val="99"/>
+    <w:unhideWhenUsed/>
+    <w:rsid w:val="00966B56"/>
+    <w:rPr>
+      <w:color w:val="0563C1" w:themeColor="hyperlink"/>
+      <w:u w:val="single"/>
+    </w:rPr>
+  </w:style>
+  <w:style w:type="paragraph" w:styleId="Bibliography">
+    <w:name w:val="Bibliography"/>
+    <w:basedOn w:val="Normal"/>
+    <w:next w:val="Normal"/>
+    <w:uiPriority w:val="37"/>
+    <w:unhideWhenUsed/>
+    <w:rsid w:val="00966B56"/>
+  </w:style>
 </w:styles>
 </file>
 

</xml_diff>